<commit_message>
Fix: Resolve Firebase sync error and Restore Premium UI design
</commit_message>
<xml_diff>
--- a/チャット履歴.docx
+++ b/チャット履歴.docx
@@ -37133,22 +37133,217 @@
         </w:rPr>
         <w:t>5分ほど経ってから、</w:t>
       </w:r>
+      <w:r>
+        <w:rPr>
+          <w:b/>
+          <w:bCs/>
+        </w:rPr>
+        <w:fldChar w:fldCharType="begin"/>
+      </w:r>
+      <w:r>
+        <w:rPr>
+          <w:b/>
+          <w:bCs/>
+        </w:rPr>
+        <w:instrText>HYPERLINK "https://saigaireport.pages.dev/"</w:instrText>
+      </w:r>
+      <w:r>
+        <w:rPr>
+          <w:b/>
+          <w:bCs/>
+        </w:rPr>
+      </w:r>
+      <w:r>
+        <w:rPr>
+          <w:b/>
+          <w:bCs/>
+        </w:rPr>
+        <w:fldChar w:fldCharType="separate"/>
+      </w:r>
+      <w:r>
+        <w:rPr>
+          <w:rStyle w:val="aa"/>
+          <w:b/>
+          <w:bCs/>
+        </w:rPr>
+        <w:t>https://saigaireport.pages.dev</w:t>
+      </w:r>
+      <w:r>
+        <w:fldChar w:fldCharType="end"/>
+      </w:r>
+      <w:r>
+        <w:rPr>
+          <w:b/>
+          <w:bCs/>
+        </w:rPr>
+        <w:t> にアクセスし、Ctrl + F5（スーパーリロード）を一度だけ実行してください。</w:t>
+      </w:r>
+    </w:p>
+    <w:p>
+      <w:pPr>
+        <w:pBdr>
+          <w:bottom w:val="single" w:sz="6" w:space="1" w:color="auto"/>
+        </w:pBdr>
+      </w:pPr>
+      <w:r>
+        <w:t>これでようやく「全災害情報タイムライン」の文字が表示されるはずです。画面が表示されましたら、ぜひお知らせください！</w:t>
+      </w:r>
+    </w:p>
+    <w:p/>
+    <w:p>
+      <w:pPr>
+        <w:rPr>
+          <w:color w:val="EE0000"/>
+        </w:rPr>
+      </w:pPr>
+      <w:r>
+        <w:rPr>
+          <w:rFonts w:hint="eastAsia"/>
+          <w:color w:val="EE0000"/>
+        </w:rPr>
+        <w:t>「</w:t>
+      </w:r>
+      <w:r>
+        <w:rPr>
+          <w:color w:val="EE0000"/>
+        </w:rPr>
+        <w:t>5分経過してアクセスしました。スーパーリロードも実行しましたが、白いままです。</w:t>
+      </w:r>
+      <w:r>
+        <w:rPr>
+          <w:rFonts w:hint="eastAsia"/>
+          <w:color w:val="EE0000"/>
+        </w:rPr>
+        <w:t>」</w:t>
+      </w:r>
+    </w:p>
+    <w:p>
+      <w:pPr>
+        <w:rPr>
+          <w:color w:val="EE0000"/>
+        </w:rPr>
+      </w:pPr>
+    </w:p>
+    <w:p>
+      <w:r>
+        <w:t>何度も申し訳ございません。現在の「真っ白な画面」の原因を特定するために、</w:t>
+      </w:r>
+      <w:r>
+        <w:rPr>
+          <w:b/>
+          <w:bCs/>
+        </w:rPr>
+        <w:t>診断機能を備えた特別なプログラム</w:t>
+      </w:r>
+      <w:r>
+        <w:t>を送信しました。</w:t>
+      </w:r>
+    </w:p>
+    <w:p>
+      <w:r>
+        <w:t>今回の対応</w:t>
+      </w:r>
+    </w:p>
+    <w:p>
+      <w:r>
+        <w:t>通常、真っ白な画面になる場合は何らかのエラーが発生していますが、それが画面上に表示されないために原因が特定しづらい状態です。</w:t>
+      </w:r>
+    </w:p>
+    <w:p>
+      <w:r>
+        <w:t>そこで今回は、プログラムの起動時に以下のメッセージが画面に（または裏側に）出るように仕込みました。</w:t>
+      </w:r>
+    </w:p>
+    <w:p>
+      <w:pPr>
+        <w:numPr>
+          <w:ilvl w:val="0"/>
+          <w:numId w:val="201"/>
+        </w:numPr>
+      </w:pPr>
+      <w:r>
+        <w:rPr>
+          <w:b/>
+          <w:bCs/>
+        </w:rPr>
+        <w:t>「アプリを起動しています...」</w:t>
+      </w:r>
+      <w:r>
+        <w:t> という文字が画面の左上に出るようにしました。</w:t>
+      </w:r>
+    </w:p>
+    <w:p>
+      <w:pPr>
+        <w:numPr>
+          <w:ilvl w:val="0"/>
+          <w:numId w:val="201"/>
+        </w:numPr>
+      </w:pPr>
+      <w:r>
+        <w:t>万が一途中でクラッシュした場合、</w:t>
+      </w:r>
+      <w:r>
+        <w:rPr>
+          <w:b/>
+          <w:bCs/>
+        </w:rPr>
+        <w:t>「エラーが発生しました：〇〇」</w:t>
+      </w:r>
+      <w:r>
+        <w:t> という赤い文字が画面に出るようにしました。</w:t>
+      </w:r>
+    </w:p>
+    <w:p>
+      <w:r>
+        <w:t>次のステップ</w:t>
+      </w:r>
+    </w:p>
+    <w:p>
+      <w:r>
+        <w:t>あと5分ほどでデプロイが完了します。</w:t>
+      </w:r>
+    </w:p>
+    <w:p>
+      <w:pPr>
+        <w:numPr>
+          <w:ilvl w:val="0"/>
+          <w:numId w:val="202"/>
+        </w:numPr>
+      </w:pPr>
+      <w:r>
+        <w:t>再度 </w:t>
+      </w:r>
       <w:hyperlink r:id="rId34" w:history="1">
         <w:r>
           <w:rPr>
             <w:rStyle w:val="aa"/>
-            <w:b/>
-            <w:bCs/>
           </w:rPr>
           <w:t>https://saigaireport.pages.dev</w:t>
         </w:r>
       </w:hyperlink>
       <w:r>
-        <w:rPr>
-          <w:b/>
-          <w:bCs/>
-        </w:rPr>
-        <w:t> にアクセスし、Ctrl + F5（スーパーリロード）を一度だけ実行してください。</w:t>
+        <w:t> にアクセスしてください。</w:t>
+      </w:r>
+    </w:p>
+    <w:p>
+      <w:pPr>
+        <w:numPr>
+          <w:ilvl w:val="0"/>
+          <w:numId w:val="202"/>
+        </w:numPr>
+      </w:pPr>
+      <w:r>
+        <w:t>もし画面が真っ白のままであれば、</w:t>
+      </w:r>
+      <w:r>
+        <w:rPr>
+          <w:b/>
+          <w:bCs/>
+        </w:rPr>
+        <w:t>「アプリを起動しています...」という文字すら出ていないか、あるいは別の文字が出ているか</w:t>
+      </w:r>
+      <w:r>
+        <w:t>を教えていただけますでしょうか？</w:t>
       </w:r>
     </w:p>
     <w:p>
@@ -37158,7 +37353,7 @@
         </w:pBdr>
       </w:pPr>
       <w:r>
-        <w:t>これでようやく「全災害情報タイムライン」の文字が表示されるはずです。画面が表示されましたら、ぜひお知らせください！</w:t>
+        <w:t>もし「アプリを起動しています...」の文字すら出ない場合、プログラムそのものがブラウザに読み込まれていない（あるいは読み込みの前の段階で止まっている）ことが確定します。その結果をお待ちしております。</w:t>
       </w:r>
     </w:p>
     <w:p/>
@@ -37170,7 +37365,132 @@
         <w:t>「</w:t>
       </w:r>
       <w:r>
-        <w:t>5分経過してアクセスしました。スーパーリロードも実行しましたが、白いままです。</w:t>
+        <w:t>画面表示できました。しかし災害情報の送信で次のエラーが出ます。</w:t>
+      </w:r>
+      <w:proofErr w:type="spellStart"/>
+      <w:r>
+        <w:t>saigaireport.pages.dev</w:t>
+      </w:r>
+      <w:proofErr w:type="spellEnd"/>
+      <w:r>
+        <w:t>の内容 「送信に失敗しましたが、端末に保存されませんでした。」解決できますか？他にも画面構成が変わってしまっている所もありますが、まずは送信が出来るようにして下さい。</w:t>
+      </w:r>
+      <w:r>
+        <w:rPr>
+          <w:rFonts w:hint="eastAsia"/>
+        </w:rPr>
+        <w:t>」</w:t>
+      </w:r>
+    </w:p>
+    <w:p/>
+    <w:p>
+      <w:r>
+        <w:t>表示ができるようになり、一歩前進しました！しかし、送信エラーとデザインの退行が発生してしまい、申し訳ありません。</w:t>
+      </w:r>
+    </w:p>
+    <w:p>
+      <w:r>
+        <w:t>これまでの調査で、送信エラーの原因は </w:t>
+      </w:r>
+      <w:r>
+        <w:rPr>
+          <w:b/>
+          <w:bCs/>
+        </w:rPr>
+        <w:t>「Firebaseの接続準備が整う前に送信しようとしている」</w:t>
+      </w:r>
+      <w:r>
+        <w:t> ことにあると特定しました。また、ホワイトスクリーン調査のために一時的にシ</w:t>
+      </w:r>
+      <w:r>
+        <w:lastRenderedPageBreak/>
+        <w:t>ンプルにした画面構成を、</w:t>
+      </w:r>
+      <w:r>
+        <w:rPr>
+          <w:b/>
+          <w:bCs/>
+        </w:rPr>
+        <w:t>元のリッチで美しい消防団アプリのデザイン</w:t>
+      </w:r>
+      <w:r>
+        <w:t> に完全復元します。</w:t>
+      </w:r>
+    </w:p>
+    <w:p>
+      <w:r>
+        <w:t>修正とデザイン復元のプラン (implementation_plan.md)</w:t>
+      </w:r>
+    </w:p>
+    <w:p>
+      <w:r>
+        <w:t>確認させていただきたい点</w:t>
+      </w:r>
+    </w:p>
+    <w:p>
+      <w:r>
+        <w:t>エラーメッセージの末尾は </w:t>
+      </w:r>
+      <w:r>
+        <w:rPr>
+          <w:b/>
+          <w:bCs/>
+        </w:rPr>
+        <w:t>「保存されました（されました）」</w:t>
+      </w:r>
+      <w:r>
+        <w:t> でしたでしょうか？ それとも </w:t>
+      </w:r>
+      <w:r>
+        <w:rPr>
+          <w:b/>
+          <w:bCs/>
+        </w:rPr>
+        <w:t>「されませんでした（されませんでした）」</w:t>
+      </w:r>
+      <w:r>
+        <w:t> でしたでしょうか？</w:t>
+      </w:r>
+    </w:p>
+    <w:p>
+      <w:pPr>
+        <w:numPr>
+          <w:ilvl w:val="0"/>
+          <w:numId w:val="203"/>
+        </w:numPr>
+      </w:pPr>
+      <w:r>
+        <w:t>もし「されませんでした」であれば、端末の保存（</w:t>
+      </w:r>
+      <w:proofErr w:type="spellStart"/>
+      <w:r>
+        <w:t>IndexedDB</w:t>
+      </w:r>
+      <w:proofErr w:type="spellEnd"/>
+      <w:r>
+        <w:t>）容量が写真のサイズで一杯になっている可能性があります。</w:t>
+      </w:r>
+    </w:p>
+    <w:p>
+      <w:pPr>
+        <w:pBdr>
+          <w:bottom w:val="single" w:sz="6" w:space="1" w:color="auto"/>
+        </w:pBdr>
+      </w:pPr>
+      <w:r>
+        <w:t>このプランで送信機能の修正とデザインの復元を進めてもよろしいでしょうか？承認いただければ、最優先で実行いたします。</w:t>
+      </w:r>
+    </w:p>
+    <w:p/>
+    <w:p>
+      <w:r>
+        <w:rPr>
+          <w:rFonts w:hint="eastAsia"/>
+        </w:rPr>
+        <w:t>「</w:t>
+      </w:r>
+      <w:r>
+        <w:t>送信に失敗しましたが、端末には保存されました。　です。</w:t>
       </w:r>
       <w:r>
         <w:rPr>
@@ -38899,6 +39219,155 @@
     </w:lvl>
   </w:abstractNum>
   <w:abstractNum w:abstractNumId="13" w15:restartNumberingAfterBreak="0">
+    <w:nsid w:val="0E6E3659"/>
+    <w:multiLevelType w:val="multilevel"/>
+    <w:tmpl w:val="541C4EC6"/>
+    <w:lvl w:ilvl="0">
+      <w:start w:val="1"/>
+      <w:numFmt w:val="bullet"/>
+      <w:lvlText w:val=""/>
+      <w:lvlJc w:val="left"/>
+      <w:pPr>
+        <w:tabs>
+          <w:tab w:val="num" w:pos="720"/>
+        </w:tabs>
+        <w:ind w:left="720" w:hanging="360"/>
+      </w:pPr>
+      <w:rPr>
+        <w:rFonts w:ascii="Symbol" w:hAnsi="Symbol" w:hint="default"/>
+        <w:sz w:val="20"/>
+      </w:rPr>
+    </w:lvl>
+    <w:lvl w:ilvl="1" w:tentative="1">
+      <w:start w:val="1"/>
+      <w:numFmt w:val="bullet"/>
+      <w:lvlText w:val=""/>
+      <w:lvlJc w:val="left"/>
+      <w:pPr>
+        <w:tabs>
+          <w:tab w:val="num" w:pos="1440"/>
+        </w:tabs>
+        <w:ind w:left="1440" w:hanging="360"/>
+      </w:pPr>
+      <w:rPr>
+        <w:rFonts w:ascii="Symbol" w:hAnsi="Symbol" w:hint="default"/>
+        <w:sz w:val="20"/>
+      </w:rPr>
+    </w:lvl>
+    <w:lvl w:ilvl="2" w:tentative="1">
+      <w:start w:val="1"/>
+      <w:numFmt w:val="bullet"/>
+      <w:lvlText w:val=""/>
+      <w:lvlJc w:val="left"/>
+      <w:pPr>
+        <w:tabs>
+          <w:tab w:val="num" w:pos="2160"/>
+        </w:tabs>
+        <w:ind w:left="2160" w:hanging="360"/>
+      </w:pPr>
+      <w:rPr>
+        <w:rFonts w:ascii="Symbol" w:hAnsi="Symbol" w:hint="default"/>
+        <w:sz w:val="20"/>
+      </w:rPr>
+    </w:lvl>
+    <w:lvl w:ilvl="3" w:tentative="1">
+      <w:start w:val="1"/>
+      <w:numFmt w:val="bullet"/>
+      <w:lvlText w:val=""/>
+      <w:lvlJc w:val="left"/>
+      <w:pPr>
+        <w:tabs>
+          <w:tab w:val="num" w:pos="2880"/>
+        </w:tabs>
+        <w:ind w:left="2880" w:hanging="360"/>
+      </w:pPr>
+      <w:rPr>
+        <w:rFonts w:ascii="Symbol" w:hAnsi="Symbol" w:hint="default"/>
+        <w:sz w:val="20"/>
+      </w:rPr>
+    </w:lvl>
+    <w:lvl w:ilvl="4" w:tentative="1">
+      <w:start w:val="1"/>
+      <w:numFmt w:val="bullet"/>
+      <w:lvlText w:val=""/>
+      <w:lvlJc w:val="left"/>
+      <w:pPr>
+        <w:tabs>
+          <w:tab w:val="num" w:pos="3600"/>
+        </w:tabs>
+        <w:ind w:left="3600" w:hanging="360"/>
+      </w:pPr>
+      <w:rPr>
+        <w:rFonts w:ascii="Symbol" w:hAnsi="Symbol" w:hint="default"/>
+        <w:sz w:val="20"/>
+      </w:rPr>
+    </w:lvl>
+    <w:lvl w:ilvl="5" w:tentative="1">
+      <w:start w:val="1"/>
+      <w:numFmt w:val="bullet"/>
+      <w:lvlText w:val=""/>
+      <w:lvlJc w:val="left"/>
+      <w:pPr>
+        <w:tabs>
+          <w:tab w:val="num" w:pos="4320"/>
+        </w:tabs>
+        <w:ind w:left="4320" w:hanging="360"/>
+      </w:pPr>
+      <w:rPr>
+        <w:rFonts w:ascii="Symbol" w:hAnsi="Symbol" w:hint="default"/>
+        <w:sz w:val="20"/>
+      </w:rPr>
+    </w:lvl>
+    <w:lvl w:ilvl="6" w:tentative="1">
+      <w:start w:val="1"/>
+      <w:numFmt w:val="bullet"/>
+      <w:lvlText w:val=""/>
+      <w:lvlJc w:val="left"/>
+      <w:pPr>
+        <w:tabs>
+          <w:tab w:val="num" w:pos="5040"/>
+        </w:tabs>
+        <w:ind w:left="5040" w:hanging="360"/>
+      </w:pPr>
+      <w:rPr>
+        <w:rFonts w:ascii="Symbol" w:hAnsi="Symbol" w:hint="default"/>
+        <w:sz w:val="20"/>
+      </w:rPr>
+    </w:lvl>
+    <w:lvl w:ilvl="7" w:tentative="1">
+      <w:start w:val="1"/>
+      <w:numFmt w:val="bullet"/>
+      <w:lvlText w:val=""/>
+      <w:lvlJc w:val="left"/>
+      <w:pPr>
+        <w:tabs>
+          <w:tab w:val="num" w:pos="5760"/>
+        </w:tabs>
+        <w:ind w:left="5760" w:hanging="360"/>
+      </w:pPr>
+      <w:rPr>
+        <w:rFonts w:ascii="Symbol" w:hAnsi="Symbol" w:hint="default"/>
+        <w:sz w:val="20"/>
+      </w:rPr>
+    </w:lvl>
+    <w:lvl w:ilvl="8" w:tentative="1">
+      <w:start w:val="1"/>
+      <w:numFmt w:val="bullet"/>
+      <w:lvlText w:val=""/>
+      <w:lvlJc w:val="left"/>
+      <w:pPr>
+        <w:tabs>
+          <w:tab w:val="num" w:pos="6480"/>
+        </w:tabs>
+        <w:ind w:left="6480" w:hanging="360"/>
+      </w:pPr>
+      <w:rPr>
+        <w:rFonts w:ascii="Symbol" w:hAnsi="Symbol" w:hint="default"/>
+        <w:sz w:val="20"/>
+      </w:rPr>
+    </w:lvl>
+  </w:abstractNum>
+  <w:abstractNum w:abstractNumId="14" w15:restartNumberingAfterBreak="0">
     <w:nsid w:val="0FC075D9"/>
     <w:multiLevelType w:val="multilevel"/>
     <w:tmpl w:val="8E9C5B7E"/>
@@ -39047,7 +39516,7 @@
       </w:rPr>
     </w:lvl>
   </w:abstractNum>
-  <w:abstractNum w:abstractNumId="14" w15:restartNumberingAfterBreak="0">
+  <w:abstractNum w:abstractNumId="15" w15:restartNumberingAfterBreak="0">
     <w:nsid w:val="0FD46B4F"/>
     <w:multiLevelType w:val="multilevel"/>
     <w:tmpl w:val="E4902A98"/>
@@ -39196,7 +39665,7 @@
       </w:rPr>
     </w:lvl>
   </w:abstractNum>
-  <w:abstractNum w:abstractNumId="15" w15:restartNumberingAfterBreak="0">
+  <w:abstractNum w:abstractNumId="16" w15:restartNumberingAfterBreak="0">
     <w:nsid w:val="0FF010BD"/>
     <w:multiLevelType w:val="multilevel"/>
     <w:tmpl w:val="AF9C753A"/>
@@ -39309,7 +39778,7 @@
       </w:pPr>
     </w:lvl>
   </w:abstractNum>
-  <w:abstractNum w:abstractNumId="16" w15:restartNumberingAfterBreak="0">
+  <w:abstractNum w:abstractNumId="17" w15:restartNumberingAfterBreak="0">
     <w:nsid w:val="12D47B59"/>
     <w:multiLevelType w:val="multilevel"/>
     <w:tmpl w:val="92400F16"/>
@@ -39426,7 +39895,7 @@
       </w:pPr>
     </w:lvl>
   </w:abstractNum>
-  <w:abstractNum w:abstractNumId="17" w15:restartNumberingAfterBreak="0">
+  <w:abstractNum w:abstractNumId="18" w15:restartNumberingAfterBreak="0">
     <w:nsid w:val="13B654CE"/>
     <w:multiLevelType w:val="multilevel"/>
     <w:tmpl w:val="59B26A06"/>
@@ -39539,7 +40008,7 @@
       </w:pPr>
     </w:lvl>
   </w:abstractNum>
-  <w:abstractNum w:abstractNumId="18" w15:restartNumberingAfterBreak="0">
+  <w:abstractNum w:abstractNumId="19" w15:restartNumberingAfterBreak="0">
     <w:nsid w:val="13FC5E3A"/>
     <w:multiLevelType w:val="multilevel"/>
     <w:tmpl w:val="3E92C7BE"/>
@@ -39656,7 +40125,7 @@
       </w:pPr>
     </w:lvl>
   </w:abstractNum>
-  <w:abstractNum w:abstractNumId="19" w15:restartNumberingAfterBreak="0">
+  <w:abstractNum w:abstractNumId="20" w15:restartNumberingAfterBreak="0">
     <w:nsid w:val="14F6508D"/>
     <w:multiLevelType w:val="multilevel"/>
     <w:tmpl w:val="02D28A52"/>
@@ -39773,7 +40242,7 @@
       </w:pPr>
     </w:lvl>
   </w:abstractNum>
-  <w:abstractNum w:abstractNumId="20" w15:restartNumberingAfterBreak="0">
+  <w:abstractNum w:abstractNumId="21" w15:restartNumberingAfterBreak="0">
     <w:nsid w:val="152324B4"/>
     <w:multiLevelType w:val="multilevel"/>
     <w:tmpl w:val="872ABE4A"/>
@@ -39886,7 +40355,7 @@
       </w:pPr>
     </w:lvl>
   </w:abstractNum>
-  <w:abstractNum w:abstractNumId="21" w15:restartNumberingAfterBreak="0">
+  <w:abstractNum w:abstractNumId="22" w15:restartNumberingAfterBreak="0">
     <w:nsid w:val="15FB62CB"/>
     <w:multiLevelType w:val="multilevel"/>
     <w:tmpl w:val="AEBE2058"/>
@@ -40035,7 +40504,7 @@
       </w:rPr>
     </w:lvl>
   </w:abstractNum>
-  <w:abstractNum w:abstractNumId="22" w15:restartNumberingAfterBreak="0">
+  <w:abstractNum w:abstractNumId="23" w15:restartNumberingAfterBreak="0">
     <w:nsid w:val="16B6771A"/>
     <w:multiLevelType w:val="multilevel"/>
     <w:tmpl w:val="D3F621E4"/>
@@ -40148,7 +40617,7 @@
       </w:pPr>
     </w:lvl>
   </w:abstractNum>
-  <w:abstractNum w:abstractNumId="23" w15:restartNumberingAfterBreak="0">
+  <w:abstractNum w:abstractNumId="24" w15:restartNumberingAfterBreak="0">
     <w:nsid w:val="17111C35"/>
     <w:multiLevelType w:val="multilevel"/>
     <w:tmpl w:val="B24803AE"/>
@@ -40297,7 +40766,7 @@
       </w:rPr>
     </w:lvl>
   </w:abstractNum>
-  <w:abstractNum w:abstractNumId="24" w15:restartNumberingAfterBreak="0">
+  <w:abstractNum w:abstractNumId="25" w15:restartNumberingAfterBreak="0">
     <w:nsid w:val="17E44DDF"/>
     <w:multiLevelType w:val="multilevel"/>
     <w:tmpl w:val="4F361F62"/>
@@ -40410,7 +40879,7 @@
       </w:pPr>
     </w:lvl>
   </w:abstractNum>
-  <w:abstractNum w:abstractNumId="25" w15:restartNumberingAfterBreak="0">
+  <w:abstractNum w:abstractNumId="26" w15:restartNumberingAfterBreak="0">
     <w:nsid w:val="193775B6"/>
     <w:multiLevelType w:val="multilevel"/>
     <w:tmpl w:val="11DC9952"/>
@@ -40559,7 +41028,7 @@
       </w:rPr>
     </w:lvl>
   </w:abstractNum>
-  <w:abstractNum w:abstractNumId="26" w15:restartNumberingAfterBreak="0">
+  <w:abstractNum w:abstractNumId="27" w15:restartNumberingAfterBreak="0">
     <w:nsid w:val="19561B40"/>
     <w:multiLevelType w:val="multilevel"/>
     <w:tmpl w:val="22428AF4"/>
@@ -40672,7 +41141,7 @@
       </w:pPr>
     </w:lvl>
   </w:abstractNum>
-  <w:abstractNum w:abstractNumId="27" w15:restartNumberingAfterBreak="0">
+  <w:abstractNum w:abstractNumId="28" w15:restartNumberingAfterBreak="0">
     <w:nsid w:val="197C6F6C"/>
     <w:multiLevelType w:val="multilevel"/>
     <w:tmpl w:val="86DE87AA"/>
@@ -40785,7 +41254,7 @@
       </w:pPr>
     </w:lvl>
   </w:abstractNum>
-  <w:abstractNum w:abstractNumId="28" w15:restartNumberingAfterBreak="0">
+  <w:abstractNum w:abstractNumId="29" w15:restartNumberingAfterBreak="0">
     <w:nsid w:val="19EE6AD1"/>
     <w:multiLevelType w:val="multilevel"/>
     <w:tmpl w:val="25F6CC76"/>
@@ -40934,7 +41403,7 @@
       </w:rPr>
     </w:lvl>
   </w:abstractNum>
-  <w:abstractNum w:abstractNumId="29" w15:restartNumberingAfterBreak="0">
+  <w:abstractNum w:abstractNumId="30" w15:restartNumberingAfterBreak="0">
     <w:nsid w:val="1B216513"/>
     <w:multiLevelType w:val="multilevel"/>
     <w:tmpl w:val="876E1D16"/>
@@ -41083,7 +41552,7 @@
       </w:rPr>
     </w:lvl>
   </w:abstractNum>
-  <w:abstractNum w:abstractNumId="30" w15:restartNumberingAfterBreak="0">
+  <w:abstractNum w:abstractNumId="31" w15:restartNumberingAfterBreak="0">
     <w:nsid w:val="1C2B51B2"/>
     <w:multiLevelType w:val="multilevel"/>
     <w:tmpl w:val="C2585408"/>
@@ -41196,7 +41665,7 @@
       </w:pPr>
     </w:lvl>
   </w:abstractNum>
-  <w:abstractNum w:abstractNumId="31" w15:restartNumberingAfterBreak="0">
+  <w:abstractNum w:abstractNumId="32" w15:restartNumberingAfterBreak="0">
     <w:nsid w:val="1C757D3F"/>
     <w:multiLevelType w:val="multilevel"/>
     <w:tmpl w:val="3932AB56"/>
@@ -41309,7 +41778,7 @@
       </w:pPr>
     </w:lvl>
   </w:abstractNum>
-  <w:abstractNum w:abstractNumId="32" w15:restartNumberingAfterBreak="0">
+  <w:abstractNum w:abstractNumId="33" w15:restartNumberingAfterBreak="0">
     <w:nsid w:val="1CC854F9"/>
     <w:multiLevelType w:val="multilevel"/>
     <w:tmpl w:val="4F76C90C"/>
@@ -41458,7 +41927,7 @@
       </w:rPr>
     </w:lvl>
   </w:abstractNum>
-  <w:abstractNum w:abstractNumId="33" w15:restartNumberingAfterBreak="0">
+  <w:abstractNum w:abstractNumId="34" w15:restartNumberingAfterBreak="0">
     <w:nsid w:val="1DAB55BA"/>
     <w:multiLevelType w:val="multilevel"/>
     <w:tmpl w:val="289E8D36"/>
@@ -41571,7 +42040,7 @@
       </w:pPr>
     </w:lvl>
   </w:abstractNum>
-  <w:abstractNum w:abstractNumId="34" w15:restartNumberingAfterBreak="0">
+  <w:abstractNum w:abstractNumId="35" w15:restartNumberingAfterBreak="0">
     <w:nsid w:val="1DB9031C"/>
     <w:multiLevelType w:val="multilevel"/>
     <w:tmpl w:val="EFA66CB0"/>
@@ -41720,7 +42189,7 @@
       </w:rPr>
     </w:lvl>
   </w:abstractNum>
-  <w:abstractNum w:abstractNumId="35" w15:restartNumberingAfterBreak="0">
+  <w:abstractNum w:abstractNumId="36" w15:restartNumberingAfterBreak="0">
     <w:nsid w:val="1DC5535D"/>
     <w:multiLevelType w:val="multilevel"/>
     <w:tmpl w:val="A266D508"/>
@@ -41869,7 +42338,7 @@
       </w:rPr>
     </w:lvl>
   </w:abstractNum>
-  <w:abstractNum w:abstractNumId="36" w15:restartNumberingAfterBreak="0">
+  <w:abstractNum w:abstractNumId="37" w15:restartNumberingAfterBreak="0">
     <w:nsid w:val="1F8B58C1"/>
     <w:multiLevelType w:val="multilevel"/>
     <w:tmpl w:val="6D1E8A40"/>
@@ -41986,7 +42455,7 @@
       </w:pPr>
     </w:lvl>
   </w:abstractNum>
-  <w:abstractNum w:abstractNumId="37" w15:restartNumberingAfterBreak="0">
+  <w:abstractNum w:abstractNumId="38" w15:restartNumberingAfterBreak="0">
     <w:nsid w:val="20301827"/>
     <w:multiLevelType w:val="multilevel"/>
     <w:tmpl w:val="79B6AC2E"/>
@@ -42135,7 +42604,7 @@
       </w:rPr>
     </w:lvl>
   </w:abstractNum>
-  <w:abstractNum w:abstractNumId="38" w15:restartNumberingAfterBreak="0">
+  <w:abstractNum w:abstractNumId="39" w15:restartNumberingAfterBreak="0">
     <w:nsid w:val="20982B0E"/>
     <w:multiLevelType w:val="multilevel"/>
     <w:tmpl w:val="CAC45B04"/>
@@ -42252,7 +42721,7 @@
       </w:pPr>
     </w:lvl>
   </w:abstractNum>
-  <w:abstractNum w:abstractNumId="39" w15:restartNumberingAfterBreak="0">
+  <w:abstractNum w:abstractNumId="40" w15:restartNumberingAfterBreak="0">
     <w:nsid w:val="20A91DCA"/>
     <w:multiLevelType w:val="multilevel"/>
     <w:tmpl w:val="22C0A11E"/>
@@ -42401,7 +42870,7 @@
       </w:rPr>
     </w:lvl>
   </w:abstractNum>
-  <w:abstractNum w:abstractNumId="40" w15:restartNumberingAfterBreak="0">
+  <w:abstractNum w:abstractNumId="41" w15:restartNumberingAfterBreak="0">
     <w:nsid w:val="20E4730A"/>
     <w:multiLevelType w:val="multilevel"/>
     <w:tmpl w:val="3F982870"/>
@@ -42518,7 +42987,7 @@
       </w:pPr>
     </w:lvl>
   </w:abstractNum>
-  <w:abstractNum w:abstractNumId="41" w15:restartNumberingAfterBreak="0">
+  <w:abstractNum w:abstractNumId="42" w15:restartNumberingAfterBreak="0">
     <w:nsid w:val="226128AC"/>
     <w:multiLevelType w:val="multilevel"/>
     <w:tmpl w:val="04663C56"/>
@@ -42667,7 +43136,7 @@
       </w:rPr>
     </w:lvl>
   </w:abstractNum>
-  <w:abstractNum w:abstractNumId="42" w15:restartNumberingAfterBreak="0">
+  <w:abstractNum w:abstractNumId="43" w15:restartNumberingAfterBreak="0">
     <w:nsid w:val="23371ED0"/>
     <w:multiLevelType w:val="multilevel"/>
     <w:tmpl w:val="8752E3D8"/>
@@ -42816,7 +43285,7 @@
       </w:rPr>
     </w:lvl>
   </w:abstractNum>
-  <w:abstractNum w:abstractNumId="43" w15:restartNumberingAfterBreak="0">
+  <w:abstractNum w:abstractNumId="44" w15:restartNumberingAfterBreak="0">
     <w:nsid w:val="24C022AE"/>
     <w:multiLevelType w:val="multilevel"/>
     <w:tmpl w:val="6A00EABA"/>
@@ -42965,7 +43434,7 @@
       </w:rPr>
     </w:lvl>
   </w:abstractNum>
-  <w:abstractNum w:abstractNumId="44" w15:restartNumberingAfterBreak="0">
+  <w:abstractNum w:abstractNumId="45" w15:restartNumberingAfterBreak="0">
     <w:nsid w:val="24F336E3"/>
     <w:multiLevelType w:val="multilevel"/>
     <w:tmpl w:val="E29C27C6"/>
@@ -43082,7 +43551,7 @@
       </w:pPr>
     </w:lvl>
   </w:abstractNum>
-  <w:abstractNum w:abstractNumId="45" w15:restartNumberingAfterBreak="0">
+  <w:abstractNum w:abstractNumId="46" w15:restartNumberingAfterBreak="0">
     <w:nsid w:val="25DE6D5A"/>
     <w:multiLevelType w:val="multilevel"/>
     <w:tmpl w:val="C45CB6F0"/>
@@ -43231,7 +43700,7 @@
       </w:rPr>
     </w:lvl>
   </w:abstractNum>
-  <w:abstractNum w:abstractNumId="46" w15:restartNumberingAfterBreak="0">
+  <w:abstractNum w:abstractNumId="47" w15:restartNumberingAfterBreak="0">
     <w:nsid w:val="25FA1773"/>
     <w:multiLevelType w:val="multilevel"/>
     <w:tmpl w:val="71E870C8"/>
@@ -43380,7 +43849,7 @@
       </w:rPr>
     </w:lvl>
   </w:abstractNum>
-  <w:abstractNum w:abstractNumId="47" w15:restartNumberingAfterBreak="0">
+  <w:abstractNum w:abstractNumId="48" w15:restartNumberingAfterBreak="0">
     <w:nsid w:val="262A61A8"/>
     <w:multiLevelType w:val="multilevel"/>
     <w:tmpl w:val="8762313E"/>
@@ -43497,7 +43966,7 @@
       </w:pPr>
     </w:lvl>
   </w:abstractNum>
-  <w:abstractNum w:abstractNumId="48" w15:restartNumberingAfterBreak="0">
+  <w:abstractNum w:abstractNumId="49" w15:restartNumberingAfterBreak="0">
     <w:nsid w:val="267503A7"/>
     <w:multiLevelType w:val="multilevel"/>
     <w:tmpl w:val="A92C8EF8"/>
@@ -43646,7 +44115,7 @@
       </w:rPr>
     </w:lvl>
   </w:abstractNum>
-  <w:abstractNum w:abstractNumId="49" w15:restartNumberingAfterBreak="0">
+  <w:abstractNum w:abstractNumId="50" w15:restartNumberingAfterBreak="0">
     <w:nsid w:val="26CA5E03"/>
     <w:multiLevelType w:val="multilevel"/>
     <w:tmpl w:val="E4A645DC"/>
@@ -43759,7 +44228,7 @@
       </w:pPr>
     </w:lvl>
   </w:abstractNum>
-  <w:abstractNum w:abstractNumId="50" w15:restartNumberingAfterBreak="0">
+  <w:abstractNum w:abstractNumId="51" w15:restartNumberingAfterBreak="0">
     <w:nsid w:val="273C7502"/>
     <w:multiLevelType w:val="multilevel"/>
     <w:tmpl w:val="256E7586"/>
@@ -43908,7 +44377,7 @@
       </w:rPr>
     </w:lvl>
   </w:abstractNum>
-  <w:abstractNum w:abstractNumId="51" w15:restartNumberingAfterBreak="0">
+  <w:abstractNum w:abstractNumId="52" w15:restartNumberingAfterBreak="0">
     <w:nsid w:val="280F1262"/>
     <w:multiLevelType w:val="multilevel"/>
     <w:tmpl w:val="E6086032"/>
@@ -44057,7 +44526,7 @@
       </w:rPr>
     </w:lvl>
   </w:abstractNum>
-  <w:abstractNum w:abstractNumId="52" w15:restartNumberingAfterBreak="0">
+  <w:abstractNum w:abstractNumId="53" w15:restartNumberingAfterBreak="0">
     <w:nsid w:val="282A0C1D"/>
     <w:multiLevelType w:val="multilevel"/>
     <w:tmpl w:val="CD66732E"/>
@@ -44174,7 +44643,7 @@
       </w:pPr>
     </w:lvl>
   </w:abstractNum>
-  <w:abstractNum w:abstractNumId="53" w15:restartNumberingAfterBreak="0">
+  <w:abstractNum w:abstractNumId="54" w15:restartNumberingAfterBreak="0">
     <w:nsid w:val="28742AB8"/>
     <w:multiLevelType w:val="multilevel"/>
     <w:tmpl w:val="2DFC6CDE"/>
@@ -44291,7 +44760,7 @@
       </w:pPr>
     </w:lvl>
   </w:abstractNum>
-  <w:abstractNum w:abstractNumId="54" w15:restartNumberingAfterBreak="0">
+  <w:abstractNum w:abstractNumId="55" w15:restartNumberingAfterBreak="0">
     <w:nsid w:val="29E737B1"/>
     <w:multiLevelType w:val="multilevel"/>
     <w:tmpl w:val="895E70B0"/>
@@ -44404,7 +44873,7 @@
       </w:pPr>
     </w:lvl>
   </w:abstractNum>
-  <w:abstractNum w:abstractNumId="55" w15:restartNumberingAfterBreak="0">
+  <w:abstractNum w:abstractNumId="56" w15:restartNumberingAfterBreak="0">
     <w:nsid w:val="2ABA6A84"/>
     <w:multiLevelType w:val="multilevel"/>
     <w:tmpl w:val="486A912E"/>
@@ -44517,7 +44986,7 @@
       </w:pPr>
     </w:lvl>
   </w:abstractNum>
-  <w:abstractNum w:abstractNumId="56" w15:restartNumberingAfterBreak="0">
+  <w:abstractNum w:abstractNumId="57" w15:restartNumberingAfterBreak="0">
     <w:nsid w:val="2AD02549"/>
     <w:multiLevelType w:val="multilevel"/>
     <w:tmpl w:val="164E2AC4"/>
@@ -44634,7 +45103,7 @@
       </w:pPr>
     </w:lvl>
   </w:abstractNum>
-  <w:abstractNum w:abstractNumId="57" w15:restartNumberingAfterBreak="0">
+  <w:abstractNum w:abstractNumId="58" w15:restartNumberingAfterBreak="0">
     <w:nsid w:val="2B5F0ADB"/>
     <w:multiLevelType w:val="multilevel"/>
     <w:tmpl w:val="56E066EA"/>
@@ -44747,7 +45216,7 @@
       </w:pPr>
     </w:lvl>
   </w:abstractNum>
-  <w:abstractNum w:abstractNumId="58" w15:restartNumberingAfterBreak="0">
+  <w:abstractNum w:abstractNumId="59" w15:restartNumberingAfterBreak="0">
     <w:nsid w:val="2B8537C4"/>
     <w:multiLevelType w:val="multilevel"/>
     <w:tmpl w:val="2DFCA6C0"/>
@@ -44864,7 +45333,7 @@
       </w:pPr>
     </w:lvl>
   </w:abstractNum>
-  <w:abstractNum w:abstractNumId="59" w15:restartNumberingAfterBreak="0">
+  <w:abstractNum w:abstractNumId="60" w15:restartNumberingAfterBreak="0">
     <w:nsid w:val="2C7D74A6"/>
     <w:multiLevelType w:val="multilevel"/>
     <w:tmpl w:val="B5147606"/>
@@ -44977,7 +45446,7 @@
       </w:pPr>
     </w:lvl>
   </w:abstractNum>
-  <w:abstractNum w:abstractNumId="60" w15:restartNumberingAfterBreak="0">
+  <w:abstractNum w:abstractNumId="61" w15:restartNumberingAfterBreak="0">
     <w:nsid w:val="2CB5577D"/>
     <w:multiLevelType w:val="multilevel"/>
     <w:tmpl w:val="3B86DD98"/>
@@ -45090,7 +45559,7 @@
       </w:pPr>
     </w:lvl>
   </w:abstractNum>
-  <w:abstractNum w:abstractNumId="61" w15:restartNumberingAfterBreak="0">
+  <w:abstractNum w:abstractNumId="62" w15:restartNumberingAfterBreak="0">
     <w:nsid w:val="2CEB5E83"/>
     <w:multiLevelType w:val="multilevel"/>
     <w:tmpl w:val="3F9245DE"/>
@@ -45203,7 +45672,7 @@
       </w:pPr>
     </w:lvl>
   </w:abstractNum>
-  <w:abstractNum w:abstractNumId="62" w15:restartNumberingAfterBreak="0">
+  <w:abstractNum w:abstractNumId="63" w15:restartNumberingAfterBreak="0">
     <w:nsid w:val="2D2938E3"/>
     <w:multiLevelType w:val="multilevel"/>
     <w:tmpl w:val="5AF2635E"/>
@@ -45320,7 +45789,7 @@
       </w:pPr>
     </w:lvl>
   </w:abstractNum>
-  <w:abstractNum w:abstractNumId="63" w15:restartNumberingAfterBreak="0">
+  <w:abstractNum w:abstractNumId="64" w15:restartNumberingAfterBreak="0">
     <w:nsid w:val="30DB035F"/>
     <w:multiLevelType w:val="multilevel"/>
     <w:tmpl w:val="E17AC872"/>
@@ -45433,7 +45902,7 @@
       </w:pPr>
     </w:lvl>
   </w:abstractNum>
-  <w:abstractNum w:abstractNumId="64" w15:restartNumberingAfterBreak="0">
+  <w:abstractNum w:abstractNumId="65" w15:restartNumberingAfterBreak="0">
     <w:nsid w:val="316F3DF7"/>
     <w:multiLevelType w:val="multilevel"/>
     <w:tmpl w:val="D7149616"/>
@@ -45546,7 +46015,7 @@
       </w:pPr>
     </w:lvl>
   </w:abstractNum>
-  <w:abstractNum w:abstractNumId="65" w15:restartNumberingAfterBreak="0">
+  <w:abstractNum w:abstractNumId="66" w15:restartNumberingAfterBreak="0">
     <w:nsid w:val="31B1219F"/>
     <w:multiLevelType w:val="multilevel"/>
     <w:tmpl w:val="294CBEEC"/>
@@ -45659,7 +46128,7 @@
       </w:pPr>
     </w:lvl>
   </w:abstractNum>
-  <w:abstractNum w:abstractNumId="66" w15:restartNumberingAfterBreak="0">
+  <w:abstractNum w:abstractNumId="67" w15:restartNumberingAfterBreak="0">
     <w:nsid w:val="31DC0752"/>
     <w:multiLevelType w:val="multilevel"/>
     <w:tmpl w:val="13504090"/>
@@ -45772,7 +46241,7 @@
       </w:pPr>
     </w:lvl>
   </w:abstractNum>
-  <w:abstractNum w:abstractNumId="67" w15:restartNumberingAfterBreak="0">
+  <w:abstractNum w:abstractNumId="68" w15:restartNumberingAfterBreak="0">
     <w:nsid w:val="32243C7B"/>
     <w:multiLevelType w:val="multilevel"/>
     <w:tmpl w:val="EA926358"/>
@@ -45921,7 +46390,7 @@
       </w:rPr>
     </w:lvl>
   </w:abstractNum>
-  <w:abstractNum w:abstractNumId="68" w15:restartNumberingAfterBreak="0">
+  <w:abstractNum w:abstractNumId="69" w15:restartNumberingAfterBreak="0">
     <w:nsid w:val="32B215EC"/>
     <w:multiLevelType w:val="multilevel"/>
     <w:tmpl w:val="74EAAF8E"/>
@@ -46034,7 +46503,7 @@
       </w:pPr>
     </w:lvl>
   </w:abstractNum>
-  <w:abstractNum w:abstractNumId="69" w15:restartNumberingAfterBreak="0">
+  <w:abstractNum w:abstractNumId="70" w15:restartNumberingAfterBreak="0">
     <w:nsid w:val="32C55FAF"/>
     <w:multiLevelType w:val="multilevel"/>
     <w:tmpl w:val="FB244F80"/>
@@ -46183,7 +46652,7 @@
       </w:rPr>
     </w:lvl>
   </w:abstractNum>
-  <w:abstractNum w:abstractNumId="70" w15:restartNumberingAfterBreak="0">
+  <w:abstractNum w:abstractNumId="71" w15:restartNumberingAfterBreak="0">
     <w:nsid w:val="356F1387"/>
     <w:multiLevelType w:val="multilevel"/>
     <w:tmpl w:val="A4028C62"/>
@@ -46332,7 +46801,7 @@
       </w:rPr>
     </w:lvl>
   </w:abstractNum>
-  <w:abstractNum w:abstractNumId="71" w15:restartNumberingAfterBreak="0">
+  <w:abstractNum w:abstractNumId="72" w15:restartNumberingAfterBreak="0">
     <w:nsid w:val="35EA7E57"/>
     <w:multiLevelType w:val="multilevel"/>
     <w:tmpl w:val="38DA783A"/>
@@ -46445,7 +46914,7 @@
       </w:pPr>
     </w:lvl>
   </w:abstractNum>
-  <w:abstractNum w:abstractNumId="72" w15:restartNumberingAfterBreak="0">
+  <w:abstractNum w:abstractNumId="73" w15:restartNumberingAfterBreak="0">
     <w:nsid w:val="37550099"/>
     <w:multiLevelType w:val="multilevel"/>
     <w:tmpl w:val="4E80F410"/>
@@ -46562,7 +47031,7 @@
       </w:pPr>
     </w:lvl>
   </w:abstractNum>
-  <w:abstractNum w:abstractNumId="73" w15:restartNumberingAfterBreak="0">
+  <w:abstractNum w:abstractNumId="74" w15:restartNumberingAfterBreak="0">
     <w:nsid w:val="37D820E4"/>
     <w:multiLevelType w:val="multilevel"/>
     <w:tmpl w:val="22FC75C6"/>
@@ -46711,7 +47180,7 @@
       </w:rPr>
     </w:lvl>
   </w:abstractNum>
-  <w:abstractNum w:abstractNumId="74" w15:restartNumberingAfterBreak="0">
+  <w:abstractNum w:abstractNumId="75" w15:restartNumberingAfterBreak="0">
     <w:nsid w:val="37F0247B"/>
     <w:multiLevelType w:val="multilevel"/>
     <w:tmpl w:val="9D9621D0"/>
@@ -46828,7 +47297,7 @@
       </w:pPr>
     </w:lvl>
   </w:abstractNum>
-  <w:abstractNum w:abstractNumId="75" w15:restartNumberingAfterBreak="0">
+  <w:abstractNum w:abstractNumId="76" w15:restartNumberingAfterBreak="0">
     <w:nsid w:val="38781B8F"/>
     <w:multiLevelType w:val="multilevel"/>
     <w:tmpl w:val="F43C34A0"/>
@@ -46945,7 +47414,7 @@
       </w:pPr>
     </w:lvl>
   </w:abstractNum>
-  <w:abstractNum w:abstractNumId="76" w15:restartNumberingAfterBreak="0">
+  <w:abstractNum w:abstractNumId="77" w15:restartNumberingAfterBreak="0">
     <w:nsid w:val="38C102AA"/>
     <w:multiLevelType w:val="multilevel"/>
     <w:tmpl w:val="A4746E7E"/>
@@ -47094,7 +47563,7 @@
       </w:rPr>
     </w:lvl>
   </w:abstractNum>
-  <w:abstractNum w:abstractNumId="77" w15:restartNumberingAfterBreak="0">
+  <w:abstractNum w:abstractNumId="78" w15:restartNumberingAfterBreak="0">
     <w:nsid w:val="39E53615"/>
     <w:multiLevelType w:val="multilevel"/>
     <w:tmpl w:val="F6001C8C"/>
@@ -47243,7 +47712,7 @@
       </w:rPr>
     </w:lvl>
   </w:abstractNum>
-  <w:abstractNum w:abstractNumId="78" w15:restartNumberingAfterBreak="0">
+  <w:abstractNum w:abstractNumId="79" w15:restartNumberingAfterBreak="0">
     <w:nsid w:val="3A627DC2"/>
     <w:multiLevelType w:val="multilevel"/>
     <w:tmpl w:val="9806B5CC"/>
@@ -47392,7 +47861,7 @@
       </w:rPr>
     </w:lvl>
   </w:abstractNum>
-  <w:abstractNum w:abstractNumId="79" w15:restartNumberingAfterBreak="0">
+  <w:abstractNum w:abstractNumId="80" w15:restartNumberingAfterBreak="0">
     <w:nsid w:val="3AB86A9E"/>
     <w:multiLevelType w:val="multilevel"/>
     <w:tmpl w:val="0E94C00A"/>
@@ -47505,7 +47974,7 @@
       </w:pPr>
     </w:lvl>
   </w:abstractNum>
-  <w:abstractNum w:abstractNumId="80" w15:restartNumberingAfterBreak="0">
+  <w:abstractNum w:abstractNumId="81" w15:restartNumberingAfterBreak="0">
     <w:nsid w:val="3B3B0B1C"/>
     <w:multiLevelType w:val="multilevel"/>
     <w:tmpl w:val="CD664BD0"/>
@@ -47654,7 +48123,7 @@
       </w:rPr>
     </w:lvl>
   </w:abstractNum>
-  <w:abstractNum w:abstractNumId="81" w15:restartNumberingAfterBreak="0">
+  <w:abstractNum w:abstractNumId="82" w15:restartNumberingAfterBreak="0">
     <w:nsid w:val="3B53161F"/>
     <w:multiLevelType w:val="multilevel"/>
     <w:tmpl w:val="9B6E392A"/>
@@ -47803,7 +48272,7 @@
       </w:rPr>
     </w:lvl>
   </w:abstractNum>
-  <w:abstractNum w:abstractNumId="82" w15:restartNumberingAfterBreak="0">
+  <w:abstractNum w:abstractNumId="83" w15:restartNumberingAfterBreak="0">
     <w:nsid w:val="3B961BD4"/>
     <w:multiLevelType w:val="multilevel"/>
     <w:tmpl w:val="9CDE90DE"/>
@@ -47920,7 +48389,7 @@
       </w:pPr>
     </w:lvl>
   </w:abstractNum>
-  <w:abstractNum w:abstractNumId="83" w15:restartNumberingAfterBreak="0">
+  <w:abstractNum w:abstractNumId="84" w15:restartNumberingAfterBreak="0">
     <w:nsid w:val="3BFB5921"/>
     <w:multiLevelType w:val="multilevel"/>
     <w:tmpl w:val="0FA6CE6A"/>
@@ -48069,7 +48538,7 @@
       </w:rPr>
     </w:lvl>
   </w:abstractNum>
-  <w:abstractNum w:abstractNumId="84" w15:restartNumberingAfterBreak="0">
+  <w:abstractNum w:abstractNumId="85" w15:restartNumberingAfterBreak="0">
     <w:nsid w:val="3D243E74"/>
     <w:multiLevelType w:val="multilevel"/>
     <w:tmpl w:val="636CADC2"/>
@@ -48182,7 +48651,7 @@
       </w:pPr>
     </w:lvl>
   </w:abstractNum>
-  <w:abstractNum w:abstractNumId="85" w15:restartNumberingAfterBreak="0">
+  <w:abstractNum w:abstractNumId="86" w15:restartNumberingAfterBreak="0">
     <w:nsid w:val="3DF475C4"/>
     <w:multiLevelType w:val="multilevel"/>
     <w:tmpl w:val="647C6328"/>
@@ -48331,7 +48800,7 @@
       </w:rPr>
     </w:lvl>
   </w:abstractNum>
-  <w:abstractNum w:abstractNumId="86" w15:restartNumberingAfterBreak="0">
+  <w:abstractNum w:abstractNumId="87" w15:restartNumberingAfterBreak="0">
     <w:nsid w:val="3F2F28BC"/>
     <w:multiLevelType w:val="multilevel"/>
     <w:tmpl w:val="CED4163C"/>
@@ -48444,7 +48913,7 @@
       </w:pPr>
     </w:lvl>
   </w:abstractNum>
-  <w:abstractNum w:abstractNumId="87" w15:restartNumberingAfterBreak="0">
+  <w:abstractNum w:abstractNumId="88" w15:restartNumberingAfterBreak="0">
     <w:nsid w:val="3F781B31"/>
     <w:multiLevelType w:val="multilevel"/>
     <w:tmpl w:val="D30E4AF4"/>
@@ -48561,7 +49030,7 @@
       </w:pPr>
     </w:lvl>
   </w:abstractNum>
-  <w:abstractNum w:abstractNumId="88" w15:restartNumberingAfterBreak="0">
+  <w:abstractNum w:abstractNumId="89" w15:restartNumberingAfterBreak="0">
     <w:nsid w:val="406B17C2"/>
     <w:multiLevelType w:val="multilevel"/>
     <w:tmpl w:val="2AF2DE58"/>
@@ -48674,7 +49143,7 @@
       </w:pPr>
     </w:lvl>
   </w:abstractNum>
-  <w:abstractNum w:abstractNumId="89" w15:restartNumberingAfterBreak="0">
+  <w:abstractNum w:abstractNumId="90" w15:restartNumberingAfterBreak="0">
     <w:nsid w:val="408A3E59"/>
     <w:multiLevelType w:val="multilevel"/>
     <w:tmpl w:val="29DE851C"/>
@@ -48787,7 +49256,7 @@
       </w:pPr>
     </w:lvl>
   </w:abstractNum>
-  <w:abstractNum w:abstractNumId="90" w15:restartNumberingAfterBreak="0">
+  <w:abstractNum w:abstractNumId="91" w15:restartNumberingAfterBreak="0">
     <w:nsid w:val="41035F14"/>
     <w:multiLevelType w:val="multilevel"/>
     <w:tmpl w:val="B99AFF60"/>
@@ -48904,7 +49373,7 @@
       </w:pPr>
     </w:lvl>
   </w:abstractNum>
-  <w:abstractNum w:abstractNumId="91" w15:restartNumberingAfterBreak="0">
+  <w:abstractNum w:abstractNumId="92" w15:restartNumberingAfterBreak="0">
     <w:nsid w:val="42ED30EB"/>
     <w:multiLevelType w:val="multilevel"/>
     <w:tmpl w:val="E56E69F8"/>
@@ -49017,7 +49486,7 @@
       </w:pPr>
     </w:lvl>
   </w:abstractNum>
-  <w:abstractNum w:abstractNumId="92" w15:restartNumberingAfterBreak="0">
+  <w:abstractNum w:abstractNumId="93" w15:restartNumberingAfterBreak="0">
     <w:nsid w:val="43083F1B"/>
     <w:multiLevelType w:val="multilevel"/>
     <w:tmpl w:val="5D3C41AA"/>
@@ -49130,7 +49599,7 @@
       </w:pPr>
     </w:lvl>
   </w:abstractNum>
-  <w:abstractNum w:abstractNumId="93" w15:restartNumberingAfterBreak="0">
+  <w:abstractNum w:abstractNumId="94" w15:restartNumberingAfterBreak="0">
     <w:nsid w:val="43C8008C"/>
     <w:multiLevelType w:val="multilevel"/>
     <w:tmpl w:val="6DE66ED8"/>
@@ -49243,7 +49712,7 @@
       </w:pPr>
     </w:lvl>
   </w:abstractNum>
-  <w:abstractNum w:abstractNumId="94" w15:restartNumberingAfterBreak="0">
+  <w:abstractNum w:abstractNumId="95" w15:restartNumberingAfterBreak="0">
     <w:nsid w:val="43D17831"/>
     <w:multiLevelType w:val="multilevel"/>
     <w:tmpl w:val="7FC87F90"/>
@@ -49356,7 +49825,7 @@
       </w:pPr>
     </w:lvl>
   </w:abstractNum>
-  <w:abstractNum w:abstractNumId="95" w15:restartNumberingAfterBreak="0">
+  <w:abstractNum w:abstractNumId="96" w15:restartNumberingAfterBreak="0">
     <w:nsid w:val="44066B20"/>
     <w:multiLevelType w:val="multilevel"/>
     <w:tmpl w:val="EA765396"/>
@@ -49469,7 +49938,7 @@
       </w:pPr>
     </w:lvl>
   </w:abstractNum>
-  <w:abstractNum w:abstractNumId="96" w15:restartNumberingAfterBreak="0">
+  <w:abstractNum w:abstractNumId="97" w15:restartNumberingAfterBreak="0">
     <w:nsid w:val="44983E34"/>
     <w:multiLevelType w:val="multilevel"/>
     <w:tmpl w:val="335A6FE2"/>
@@ -49582,7 +50051,7 @@
       </w:pPr>
     </w:lvl>
   </w:abstractNum>
-  <w:abstractNum w:abstractNumId="97" w15:restartNumberingAfterBreak="0">
+  <w:abstractNum w:abstractNumId="98" w15:restartNumberingAfterBreak="0">
     <w:nsid w:val="44B471DD"/>
     <w:multiLevelType w:val="multilevel"/>
     <w:tmpl w:val="07521FF2"/>
@@ -49695,7 +50164,7 @@
       </w:pPr>
     </w:lvl>
   </w:abstractNum>
-  <w:abstractNum w:abstractNumId="98" w15:restartNumberingAfterBreak="0">
+  <w:abstractNum w:abstractNumId="99" w15:restartNumberingAfterBreak="0">
     <w:nsid w:val="464A4875"/>
     <w:multiLevelType w:val="multilevel"/>
     <w:tmpl w:val="01464750"/>
@@ -49812,7 +50281,7 @@
       </w:pPr>
     </w:lvl>
   </w:abstractNum>
-  <w:abstractNum w:abstractNumId="99" w15:restartNumberingAfterBreak="0">
+  <w:abstractNum w:abstractNumId="100" w15:restartNumberingAfterBreak="0">
     <w:nsid w:val="46E45680"/>
     <w:multiLevelType w:val="multilevel"/>
     <w:tmpl w:val="4B9C2C7A"/>
@@ -49925,7 +50394,7 @@
       </w:pPr>
     </w:lvl>
   </w:abstractNum>
-  <w:abstractNum w:abstractNumId="100" w15:restartNumberingAfterBreak="0">
+  <w:abstractNum w:abstractNumId="101" w15:restartNumberingAfterBreak="0">
     <w:nsid w:val="47E72DF4"/>
     <w:multiLevelType w:val="multilevel"/>
     <w:tmpl w:val="513E270E"/>
@@ -50038,7 +50507,7 @@
       </w:pPr>
     </w:lvl>
   </w:abstractNum>
-  <w:abstractNum w:abstractNumId="101" w15:restartNumberingAfterBreak="0">
+  <w:abstractNum w:abstractNumId="102" w15:restartNumberingAfterBreak="0">
     <w:nsid w:val="48104DC2"/>
     <w:multiLevelType w:val="multilevel"/>
     <w:tmpl w:val="851CF8A4"/>
@@ -50155,7 +50624,7 @@
       </w:pPr>
     </w:lvl>
   </w:abstractNum>
-  <w:abstractNum w:abstractNumId="102" w15:restartNumberingAfterBreak="0">
+  <w:abstractNum w:abstractNumId="103" w15:restartNumberingAfterBreak="0">
     <w:nsid w:val="48A1167E"/>
     <w:multiLevelType w:val="multilevel"/>
     <w:tmpl w:val="3C501384"/>
@@ -50268,7 +50737,7 @@
       </w:pPr>
     </w:lvl>
   </w:abstractNum>
-  <w:abstractNum w:abstractNumId="103" w15:restartNumberingAfterBreak="0">
+  <w:abstractNum w:abstractNumId="104" w15:restartNumberingAfterBreak="0">
     <w:nsid w:val="491275A2"/>
     <w:multiLevelType w:val="multilevel"/>
     <w:tmpl w:val="2EDACE96"/>
@@ -50385,7 +50854,7 @@
       </w:pPr>
     </w:lvl>
   </w:abstractNum>
-  <w:abstractNum w:abstractNumId="104" w15:restartNumberingAfterBreak="0">
+  <w:abstractNum w:abstractNumId="105" w15:restartNumberingAfterBreak="0">
     <w:nsid w:val="49DA708D"/>
     <w:multiLevelType w:val="multilevel"/>
     <w:tmpl w:val="462A0D68"/>
@@ -50498,7 +50967,7 @@
       </w:pPr>
     </w:lvl>
   </w:abstractNum>
-  <w:abstractNum w:abstractNumId="105" w15:restartNumberingAfterBreak="0">
+  <w:abstractNum w:abstractNumId="106" w15:restartNumberingAfterBreak="0">
     <w:nsid w:val="4A48617C"/>
     <w:multiLevelType w:val="multilevel"/>
     <w:tmpl w:val="1ACE9B2E"/>
@@ -50611,7 +51080,7 @@
       </w:pPr>
     </w:lvl>
   </w:abstractNum>
-  <w:abstractNum w:abstractNumId="106" w15:restartNumberingAfterBreak="0">
+  <w:abstractNum w:abstractNumId="107" w15:restartNumberingAfterBreak="0">
     <w:nsid w:val="4AA27CA7"/>
     <w:multiLevelType w:val="multilevel"/>
     <w:tmpl w:val="C242D0AA"/>
@@ -50724,7 +51193,7 @@
       </w:pPr>
     </w:lvl>
   </w:abstractNum>
-  <w:abstractNum w:abstractNumId="107" w15:restartNumberingAfterBreak="0">
+  <w:abstractNum w:abstractNumId="108" w15:restartNumberingAfterBreak="0">
     <w:nsid w:val="4AEE4188"/>
     <w:multiLevelType w:val="multilevel"/>
     <w:tmpl w:val="8D78BEC4"/>
@@ -50873,7 +51342,7 @@
       </w:rPr>
     </w:lvl>
   </w:abstractNum>
-  <w:abstractNum w:abstractNumId="108" w15:restartNumberingAfterBreak="0">
+  <w:abstractNum w:abstractNumId="109" w15:restartNumberingAfterBreak="0">
     <w:nsid w:val="4B3D33B4"/>
     <w:multiLevelType w:val="multilevel"/>
     <w:tmpl w:val="67B615FC"/>
@@ -50990,7 +51459,7 @@
       </w:pPr>
     </w:lvl>
   </w:abstractNum>
-  <w:abstractNum w:abstractNumId="109" w15:restartNumberingAfterBreak="0">
+  <w:abstractNum w:abstractNumId="110" w15:restartNumberingAfterBreak="0">
     <w:nsid w:val="4B985712"/>
     <w:multiLevelType w:val="multilevel"/>
     <w:tmpl w:val="0780201E"/>
@@ -51139,7 +51608,7 @@
       </w:rPr>
     </w:lvl>
   </w:abstractNum>
-  <w:abstractNum w:abstractNumId="110" w15:restartNumberingAfterBreak="0">
+  <w:abstractNum w:abstractNumId="111" w15:restartNumberingAfterBreak="0">
     <w:nsid w:val="4BCC16FF"/>
     <w:multiLevelType w:val="multilevel"/>
     <w:tmpl w:val="AF34FA2A"/>
@@ -51288,7 +51757,7 @@
       </w:rPr>
     </w:lvl>
   </w:abstractNum>
-  <w:abstractNum w:abstractNumId="111" w15:restartNumberingAfterBreak="0">
+  <w:abstractNum w:abstractNumId="112" w15:restartNumberingAfterBreak="0">
     <w:nsid w:val="4C3B3EF0"/>
     <w:multiLevelType w:val="multilevel"/>
     <w:tmpl w:val="746CDCD4"/>
@@ -51401,7 +51870,7 @@
       </w:pPr>
     </w:lvl>
   </w:abstractNum>
-  <w:abstractNum w:abstractNumId="112" w15:restartNumberingAfterBreak="0">
+  <w:abstractNum w:abstractNumId="113" w15:restartNumberingAfterBreak="0">
     <w:nsid w:val="4C952815"/>
     <w:multiLevelType w:val="multilevel"/>
     <w:tmpl w:val="DE20F42C"/>
@@ -51518,7 +51987,7 @@
       </w:pPr>
     </w:lvl>
   </w:abstractNum>
-  <w:abstractNum w:abstractNumId="113" w15:restartNumberingAfterBreak="0">
+  <w:abstractNum w:abstractNumId="114" w15:restartNumberingAfterBreak="0">
     <w:nsid w:val="4CC26436"/>
     <w:multiLevelType w:val="multilevel"/>
     <w:tmpl w:val="6EB8FA40"/>
@@ -51631,7 +52100,7 @@
       </w:pPr>
     </w:lvl>
   </w:abstractNum>
-  <w:abstractNum w:abstractNumId="114" w15:restartNumberingAfterBreak="0">
+  <w:abstractNum w:abstractNumId="115" w15:restartNumberingAfterBreak="0">
     <w:nsid w:val="4D032D4A"/>
     <w:multiLevelType w:val="multilevel"/>
     <w:tmpl w:val="63BC9612"/>
@@ -51744,7 +52213,7 @@
       </w:pPr>
     </w:lvl>
   </w:abstractNum>
-  <w:abstractNum w:abstractNumId="115" w15:restartNumberingAfterBreak="0">
+  <w:abstractNum w:abstractNumId="116" w15:restartNumberingAfterBreak="0">
     <w:nsid w:val="4DB44AF0"/>
     <w:multiLevelType w:val="multilevel"/>
     <w:tmpl w:val="58DA2EE2"/>
@@ -51857,7 +52326,7 @@
       </w:pPr>
     </w:lvl>
   </w:abstractNum>
-  <w:abstractNum w:abstractNumId="116" w15:restartNumberingAfterBreak="0">
+  <w:abstractNum w:abstractNumId="117" w15:restartNumberingAfterBreak="0">
     <w:nsid w:val="4DF86B1F"/>
     <w:multiLevelType w:val="multilevel"/>
     <w:tmpl w:val="A482ABCE"/>
@@ -52006,7 +52475,7 @@
       </w:rPr>
     </w:lvl>
   </w:abstractNum>
-  <w:abstractNum w:abstractNumId="117" w15:restartNumberingAfterBreak="0">
+  <w:abstractNum w:abstractNumId="118" w15:restartNumberingAfterBreak="0">
     <w:nsid w:val="4E2B7FEA"/>
     <w:multiLevelType w:val="multilevel"/>
     <w:tmpl w:val="04FA4720"/>
@@ -52119,7 +52588,7 @@
       </w:pPr>
     </w:lvl>
   </w:abstractNum>
-  <w:abstractNum w:abstractNumId="118" w15:restartNumberingAfterBreak="0">
+  <w:abstractNum w:abstractNumId="119" w15:restartNumberingAfterBreak="0">
     <w:nsid w:val="4E4454FC"/>
     <w:multiLevelType w:val="multilevel"/>
     <w:tmpl w:val="35F21314"/>
@@ -52232,7 +52701,7 @@
       </w:pPr>
     </w:lvl>
   </w:abstractNum>
-  <w:abstractNum w:abstractNumId="119" w15:restartNumberingAfterBreak="0">
+  <w:abstractNum w:abstractNumId="120" w15:restartNumberingAfterBreak="0">
     <w:nsid w:val="4E7771A5"/>
     <w:multiLevelType w:val="multilevel"/>
     <w:tmpl w:val="0E4CC61E"/>
@@ -52381,7 +52850,7 @@
       </w:rPr>
     </w:lvl>
   </w:abstractNum>
-  <w:abstractNum w:abstractNumId="120" w15:restartNumberingAfterBreak="0">
+  <w:abstractNum w:abstractNumId="121" w15:restartNumberingAfterBreak="0">
     <w:nsid w:val="4E956A86"/>
     <w:multiLevelType w:val="multilevel"/>
     <w:tmpl w:val="EE82B4D6"/>
@@ -52494,7 +52963,7 @@
       </w:pPr>
     </w:lvl>
   </w:abstractNum>
-  <w:abstractNum w:abstractNumId="121" w15:restartNumberingAfterBreak="0">
+  <w:abstractNum w:abstractNumId="122" w15:restartNumberingAfterBreak="0">
     <w:nsid w:val="4F332B07"/>
     <w:multiLevelType w:val="multilevel"/>
     <w:tmpl w:val="D8469A06"/>
@@ -52611,7 +53080,7 @@
       </w:pPr>
     </w:lvl>
   </w:abstractNum>
-  <w:abstractNum w:abstractNumId="122" w15:restartNumberingAfterBreak="0">
+  <w:abstractNum w:abstractNumId="123" w15:restartNumberingAfterBreak="0">
     <w:nsid w:val="507157BC"/>
     <w:multiLevelType w:val="multilevel"/>
     <w:tmpl w:val="0BC624E8"/>
@@ -52724,7 +53193,7 @@
       </w:pPr>
     </w:lvl>
   </w:abstractNum>
-  <w:abstractNum w:abstractNumId="123" w15:restartNumberingAfterBreak="0">
+  <w:abstractNum w:abstractNumId="124" w15:restartNumberingAfterBreak="0">
     <w:nsid w:val="533E35AF"/>
     <w:multiLevelType w:val="multilevel"/>
     <w:tmpl w:val="837EDF0E"/>
@@ -52841,7 +53310,7 @@
       </w:pPr>
     </w:lvl>
   </w:abstractNum>
-  <w:abstractNum w:abstractNumId="124" w15:restartNumberingAfterBreak="0">
+  <w:abstractNum w:abstractNumId="125" w15:restartNumberingAfterBreak="0">
     <w:nsid w:val="534F4431"/>
     <w:multiLevelType w:val="multilevel"/>
     <w:tmpl w:val="BF7CAB86"/>
@@ -52990,7 +53459,7 @@
       </w:rPr>
     </w:lvl>
   </w:abstractNum>
-  <w:abstractNum w:abstractNumId="125" w15:restartNumberingAfterBreak="0">
+  <w:abstractNum w:abstractNumId="126" w15:restartNumberingAfterBreak="0">
     <w:nsid w:val="536759AD"/>
     <w:multiLevelType w:val="multilevel"/>
     <w:tmpl w:val="F1F00B3C"/>
@@ -53107,7 +53576,7 @@
       </w:pPr>
     </w:lvl>
   </w:abstractNum>
-  <w:abstractNum w:abstractNumId="126" w15:restartNumberingAfterBreak="0">
+  <w:abstractNum w:abstractNumId="127" w15:restartNumberingAfterBreak="0">
     <w:nsid w:val="53AC4292"/>
     <w:multiLevelType w:val="hybridMultilevel"/>
     <w:tmpl w:val="4F0CEF54"/>
@@ -53196,7 +53665,7 @@
       </w:pPr>
     </w:lvl>
   </w:abstractNum>
-  <w:abstractNum w:abstractNumId="127" w15:restartNumberingAfterBreak="0">
+  <w:abstractNum w:abstractNumId="128" w15:restartNumberingAfterBreak="0">
     <w:nsid w:val="54354DDE"/>
     <w:multiLevelType w:val="multilevel"/>
     <w:tmpl w:val="12246854"/>
@@ -53345,7 +53814,7 @@
       </w:rPr>
     </w:lvl>
   </w:abstractNum>
-  <w:abstractNum w:abstractNumId="128" w15:restartNumberingAfterBreak="0">
+  <w:abstractNum w:abstractNumId="129" w15:restartNumberingAfterBreak="0">
     <w:nsid w:val="548B3142"/>
     <w:multiLevelType w:val="multilevel"/>
     <w:tmpl w:val="CDF85F84"/>
@@ -53494,7 +53963,7 @@
       </w:rPr>
     </w:lvl>
   </w:abstractNum>
-  <w:abstractNum w:abstractNumId="129" w15:restartNumberingAfterBreak="0">
+  <w:abstractNum w:abstractNumId="130" w15:restartNumberingAfterBreak="0">
     <w:nsid w:val="54DB296D"/>
     <w:multiLevelType w:val="multilevel"/>
     <w:tmpl w:val="E66EA43A"/>
@@ -53611,7 +54080,7 @@
       </w:pPr>
     </w:lvl>
   </w:abstractNum>
-  <w:abstractNum w:abstractNumId="130" w15:restartNumberingAfterBreak="0">
+  <w:abstractNum w:abstractNumId="131" w15:restartNumberingAfterBreak="0">
     <w:nsid w:val="550C03CE"/>
     <w:multiLevelType w:val="multilevel"/>
     <w:tmpl w:val="37A076FA"/>
@@ -53724,7 +54193,7 @@
       </w:pPr>
     </w:lvl>
   </w:abstractNum>
-  <w:abstractNum w:abstractNumId="131" w15:restartNumberingAfterBreak="0">
+  <w:abstractNum w:abstractNumId="132" w15:restartNumberingAfterBreak="0">
     <w:nsid w:val="554E68E3"/>
     <w:multiLevelType w:val="multilevel"/>
     <w:tmpl w:val="389630B4"/>
@@ -53837,7 +54306,7 @@
       </w:pPr>
     </w:lvl>
   </w:abstractNum>
-  <w:abstractNum w:abstractNumId="132" w15:restartNumberingAfterBreak="0">
+  <w:abstractNum w:abstractNumId="133" w15:restartNumberingAfterBreak="0">
     <w:nsid w:val="556D0E6B"/>
     <w:multiLevelType w:val="multilevel"/>
     <w:tmpl w:val="A7A015D4"/>
@@ -53954,7 +54423,7 @@
       </w:pPr>
     </w:lvl>
   </w:abstractNum>
-  <w:abstractNum w:abstractNumId="133" w15:restartNumberingAfterBreak="0">
+  <w:abstractNum w:abstractNumId="134" w15:restartNumberingAfterBreak="0">
     <w:nsid w:val="55766A99"/>
     <w:multiLevelType w:val="multilevel"/>
     <w:tmpl w:val="61D0CBF0"/>
@@ -54067,7 +54536,7 @@
       </w:pPr>
     </w:lvl>
   </w:abstractNum>
-  <w:abstractNum w:abstractNumId="134" w15:restartNumberingAfterBreak="0">
+  <w:abstractNum w:abstractNumId="135" w15:restartNumberingAfterBreak="0">
     <w:nsid w:val="558E78DE"/>
     <w:multiLevelType w:val="multilevel"/>
     <w:tmpl w:val="530C880C"/>
@@ -54180,7 +54649,7 @@
       </w:pPr>
     </w:lvl>
   </w:abstractNum>
-  <w:abstractNum w:abstractNumId="135" w15:restartNumberingAfterBreak="0">
+  <w:abstractNum w:abstractNumId="136" w15:restartNumberingAfterBreak="0">
     <w:nsid w:val="5680284F"/>
     <w:multiLevelType w:val="multilevel"/>
     <w:tmpl w:val="37E6FF24"/>
@@ -54293,7 +54762,7 @@
       </w:pPr>
     </w:lvl>
   </w:abstractNum>
-  <w:abstractNum w:abstractNumId="136" w15:restartNumberingAfterBreak="0">
+  <w:abstractNum w:abstractNumId="137" w15:restartNumberingAfterBreak="0">
     <w:nsid w:val="570B1384"/>
     <w:multiLevelType w:val="multilevel"/>
     <w:tmpl w:val="A03C9384"/>
@@ -54442,7 +54911,7 @@
       </w:rPr>
     </w:lvl>
   </w:abstractNum>
-  <w:abstractNum w:abstractNumId="137" w15:restartNumberingAfterBreak="0">
+  <w:abstractNum w:abstractNumId="138" w15:restartNumberingAfterBreak="0">
     <w:nsid w:val="575232BF"/>
     <w:multiLevelType w:val="multilevel"/>
     <w:tmpl w:val="F376B0FA"/>
@@ -54555,7 +55024,7 @@
       </w:pPr>
     </w:lvl>
   </w:abstractNum>
-  <w:abstractNum w:abstractNumId="138" w15:restartNumberingAfterBreak="0">
+  <w:abstractNum w:abstractNumId="139" w15:restartNumberingAfterBreak="0">
     <w:nsid w:val="57BC0BBA"/>
     <w:multiLevelType w:val="multilevel"/>
     <w:tmpl w:val="1AB2A202"/>
@@ -54668,7 +55137,7 @@
       </w:pPr>
     </w:lvl>
   </w:abstractNum>
-  <w:abstractNum w:abstractNumId="139" w15:restartNumberingAfterBreak="0">
+  <w:abstractNum w:abstractNumId="140" w15:restartNumberingAfterBreak="0">
     <w:nsid w:val="581A1A4E"/>
     <w:multiLevelType w:val="multilevel"/>
     <w:tmpl w:val="AB20A01E"/>
@@ -54817,7 +55286,7 @@
       </w:rPr>
     </w:lvl>
   </w:abstractNum>
-  <w:abstractNum w:abstractNumId="140" w15:restartNumberingAfterBreak="0">
+  <w:abstractNum w:abstractNumId="141" w15:restartNumberingAfterBreak="0">
     <w:nsid w:val="59B36D59"/>
     <w:multiLevelType w:val="multilevel"/>
     <w:tmpl w:val="61465210"/>
@@ -54934,7 +55403,7 @@
       </w:pPr>
     </w:lvl>
   </w:abstractNum>
-  <w:abstractNum w:abstractNumId="141" w15:restartNumberingAfterBreak="0">
+  <w:abstractNum w:abstractNumId="142" w15:restartNumberingAfterBreak="0">
     <w:nsid w:val="5B1C198D"/>
     <w:multiLevelType w:val="multilevel"/>
     <w:tmpl w:val="EC10DAE8"/>
@@ -55047,7 +55516,7 @@
       </w:pPr>
     </w:lvl>
   </w:abstractNum>
-  <w:abstractNum w:abstractNumId="142" w15:restartNumberingAfterBreak="0">
+  <w:abstractNum w:abstractNumId="143" w15:restartNumberingAfterBreak="0">
     <w:nsid w:val="5BE11CD3"/>
     <w:multiLevelType w:val="multilevel"/>
     <w:tmpl w:val="E8CECECC"/>
@@ -55160,7 +55629,7 @@
       </w:pPr>
     </w:lvl>
   </w:abstractNum>
-  <w:abstractNum w:abstractNumId="143" w15:restartNumberingAfterBreak="0">
+  <w:abstractNum w:abstractNumId="144" w15:restartNumberingAfterBreak="0">
     <w:nsid w:val="5C4C1E34"/>
     <w:multiLevelType w:val="multilevel"/>
     <w:tmpl w:val="DD6C2480"/>
@@ -55309,7 +55778,7 @@
       </w:rPr>
     </w:lvl>
   </w:abstractNum>
-  <w:abstractNum w:abstractNumId="144" w15:restartNumberingAfterBreak="0">
+  <w:abstractNum w:abstractNumId="145" w15:restartNumberingAfterBreak="0">
     <w:nsid w:val="5D4978B1"/>
     <w:multiLevelType w:val="multilevel"/>
     <w:tmpl w:val="E8B04226"/>
@@ -55458,7 +55927,7 @@
       </w:rPr>
     </w:lvl>
   </w:abstractNum>
-  <w:abstractNum w:abstractNumId="145" w15:restartNumberingAfterBreak="0">
+  <w:abstractNum w:abstractNumId="146" w15:restartNumberingAfterBreak="0">
     <w:nsid w:val="5DD57DEB"/>
     <w:multiLevelType w:val="multilevel"/>
     <w:tmpl w:val="06FE81CA"/>
@@ -55571,7 +56040,7 @@
       </w:pPr>
     </w:lvl>
   </w:abstractNum>
-  <w:abstractNum w:abstractNumId="146" w15:restartNumberingAfterBreak="0">
+  <w:abstractNum w:abstractNumId="147" w15:restartNumberingAfterBreak="0">
     <w:nsid w:val="5E65244F"/>
     <w:multiLevelType w:val="multilevel"/>
     <w:tmpl w:val="561019E4"/>
@@ -55688,7 +56157,7 @@
       </w:pPr>
     </w:lvl>
   </w:abstractNum>
-  <w:abstractNum w:abstractNumId="147" w15:restartNumberingAfterBreak="0">
+  <w:abstractNum w:abstractNumId="148" w15:restartNumberingAfterBreak="0">
     <w:nsid w:val="5EA230AE"/>
     <w:multiLevelType w:val="multilevel"/>
     <w:tmpl w:val="A49ECC58"/>
@@ -55805,7 +56274,7 @@
       </w:pPr>
     </w:lvl>
   </w:abstractNum>
-  <w:abstractNum w:abstractNumId="148" w15:restartNumberingAfterBreak="0">
+  <w:abstractNum w:abstractNumId="149" w15:restartNumberingAfterBreak="0">
     <w:nsid w:val="5F115971"/>
     <w:multiLevelType w:val="multilevel"/>
     <w:tmpl w:val="16760B04"/>
@@ -55954,7 +56423,7 @@
       </w:rPr>
     </w:lvl>
   </w:abstractNum>
-  <w:abstractNum w:abstractNumId="149" w15:restartNumberingAfterBreak="0">
+  <w:abstractNum w:abstractNumId="150" w15:restartNumberingAfterBreak="0">
     <w:nsid w:val="5F7B36A5"/>
     <w:multiLevelType w:val="multilevel"/>
     <w:tmpl w:val="097AD57E"/>
@@ -56103,7 +56572,7 @@
       </w:rPr>
     </w:lvl>
   </w:abstractNum>
-  <w:abstractNum w:abstractNumId="150" w15:restartNumberingAfterBreak="0">
+  <w:abstractNum w:abstractNumId="151" w15:restartNumberingAfterBreak="0">
     <w:nsid w:val="60892418"/>
     <w:multiLevelType w:val="multilevel"/>
     <w:tmpl w:val="B26C8FD4"/>
@@ -56216,7 +56685,7 @@
       </w:pPr>
     </w:lvl>
   </w:abstractNum>
-  <w:abstractNum w:abstractNumId="151" w15:restartNumberingAfterBreak="0">
+  <w:abstractNum w:abstractNumId="152" w15:restartNumberingAfterBreak="0">
     <w:nsid w:val="608B6E2E"/>
     <w:multiLevelType w:val="multilevel"/>
     <w:tmpl w:val="4EDCD094"/>
@@ -56365,7 +56834,7 @@
       </w:rPr>
     </w:lvl>
   </w:abstractNum>
-  <w:abstractNum w:abstractNumId="152" w15:restartNumberingAfterBreak="0">
+  <w:abstractNum w:abstractNumId="153" w15:restartNumberingAfterBreak="0">
     <w:nsid w:val="62B332AE"/>
     <w:multiLevelType w:val="multilevel"/>
     <w:tmpl w:val="FDFEB8B4"/>
@@ -56514,7 +56983,7 @@
       </w:rPr>
     </w:lvl>
   </w:abstractNum>
-  <w:abstractNum w:abstractNumId="153" w15:restartNumberingAfterBreak="0">
+  <w:abstractNum w:abstractNumId="154" w15:restartNumberingAfterBreak="0">
     <w:nsid w:val="62D2677D"/>
     <w:multiLevelType w:val="multilevel"/>
     <w:tmpl w:val="FAA07F2C"/>
@@ -56631,7 +57100,7 @@
       </w:pPr>
     </w:lvl>
   </w:abstractNum>
-  <w:abstractNum w:abstractNumId="154" w15:restartNumberingAfterBreak="0">
+  <w:abstractNum w:abstractNumId="155" w15:restartNumberingAfterBreak="0">
     <w:nsid w:val="63186CEA"/>
     <w:multiLevelType w:val="multilevel"/>
     <w:tmpl w:val="4180175A"/>
@@ -56748,7 +57217,7 @@
       </w:pPr>
     </w:lvl>
   </w:abstractNum>
-  <w:abstractNum w:abstractNumId="155" w15:restartNumberingAfterBreak="0">
+  <w:abstractNum w:abstractNumId="156" w15:restartNumberingAfterBreak="0">
     <w:nsid w:val="63CD6B31"/>
     <w:multiLevelType w:val="multilevel"/>
     <w:tmpl w:val="1C400508"/>
@@ -56861,7 +57330,7 @@
       </w:pPr>
     </w:lvl>
   </w:abstractNum>
-  <w:abstractNum w:abstractNumId="156" w15:restartNumberingAfterBreak="0">
+  <w:abstractNum w:abstractNumId="157" w15:restartNumberingAfterBreak="0">
     <w:nsid w:val="648E7032"/>
     <w:multiLevelType w:val="multilevel"/>
     <w:tmpl w:val="FC62E00A"/>
@@ -57010,7 +57479,156 @@
       </w:rPr>
     </w:lvl>
   </w:abstractNum>
-  <w:abstractNum w:abstractNumId="157" w15:restartNumberingAfterBreak="0">
+  <w:abstractNum w:abstractNumId="158" w15:restartNumberingAfterBreak="0">
+    <w:nsid w:val="64BC39EB"/>
+    <w:multiLevelType w:val="multilevel"/>
+    <w:tmpl w:val="425C4B32"/>
+    <w:lvl w:ilvl="0">
+      <w:start w:val="1"/>
+      <w:numFmt w:val="bullet"/>
+      <w:lvlText w:val=""/>
+      <w:lvlJc w:val="left"/>
+      <w:pPr>
+        <w:tabs>
+          <w:tab w:val="num" w:pos="720"/>
+        </w:tabs>
+        <w:ind w:left="720" w:hanging="360"/>
+      </w:pPr>
+      <w:rPr>
+        <w:rFonts w:ascii="Symbol" w:hAnsi="Symbol" w:hint="default"/>
+        <w:sz w:val="20"/>
+      </w:rPr>
+    </w:lvl>
+    <w:lvl w:ilvl="1" w:tentative="1">
+      <w:start w:val="1"/>
+      <w:numFmt w:val="bullet"/>
+      <w:lvlText w:val=""/>
+      <w:lvlJc w:val="left"/>
+      <w:pPr>
+        <w:tabs>
+          <w:tab w:val="num" w:pos="1440"/>
+        </w:tabs>
+        <w:ind w:left="1440" w:hanging="360"/>
+      </w:pPr>
+      <w:rPr>
+        <w:rFonts w:ascii="Symbol" w:hAnsi="Symbol" w:hint="default"/>
+        <w:sz w:val="20"/>
+      </w:rPr>
+    </w:lvl>
+    <w:lvl w:ilvl="2" w:tentative="1">
+      <w:start w:val="1"/>
+      <w:numFmt w:val="bullet"/>
+      <w:lvlText w:val=""/>
+      <w:lvlJc w:val="left"/>
+      <w:pPr>
+        <w:tabs>
+          <w:tab w:val="num" w:pos="2160"/>
+        </w:tabs>
+        <w:ind w:left="2160" w:hanging="360"/>
+      </w:pPr>
+      <w:rPr>
+        <w:rFonts w:ascii="Symbol" w:hAnsi="Symbol" w:hint="default"/>
+        <w:sz w:val="20"/>
+      </w:rPr>
+    </w:lvl>
+    <w:lvl w:ilvl="3" w:tentative="1">
+      <w:start w:val="1"/>
+      <w:numFmt w:val="bullet"/>
+      <w:lvlText w:val=""/>
+      <w:lvlJc w:val="left"/>
+      <w:pPr>
+        <w:tabs>
+          <w:tab w:val="num" w:pos="2880"/>
+        </w:tabs>
+        <w:ind w:left="2880" w:hanging="360"/>
+      </w:pPr>
+      <w:rPr>
+        <w:rFonts w:ascii="Symbol" w:hAnsi="Symbol" w:hint="default"/>
+        <w:sz w:val="20"/>
+      </w:rPr>
+    </w:lvl>
+    <w:lvl w:ilvl="4" w:tentative="1">
+      <w:start w:val="1"/>
+      <w:numFmt w:val="bullet"/>
+      <w:lvlText w:val=""/>
+      <w:lvlJc w:val="left"/>
+      <w:pPr>
+        <w:tabs>
+          <w:tab w:val="num" w:pos="3600"/>
+        </w:tabs>
+        <w:ind w:left="3600" w:hanging="360"/>
+      </w:pPr>
+      <w:rPr>
+        <w:rFonts w:ascii="Symbol" w:hAnsi="Symbol" w:hint="default"/>
+        <w:sz w:val="20"/>
+      </w:rPr>
+    </w:lvl>
+    <w:lvl w:ilvl="5" w:tentative="1">
+      <w:start w:val="1"/>
+      <w:numFmt w:val="bullet"/>
+      <w:lvlText w:val=""/>
+      <w:lvlJc w:val="left"/>
+      <w:pPr>
+        <w:tabs>
+          <w:tab w:val="num" w:pos="4320"/>
+        </w:tabs>
+        <w:ind w:left="4320" w:hanging="360"/>
+      </w:pPr>
+      <w:rPr>
+        <w:rFonts w:ascii="Symbol" w:hAnsi="Symbol" w:hint="default"/>
+        <w:sz w:val="20"/>
+      </w:rPr>
+    </w:lvl>
+    <w:lvl w:ilvl="6" w:tentative="1">
+      <w:start w:val="1"/>
+      <w:numFmt w:val="bullet"/>
+      <w:lvlText w:val=""/>
+      <w:lvlJc w:val="left"/>
+      <w:pPr>
+        <w:tabs>
+          <w:tab w:val="num" w:pos="5040"/>
+        </w:tabs>
+        <w:ind w:left="5040" w:hanging="360"/>
+      </w:pPr>
+      <w:rPr>
+        <w:rFonts w:ascii="Symbol" w:hAnsi="Symbol" w:hint="default"/>
+        <w:sz w:val="20"/>
+      </w:rPr>
+    </w:lvl>
+    <w:lvl w:ilvl="7" w:tentative="1">
+      <w:start w:val="1"/>
+      <w:numFmt w:val="bullet"/>
+      <w:lvlText w:val=""/>
+      <w:lvlJc w:val="left"/>
+      <w:pPr>
+        <w:tabs>
+          <w:tab w:val="num" w:pos="5760"/>
+        </w:tabs>
+        <w:ind w:left="5760" w:hanging="360"/>
+      </w:pPr>
+      <w:rPr>
+        <w:rFonts w:ascii="Symbol" w:hAnsi="Symbol" w:hint="default"/>
+        <w:sz w:val="20"/>
+      </w:rPr>
+    </w:lvl>
+    <w:lvl w:ilvl="8" w:tentative="1">
+      <w:start w:val="1"/>
+      <w:numFmt w:val="bullet"/>
+      <w:lvlText w:val=""/>
+      <w:lvlJc w:val="left"/>
+      <w:pPr>
+        <w:tabs>
+          <w:tab w:val="num" w:pos="6480"/>
+        </w:tabs>
+        <w:ind w:left="6480" w:hanging="360"/>
+      </w:pPr>
+      <w:rPr>
+        <w:rFonts w:ascii="Symbol" w:hAnsi="Symbol" w:hint="default"/>
+        <w:sz w:val="20"/>
+      </w:rPr>
+    </w:lvl>
+  </w:abstractNum>
+  <w:abstractNum w:abstractNumId="159" w15:restartNumberingAfterBreak="0">
     <w:nsid w:val="64CE0601"/>
     <w:multiLevelType w:val="multilevel"/>
     <w:tmpl w:val="EB66259A"/>
@@ -57127,7 +57745,7 @@
       </w:pPr>
     </w:lvl>
   </w:abstractNum>
-  <w:abstractNum w:abstractNumId="158" w15:restartNumberingAfterBreak="0">
+  <w:abstractNum w:abstractNumId="160" w15:restartNumberingAfterBreak="0">
     <w:nsid w:val="658F6959"/>
     <w:multiLevelType w:val="multilevel"/>
     <w:tmpl w:val="88F6DB54"/>
@@ -57276,7 +57894,7 @@
       </w:rPr>
     </w:lvl>
   </w:abstractNum>
-  <w:abstractNum w:abstractNumId="159" w15:restartNumberingAfterBreak="0">
+  <w:abstractNum w:abstractNumId="161" w15:restartNumberingAfterBreak="0">
     <w:nsid w:val="660F1065"/>
     <w:multiLevelType w:val="multilevel"/>
     <w:tmpl w:val="47642678"/>
@@ -57389,7 +58007,7 @@
       </w:pPr>
     </w:lvl>
   </w:abstractNum>
-  <w:abstractNum w:abstractNumId="160" w15:restartNumberingAfterBreak="0">
+  <w:abstractNum w:abstractNumId="162" w15:restartNumberingAfterBreak="0">
     <w:nsid w:val="663D7BCC"/>
     <w:multiLevelType w:val="multilevel"/>
     <w:tmpl w:val="34CAB34E"/>
@@ -57502,7 +58120,7 @@
       </w:pPr>
     </w:lvl>
   </w:abstractNum>
-  <w:abstractNum w:abstractNumId="161" w15:restartNumberingAfterBreak="0">
+  <w:abstractNum w:abstractNumId="163" w15:restartNumberingAfterBreak="0">
     <w:nsid w:val="671B48A4"/>
     <w:multiLevelType w:val="multilevel"/>
     <w:tmpl w:val="F250794E"/>
@@ -57619,7 +58237,7 @@
       </w:pPr>
     </w:lvl>
   </w:abstractNum>
-  <w:abstractNum w:abstractNumId="162" w15:restartNumberingAfterBreak="0">
+  <w:abstractNum w:abstractNumId="164" w15:restartNumberingAfterBreak="0">
     <w:nsid w:val="681D785E"/>
     <w:multiLevelType w:val="multilevel"/>
     <w:tmpl w:val="E3FAAD48"/>
@@ -57732,7 +58350,7 @@
       </w:pPr>
     </w:lvl>
   </w:abstractNum>
-  <w:abstractNum w:abstractNumId="163" w15:restartNumberingAfterBreak="0">
+  <w:abstractNum w:abstractNumId="165" w15:restartNumberingAfterBreak="0">
     <w:nsid w:val="68F0090B"/>
     <w:multiLevelType w:val="multilevel"/>
     <w:tmpl w:val="3F028008"/>
@@ -57881,7 +58499,7 @@
       </w:rPr>
     </w:lvl>
   </w:abstractNum>
-  <w:abstractNum w:abstractNumId="164" w15:restartNumberingAfterBreak="0">
+  <w:abstractNum w:abstractNumId="166" w15:restartNumberingAfterBreak="0">
     <w:nsid w:val="695D6A99"/>
     <w:multiLevelType w:val="multilevel"/>
     <w:tmpl w:val="659A40B6"/>
@@ -57998,7 +58616,7 @@
       </w:pPr>
     </w:lvl>
   </w:abstractNum>
-  <w:abstractNum w:abstractNumId="165" w15:restartNumberingAfterBreak="0">
+  <w:abstractNum w:abstractNumId="167" w15:restartNumberingAfterBreak="0">
     <w:nsid w:val="69786AC2"/>
     <w:multiLevelType w:val="multilevel"/>
     <w:tmpl w:val="AF70F76E"/>
@@ -58111,7 +58729,7 @@
       </w:pPr>
     </w:lvl>
   </w:abstractNum>
-  <w:abstractNum w:abstractNumId="166" w15:restartNumberingAfterBreak="0">
+  <w:abstractNum w:abstractNumId="168" w15:restartNumberingAfterBreak="0">
     <w:nsid w:val="69A35405"/>
     <w:multiLevelType w:val="multilevel"/>
     <w:tmpl w:val="1924F998"/>
@@ -58228,7 +58846,7 @@
       </w:pPr>
     </w:lvl>
   </w:abstractNum>
-  <w:abstractNum w:abstractNumId="167" w15:restartNumberingAfterBreak="0">
+  <w:abstractNum w:abstractNumId="169" w15:restartNumberingAfterBreak="0">
     <w:nsid w:val="69DD1AF8"/>
     <w:multiLevelType w:val="multilevel"/>
     <w:tmpl w:val="BD5AC04A"/>
@@ -58345,7 +58963,7 @@
       </w:pPr>
     </w:lvl>
   </w:abstractNum>
-  <w:abstractNum w:abstractNumId="168" w15:restartNumberingAfterBreak="0">
+  <w:abstractNum w:abstractNumId="170" w15:restartNumberingAfterBreak="0">
     <w:nsid w:val="6A701DE7"/>
     <w:multiLevelType w:val="multilevel"/>
     <w:tmpl w:val="97D2F714"/>
@@ -58458,7 +59076,7 @@
       </w:pPr>
     </w:lvl>
   </w:abstractNum>
-  <w:abstractNum w:abstractNumId="169" w15:restartNumberingAfterBreak="0">
+  <w:abstractNum w:abstractNumId="171" w15:restartNumberingAfterBreak="0">
     <w:nsid w:val="6C885F83"/>
     <w:multiLevelType w:val="multilevel"/>
     <w:tmpl w:val="E04C4104"/>
@@ -58571,7 +59189,7 @@
       </w:pPr>
     </w:lvl>
   </w:abstractNum>
-  <w:abstractNum w:abstractNumId="170" w15:restartNumberingAfterBreak="0">
+  <w:abstractNum w:abstractNumId="172" w15:restartNumberingAfterBreak="0">
     <w:nsid w:val="6D52424E"/>
     <w:multiLevelType w:val="multilevel"/>
     <w:tmpl w:val="EC089A6C"/>
@@ -58720,7 +59338,7 @@
       </w:rPr>
     </w:lvl>
   </w:abstractNum>
-  <w:abstractNum w:abstractNumId="171" w15:restartNumberingAfterBreak="0">
+  <w:abstractNum w:abstractNumId="173" w15:restartNumberingAfterBreak="0">
     <w:nsid w:val="700C582D"/>
     <w:multiLevelType w:val="multilevel"/>
     <w:tmpl w:val="F1E6B3F6"/>
@@ -58837,7 +59455,7 @@
       </w:pPr>
     </w:lvl>
   </w:abstractNum>
-  <w:abstractNum w:abstractNumId="172" w15:restartNumberingAfterBreak="0">
+  <w:abstractNum w:abstractNumId="174" w15:restartNumberingAfterBreak="0">
     <w:nsid w:val="71396F90"/>
     <w:multiLevelType w:val="multilevel"/>
     <w:tmpl w:val="49D603BA"/>
@@ -58950,7 +59568,7 @@
       </w:pPr>
     </w:lvl>
   </w:abstractNum>
-  <w:abstractNum w:abstractNumId="173" w15:restartNumberingAfterBreak="0">
+  <w:abstractNum w:abstractNumId="175" w15:restartNumberingAfterBreak="0">
     <w:nsid w:val="714C3769"/>
     <w:multiLevelType w:val="multilevel"/>
     <w:tmpl w:val="0400F236"/>
@@ -59067,7 +59685,7 @@
       </w:pPr>
     </w:lvl>
   </w:abstractNum>
-  <w:abstractNum w:abstractNumId="174" w15:restartNumberingAfterBreak="0">
+  <w:abstractNum w:abstractNumId="176" w15:restartNumberingAfterBreak="0">
     <w:nsid w:val="718A101C"/>
     <w:multiLevelType w:val="multilevel"/>
     <w:tmpl w:val="5CD8517C"/>
@@ -59180,7 +59798,7 @@
       </w:pPr>
     </w:lvl>
   </w:abstractNum>
-  <w:abstractNum w:abstractNumId="175" w15:restartNumberingAfterBreak="0">
+  <w:abstractNum w:abstractNumId="177" w15:restartNumberingAfterBreak="0">
     <w:nsid w:val="71BE59BD"/>
     <w:multiLevelType w:val="multilevel"/>
     <w:tmpl w:val="EEA6D5E4"/>
@@ -59329,7 +59947,120 @@
       </w:rPr>
     </w:lvl>
   </w:abstractNum>
-  <w:abstractNum w:abstractNumId="176" w15:restartNumberingAfterBreak="0">
+  <w:abstractNum w:abstractNumId="178" w15:restartNumberingAfterBreak="0">
+    <w:nsid w:val="723B172E"/>
+    <w:multiLevelType w:val="multilevel"/>
+    <w:tmpl w:val="EABCB996"/>
+    <w:lvl w:ilvl="0">
+      <w:start w:val="1"/>
+      <w:numFmt w:val="decimal"/>
+      <w:lvlText w:val="%1."/>
+      <w:lvlJc w:val="left"/>
+      <w:pPr>
+        <w:tabs>
+          <w:tab w:val="num" w:pos="720"/>
+        </w:tabs>
+        <w:ind w:left="720" w:hanging="360"/>
+      </w:pPr>
+    </w:lvl>
+    <w:lvl w:ilvl="1" w:tentative="1">
+      <w:start w:val="1"/>
+      <w:numFmt w:val="decimal"/>
+      <w:lvlText w:val="%2."/>
+      <w:lvlJc w:val="left"/>
+      <w:pPr>
+        <w:tabs>
+          <w:tab w:val="num" w:pos="1440"/>
+        </w:tabs>
+        <w:ind w:left="1440" w:hanging="360"/>
+      </w:pPr>
+    </w:lvl>
+    <w:lvl w:ilvl="2" w:tentative="1">
+      <w:start w:val="1"/>
+      <w:numFmt w:val="decimal"/>
+      <w:lvlText w:val="%3."/>
+      <w:lvlJc w:val="left"/>
+      <w:pPr>
+        <w:tabs>
+          <w:tab w:val="num" w:pos="2160"/>
+        </w:tabs>
+        <w:ind w:left="2160" w:hanging="360"/>
+      </w:pPr>
+    </w:lvl>
+    <w:lvl w:ilvl="3" w:tentative="1">
+      <w:start w:val="1"/>
+      <w:numFmt w:val="decimal"/>
+      <w:lvlText w:val="%4."/>
+      <w:lvlJc w:val="left"/>
+      <w:pPr>
+        <w:tabs>
+          <w:tab w:val="num" w:pos="2880"/>
+        </w:tabs>
+        <w:ind w:left="2880" w:hanging="360"/>
+      </w:pPr>
+    </w:lvl>
+    <w:lvl w:ilvl="4" w:tentative="1">
+      <w:start w:val="1"/>
+      <w:numFmt w:val="decimal"/>
+      <w:lvlText w:val="%5."/>
+      <w:lvlJc w:val="left"/>
+      <w:pPr>
+        <w:tabs>
+          <w:tab w:val="num" w:pos="3600"/>
+        </w:tabs>
+        <w:ind w:left="3600" w:hanging="360"/>
+      </w:pPr>
+    </w:lvl>
+    <w:lvl w:ilvl="5" w:tentative="1">
+      <w:start w:val="1"/>
+      <w:numFmt w:val="decimal"/>
+      <w:lvlText w:val="%6."/>
+      <w:lvlJc w:val="left"/>
+      <w:pPr>
+        <w:tabs>
+          <w:tab w:val="num" w:pos="4320"/>
+        </w:tabs>
+        <w:ind w:left="4320" w:hanging="360"/>
+      </w:pPr>
+    </w:lvl>
+    <w:lvl w:ilvl="6" w:tentative="1">
+      <w:start w:val="1"/>
+      <w:numFmt w:val="decimal"/>
+      <w:lvlText w:val="%7."/>
+      <w:lvlJc w:val="left"/>
+      <w:pPr>
+        <w:tabs>
+          <w:tab w:val="num" w:pos="5040"/>
+        </w:tabs>
+        <w:ind w:left="5040" w:hanging="360"/>
+      </w:pPr>
+    </w:lvl>
+    <w:lvl w:ilvl="7" w:tentative="1">
+      <w:start w:val="1"/>
+      <w:numFmt w:val="decimal"/>
+      <w:lvlText w:val="%8."/>
+      <w:lvlJc w:val="left"/>
+      <w:pPr>
+        <w:tabs>
+          <w:tab w:val="num" w:pos="5760"/>
+        </w:tabs>
+        <w:ind w:left="5760" w:hanging="360"/>
+      </w:pPr>
+    </w:lvl>
+    <w:lvl w:ilvl="8" w:tentative="1">
+      <w:start w:val="1"/>
+      <w:numFmt w:val="decimal"/>
+      <w:lvlText w:val="%9."/>
+      <w:lvlJc w:val="left"/>
+      <w:pPr>
+        <w:tabs>
+          <w:tab w:val="num" w:pos="6480"/>
+        </w:tabs>
+        <w:ind w:left="6480" w:hanging="360"/>
+      </w:pPr>
+    </w:lvl>
+  </w:abstractNum>
+  <w:abstractNum w:abstractNumId="179" w15:restartNumberingAfterBreak="0">
     <w:nsid w:val="72644679"/>
     <w:multiLevelType w:val="multilevel"/>
     <w:tmpl w:val="8940D022"/>
@@ -59446,7 +60177,7 @@
       </w:pPr>
     </w:lvl>
   </w:abstractNum>
-  <w:abstractNum w:abstractNumId="177" w15:restartNumberingAfterBreak="0">
+  <w:abstractNum w:abstractNumId="180" w15:restartNumberingAfterBreak="0">
     <w:nsid w:val="73420300"/>
     <w:multiLevelType w:val="multilevel"/>
     <w:tmpl w:val="9A482894"/>
@@ -59563,7 +60294,7 @@
       </w:pPr>
     </w:lvl>
   </w:abstractNum>
-  <w:abstractNum w:abstractNumId="178" w15:restartNumberingAfterBreak="0">
+  <w:abstractNum w:abstractNumId="181" w15:restartNumberingAfterBreak="0">
     <w:nsid w:val="737B0DAD"/>
     <w:multiLevelType w:val="multilevel"/>
     <w:tmpl w:val="A67435B0"/>
@@ -59676,7 +60407,7 @@
       </w:pPr>
     </w:lvl>
   </w:abstractNum>
-  <w:abstractNum w:abstractNumId="179" w15:restartNumberingAfterBreak="0">
+  <w:abstractNum w:abstractNumId="182" w15:restartNumberingAfterBreak="0">
     <w:nsid w:val="73AE2955"/>
     <w:multiLevelType w:val="multilevel"/>
     <w:tmpl w:val="DCC05106"/>
@@ -59825,7 +60556,7 @@
       </w:rPr>
     </w:lvl>
   </w:abstractNum>
-  <w:abstractNum w:abstractNumId="180" w15:restartNumberingAfterBreak="0">
+  <w:abstractNum w:abstractNumId="183" w15:restartNumberingAfterBreak="0">
     <w:nsid w:val="74122332"/>
     <w:multiLevelType w:val="multilevel"/>
     <w:tmpl w:val="D7BAA042"/>
@@ -59974,7 +60705,7 @@
       </w:rPr>
     </w:lvl>
   </w:abstractNum>
-  <w:abstractNum w:abstractNumId="181" w15:restartNumberingAfterBreak="0">
+  <w:abstractNum w:abstractNumId="184" w15:restartNumberingAfterBreak="0">
     <w:nsid w:val="74540941"/>
     <w:multiLevelType w:val="multilevel"/>
     <w:tmpl w:val="8CD6733A"/>
@@ -60091,7 +60822,7 @@
       </w:pPr>
     </w:lvl>
   </w:abstractNum>
-  <w:abstractNum w:abstractNumId="182" w15:restartNumberingAfterBreak="0">
+  <w:abstractNum w:abstractNumId="185" w15:restartNumberingAfterBreak="0">
     <w:nsid w:val="7497277D"/>
     <w:multiLevelType w:val="multilevel"/>
     <w:tmpl w:val="30D48552"/>
@@ -60204,7 +60935,7 @@
       </w:pPr>
     </w:lvl>
   </w:abstractNum>
-  <w:abstractNum w:abstractNumId="183" w15:restartNumberingAfterBreak="0">
+  <w:abstractNum w:abstractNumId="186" w15:restartNumberingAfterBreak="0">
     <w:nsid w:val="749E2893"/>
     <w:multiLevelType w:val="multilevel"/>
     <w:tmpl w:val="7794CA12"/>
@@ -60321,7 +61052,7 @@
       </w:pPr>
     </w:lvl>
   </w:abstractNum>
-  <w:abstractNum w:abstractNumId="184" w15:restartNumberingAfterBreak="0">
+  <w:abstractNum w:abstractNumId="187" w15:restartNumberingAfterBreak="0">
     <w:nsid w:val="74FB20C9"/>
     <w:multiLevelType w:val="multilevel"/>
     <w:tmpl w:val="E6FAA2AC"/>
@@ -60434,7 +61165,7 @@
       </w:pPr>
     </w:lvl>
   </w:abstractNum>
-  <w:abstractNum w:abstractNumId="185" w15:restartNumberingAfterBreak="0">
+  <w:abstractNum w:abstractNumId="188" w15:restartNumberingAfterBreak="0">
     <w:nsid w:val="7584213B"/>
     <w:multiLevelType w:val="multilevel"/>
     <w:tmpl w:val="09F8B056"/>
@@ -60583,7 +61314,7 @@
       </w:rPr>
     </w:lvl>
   </w:abstractNum>
-  <w:abstractNum w:abstractNumId="186" w15:restartNumberingAfterBreak="0">
+  <w:abstractNum w:abstractNumId="189" w15:restartNumberingAfterBreak="0">
     <w:nsid w:val="7608668A"/>
     <w:multiLevelType w:val="multilevel"/>
     <w:tmpl w:val="296EE14C"/>
@@ -60732,7 +61463,7 @@
       </w:rPr>
     </w:lvl>
   </w:abstractNum>
-  <w:abstractNum w:abstractNumId="187" w15:restartNumberingAfterBreak="0">
+  <w:abstractNum w:abstractNumId="190" w15:restartNumberingAfterBreak="0">
     <w:nsid w:val="76637E8B"/>
     <w:multiLevelType w:val="multilevel"/>
     <w:tmpl w:val="CCD23BE8"/>
@@ -60881,7 +61612,7 @@
       </w:rPr>
     </w:lvl>
   </w:abstractNum>
-  <w:abstractNum w:abstractNumId="188" w15:restartNumberingAfterBreak="0">
+  <w:abstractNum w:abstractNumId="191" w15:restartNumberingAfterBreak="0">
     <w:nsid w:val="76777F05"/>
     <w:multiLevelType w:val="multilevel"/>
     <w:tmpl w:val="67BABF30"/>
@@ -60994,7 +61725,7 @@
       </w:pPr>
     </w:lvl>
   </w:abstractNum>
-  <w:abstractNum w:abstractNumId="189" w15:restartNumberingAfterBreak="0">
+  <w:abstractNum w:abstractNumId="192" w15:restartNumberingAfterBreak="0">
     <w:nsid w:val="76AE47D3"/>
     <w:multiLevelType w:val="multilevel"/>
     <w:tmpl w:val="5B72B3F0"/>
@@ -61107,7 +61838,7 @@
       </w:pPr>
     </w:lvl>
   </w:abstractNum>
-  <w:abstractNum w:abstractNumId="190" w15:restartNumberingAfterBreak="0">
+  <w:abstractNum w:abstractNumId="193" w15:restartNumberingAfterBreak="0">
     <w:nsid w:val="76E453BA"/>
     <w:multiLevelType w:val="multilevel"/>
     <w:tmpl w:val="79A6522E"/>
@@ -61256,7 +61987,7 @@
       </w:rPr>
     </w:lvl>
   </w:abstractNum>
-  <w:abstractNum w:abstractNumId="191" w15:restartNumberingAfterBreak="0">
+  <w:abstractNum w:abstractNumId="194" w15:restartNumberingAfterBreak="0">
     <w:nsid w:val="77E3193E"/>
     <w:multiLevelType w:val="multilevel"/>
     <w:tmpl w:val="048270E0"/>
@@ -61369,7 +62100,7 @@
       </w:pPr>
     </w:lvl>
   </w:abstractNum>
-  <w:abstractNum w:abstractNumId="192" w15:restartNumberingAfterBreak="0">
+  <w:abstractNum w:abstractNumId="195" w15:restartNumberingAfterBreak="0">
     <w:nsid w:val="7AC767E7"/>
     <w:multiLevelType w:val="multilevel"/>
     <w:tmpl w:val="8EC46F34"/>
@@ -61518,7 +62249,7 @@
       </w:rPr>
     </w:lvl>
   </w:abstractNum>
-  <w:abstractNum w:abstractNumId="193" w15:restartNumberingAfterBreak="0">
+  <w:abstractNum w:abstractNumId="196" w15:restartNumberingAfterBreak="0">
     <w:nsid w:val="7B0A7861"/>
     <w:multiLevelType w:val="multilevel"/>
     <w:tmpl w:val="F5A8C422"/>
@@ -61631,7 +62362,7 @@
       </w:pPr>
     </w:lvl>
   </w:abstractNum>
-  <w:abstractNum w:abstractNumId="194" w15:restartNumberingAfterBreak="0">
+  <w:abstractNum w:abstractNumId="197" w15:restartNumberingAfterBreak="0">
     <w:nsid w:val="7BAE23B0"/>
     <w:multiLevelType w:val="multilevel"/>
     <w:tmpl w:val="C010C154"/>
@@ -61780,7 +62511,7 @@
       </w:rPr>
     </w:lvl>
   </w:abstractNum>
-  <w:abstractNum w:abstractNumId="195" w15:restartNumberingAfterBreak="0">
+  <w:abstractNum w:abstractNumId="198" w15:restartNumberingAfterBreak="0">
     <w:nsid w:val="7CAE74D9"/>
     <w:multiLevelType w:val="multilevel"/>
     <w:tmpl w:val="D15C67A8"/>
@@ -61897,7 +62628,7 @@
       </w:pPr>
     </w:lvl>
   </w:abstractNum>
-  <w:abstractNum w:abstractNumId="196" w15:restartNumberingAfterBreak="0">
+  <w:abstractNum w:abstractNumId="199" w15:restartNumberingAfterBreak="0">
     <w:nsid w:val="7D015591"/>
     <w:multiLevelType w:val="multilevel"/>
     <w:tmpl w:val="A7482748"/>
@@ -62014,7 +62745,7 @@
       </w:pPr>
     </w:lvl>
   </w:abstractNum>
-  <w:abstractNum w:abstractNumId="197" w15:restartNumberingAfterBreak="0">
+  <w:abstractNum w:abstractNumId="200" w15:restartNumberingAfterBreak="0">
     <w:nsid w:val="7E1E1EAD"/>
     <w:multiLevelType w:val="multilevel"/>
     <w:tmpl w:val="F7AE9A24"/>
@@ -62131,7 +62862,7 @@
       </w:pPr>
     </w:lvl>
   </w:abstractNum>
-  <w:abstractNum w:abstractNumId="198" w15:restartNumberingAfterBreak="0">
+  <w:abstractNum w:abstractNumId="201" w15:restartNumberingAfterBreak="0">
     <w:nsid w:val="7F424B9F"/>
     <w:multiLevelType w:val="multilevel"/>
     <w:tmpl w:val="B5FC2886"/>
@@ -62244,7 +62975,7 @@
       </w:pPr>
     </w:lvl>
   </w:abstractNum>
-  <w:abstractNum w:abstractNumId="199" w15:restartNumberingAfterBreak="0">
+  <w:abstractNum w:abstractNumId="202" w15:restartNumberingAfterBreak="0">
     <w:nsid w:val="7FE662A4"/>
     <w:multiLevelType w:val="multilevel"/>
     <w:tmpl w:val="04E4FC32"/>
@@ -62358,139 +63089,139 @@
     </w:lvl>
   </w:abstractNum>
   <w:num w:numId="1" w16cid:durableId="720787938">
-    <w:abstractNumId w:val="18"/>
+    <w:abstractNumId w:val="19"/>
   </w:num>
   <w:num w:numId="2" w16cid:durableId="2122188350">
-    <w:abstractNumId w:val="182"/>
+    <w:abstractNumId w:val="185"/>
   </w:num>
   <w:num w:numId="3" w16cid:durableId="290138649">
-    <w:abstractNumId w:val="36"/>
+    <w:abstractNumId w:val="37"/>
   </w:num>
   <w:num w:numId="4" w16cid:durableId="595292039">
     <w:abstractNumId w:val="11"/>
   </w:num>
   <w:num w:numId="5" w16cid:durableId="1847280962">
-    <w:abstractNumId w:val="19"/>
+    <w:abstractNumId w:val="20"/>
   </w:num>
   <w:num w:numId="6" w16cid:durableId="1617760563">
-    <w:abstractNumId w:val="169"/>
+    <w:abstractNumId w:val="171"/>
   </w:num>
   <w:num w:numId="7" w16cid:durableId="120729188">
-    <w:abstractNumId w:val="184"/>
+    <w:abstractNumId w:val="187"/>
   </w:num>
   <w:num w:numId="8" w16cid:durableId="43719143">
-    <w:abstractNumId w:val="120"/>
+    <w:abstractNumId w:val="121"/>
   </w:num>
   <w:num w:numId="9" w16cid:durableId="2097052817">
-    <w:abstractNumId w:val="178"/>
+    <w:abstractNumId w:val="181"/>
   </w:num>
   <w:num w:numId="10" w16cid:durableId="1925332722">
+    <w:abstractNumId w:val="132"/>
+  </w:num>
+  <w:num w:numId="11" w16cid:durableId="204148796">
+    <w:abstractNumId w:val="198"/>
+  </w:num>
+  <w:num w:numId="12" w16cid:durableId="677930456">
+    <w:abstractNumId w:val="162"/>
+  </w:num>
+  <w:num w:numId="13" w16cid:durableId="461389204">
+    <w:abstractNumId w:val="161"/>
+  </w:num>
+  <w:num w:numId="14" w16cid:durableId="1933659178">
+    <w:abstractNumId w:val="18"/>
+  </w:num>
+  <w:num w:numId="15" w16cid:durableId="1880163776">
+    <w:abstractNumId w:val="94"/>
+  </w:num>
+  <w:num w:numId="16" w16cid:durableId="1840995707">
     <w:abstractNumId w:val="131"/>
   </w:num>
-  <w:num w:numId="11" w16cid:durableId="204148796">
-    <w:abstractNumId w:val="195"/>
-  </w:num>
-  <w:num w:numId="12" w16cid:durableId="677930456">
-    <w:abstractNumId w:val="160"/>
-  </w:num>
-  <w:num w:numId="13" w16cid:durableId="461389204">
-    <w:abstractNumId w:val="159"/>
-  </w:num>
-  <w:num w:numId="14" w16cid:durableId="1933659178">
-    <w:abstractNumId w:val="17"/>
-  </w:num>
-  <w:num w:numId="15" w16cid:durableId="1880163776">
-    <w:abstractNumId w:val="93"/>
-  </w:num>
-  <w:num w:numId="16" w16cid:durableId="1840995707">
-    <w:abstractNumId w:val="130"/>
-  </w:num>
   <w:num w:numId="17" w16cid:durableId="550731318">
-    <w:abstractNumId w:val="185"/>
+    <w:abstractNumId w:val="188"/>
   </w:num>
   <w:num w:numId="18" w16cid:durableId="1973629605">
-    <w:abstractNumId w:val="79"/>
+    <w:abstractNumId w:val="80"/>
   </w:num>
   <w:num w:numId="19" w16cid:durableId="872235080">
-    <w:abstractNumId w:val="32"/>
+    <w:abstractNumId w:val="33"/>
   </w:num>
   <w:num w:numId="20" w16cid:durableId="984550753">
-    <w:abstractNumId w:val="116"/>
+    <w:abstractNumId w:val="117"/>
   </w:num>
   <w:num w:numId="21" w16cid:durableId="688216659">
-    <w:abstractNumId w:val="196"/>
+    <w:abstractNumId w:val="199"/>
   </w:num>
   <w:num w:numId="22" w16cid:durableId="1910460291">
-    <w:abstractNumId w:val="27"/>
+    <w:abstractNumId w:val="28"/>
   </w:num>
   <w:num w:numId="23" w16cid:durableId="1260138581">
-    <w:abstractNumId w:val="43"/>
+    <w:abstractNumId w:val="44"/>
   </w:num>
   <w:num w:numId="24" w16cid:durableId="1644503332">
-    <w:abstractNumId w:val="105"/>
+    <w:abstractNumId w:val="106"/>
   </w:num>
   <w:num w:numId="25" w16cid:durableId="229116854">
-    <w:abstractNumId w:val="35"/>
+    <w:abstractNumId w:val="36"/>
   </w:num>
   <w:num w:numId="26" w16cid:durableId="1425801237">
-    <w:abstractNumId w:val="114"/>
+    <w:abstractNumId w:val="115"/>
   </w:num>
   <w:num w:numId="27" w16cid:durableId="1291547366">
-    <w:abstractNumId w:val="90"/>
+    <w:abstractNumId w:val="91"/>
   </w:num>
   <w:num w:numId="28" w16cid:durableId="1019892213">
-    <w:abstractNumId w:val="81"/>
+    <w:abstractNumId w:val="82"/>
   </w:num>
   <w:num w:numId="29" w16cid:durableId="2011176441">
-    <w:abstractNumId w:val="112"/>
+    <w:abstractNumId w:val="113"/>
   </w:num>
   <w:num w:numId="30" w16cid:durableId="904994195">
     <w:abstractNumId w:val="4"/>
   </w:num>
   <w:num w:numId="31" w16cid:durableId="469321429">
-    <w:abstractNumId w:val="21"/>
+    <w:abstractNumId w:val="22"/>
   </w:num>
   <w:num w:numId="32" w16cid:durableId="429549527">
-    <w:abstractNumId w:val="48"/>
+    <w:abstractNumId w:val="49"/>
   </w:num>
   <w:num w:numId="33" w16cid:durableId="901989019">
-    <w:abstractNumId w:val="152"/>
+    <w:abstractNumId w:val="153"/>
   </w:num>
   <w:num w:numId="34" w16cid:durableId="1613777564">
     <w:abstractNumId w:val="1"/>
   </w:num>
   <w:num w:numId="35" w16cid:durableId="1600016767">
-    <w:abstractNumId w:val="173"/>
+    <w:abstractNumId w:val="175"/>
   </w:num>
   <w:num w:numId="36" w16cid:durableId="1816994449">
-    <w:abstractNumId w:val="71"/>
+    <w:abstractNumId w:val="72"/>
   </w:num>
   <w:num w:numId="37" w16cid:durableId="1140609622">
-    <w:abstractNumId w:val="121"/>
+    <w:abstractNumId w:val="122"/>
   </w:num>
   <w:num w:numId="38" w16cid:durableId="547574006">
-    <w:abstractNumId w:val="177"/>
+    <w:abstractNumId w:val="180"/>
   </w:num>
   <w:num w:numId="39" w16cid:durableId="1926454116">
-    <w:abstractNumId w:val="65"/>
+    <w:abstractNumId w:val="66"/>
   </w:num>
   <w:num w:numId="40" w16cid:durableId="613295287">
-    <w:abstractNumId w:val="125"/>
+    <w:abstractNumId w:val="126"/>
   </w:num>
   <w:num w:numId="41" w16cid:durableId="616762043">
-    <w:abstractNumId w:val="176"/>
+    <w:abstractNumId w:val="179"/>
   </w:num>
   <w:num w:numId="42" w16cid:durableId="1999190555">
-    <w:abstractNumId w:val="115"/>
+    <w:abstractNumId w:val="116"/>
   </w:num>
   <w:num w:numId="43" w16cid:durableId="1404599519">
-    <w:abstractNumId w:val="132"/>
+    <w:abstractNumId w:val="133"/>
   </w:num>
   <w:num w:numId="44" w16cid:durableId="1060250660">
-    <w:abstractNumId w:val="126"/>
+    <w:abstractNumId w:val="127"/>
   </w:num>
   <w:num w:numId="45" w16cid:durableId="74593740">
-    <w:abstractNumId w:val="161"/>
+    <w:abstractNumId w:val="163"/>
   </w:num>
   <w:num w:numId="46" w16cid:durableId="1259214755">
     <w:abstractNumId w:val="7"/>
@@ -62499,142 +63230,142 @@
     <w:abstractNumId w:val="6"/>
   </w:num>
   <w:num w:numId="48" w16cid:durableId="602999984">
-    <w:abstractNumId w:val="26"/>
+    <w:abstractNumId w:val="27"/>
   </w:num>
   <w:num w:numId="49" w16cid:durableId="1457484756">
-    <w:abstractNumId w:val="180"/>
+    <w:abstractNumId w:val="183"/>
   </w:num>
   <w:num w:numId="50" w16cid:durableId="1184441454">
-    <w:abstractNumId w:val="156"/>
+    <w:abstractNumId w:val="157"/>
   </w:num>
   <w:num w:numId="51" w16cid:durableId="600069704">
+    <w:abstractNumId w:val="77"/>
+  </w:num>
+  <w:num w:numId="52" w16cid:durableId="1329747235">
+    <w:abstractNumId w:val="137"/>
+  </w:num>
+  <w:num w:numId="53" w16cid:durableId="16781818">
+    <w:abstractNumId w:val="148"/>
+  </w:num>
+  <w:num w:numId="54" w16cid:durableId="152913906">
+    <w:abstractNumId w:val="53"/>
+  </w:num>
+  <w:num w:numId="55" w16cid:durableId="1464350358">
+    <w:abstractNumId w:val="125"/>
+  </w:num>
+  <w:num w:numId="56" w16cid:durableId="590813891">
+    <w:abstractNumId w:val="123"/>
+  </w:num>
+  <w:num w:numId="57" w16cid:durableId="681473003">
+    <w:abstractNumId w:val="155"/>
+  </w:num>
+  <w:num w:numId="58" w16cid:durableId="448858249">
     <w:abstractNumId w:val="76"/>
   </w:num>
-  <w:num w:numId="52" w16cid:durableId="1329747235">
-    <w:abstractNumId w:val="136"/>
+  <w:num w:numId="59" w16cid:durableId="553349782">
+    <w:abstractNumId w:val="45"/>
   </w:num>
-  <w:num w:numId="53" w16cid:durableId="16781818">
-    <w:abstractNumId w:val="147"/>
+  <w:num w:numId="60" w16cid:durableId="740492220">
+    <w:abstractNumId w:val="95"/>
   </w:num>
-  <w:num w:numId="54" w16cid:durableId="152913906">
-    <w:abstractNumId w:val="52"/>
+  <w:num w:numId="61" w16cid:durableId="141428899">
+    <w:abstractNumId w:val="177"/>
   </w:num>
-  <w:num w:numId="55" w16cid:durableId="1464350358">
-    <w:abstractNumId w:val="124"/>
+  <w:num w:numId="62" w16cid:durableId="1886334593">
+    <w:abstractNumId w:val="168"/>
   </w:num>
-  <w:num w:numId="56" w16cid:durableId="590813891">
-    <w:abstractNumId w:val="122"/>
+  <w:num w:numId="63" w16cid:durableId="1709601069">
+    <w:abstractNumId w:val="130"/>
   </w:num>
-  <w:num w:numId="57" w16cid:durableId="681473003">
+  <w:num w:numId="64" w16cid:durableId="583994672">
     <w:abstractNumId w:val="154"/>
   </w:num>
-  <w:num w:numId="58" w16cid:durableId="448858249">
-    <w:abstractNumId w:val="75"/>
-  </w:num>
-  <w:num w:numId="59" w16cid:durableId="553349782">
-    <w:abstractNumId w:val="44"/>
-  </w:num>
-  <w:num w:numId="60" w16cid:durableId="740492220">
-    <w:abstractNumId w:val="94"/>
-  </w:num>
-  <w:num w:numId="61" w16cid:durableId="141428899">
-    <w:abstractNumId w:val="175"/>
-  </w:num>
-  <w:num w:numId="62" w16cid:durableId="1886334593">
-    <w:abstractNumId w:val="166"/>
-  </w:num>
-  <w:num w:numId="63" w16cid:durableId="1709601069">
-    <w:abstractNumId w:val="129"/>
-  </w:num>
-  <w:num w:numId="64" w16cid:durableId="583994672">
-    <w:abstractNumId w:val="153"/>
-  </w:num>
   <w:num w:numId="65" w16cid:durableId="1455640937">
-    <w:abstractNumId w:val="58"/>
+    <w:abstractNumId w:val="59"/>
   </w:num>
   <w:num w:numId="66" w16cid:durableId="1175614540">
-    <w:abstractNumId w:val="92"/>
+    <w:abstractNumId w:val="93"/>
   </w:num>
   <w:num w:numId="67" w16cid:durableId="2116124383">
-    <w:abstractNumId w:val="181"/>
+    <w:abstractNumId w:val="184"/>
   </w:num>
   <w:num w:numId="68" w16cid:durableId="339822818">
     <w:abstractNumId w:val="3"/>
   </w:num>
   <w:num w:numId="69" w16cid:durableId="1694376526">
-    <w:abstractNumId w:val="106"/>
+    <w:abstractNumId w:val="107"/>
   </w:num>
   <w:num w:numId="70" w16cid:durableId="826287560">
-    <w:abstractNumId w:val="109"/>
+    <w:abstractNumId w:val="110"/>
   </w:num>
   <w:num w:numId="71" w16cid:durableId="613905652">
-    <w:abstractNumId w:val="30"/>
+    <w:abstractNumId w:val="31"/>
   </w:num>
   <w:num w:numId="72" w16cid:durableId="474612903">
-    <w:abstractNumId w:val="144"/>
+    <w:abstractNumId w:val="145"/>
   </w:num>
   <w:num w:numId="73" w16cid:durableId="1396392309">
+    <w:abstractNumId w:val="48"/>
+  </w:num>
+  <w:num w:numId="74" w16cid:durableId="1164706610">
+    <w:abstractNumId w:val="58"/>
+  </w:num>
+  <w:num w:numId="75" w16cid:durableId="507865771">
+    <w:abstractNumId w:val="83"/>
+  </w:num>
+  <w:num w:numId="76" w16cid:durableId="839125081">
+    <w:abstractNumId w:val="112"/>
+  </w:num>
+  <w:num w:numId="77" w16cid:durableId="1907640573">
+    <w:abstractNumId w:val="166"/>
+  </w:num>
+  <w:num w:numId="78" w16cid:durableId="1111514901">
+    <w:abstractNumId w:val="55"/>
+  </w:num>
+  <w:num w:numId="79" w16cid:durableId="610628819">
+    <w:abstractNumId w:val="169"/>
+  </w:num>
+  <w:num w:numId="80" w16cid:durableId="1456830388">
+    <w:abstractNumId w:val="136"/>
+  </w:num>
+  <w:num w:numId="81" w16cid:durableId="296496655">
+    <w:abstractNumId w:val="17"/>
+  </w:num>
+  <w:num w:numId="82" w16cid:durableId="1493988613">
+    <w:abstractNumId w:val="41"/>
+  </w:num>
+  <w:num w:numId="83" w16cid:durableId="220791385">
     <w:abstractNumId w:val="47"/>
   </w:num>
-  <w:num w:numId="74" w16cid:durableId="1164706610">
-    <w:abstractNumId w:val="57"/>
-  </w:num>
-  <w:num w:numId="75" w16cid:durableId="507865771">
-    <w:abstractNumId w:val="82"/>
-  </w:num>
-  <w:num w:numId="76" w16cid:durableId="839125081">
-    <w:abstractNumId w:val="111"/>
-  </w:num>
-  <w:num w:numId="77" w16cid:durableId="1907640573">
-    <w:abstractNumId w:val="164"/>
-  </w:num>
-  <w:num w:numId="78" w16cid:durableId="1111514901">
-    <w:abstractNumId w:val="54"/>
-  </w:num>
-  <w:num w:numId="79" w16cid:durableId="610628819">
-    <w:abstractNumId w:val="167"/>
-  </w:num>
-  <w:num w:numId="80" w16cid:durableId="1456830388">
-    <w:abstractNumId w:val="135"/>
-  </w:num>
-  <w:num w:numId="81" w16cid:durableId="296496655">
-    <w:abstractNumId w:val="16"/>
-  </w:num>
-  <w:num w:numId="82" w16cid:durableId="1493988613">
-    <w:abstractNumId w:val="40"/>
-  </w:num>
-  <w:num w:numId="83" w16cid:durableId="220791385">
-    <w:abstractNumId w:val="46"/>
-  </w:num>
   <w:num w:numId="84" w16cid:durableId="277494691">
-    <w:abstractNumId w:val="98"/>
+    <w:abstractNumId w:val="99"/>
   </w:num>
   <w:num w:numId="85" w16cid:durableId="1853449985">
-    <w:abstractNumId w:val="78"/>
+    <w:abstractNumId w:val="79"/>
   </w:num>
   <w:num w:numId="86" w16cid:durableId="1657372575">
-    <w:abstractNumId w:val="140"/>
+    <w:abstractNumId w:val="141"/>
   </w:num>
   <w:num w:numId="87" w16cid:durableId="841238149">
-    <w:abstractNumId w:val="25"/>
+    <w:abstractNumId w:val="26"/>
   </w:num>
   <w:num w:numId="88" w16cid:durableId="1834905874">
-    <w:abstractNumId w:val="61"/>
+    <w:abstractNumId w:val="62"/>
   </w:num>
   <w:num w:numId="89" w16cid:durableId="1612280281">
-    <w:abstractNumId w:val="197"/>
+    <w:abstractNumId w:val="200"/>
   </w:num>
   <w:num w:numId="90" w16cid:durableId="1885369056">
-    <w:abstractNumId w:val="128"/>
+    <w:abstractNumId w:val="129"/>
   </w:num>
   <w:num w:numId="91" w16cid:durableId="579606855">
-    <w:abstractNumId w:val="101"/>
+    <w:abstractNumId w:val="102"/>
   </w:num>
   <w:num w:numId="92" w16cid:durableId="98723762">
-    <w:abstractNumId w:val="70"/>
+    <w:abstractNumId w:val="71"/>
   </w:num>
   <w:num w:numId="93" w16cid:durableId="1276251666">
-    <w:abstractNumId w:val="123"/>
+    <w:abstractNumId w:val="124"/>
   </w:num>
   <w:num w:numId="94" w16cid:durableId="1003168853">
     <w:abstractNumId w:val="2"/>
@@ -62646,19 +63377,19 @@
     <w:abstractNumId w:val="8"/>
   </w:num>
   <w:num w:numId="97" w16cid:durableId="666250584">
-    <w:abstractNumId w:val="133"/>
+    <w:abstractNumId w:val="134"/>
   </w:num>
   <w:num w:numId="98" w16cid:durableId="2072849294">
-    <w:abstractNumId w:val="87"/>
+    <w:abstractNumId w:val="88"/>
   </w:num>
   <w:num w:numId="99" w16cid:durableId="164977349">
-    <w:abstractNumId w:val="117"/>
+    <w:abstractNumId w:val="118"/>
   </w:num>
   <w:num w:numId="100" w16cid:durableId="987516317">
-    <w:abstractNumId w:val="64"/>
+    <w:abstractNumId w:val="65"/>
   </w:num>
   <w:num w:numId="101" w16cid:durableId="1860242736">
-    <w:abstractNumId w:val="103"/>
+    <w:abstractNumId w:val="104"/>
   </w:num>
   <w:num w:numId="102" w16cid:durableId="1477988547">
     <w:abstractNumId w:val="9"/>
@@ -62667,295 +63398,304 @@
     <w:abstractNumId w:val="0"/>
   </w:num>
   <w:num w:numId="104" w16cid:durableId="937061478">
-    <w:abstractNumId w:val="31"/>
+    <w:abstractNumId w:val="32"/>
   </w:num>
   <w:num w:numId="105" w16cid:durableId="1562525008">
-    <w:abstractNumId w:val="134"/>
+    <w:abstractNumId w:val="135"/>
   </w:num>
   <w:num w:numId="106" w16cid:durableId="782572167">
+    <w:abstractNumId w:val="15"/>
+  </w:num>
+  <w:num w:numId="107" w16cid:durableId="1048140908">
+    <w:abstractNumId w:val="142"/>
+  </w:num>
+  <w:num w:numId="108" w16cid:durableId="1143162587">
+    <w:abstractNumId w:val="173"/>
+  </w:num>
+  <w:num w:numId="109" w16cid:durableId="2134132814">
+    <w:abstractNumId w:val="120"/>
+  </w:num>
+  <w:num w:numId="110" w16cid:durableId="1320571727">
+    <w:abstractNumId w:val="73"/>
+  </w:num>
+  <w:num w:numId="111" w16cid:durableId="206528832">
+    <w:abstractNumId w:val="90"/>
+  </w:num>
+  <w:num w:numId="112" w16cid:durableId="1475489534">
+    <w:abstractNumId w:val="46"/>
+  </w:num>
+  <w:num w:numId="113" w16cid:durableId="839348143">
     <w:abstractNumId w:val="14"/>
   </w:num>
-  <w:num w:numId="107" w16cid:durableId="1048140908">
-    <w:abstractNumId w:val="141"/>
-  </w:num>
-  <w:num w:numId="108" w16cid:durableId="1143162587">
-    <w:abstractNumId w:val="171"/>
-  </w:num>
-  <w:num w:numId="109" w16cid:durableId="2134132814">
-    <w:abstractNumId w:val="119"/>
-  </w:num>
-  <w:num w:numId="110" w16cid:durableId="1320571727">
-    <w:abstractNumId w:val="72"/>
-  </w:num>
-  <w:num w:numId="111" w16cid:durableId="206528832">
-    <w:abstractNumId w:val="89"/>
-  </w:num>
-  <w:num w:numId="112" w16cid:durableId="1475489534">
-    <w:abstractNumId w:val="45"/>
-  </w:num>
-  <w:num w:numId="113" w16cid:durableId="839348143">
-    <w:abstractNumId w:val="13"/>
-  </w:num>
   <w:num w:numId="114" w16cid:durableId="1483306220">
-    <w:abstractNumId w:val="158"/>
+    <w:abstractNumId w:val="160"/>
   </w:num>
   <w:num w:numId="115" w16cid:durableId="899829047">
-    <w:abstractNumId w:val="63"/>
+    <w:abstractNumId w:val="64"/>
   </w:num>
   <w:num w:numId="116" w16cid:durableId="1312249696">
-    <w:abstractNumId w:val="77"/>
+    <w:abstractNumId w:val="78"/>
   </w:num>
   <w:num w:numId="117" w16cid:durableId="1355230779">
+    <w:abstractNumId w:val="109"/>
+  </w:num>
+  <w:num w:numId="118" w16cid:durableId="1949197237">
+    <w:abstractNumId w:val="81"/>
+  </w:num>
+  <w:num w:numId="119" w16cid:durableId="152720340">
+    <w:abstractNumId w:val="114"/>
+  </w:num>
+  <w:num w:numId="120" w16cid:durableId="376469452">
+    <w:abstractNumId w:val="193"/>
+  </w:num>
+  <w:num w:numId="121" w16cid:durableId="1135951281">
+    <w:abstractNumId w:val="43"/>
+  </w:num>
+  <w:num w:numId="122" w16cid:durableId="632490731">
+    <w:abstractNumId w:val="197"/>
+  </w:num>
+  <w:num w:numId="123" w16cid:durableId="268390822">
+    <w:abstractNumId w:val="51"/>
+  </w:num>
+  <w:num w:numId="124" w16cid:durableId="2081363220">
     <w:abstractNumId w:val="108"/>
   </w:num>
-  <w:num w:numId="118" w16cid:durableId="1949197237">
-    <w:abstractNumId w:val="80"/>
+  <w:num w:numId="125" w16cid:durableId="2146239562">
+    <w:abstractNumId w:val="150"/>
   </w:num>
-  <w:num w:numId="119" w16cid:durableId="152720340">
-    <w:abstractNumId w:val="113"/>
+  <w:num w:numId="126" w16cid:durableId="274218658">
+    <w:abstractNumId w:val="103"/>
   </w:num>
-  <w:num w:numId="120" w16cid:durableId="376469452">
-    <w:abstractNumId w:val="190"/>
+  <w:num w:numId="127" w16cid:durableId="1330477011">
+    <w:abstractNumId w:val="144"/>
   </w:num>
-  <w:num w:numId="121" w16cid:durableId="1135951281">
+  <w:num w:numId="128" w16cid:durableId="521088880">
     <w:abstractNumId w:val="42"/>
   </w:num>
-  <w:num w:numId="122" w16cid:durableId="632490731">
-    <w:abstractNumId w:val="194"/>
-  </w:num>
-  <w:num w:numId="123" w16cid:durableId="268390822">
-    <w:abstractNumId w:val="50"/>
-  </w:num>
-  <w:num w:numId="124" w16cid:durableId="2081363220">
-    <w:abstractNumId w:val="107"/>
-  </w:num>
-  <w:num w:numId="125" w16cid:durableId="2146239562">
-    <w:abstractNumId w:val="149"/>
-  </w:num>
-  <w:num w:numId="126" w16cid:durableId="274218658">
-    <w:abstractNumId w:val="102"/>
-  </w:num>
-  <w:num w:numId="127" w16cid:durableId="1330477011">
-    <w:abstractNumId w:val="143"/>
-  </w:num>
-  <w:num w:numId="128" w16cid:durableId="521088880">
-    <w:abstractNumId w:val="41"/>
-  </w:num>
   <w:num w:numId="129" w16cid:durableId="1620213678">
-    <w:abstractNumId w:val="51"/>
+    <w:abstractNumId w:val="52"/>
   </w:num>
   <w:num w:numId="130" w16cid:durableId="889421125">
-    <w:abstractNumId w:val="28"/>
+    <w:abstractNumId w:val="29"/>
   </w:num>
   <w:num w:numId="131" w16cid:durableId="2135512691">
-    <w:abstractNumId w:val="142"/>
+    <w:abstractNumId w:val="143"/>
   </w:num>
   <w:num w:numId="132" w16cid:durableId="818545028">
     <w:abstractNumId w:val="5"/>
   </w:num>
   <w:num w:numId="133" w16cid:durableId="1952710860">
-    <w:abstractNumId w:val="110"/>
+    <w:abstractNumId w:val="111"/>
   </w:num>
   <w:num w:numId="134" w16cid:durableId="1104106408">
+    <w:abstractNumId w:val="85"/>
+  </w:num>
+  <w:num w:numId="135" w16cid:durableId="1667707256">
+    <w:abstractNumId w:val="34"/>
+  </w:num>
+  <w:num w:numId="136" w16cid:durableId="1099057485">
+    <w:abstractNumId w:val="190"/>
+  </w:num>
+  <w:num w:numId="137" w16cid:durableId="883905248">
+    <w:abstractNumId w:val="156"/>
+  </w:num>
+  <w:num w:numId="138" w16cid:durableId="548878409">
+    <w:abstractNumId w:val="70"/>
+  </w:num>
+  <w:num w:numId="139" w16cid:durableId="592129558">
+    <w:abstractNumId w:val="151"/>
+  </w:num>
+  <w:num w:numId="140" w16cid:durableId="985278700">
     <w:abstractNumId w:val="84"/>
   </w:num>
-  <w:num w:numId="135" w16cid:durableId="1667707256">
-    <w:abstractNumId w:val="33"/>
+  <w:num w:numId="141" w16cid:durableId="506595522">
+    <w:abstractNumId w:val="165"/>
   </w:num>
-  <w:num w:numId="136" w16cid:durableId="1099057485">
-    <w:abstractNumId w:val="187"/>
-  </w:num>
-  <w:num w:numId="137" w16cid:durableId="883905248">
-    <w:abstractNumId w:val="155"/>
-  </w:num>
-  <w:num w:numId="138" w16cid:durableId="548878409">
+  <w:num w:numId="142" w16cid:durableId="1088043777">
     <w:abstractNumId w:val="69"/>
   </w:num>
-  <w:num w:numId="139" w16cid:durableId="592129558">
-    <w:abstractNumId w:val="150"/>
-  </w:num>
-  <w:num w:numId="140" w16cid:durableId="985278700">
-    <w:abstractNumId w:val="83"/>
-  </w:num>
-  <w:num w:numId="141" w16cid:durableId="506595522">
-    <w:abstractNumId w:val="163"/>
-  </w:num>
-  <w:num w:numId="142" w16cid:durableId="1088043777">
-    <w:abstractNumId w:val="68"/>
-  </w:num>
   <w:num w:numId="143" w16cid:durableId="2054378093">
-    <w:abstractNumId w:val="157"/>
+    <w:abstractNumId w:val="159"/>
   </w:num>
   <w:num w:numId="144" w16cid:durableId="665090898">
-    <w:abstractNumId w:val="168"/>
+    <w:abstractNumId w:val="170"/>
   </w:num>
   <w:num w:numId="145" w16cid:durableId="1542353486">
-    <w:abstractNumId w:val="183"/>
+    <w:abstractNumId w:val="186"/>
   </w:num>
   <w:num w:numId="146" w16cid:durableId="12999930">
-    <w:abstractNumId w:val="165"/>
+    <w:abstractNumId w:val="167"/>
   </w:num>
   <w:num w:numId="147" w16cid:durableId="554658314">
-    <w:abstractNumId w:val="59"/>
+    <w:abstractNumId w:val="60"/>
   </w:num>
   <w:num w:numId="148" w16cid:durableId="1662661964">
-    <w:abstractNumId w:val="100"/>
+    <w:abstractNumId w:val="101"/>
   </w:num>
   <w:num w:numId="149" w16cid:durableId="2021158411">
-    <w:abstractNumId w:val="137"/>
+    <w:abstractNumId w:val="138"/>
   </w:num>
   <w:num w:numId="150" w16cid:durableId="1588882082">
-    <w:abstractNumId w:val="193"/>
+    <w:abstractNumId w:val="196"/>
   </w:num>
   <w:num w:numId="151" w16cid:durableId="1460341342">
-    <w:abstractNumId w:val="39"/>
+    <w:abstractNumId w:val="40"/>
   </w:num>
   <w:num w:numId="152" w16cid:durableId="1515073945">
-    <w:abstractNumId w:val="104"/>
+    <w:abstractNumId w:val="105"/>
   </w:num>
   <w:num w:numId="153" w16cid:durableId="1536574827">
-    <w:abstractNumId w:val="179"/>
+    <w:abstractNumId w:val="182"/>
   </w:num>
   <w:num w:numId="154" w16cid:durableId="452018586">
-    <w:abstractNumId w:val="151"/>
+    <w:abstractNumId w:val="152"/>
   </w:num>
   <w:num w:numId="155" w16cid:durableId="1342387813">
-    <w:abstractNumId w:val="60"/>
+    <w:abstractNumId w:val="61"/>
   </w:num>
   <w:num w:numId="156" w16cid:durableId="1784152374">
     <w:abstractNumId w:val="10"/>
   </w:num>
   <w:num w:numId="157" w16cid:durableId="1797599501">
-    <w:abstractNumId w:val="20"/>
+    <w:abstractNumId w:val="21"/>
   </w:num>
   <w:num w:numId="158" w16cid:durableId="706755317">
+    <w:abstractNumId w:val="25"/>
+  </w:num>
+  <w:num w:numId="159" w16cid:durableId="1484395961">
+    <w:abstractNumId w:val="195"/>
+  </w:num>
+  <w:num w:numId="160" w16cid:durableId="190802594">
+    <w:abstractNumId w:val="38"/>
+  </w:num>
+  <w:num w:numId="161" w16cid:durableId="1238440755">
+    <w:abstractNumId w:val="100"/>
+  </w:num>
+  <w:num w:numId="162" w16cid:durableId="1216313167">
     <w:abstractNumId w:val="24"/>
   </w:num>
-  <w:num w:numId="159" w16cid:durableId="1484395961">
+  <w:num w:numId="163" w16cid:durableId="1405377389">
+    <w:abstractNumId w:val="139"/>
+  </w:num>
+  <w:num w:numId="164" w16cid:durableId="997079127">
+    <w:abstractNumId w:val="89"/>
+  </w:num>
+  <w:num w:numId="165" w16cid:durableId="950625477">
+    <w:abstractNumId w:val="75"/>
+  </w:num>
+  <w:num w:numId="166" w16cid:durableId="10304174">
+    <w:abstractNumId w:val="35"/>
+  </w:num>
+  <w:num w:numId="167" w16cid:durableId="79375219">
+    <w:abstractNumId w:val="149"/>
+  </w:num>
+  <w:num w:numId="168" w16cid:durableId="166865891">
+    <w:abstractNumId w:val="30"/>
+  </w:num>
+  <w:num w:numId="169" w16cid:durableId="361790208">
+    <w:abstractNumId w:val="119"/>
+  </w:num>
+  <w:num w:numId="170" w16cid:durableId="57097848">
+    <w:abstractNumId w:val="56"/>
+  </w:num>
+  <w:num w:numId="171" w16cid:durableId="766198819">
+    <w:abstractNumId w:val="86"/>
+  </w:num>
+  <w:num w:numId="172" w16cid:durableId="1211499061">
+    <w:abstractNumId w:val="50"/>
+  </w:num>
+  <w:num w:numId="173" w16cid:durableId="283080003">
+    <w:abstractNumId w:val="201"/>
+  </w:num>
+  <w:num w:numId="174" w16cid:durableId="1553426079">
+    <w:abstractNumId w:val="194"/>
+  </w:num>
+  <w:num w:numId="175" w16cid:durableId="1091394449">
+    <w:abstractNumId w:val="63"/>
+  </w:num>
+  <w:num w:numId="176" w16cid:durableId="1367634584">
+    <w:abstractNumId w:val="146"/>
+  </w:num>
+  <w:num w:numId="177" w16cid:durableId="1165852170">
+    <w:abstractNumId w:val="147"/>
+  </w:num>
+  <w:num w:numId="178" w16cid:durableId="2038700258">
+    <w:abstractNumId w:val="54"/>
+  </w:num>
+  <w:num w:numId="179" w16cid:durableId="2116898398">
+    <w:abstractNumId w:val="128"/>
+  </w:num>
+  <w:num w:numId="180" w16cid:durableId="360203943">
+    <w:abstractNumId w:val="39"/>
+  </w:num>
+  <w:num w:numId="181" w16cid:durableId="2061125978">
+    <w:abstractNumId w:val="98"/>
+  </w:num>
+  <w:num w:numId="182" w16cid:durableId="1221601732">
+    <w:abstractNumId w:val="74"/>
+  </w:num>
+  <w:num w:numId="183" w16cid:durableId="1689021137">
+    <w:abstractNumId w:val="16"/>
+  </w:num>
+  <w:num w:numId="184" w16cid:durableId="1153184084">
+    <w:abstractNumId w:val="23"/>
+  </w:num>
+  <w:num w:numId="185" w16cid:durableId="261765655">
+    <w:abstractNumId w:val="67"/>
+  </w:num>
+  <w:num w:numId="186" w16cid:durableId="1412504817">
+    <w:abstractNumId w:val="189"/>
+  </w:num>
+  <w:num w:numId="187" w16cid:durableId="483665091">
+    <w:abstractNumId w:val="140"/>
+  </w:num>
+  <w:num w:numId="188" w16cid:durableId="1355233360">
     <w:abstractNumId w:val="192"/>
   </w:num>
-  <w:num w:numId="160" w16cid:durableId="190802594">
-    <w:abstractNumId w:val="37"/>
+  <w:num w:numId="189" w16cid:durableId="352222945">
+    <w:abstractNumId w:val="57"/>
   </w:num>
-  <w:num w:numId="161" w16cid:durableId="1238440755">
-    <w:abstractNumId w:val="99"/>
+  <w:num w:numId="190" w16cid:durableId="1552962342">
+    <w:abstractNumId w:val="97"/>
   </w:num>
-  <w:num w:numId="162" w16cid:durableId="1216313167">
-    <w:abstractNumId w:val="23"/>
+  <w:num w:numId="191" w16cid:durableId="1733844750">
+    <w:abstractNumId w:val="172"/>
   </w:num>
-  <w:num w:numId="163" w16cid:durableId="1405377389">
-    <w:abstractNumId w:val="138"/>
+  <w:num w:numId="192" w16cid:durableId="193275403">
+    <w:abstractNumId w:val="164"/>
   </w:num>
-  <w:num w:numId="164" w16cid:durableId="997079127">
-    <w:abstractNumId w:val="88"/>
+  <w:num w:numId="193" w16cid:durableId="944120758">
+    <w:abstractNumId w:val="176"/>
   </w:num>
-  <w:num w:numId="165" w16cid:durableId="950625477">
-    <w:abstractNumId w:val="74"/>
+  <w:num w:numId="194" w16cid:durableId="1358195019">
+    <w:abstractNumId w:val="202"/>
   </w:num>
-  <w:num w:numId="166" w16cid:durableId="10304174">
-    <w:abstractNumId w:val="34"/>
+  <w:num w:numId="195" w16cid:durableId="1582526379">
+    <w:abstractNumId w:val="92"/>
   </w:num>
-  <w:num w:numId="167" w16cid:durableId="79375219">
-    <w:abstractNumId w:val="148"/>
+  <w:num w:numId="196" w16cid:durableId="1555775009">
+    <w:abstractNumId w:val="68"/>
   </w:num>
-  <w:num w:numId="168" w16cid:durableId="166865891">
-    <w:abstractNumId w:val="29"/>
-  </w:num>
-  <w:num w:numId="169" w16cid:durableId="361790208">
-    <w:abstractNumId w:val="118"/>
-  </w:num>
-  <w:num w:numId="170" w16cid:durableId="57097848">
-    <w:abstractNumId w:val="55"/>
-  </w:num>
-  <w:num w:numId="171" w16cid:durableId="766198819">
-    <w:abstractNumId w:val="85"/>
-  </w:num>
-  <w:num w:numId="172" w16cid:durableId="1211499061">
-    <w:abstractNumId w:val="49"/>
-  </w:num>
-  <w:num w:numId="173" w16cid:durableId="283080003">
-    <w:abstractNumId w:val="198"/>
-  </w:num>
-  <w:num w:numId="174" w16cid:durableId="1553426079">
+  <w:num w:numId="197" w16cid:durableId="49348746">
     <w:abstractNumId w:val="191"/>
   </w:num>
-  <w:num w:numId="175" w16cid:durableId="1091394449">
-    <w:abstractNumId w:val="62"/>
+  <w:num w:numId="198" w16cid:durableId="518855812">
+    <w:abstractNumId w:val="174"/>
   </w:num>
-  <w:num w:numId="176" w16cid:durableId="1367634584">
-    <w:abstractNumId w:val="145"/>
-  </w:num>
-  <w:num w:numId="177" w16cid:durableId="1165852170">
-    <w:abstractNumId w:val="146"/>
-  </w:num>
-  <w:num w:numId="178" w16cid:durableId="2038700258">
-    <w:abstractNumId w:val="53"/>
-  </w:num>
-  <w:num w:numId="179" w16cid:durableId="2116898398">
-    <w:abstractNumId w:val="127"/>
-  </w:num>
-  <w:num w:numId="180" w16cid:durableId="360203943">
-    <w:abstractNumId w:val="38"/>
-  </w:num>
-  <w:num w:numId="181" w16cid:durableId="2061125978">
-    <w:abstractNumId w:val="97"/>
-  </w:num>
-  <w:num w:numId="182" w16cid:durableId="1221601732">
-    <w:abstractNumId w:val="73"/>
-  </w:num>
-  <w:num w:numId="183" w16cid:durableId="1689021137">
-    <w:abstractNumId w:val="15"/>
-  </w:num>
-  <w:num w:numId="184" w16cid:durableId="1153184084">
-    <w:abstractNumId w:val="22"/>
-  </w:num>
-  <w:num w:numId="185" w16cid:durableId="261765655">
-    <w:abstractNumId w:val="66"/>
-  </w:num>
-  <w:num w:numId="186" w16cid:durableId="1412504817">
-    <w:abstractNumId w:val="186"/>
-  </w:num>
-  <w:num w:numId="187" w16cid:durableId="483665091">
-    <w:abstractNumId w:val="139"/>
-  </w:num>
-  <w:num w:numId="188" w16cid:durableId="1355233360">
-    <w:abstractNumId w:val="189"/>
-  </w:num>
-  <w:num w:numId="189" w16cid:durableId="352222945">
-    <w:abstractNumId w:val="56"/>
-  </w:num>
-  <w:num w:numId="190" w16cid:durableId="1552962342">
+  <w:num w:numId="199" w16cid:durableId="322659837">
     <w:abstractNumId w:val="96"/>
   </w:num>
-  <w:num w:numId="191" w16cid:durableId="1733844750">
-    <w:abstractNumId w:val="170"/>
+  <w:num w:numId="200" w16cid:durableId="708724577">
+    <w:abstractNumId w:val="87"/>
   </w:num>
-  <w:num w:numId="192" w16cid:durableId="193275403">
-    <w:abstractNumId w:val="162"/>
+  <w:num w:numId="201" w16cid:durableId="174730028">
+    <w:abstractNumId w:val="158"/>
   </w:num>
-  <w:num w:numId="193" w16cid:durableId="944120758">
-    <w:abstractNumId w:val="174"/>
+  <w:num w:numId="202" w16cid:durableId="384985789">
+    <w:abstractNumId w:val="178"/>
   </w:num>
-  <w:num w:numId="194" w16cid:durableId="1358195019">
-    <w:abstractNumId w:val="199"/>
-  </w:num>
-  <w:num w:numId="195" w16cid:durableId="1582526379">
-    <w:abstractNumId w:val="91"/>
-  </w:num>
-  <w:num w:numId="196" w16cid:durableId="1555775009">
-    <w:abstractNumId w:val="67"/>
-  </w:num>
-  <w:num w:numId="197" w16cid:durableId="49348746">
-    <w:abstractNumId w:val="188"/>
-  </w:num>
-  <w:num w:numId="198" w16cid:durableId="518855812">
-    <w:abstractNumId w:val="172"/>
-  </w:num>
-  <w:num w:numId="199" w16cid:durableId="322659837">
-    <w:abstractNumId w:val="95"/>
-  </w:num>
-  <w:num w:numId="200" w16cid:durableId="708724577">
-    <w:abstractNumId w:val="86"/>
+  <w:num w:numId="203" w16cid:durableId="1065883077">
+    <w:abstractNumId w:val="13"/>
   </w:num>
 </w:numbering>
 </file>

</xml_diff>

<commit_message>
Fix: Restore missing finalFormData variable in onSend
</commit_message>
<xml_diff>
--- a/チャット履歴.docx
+++ b/チャット履歴.docx
@@ -259,6 +259,7 @@
           <w:numId w:val="44"/>
         </w:numPr>
       </w:pPr>
+      <w:proofErr w:type="gramStart"/>
       <w:r>
         <w:rPr>
           <w:rFonts w:ascii="Segoe UI Emoji" w:hAnsi="Segoe UI Emoji" w:cs="Segoe UI Emoji"/>
@@ -266,7 +267,11 @@
         <w:t>🔍</w:t>
       </w:r>
       <w:r>
-        <w:t xml:space="preserve">  Inspect: https://vercel.com/tetsuyatanakas-projects/temp/CMhKTjTu19YUH4N4M5pCiRCN3qM3 [2s]</w:t>
+        <w:t xml:space="preserve">  Inspect</w:t>
+      </w:r>
+      <w:proofErr w:type="gramEnd"/>
+      <w:r>
+        <w:t>: https://vercel.com/tetsuyatanakas-projects/temp/CMhKTjTu19YUH4N4M5pCiRCN3qM3 [2s]</w:t>
       </w:r>
     </w:p>
     <w:p>
@@ -314,6 +319,7 @@
           <w:numId w:val="44"/>
         </w:numPr>
       </w:pPr>
+      <w:proofErr w:type="gramStart"/>
       <w:r>
         <w:rPr>
           <w:rFonts w:ascii="Segoe UI Emoji" w:hAnsi="Segoe UI Emoji" w:cs="Segoe UI Emoji"/>
@@ -321,7 +327,11 @@
         <w:t>🔗</w:t>
       </w:r>
       <w:r>
-        <w:t xml:space="preserve">  Aliased: https://temp-xi-navy.vercel.app [17s]</w:t>
+        <w:t xml:space="preserve">  Aliased</w:t>
+      </w:r>
+      <w:proofErr w:type="gramEnd"/>
+      <w:r>
+        <w:t>: https://temp-xi-navy.vercel.app [17s]</w:t>
       </w:r>
     </w:p>
     <w:p>
@@ -737,7 +747,55 @@
       </w:r>
       <w:proofErr w:type="spellEnd"/>
       <w:r>
-        <w:t xml:space="preserve"> CLI 50.1.3 ? You are deploying your home directory. Do you want to continue? yes ? Set up and deploy “~”? yes ? Which scope should contain your project? TETSUYATANAKA's projects ? Link to existing project? yes ? Which existing project do you want to link? temp </w:t>
+        <w:t xml:space="preserve"> CLI </w:t>
+      </w:r>
+      <w:proofErr w:type="gramStart"/>
+      <w:r>
+        <w:t>50.1.3 ?</w:t>
+      </w:r>
+      <w:proofErr w:type="gramEnd"/>
+      <w:r>
+        <w:t xml:space="preserve"> You are deploying your home directory. Do you want to continue? </w:t>
+      </w:r>
+      <w:proofErr w:type="gramStart"/>
+      <w:r>
+        <w:t>yes ?</w:t>
+      </w:r>
+      <w:proofErr w:type="gramEnd"/>
+      <w:r>
+        <w:t xml:space="preserve"> Set up and deploy “~”? </w:t>
+      </w:r>
+      <w:proofErr w:type="gramStart"/>
+      <w:r>
+        <w:t>yes ?</w:t>
+      </w:r>
+      <w:proofErr w:type="gramEnd"/>
+      <w:r>
+        <w:t xml:space="preserve"> Which scope should </w:t>
+      </w:r>
+      <w:proofErr w:type="gramStart"/>
+      <w:r>
+        <w:t>contain your project</w:t>
+      </w:r>
+      <w:proofErr w:type="gramEnd"/>
+      <w:r>
+        <w:t xml:space="preserve">? TETSUYATANAKA's </w:t>
+      </w:r>
+      <w:proofErr w:type="gramStart"/>
+      <w:r>
+        <w:t>projects ?</w:t>
+      </w:r>
+      <w:proofErr w:type="gramEnd"/>
+      <w:r>
+        <w:t xml:space="preserve"> Link to existing project? </w:t>
+      </w:r>
+      <w:proofErr w:type="gramStart"/>
+      <w:r>
+        <w:t>yes ?</w:t>
+      </w:r>
+      <w:proofErr w:type="gramEnd"/>
+      <w:r>
+        <w:t xml:space="preserve"> Which existing project do you want to link? temp </w:t>
       </w:r>
       <w:r>
         <w:rPr>
@@ -754,15 +812,24 @@
       </w:r>
       <w:proofErr w:type="spellEnd"/>
       <w:r>
-        <w:t>-projects/temp (created .</w:t>
+        <w:t>-projects/temp (</w:t>
+      </w:r>
+      <w:proofErr w:type="gramStart"/>
+      <w:r>
+        <w:t>created .</w:t>
       </w:r>
       <w:proofErr w:type="spellStart"/>
       <w:r>
         <w:t>vercel</w:t>
       </w:r>
       <w:proofErr w:type="spellEnd"/>
-      <w:r>
-        <w:t xml:space="preserve"> and added it to .</w:t>
+      <w:proofErr w:type="gramEnd"/>
+      <w:r>
+        <w:t xml:space="preserve"> and added it </w:t>
+      </w:r>
+      <w:proofErr w:type="gramStart"/>
+      <w:r>
+        <w:t>to .</w:t>
       </w:r>
       <w:proofErr w:type="spellStart"/>
       <w:r>
@@ -770,7 +837,19 @@
       </w:r>
       <w:proofErr w:type="spellEnd"/>
       <w:r>
-        <w:t xml:space="preserve">) ? Would you like to pull environment variables now? yes &gt; Downloading `development` Environment Variables for </w:t>
+        <w:t>) ?</w:t>
+      </w:r>
+      <w:proofErr w:type="gramEnd"/>
+      <w:r>
+        <w:t xml:space="preserve"> Would you like to pull environment variables now? </w:t>
+      </w:r>
+      <w:proofErr w:type="gramStart"/>
+      <w:r>
+        <w:t>yes</w:t>
+      </w:r>
+      <w:proofErr w:type="gramEnd"/>
+      <w:r>
+        <w:t xml:space="preserve"> &gt; Downloading `development` Environment Variables for </w:t>
       </w:r>
       <w:proofErr w:type="spellStart"/>
       <w:r>
@@ -787,21 +866,34 @@
         <w:t>✅</w:t>
       </w:r>
       <w:r>
-        <w:t xml:space="preserve"> Created .</w:t>
+        <w:t xml:space="preserve"> </w:t>
+      </w:r>
+      <w:proofErr w:type="gramStart"/>
+      <w:r>
+        <w:t>Created .</w:t>
       </w:r>
       <w:proofErr w:type="spellStart"/>
       <w:r>
-        <w:t>env.local</w:t>
+        <w:t>env</w:t>
+      </w:r>
+      <w:proofErr w:type="gramEnd"/>
+      <w:r>
+        <w:t>.local</w:t>
       </w:r>
       <w:proofErr w:type="spellEnd"/>
       <w:r>
-        <w:t xml:space="preserve"> file and added it to .</w:t>
+        <w:t xml:space="preserve"> file and added it </w:t>
+      </w:r>
+      <w:proofErr w:type="gramStart"/>
+      <w:r>
+        <w:t>to .</w:t>
       </w:r>
       <w:proofErr w:type="spellStart"/>
       <w:r>
         <w:t>gitignore</w:t>
       </w:r>
       <w:proofErr w:type="spellEnd"/>
+      <w:proofErr w:type="gramEnd"/>
       <w:r>
         <w:t xml:space="preserve"> [188ms] Error: EBUSY: resource busy or locked, open 'C:\Users\</w:t>
       </w:r>
@@ -951,7 +1043,15 @@
     </w:p>
     <w:p>
       <w:r>
-        <w:t>写真は直接カメラで撮影するとライブラリからするの2パターンが選択出来るようにして下さい。</w:t>
+        <w:t>写真は直接カメラで撮影するとライブラリから</w:t>
+      </w:r>
+      <w:proofErr w:type="gramStart"/>
+      <w:r>
+        <w:t>するの</w:t>
+      </w:r>
+      <w:proofErr w:type="gramEnd"/>
+      <w:r>
+        <w:t>2パターンが選択出来るようにして下さい。</w:t>
       </w:r>
     </w:p>
     <w:p>
@@ -1466,7 +1566,15 @@
     </w:p>
     <w:p>
       <w:r>
-        <w:t>「ID: ...」が出ました。それでも消えません</w:t>
+        <w:t xml:space="preserve">「ID: </w:t>
+      </w:r>
+      <w:proofErr w:type="gramStart"/>
+      <w:r>
+        <w:t>...</w:t>
+      </w:r>
+      <w:proofErr w:type="gramEnd"/>
+      <w:r>
+        <w:t>」が出ました。それでも消えません</w:t>
       </w:r>
     </w:p>
     <w:p>
@@ -1627,7 +1735,15 @@
     </w:p>
     <w:p>
       <w:r>
-        <w:t>２つのブラウザからそれそれ災害情報を入力しました。スプレットシートには2件のデータがありますが、2つのブラウザにはSever:2￥1件 Local 1件と表示され、履歴は表示しなくなりました。改善出来ますか？</w:t>
+        <w:t>２つのブラウザから</w:t>
+      </w:r>
+      <w:proofErr w:type="gramStart"/>
+      <w:r>
+        <w:t>それそれ</w:t>
+      </w:r>
+      <w:proofErr w:type="gramEnd"/>
+      <w:r>
+        <w:t>災害情報を入力しました。スプレットシートには2件のデータがありますが、2つのブラウザにはSever:2￥1件 Local 1件と表示され、履歴は表示しなくなりました。改善出来ますか？</w:t>
       </w:r>
     </w:p>
     <w:p>
@@ -1637,7 +1753,15 @@
     </w:p>
     <w:p>
       <w:r>
-        <w:t>先ほどの質問は訂正します。２つのブラウザからそれそれ災害情報を入力しました。スプレットシートには2件のデータがありますが、2つのブラウザにはSever:1件 Local 1件と表示され、履歴は表示しなくなりました。改善出来ますか？</w:t>
+        <w:t>先ほどの質問は訂正します。２つのブラウザから</w:t>
+      </w:r>
+      <w:proofErr w:type="gramStart"/>
+      <w:r>
+        <w:t>それそれ</w:t>
+      </w:r>
+      <w:proofErr w:type="gramEnd"/>
+      <w:r>
+        <w:t>災害情報を入力しました。スプレットシートには2件のデータがありますが、2つのブラウザにはSever:1件 Local 1件と表示され、履歴は表示しなくなりました。改善出来ますか？</w:t>
       </w:r>
     </w:p>
     <w:p>
@@ -1904,7 +2028,15 @@
     </w:p>
     <w:p>
       <w:r>
-        <w:t xml:space="preserve">何度やっても正しく表示されませんね。タイムラインに表示されるメッセージです。Server: 2件, Local: 1件 ID: ... カテゴリなし 送信済 Corp: なし | Cat: なし | Detail: なし 1/15 16:56 | </w:t>
+        <w:t xml:space="preserve">何度やっても正しく表示されませんね。タイムラインに表示されるメッセージです。Server: 2件, Local: 1件 ID: </w:t>
+      </w:r>
+      <w:proofErr w:type="gramStart"/>
+      <w:r>
+        <w:t>...</w:t>
+      </w:r>
+      <w:proofErr w:type="gramEnd"/>
+      <w:r>
+        <w:t xml:space="preserve"> カテゴリなし 送信済 Corp: なし | Cat: なし | Detail: なし 1/15 16:56 | </w:t>
       </w:r>
     </w:p>
     <w:p>
@@ -2115,38 +2247,72 @@
         <w:t xml:space="preserve"> Date ? </w:t>
       </w:r>
       <w:proofErr w:type="spellStart"/>
-      <w:r>
-        <w:t>obj.timestamp.getTime</w:t>
+      <w:proofErr w:type="gramStart"/>
+      <w:r>
+        <w:t>obj.timestamp</w:t>
+      </w:r>
+      <w:proofErr w:type="gramEnd"/>
+      <w:r>
+        <w:t>.</w:t>
+      </w:r>
+      <w:proofErr w:type="gramStart"/>
+      <w:r>
+        <w:t>getTime</w:t>
       </w:r>
       <w:proofErr w:type="spellEnd"/>
       <w:r>
-        <w:t>() : null; if (!</w:t>
+        <w:t>() :</w:t>
+      </w:r>
+      <w:proofErr w:type="gramEnd"/>
+      <w:r>
+        <w:t xml:space="preserve"> null; if </w:t>
+      </w:r>
+      <w:proofErr w:type="gramStart"/>
+      <w:r>
+        <w:t>(!</w:t>
       </w:r>
       <w:proofErr w:type="spellStart"/>
       <w:r>
         <w:t>finalTimestamp</w:t>
       </w:r>
       <w:proofErr w:type="spellEnd"/>
+      <w:proofErr w:type="gramEnd"/>
       <w:r>
         <w:t xml:space="preserve"> &amp;&amp; </w:t>
       </w:r>
       <w:proofErr w:type="spellStart"/>
+      <w:proofErr w:type="gramStart"/>
       <w:r>
         <w:t>obj.timestamp</w:t>
       </w:r>
       <w:proofErr w:type="spellEnd"/>
-      <w:r>
-        <w:t xml:space="preserve">) { try { </w:t>
+      <w:proofErr w:type="gramEnd"/>
+      <w:r>
+        <w:t xml:space="preserve">) </w:t>
+      </w:r>
+      <w:proofErr w:type="gramStart"/>
+      <w:r>
+        <w:t>{ try</w:t>
+      </w:r>
+      <w:proofErr w:type="gramEnd"/>
+      <w:r>
+        <w:t xml:space="preserve"> </w:t>
+      </w:r>
+      <w:proofErr w:type="gramStart"/>
+      <w:r>
+        <w:t xml:space="preserve">{ </w:t>
       </w:r>
       <w:proofErr w:type="spellStart"/>
       <w:r>
         <w:t>finalTimestamp</w:t>
       </w:r>
       <w:proofErr w:type="spellEnd"/>
+      <w:proofErr w:type="gramEnd"/>
       <w:r>
         <w:t xml:space="preserve"> = new Date(</w:t>
       </w:r>
       <w:proofErr w:type="spellStart"/>
+      <w:proofErr w:type="gramStart"/>
       <w:r>
         <w:t>obj.timestamp</w:t>
       </w:r>
@@ -2159,9 +2325,23 @@
         <w:t>getTime</w:t>
       </w:r>
       <w:proofErr w:type="spellEnd"/>
-      <w:r>
-        <w:t>(); } catch (e) {</w:t>
-      </w:r>
+      <w:proofErr w:type="gramEnd"/>
+      <w:r>
+        <w:t>()</w:t>
+      </w:r>
+      <w:proofErr w:type="gramStart"/>
+      <w:r>
+        <w:t>; }</w:t>
+      </w:r>
+      <w:proofErr w:type="gramEnd"/>
+      <w:r>
+        <w:t xml:space="preserve"> catch (</w:t>
+      </w:r>
+      <w:proofErr w:type="gramStart"/>
+      <w:r>
+        <w:t>e) {</w:t>
+      </w:r>
+      <w:proofErr w:type="gramEnd"/>
     </w:p>
     <w:p>
       <w:r>
@@ -2809,7 +2989,15 @@
         <w:t>​​</w:t>
       </w:r>
       <w:r>
-        <w:t>tail","Lat","Lng","Descri ption","Status","PhotoURLs"],"_debug_keys":["ID-&gt;id","Timestamp-&gt;timestamp","ReportDate-&gt;reportDate","Corp-&gt;corp","Category-&gt;category","CategoryDe</w:t>
+        <w:t>tail","Lat","Lng","Descri ption","Status","PhotoURLs"],"_debug_keys":["ID-&gt;id","Timestamp-&gt;timestamp"</w:t>
+      </w:r>
+      <w:proofErr w:type="gramStart"/>
+      <w:r>
+        <w:t>,</w:t>
+      </w:r>
+      <w:proofErr w:type="gramEnd"/>
+      <w:r>
+        <w:t>"ReportDate-&gt;reportDate","Corp-&gt;corp","Category-&gt;category","CategoryDe</w:t>
       </w:r>
       <w:r>
         <w:rPr>
@@ -2850,7 +3038,15 @@
       </w:r>
       <w:r>
         <w:lastRenderedPageBreak/>
-        <w:t>erver","created_at":1768467087821,"_debug_headers":["ID","Timestamp","ReportDate","Corp","Category","CategoryDe</w:t>
+        <w:t>erver","created_at":1768467087821,"_debug_headers":["ID"</w:t>
+      </w:r>
+      <w:proofErr w:type="gramStart"/>
+      <w:r>
+        <w:t>,</w:t>
+      </w:r>
+      <w:proofErr w:type="gramEnd"/>
+      <w:r>
+        <w:t>"Timestamp","ReportDate","Corp","Category","CategoryDe</w:t>
       </w:r>
       <w:r>
         <w:rPr>
@@ -2877,7 +3073,15 @@
         <w:t>​​</w:t>
       </w:r>
       <w:r>
-        <w:t>tail","Lat-&gt;lat","Lng-&gt;ln g","説明-&gt;メモ","ステータス-&gt;ステータス","写真URL-&gt;写真URL"]},{"id":"a7e4f82e-484b-43b1-8bd7-01055906 483b","data":{"reportDate":"2026-01-15T07:56:00.000Z","corp":"2分団","category":"倒木","</w:t>
+        <w:t>tail"</w:t>
+      </w:r>
+      <w:proofErr w:type="gramStart"/>
+      <w:r>
+        <w:t>,</w:t>
+      </w:r>
+      <w:proofErr w:type="gramEnd"/>
+      <w:r>
+        <w:t>"Lat-&gt;lat","Lng-&gt;ln g","説明-&gt;メモ","ステータス-&gt;ステータス","写真URL-&gt;写真URL"]},{"id":"a7e4f82e-484b-43b1-8bd7-01055906 483b","data":{"reportDate":"2026-01-15T07:56:00.000Z","corp":"2分団","category":"倒木","</w:t>
       </w:r>
       <w:proofErr w:type="spellStart"/>
       <w:r>
@@ -2923,7 +3127,15 @@
       </w:r>
       <w:proofErr w:type="spellEnd"/>
       <w:r>
-        <w:t>","カテゴリ-&gt;category","カテゴリ詳細-&gt;</w:t>
+        <w:t>"</w:t>
+      </w:r>
+      <w:proofErr w:type="gramStart"/>
+      <w:r>
+        <w:t>,</w:t>
+      </w:r>
+      <w:proofErr w:type="gramEnd"/>
+      <w:r>
+        <w:t>"カテゴリ-&gt;category","カテゴリ詳細-&gt;</w:t>
       </w:r>
       <w:proofErr w:type="spellStart"/>
       <w:r>
@@ -2961,7 +3173,15 @@
       </w:r>
       <w:proofErr w:type="spellEnd"/>
       <w:r>
-        <w:t>","説明-&gt;memo","ステータス-&gt;s tatus","PhotoURLs-&gt;photoUrls"]},{"id":"48115d59-3348-4a5a-8b2b-cd52c67df4d6","data":{"reportDate":"2026-01-15T07:55:0 0.000Z","corp":"1分団（久原）","category":"土砂崩れ","</w:t>
+        <w:t>","説明-&gt;memo","ステータス-&gt;s tatus","PhotoURLs-&gt;photoUrls"]},{"id":"48115d59-3348-4a5a-8b2b-cd52c67df4d6","data":{"reportDate":"2026-01-15T07:55:0 0.000Z","corp":"1分団（久原）","category":"土砂崩れ"</w:t>
+      </w:r>
+      <w:proofErr w:type="gramStart"/>
+      <w:r>
+        <w:t>,</w:t>
+      </w:r>
+      <w:proofErr w:type="gramEnd"/>
+      <w:r>
+        <w:t>"</w:t>
       </w:r>
       <w:proofErr w:type="spellStart"/>
       <w:r>
@@ -3212,7 +3432,15 @@
     </w:p>
     <w:p>
       <w:r>
-        <w:t>Server IDs:97b4,be17,a7e4,4811,82cd Local IDs: Local Pending Count:0</w:t>
+        <w:t>Server IDs:97b</w:t>
+      </w:r>
+      <w:proofErr w:type="gramStart"/>
+      <w:r>
+        <w:t>4,be17,a</w:t>
+      </w:r>
+      <w:proofErr w:type="gramEnd"/>
+      <w:r>
+        <w:t>7e4,4811,82cd Local IDs: Local Pending Count:0</w:t>
       </w:r>
     </w:p>
     <w:p>
@@ -3222,7 +3450,15 @@
     </w:p>
     <w:p>
       <w:r>
-        <w:t>活動状況の書き換え成功しました。ありがとうございます。デバック用の文字列を削除して下さい。</w:t>
+        <w:t>活動</w:t>
+      </w:r>
+      <w:proofErr w:type="gramStart"/>
+      <w:r>
+        <w:t>状況の書き換え成功しました</w:t>
+      </w:r>
+      <w:proofErr w:type="gramEnd"/>
+      <w:r>
+        <w:t>。ありがとうございます。デバック用の文字列を削除して下さい。</w:t>
       </w:r>
     </w:p>
     <w:p>
@@ -3261,14 +3497,24 @@
         <w:t>から</w:t>
       </w:r>
       <w:proofErr w:type="spellStart"/>
+      <w:proofErr w:type="gramStart"/>
       <w:r>
         <w:t>umap</w:t>
       </w:r>
       <w:proofErr w:type="spellEnd"/>
       <w:r>
-        <w:t>への変更して災害報告の全てのポイントを書き込んだり</w:t>
+        <w:t>への変更して</w:t>
+      </w:r>
+      <w:proofErr w:type="gramEnd"/>
+      <w:r>
+        <w:t>災害報告の全てのポイントを</w:t>
+      </w:r>
+      <w:proofErr w:type="gramStart"/>
+      <w:r>
+        <w:t>書き込んだり</w:t>
       </w:r>
       <w:proofErr w:type="spellStart"/>
+      <w:proofErr w:type="gramEnd"/>
       <w:r>
         <w:t>GoogleMyMap</w:t>
       </w:r>
@@ -3298,10 +3544,12 @@
         <w:t xml:space="preserve">Proceeded </w:t>
       </w:r>
       <w:proofErr w:type="spellStart"/>
+      <w:proofErr w:type="gramStart"/>
       <w:r>
         <w:t>withImplementation</w:t>
       </w:r>
       <w:proofErr w:type="spellEnd"/>
+      <w:proofErr w:type="gramEnd"/>
       <w:r>
         <w:t xml:space="preserve"> Plan</w:t>
       </w:r>
@@ -3463,10 +3711,12 @@
         <w:t xml:space="preserve">Proceeded </w:t>
       </w:r>
       <w:proofErr w:type="spellStart"/>
+      <w:proofErr w:type="gramStart"/>
       <w:r>
         <w:t>withImplementation</w:t>
       </w:r>
       <w:proofErr w:type="spellEnd"/>
+      <w:proofErr w:type="gramEnd"/>
       <w:r>
         <w:t xml:space="preserve"> Plan</w:t>
       </w:r>
@@ -3603,9 +3853,11 @@
       </w:r>
     </w:p>
     <w:p>
+      <w:proofErr w:type="gramStart"/>
       <w:r>
         <w:t>Continue</w:t>
       </w:r>
+      <w:proofErr w:type="gramEnd"/>
     </w:p>
     <w:p>
       <w:r>
@@ -3638,9 +3890,11 @@
       </w:r>
     </w:p>
     <w:p>
+      <w:proofErr w:type="gramStart"/>
       <w:r>
         <w:t>Continue</w:t>
       </w:r>
+      <w:proofErr w:type="gramEnd"/>
     </w:p>
     <w:p>
       <w:r>
@@ -3699,7 +3953,15 @@
     </w:p>
     <w:p>
       <w:r>
-        <w:t>まだ、Chromeでは起動直後に位置情報の許可ポップアップ表示されません。一度履歴画面を開いて戻るとポップアップ表示されます。修正出来ますか？</w:t>
+        <w:t>まだ、Chromeでは起動直後に位置</w:t>
+      </w:r>
+      <w:proofErr w:type="gramStart"/>
+      <w:r>
+        <w:t>情報の許可ポップアップ表示されません</w:t>
+      </w:r>
+      <w:proofErr w:type="gramEnd"/>
+      <w:r>
+        <w:t>。一度履歴画面を開いて戻るとポップアップ表示されます。修正出来ますか？</w:t>
       </w:r>
     </w:p>
     <w:p>
@@ -3940,9 +4202,11 @@
       </w:r>
     </w:p>
     <w:p>
+      <w:proofErr w:type="gramStart"/>
       <w:r>
         <w:t>Continue</w:t>
       </w:r>
+      <w:proofErr w:type="gramEnd"/>
     </w:p>
     <w:p>
       <w:r>
@@ -4030,9 +4294,11 @@
       </w:r>
     </w:p>
     <w:p>
+      <w:proofErr w:type="gramStart"/>
       <w:r>
         <w:t>Continue</w:t>
       </w:r>
+      <w:proofErr w:type="gramEnd"/>
     </w:p>
     <w:p>
       <w:r>
@@ -4116,9 +4382,11 @@
       </w:r>
     </w:p>
     <w:p>
+      <w:proofErr w:type="gramStart"/>
       <w:r>
         <w:t>Continue</w:t>
       </w:r>
+      <w:proofErr w:type="gramEnd"/>
     </w:p>
     <w:p>
       <w:r>
@@ -4141,9 +4409,11 @@
       </w:r>
     </w:p>
     <w:p>
+      <w:proofErr w:type="gramStart"/>
       <w:r>
         <w:t>Continue</w:t>
       </w:r>
+      <w:proofErr w:type="gramEnd"/>
     </w:p>
     <w:p>
       <w:r>
@@ -4270,9 +4540,11 @@
       </w:r>
     </w:p>
     <w:p>
+      <w:proofErr w:type="gramStart"/>
       <w:r>
         <w:t>Continue</w:t>
       </w:r>
+      <w:proofErr w:type="gramEnd"/>
     </w:p>
     <w:p>
       <w:r>
@@ -4284,10 +4556,12 @@
         <w:t xml:space="preserve">Proceeded </w:t>
       </w:r>
       <w:proofErr w:type="spellStart"/>
+      <w:proofErr w:type="gramStart"/>
       <w:r>
         <w:t>withImplementation</w:t>
       </w:r>
       <w:proofErr w:type="spellEnd"/>
+      <w:proofErr w:type="gramEnd"/>
       <w:r>
         <w:t xml:space="preserve"> Plan</w:t>
       </w:r>
@@ -4476,7 +4750,55 @@
           <w:b/>
           <w:bCs/>
         </w:rPr>
-        <w:t>「ファイル (File)」 ＞ 「フォルダーを開く... (Open Folder...)」</w:t>
+        <w:t>「ファイル (File)」 ＞ 「</w:t>
+      </w:r>
+      <w:proofErr w:type="gramStart"/>
+      <w:r>
+        <w:rPr>
+          <w:b/>
+          <w:bCs/>
+        </w:rPr>
+        <w:t>フォルダー</w:t>
+      </w:r>
+      <w:proofErr w:type="gramEnd"/>
+      <w:r>
+        <w:rPr>
+          <w:b/>
+          <w:bCs/>
+        </w:rPr>
+        <w:t>を開く</w:t>
+      </w:r>
+      <w:proofErr w:type="gramStart"/>
+      <w:r>
+        <w:rPr>
+          <w:b/>
+          <w:bCs/>
+        </w:rPr>
+        <w:t>...</w:t>
+      </w:r>
+      <w:proofErr w:type="gramEnd"/>
+      <w:r>
+        <w:rPr>
+          <w:b/>
+          <w:bCs/>
+        </w:rPr>
+        <w:t xml:space="preserve"> (Open Folder</w:t>
+      </w:r>
+      <w:proofErr w:type="gramStart"/>
+      <w:r>
+        <w:rPr>
+          <w:b/>
+          <w:bCs/>
+        </w:rPr>
+        <w:t>...</w:t>
+      </w:r>
+      <w:proofErr w:type="gramEnd"/>
+      <w:r>
+        <w:rPr>
+          <w:b/>
+          <w:bCs/>
+        </w:rPr>
+        <w:t>)」</w:t>
       </w:r>
       <w:r>
         <w:t> をクリックします。</w:t>
@@ -4489,8 +4811,13 @@
           <w:numId w:val="1"/>
         </w:numPr>
       </w:pPr>
-      <w:r>
-        <w:t>フォルダ選択画面が出るので、エクスプローラーから </w:t>
+      <w:proofErr w:type="gramStart"/>
+      <w:r>
+        <w:t>フォルダ</w:t>
+      </w:r>
+      <w:proofErr w:type="gramEnd"/>
+      <w:r>
+        <w:t>選択画面が出るので、エクスプローラーから </w:t>
       </w:r>
       <w:r>
         <w:rPr>
@@ -4500,7 +4827,15 @@
         <w:t>C:\Users\tanak\OneDrive\Ai\SaigaiReport</w:t>
       </w:r>
       <w:r>
-        <w:t> を選んで「フォルダーの選択」を押します。</w:t>
+        <w:t> を選んで「</w:t>
+      </w:r>
+      <w:proofErr w:type="gramStart"/>
+      <w:r>
+        <w:t>フォルダー</w:t>
+      </w:r>
+      <w:proofErr w:type="gramEnd"/>
+      <w:r>
+        <w:t>の選択」を押します。</w:t>
       </w:r>
     </w:p>
     <w:p>
@@ -5012,8 +5347,13 @@
     </w:p>
     <w:p>
       <w:r>
-        <w:t>code.gsの修正中...</w:t>
-      </w:r>
+        <w:t>code.gsの修正中</w:t>
+      </w:r>
+      <w:proofErr w:type="gramStart"/>
+      <w:r>
+        <w:t>...</w:t>
+      </w:r>
+      <w:proofErr w:type="gramEnd"/>
     </w:p>
     <w:p>
       <w:r>
@@ -5288,8 +5628,13 @@
       </w:r>
       <w:proofErr w:type="spellEnd"/>
       <w:r>
-        <w:t>の修正中...</w:t>
-      </w:r>
+        <w:t>の修正中</w:t>
+      </w:r>
+      <w:proofErr w:type="gramStart"/>
+      <w:r>
+        <w:t>...</w:t>
+      </w:r>
+      <w:proofErr w:type="gramEnd"/>
     </w:p>
     <w:p>
       <w:r>
@@ -5493,8 +5838,13 @@
     </w:p>
     <w:p>
       <w:r>
-        <w:t>修正内容の動作確認とウォークスルーの作成中...</w:t>
-      </w:r>
+        <w:t>修正内容の動作確認とウォークスルーの作成中</w:t>
+      </w:r>
+      <w:proofErr w:type="gramStart"/>
+      <w:r>
+        <w:t>...</w:t>
+      </w:r>
+      <w:proofErr w:type="gramEnd"/>
     </w:p>
     <w:p>
       <w:r>
@@ -5503,8 +5853,13 @@
     </w:p>
     <w:p>
       <w:r>
-        <w:t>walkthrough.mdの作成中...</w:t>
-      </w:r>
+        <w:t>walkthrough.mdの作成中</w:t>
+      </w:r>
+      <w:proofErr w:type="gramStart"/>
+      <w:r>
+        <w:t>...</w:t>
+      </w:r>
+      <w:proofErr w:type="gramEnd"/>
     </w:p>
     <w:p>
       <w:r>
@@ -6083,8 +6438,13 @@
       </w:r>
       <w:proofErr w:type="spellEnd"/>
       <w:r>
-        <w:t>のURL更新中...</w:t>
-      </w:r>
+        <w:t>のURL更新中</w:t>
+      </w:r>
+      <w:proofErr w:type="gramStart"/>
+      <w:r>
+        <w:t>...</w:t>
+      </w:r>
+      <w:proofErr w:type="gramEnd"/>
     </w:p>
     <w:p>
       <w:r>
@@ -6120,7 +6480,15 @@
       </w:r>
       <w:proofErr w:type="spellEnd"/>
       <w:r>
-        <w:t> の GAS_URL も新しいもの（AKfycby8dsCx...）に書き換えました。</w:t>
+        <w:t> の GAS_URL も新しいもの（AKfycby8dsCx</w:t>
+      </w:r>
+      <w:proofErr w:type="gramStart"/>
+      <w:r>
+        <w:t>...</w:t>
+      </w:r>
+      <w:proofErr w:type="gramEnd"/>
+      <w:r>
+        <w:t>）に書き換えました。</w:t>
       </w:r>
     </w:p>
     <w:p>
@@ -6465,8 +6833,13 @@
     </w:p>
     <w:p>
       <w:r>
-        <w:t>GASのデバッグ情報の収集...</w:t>
-      </w:r>
+        <w:t>GASのデバッグ情報の収集</w:t>
+      </w:r>
+      <w:proofErr w:type="gramStart"/>
+      <w:r>
+        <w:t>...</w:t>
+      </w:r>
+      <w:proofErr w:type="gramEnd"/>
     </w:p>
     <w:p>
       <w:r>
@@ -6749,8 +7122,13 @@
       </w:r>
       <w:proofErr w:type="spellEnd"/>
       <w:r>
-        <w:t>でのデバッグ情報の表示更新...</w:t>
-      </w:r>
+        <w:t>でのデバッグ情報の表示更新</w:t>
+      </w:r>
+      <w:proofErr w:type="gramStart"/>
+      <w:r>
+        <w:t>...</w:t>
+      </w:r>
+      <w:proofErr w:type="gramEnd"/>
     </w:p>
     <w:p>
       <w:r>
@@ -6954,8 +7332,13 @@
     </w:p>
     <w:p>
       <w:r>
-        <w:t>walkthrough.mdを更新し、詳細なデバッグ手順を準備中...</w:t>
-      </w:r>
+        <w:t>walkthrough.mdを更新し、詳細なデバッグ手順を準備中</w:t>
+      </w:r>
+      <w:proofErr w:type="gramStart"/>
+      <w:r>
+        <w:t>...</w:t>
+      </w:r>
+      <w:proofErr w:type="gramEnd"/>
     </w:p>
     <w:p>
       <w:r>
@@ -6964,8 +7347,13 @@
     </w:p>
     <w:p>
       <w:r>
-        <w:t>ユーザーに対して情報の再展開とデバッグ手順の案内を送信中...</w:t>
-      </w:r>
+        <w:t>ユーザーに対して情報の再展開とデバッグ手順の案内を送信中</w:t>
+      </w:r>
+      <w:proofErr w:type="gramStart"/>
+      <w:r>
+        <w:t>...</w:t>
+      </w:r>
+      <w:proofErr w:type="gramEnd"/>
     </w:p>
     <w:p>
       <w:proofErr w:type="spellStart"/>
@@ -7328,8 +7716,13 @@
     </w:p>
     <w:p>
       <w:r>
-        <w:t>GASのデバッグ情報の収集...</w:t>
-      </w:r>
+        <w:t>GASのデバッグ情報の収集</w:t>
+      </w:r>
+      <w:proofErr w:type="gramStart"/>
+      <w:r>
+        <w:t>...</w:t>
+      </w:r>
+      <w:proofErr w:type="gramEnd"/>
     </w:p>
     <w:p>
       <w:r>
@@ -7611,8 +8004,13 @@
       </w:r>
       <w:proofErr w:type="spellEnd"/>
       <w:r>
-        <w:t>でのデバッグ情報の表示更新...</w:t>
-      </w:r>
+        <w:t>でのデバッグ情報の表示更新</w:t>
+      </w:r>
+      <w:proofErr w:type="gramStart"/>
+      <w:r>
+        <w:t>...</w:t>
+      </w:r>
+      <w:proofErr w:type="gramEnd"/>
     </w:p>
     <w:p>
       <w:r>
@@ -7817,8 +8215,13 @@
     </w:p>
     <w:p>
       <w:r>
-        <w:t>walkthrough.mdを更新し、詳細なデバッグ手順を準備中...</w:t>
-      </w:r>
+        <w:t>walkthrough.mdを更新し、詳細なデバッグ手順を準備中</w:t>
+      </w:r>
+      <w:proofErr w:type="gramStart"/>
+      <w:r>
+        <w:t>...</w:t>
+      </w:r>
+      <w:proofErr w:type="gramEnd"/>
     </w:p>
     <w:p>
       <w:r>
@@ -7827,8 +8230,13 @@
     </w:p>
     <w:p>
       <w:r>
-        <w:t>ユーザーに対して情報の再展開とデバッグ手順の案内を送信中...</w:t>
-      </w:r>
+        <w:t>ユーザーに対して情報の再展開とデバッグ手順の案内を送信中</w:t>
+      </w:r>
+      <w:proofErr w:type="gramStart"/>
+      <w:r>
+        <w:t>...</w:t>
+      </w:r>
+      <w:proofErr w:type="gramEnd"/>
     </w:p>
     <w:p>
       <w:proofErr w:type="spellStart"/>
@@ -8447,8 +8855,13 @@
     </w:p>
     <w:p>
       <w:r>
-        <w:t>code.gsのヘッダー制御を改善中...</w:t>
-      </w:r>
+        <w:t>code.gsのヘッダー制御を改善中</w:t>
+      </w:r>
+      <w:proofErr w:type="gramStart"/>
+      <w:r>
+        <w:t>...</w:t>
+      </w:r>
+      <w:proofErr w:type="gramEnd"/>
     </w:p>
     <w:p>
       <w:r>
@@ -8462,8 +8875,13 @@
       </w:r>
       <w:proofErr w:type="spellEnd"/>
       <w:r>
-        <w:t>のURL同期中...</w:t>
-      </w:r>
+        <w:t>のURL同期中</w:t>
+      </w:r>
+      <w:proofErr w:type="gramStart"/>
+      <w:r>
+        <w:t>...</w:t>
+      </w:r>
+      <w:proofErr w:type="gramEnd"/>
     </w:p>
     <w:p>
       <w:r>
@@ -8657,8 +9075,13 @@
     </w:p>
     <w:p>
       <w:r>
-        <w:t>walkthrough.mdの更新と完了報告の準備中...</w:t>
-      </w:r>
+        <w:t>walkthrough.mdの更新と完了報告の準備中</w:t>
+      </w:r>
+      <w:proofErr w:type="gramStart"/>
+      <w:r>
+        <w:t>...</w:t>
+      </w:r>
+      <w:proofErr w:type="gramEnd"/>
     </w:p>
     <w:p>
       <w:r>
@@ -8856,8 +9279,13 @@
     </w:p>
     <w:p>
       <w:r>
-        <w:t>ユーザーに最終報告を送信中...</w:t>
-      </w:r>
+        <w:t>ユーザーに最終報告を送信中</w:t>
+      </w:r>
+      <w:proofErr w:type="gramStart"/>
+      <w:r>
+        <w:t>...</w:t>
+      </w:r>
+      <w:proofErr w:type="gramEnd"/>
     </w:p>
     <w:p>
       <w:r>
@@ -9648,8 +10076,13 @@
     </w:p>
     <w:p>
       <w:r>
-        <w:t>プロジェクト全体でのGAS_URLの整合性を確認中...</w:t>
-      </w:r>
+        <w:t>プロジェクト全体でのGAS_URLの整合性を確認中</w:t>
+      </w:r>
+      <w:proofErr w:type="gramStart"/>
+      <w:r>
+        <w:t>...</w:t>
+      </w:r>
+      <w:proofErr w:type="gramEnd"/>
     </w:p>
     <w:p>
       <w:r>
@@ -9658,8 +10091,13 @@
     </w:p>
     <w:p>
       <w:r>
-        <w:t>実装計画の策定中...</w:t>
-      </w:r>
+        <w:t>実装計画の策定中</w:t>
+      </w:r>
+      <w:proofErr w:type="gramStart"/>
+      <w:r>
+        <w:t>...</w:t>
+      </w:r>
+      <w:proofErr w:type="gramEnd"/>
     </w:p>
     <w:p>
       <w:r>
@@ -9668,8 +10106,13 @@
     </w:p>
     <w:p>
       <w:r>
-        <w:t>フロントエンドの共通設定化（config.js）の適用中...</w:t>
-      </w:r>
+        <w:t>フロントエンドの共通設定化（config.js）の適用中</w:t>
+      </w:r>
+      <w:proofErr w:type="gramStart"/>
+      <w:r>
+        <w:t>...</w:t>
+      </w:r>
+      <w:proofErr w:type="gramEnd"/>
     </w:p>
     <w:p>
       <w:r>
@@ -9691,8 +10134,13 @@
       </w:r>
       <w:proofErr w:type="spellEnd"/>
       <w:r>
-        <w:t>へのconfig.js適用中...</w:t>
-      </w:r>
+        <w:t>へのconfig.js適用中</w:t>
+      </w:r>
+      <w:proofErr w:type="gramStart"/>
+      <w:r>
+        <w:t>...</w:t>
+      </w:r>
+      <w:proofErr w:type="gramEnd"/>
     </w:p>
     <w:p>
       <w:r>
@@ -9706,8 +10154,13 @@
       </w:r>
       <w:proofErr w:type="spellEnd"/>
       <w:r>
-        <w:t>のハードコードURLを完全に削除し、config.jsへの移行を完了中...</w:t>
-      </w:r>
+        <w:t>のハードコードURLを完全に削除し、config.jsへの移行を完了中</w:t>
+      </w:r>
+      <w:proofErr w:type="gramStart"/>
+      <w:r>
+        <w:t>...</w:t>
+      </w:r>
+      <w:proofErr w:type="gramEnd"/>
     </w:p>
     <w:p>
       <w:r>
@@ -9721,8 +10174,13 @@
       </w:r>
       <w:proofErr w:type="spellEnd"/>
       <w:r>
-        <w:t>の最終修正と動作確認ガイドの更新中...</w:t>
-      </w:r>
+        <w:t>の最終修正と動作確認ガイドの更新中</w:t>
+      </w:r>
+      <w:proofErr w:type="gramStart"/>
+      <w:r>
+        <w:t>...</w:t>
+      </w:r>
+      <w:proofErr w:type="gramEnd"/>
     </w:p>
     <w:p>
       <w:r>
@@ -9731,8 +10189,13 @@
     </w:p>
     <w:p>
       <w:r>
-        <w:t>code.gsの完全互換化とデバッグ機能の最終調整中...</w:t>
-      </w:r>
+        <w:t>code.gsの完全互換化とデバッグ機能の最終調整中</w:t>
+      </w:r>
+      <w:proofErr w:type="gramStart"/>
+      <w:r>
+        <w:t>...</w:t>
+      </w:r>
+      <w:proofErr w:type="gramEnd"/>
     </w:p>
     <w:p>
       <w:r>
@@ -9948,8 +10411,13 @@
     </w:p>
     <w:p>
       <w:r>
-        <w:t>walkthrough.mdを更新し、最終的な解決策をユーザーに案内中...</w:t>
-      </w:r>
+        <w:t>walkthrough.mdを更新し、最終的な解決策をユーザーに案内中</w:t>
+      </w:r>
+      <w:proofErr w:type="gramStart"/>
+      <w:r>
+        <w:t>...</w:t>
+      </w:r>
+      <w:proofErr w:type="gramEnd"/>
     </w:p>
     <w:p>
       <w:r>
@@ -9958,8 +10426,13 @@
     </w:p>
     <w:p>
       <w:r>
-        <w:t>ユーザーに最終報告を送信中...</w:t>
-      </w:r>
+        <w:t>ユーザーに最終報告を送信中</w:t>
+      </w:r>
+      <w:proofErr w:type="gramStart"/>
+      <w:r>
+        <w:t>...</w:t>
+      </w:r>
+      <w:proofErr w:type="gramEnd"/>
     </w:p>
     <w:p>
       <w:r>
@@ -10706,8 +11179,13 @@
       </w:r>
       <w:proofErr w:type="spellEnd"/>
       <w:r>
-        <w:t>のコードとGASのデータ長制限を確認中...</w:t>
-      </w:r>
+        <w:t>のコードとGASのデータ長制限を確認中</w:t>
+      </w:r>
+      <w:proofErr w:type="gramStart"/>
+      <w:r>
+        <w:t>...</w:t>
+      </w:r>
+      <w:proofErr w:type="gramEnd"/>
     </w:p>
     <w:p>
       <w:r>
@@ -10716,8 +11194,13 @@
     </w:p>
     <w:p>
       <w:r>
-        <w:t>画像データ量削減と文字数制限（5万文字）対策の適用中...</w:t>
-      </w:r>
+        <w:t>画像データ量削減と文字数制限（5万文字）対策の適用中</w:t>
+      </w:r>
+      <w:proofErr w:type="gramStart"/>
+      <w:r>
+        <w:t>...</w:t>
+      </w:r>
+      <w:proofErr w:type="gramEnd"/>
     </w:p>
     <w:p>
       <w:r>
@@ -10731,8 +11214,13 @@
       </w:r>
       <w:proofErr w:type="spellEnd"/>
       <w:r>
-        <w:t>の配信データの軽量化とログ強化の適用中...</w:t>
-      </w:r>
+        <w:t>の配信データの軽量化とログ強化の適用中</w:t>
+      </w:r>
+      <w:proofErr w:type="gramStart"/>
+      <w:r>
+        <w:t>...</w:t>
+      </w:r>
+      <w:proofErr w:type="gramEnd"/>
     </w:p>
     <w:p>
       <w:r>
@@ -10741,8 +11229,13 @@
     </w:p>
     <w:p>
       <w:r>
-        <w:t>最新のGAS URLでの配信データ取得状況の最終確認中...</w:t>
-      </w:r>
+        <w:t>最新のGAS URLでの配信データ取得状況の最終確認中</w:t>
+      </w:r>
+      <w:proofErr w:type="gramStart"/>
+      <w:r>
+        <w:t>...</w:t>
+      </w:r>
+      <w:proofErr w:type="gramEnd"/>
     </w:p>
     <w:p>
       <w:r>
@@ -10759,8 +11252,13 @@
       </w:r>
       <w:proofErr w:type="spellEnd"/>
       <w:r>
-        <w:t>=true）の追加中...</w:t>
-      </w:r>
+        <w:t>=true）の追加中</w:t>
+      </w:r>
+      <w:proofErr w:type="gramStart"/>
+      <w:r>
+        <w:t>...</w:t>
+      </w:r>
+      <w:proofErr w:type="gramEnd"/>
     </w:p>
     <w:p>
       <w:r>
@@ -10774,8 +11272,13 @@
       </w:r>
       <w:proofErr w:type="spellEnd"/>
       <w:r>
-        <w:t>内のデバッグオプション（debug=true）の実装中...</w:t>
-      </w:r>
+        <w:t>内のデバッグオプション（debug=true）の実装中</w:t>
+      </w:r>
+      <w:proofErr w:type="gramStart"/>
+      <w:r>
+        <w:t>...</w:t>
+      </w:r>
+      <w:proofErr w:type="gramEnd"/>
     </w:p>
     <w:p>
       <w:r>
@@ -10814,8 +11317,13 @@
     </w:p>
     <w:p>
       <w:r>
-        <w:t>walkthrough.mdを更新し、画像サイズ制限対策とデバッグ手順を案内中...</w:t>
-      </w:r>
+        <w:t>walkthrough.mdを更新し、画像サイズ制限対策とデバッグ手順を案内中</w:t>
+      </w:r>
+      <w:proofErr w:type="gramStart"/>
+      <w:r>
+        <w:t>...</w:t>
+      </w:r>
+      <w:proofErr w:type="gramEnd"/>
     </w:p>
     <w:p>
       <w:r>
@@ -10824,8 +11332,13 @@
     </w:p>
     <w:p>
       <w:r>
-        <w:t>ユーザーにデバッグ手順の最終案内を送信中...</w:t>
-      </w:r>
+        <w:t>ユーザーにデバッグ手順の最終案内を送信中</w:t>
+      </w:r>
+      <w:proofErr w:type="gramStart"/>
+      <w:r>
+        <w:t>...</w:t>
+      </w:r>
+      <w:proofErr w:type="gramEnd"/>
     </w:p>
     <w:p>
       <w:r>
@@ -11038,7 +11551,15 @@
       </w:r>
       <w:proofErr w:type="spellEnd"/>
       <w:r>
-        <w:t xml:space="preserve">: ... </w:t>
+        <w:t xml:space="preserve">: </w:t>
+      </w:r>
+      <w:proofErr w:type="gramStart"/>
+      <w:r>
+        <w:t>...</w:t>
+      </w:r>
+      <w:proofErr w:type="gramEnd"/>
+      <w:r>
+        <w:t xml:space="preserve"> </w:t>
       </w:r>
       <w:proofErr w:type="spellStart"/>
       <w:r>
@@ -11304,8 +11825,13 @@
       </w:r>
       <w:proofErr w:type="spellEnd"/>
       <w:r>
-        <w:t>での接続テストボタンの常時表示化とステータス表示追加中...</w:t>
-      </w:r>
+        <w:t>での接続テストボタンの常時表示化とステータス表示追加中</w:t>
+      </w:r>
+      <w:proofErr w:type="gramStart"/>
+      <w:r>
+        <w:t>...</w:t>
+      </w:r>
+      <w:proofErr w:type="gramEnd"/>
     </w:p>
     <w:p>
       <w:r>
@@ -11319,8 +11845,13 @@
       </w:r>
       <w:proofErr w:type="spellEnd"/>
       <w:r>
-        <w:t>の構文エラー修正とレイアウト最終調整中...</w:t>
-      </w:r>
+        <w:t>の構文エラー修正とレイアウト最終調整中</w:t>
+      </w:r>
+      <w:proofErr w:type="gramStart"/>
+      <w:r>
+        <w:t>...</w:t>
+      </w:r>
+      <w:proofErr w:type="gramEnd"/>
     </w:p>
     <w:p>
       <w:r>
@@ -11329,8 +11860,13 @@
     </w:p>
     <w:p>
       <w:r>
-        <w:t>walkthrough.mdの最終確認と完了報告の準備中...</w:t>
-      </w:r>
+        <w:t>walkthrough.mdの最終確認と完了報告の準備中</w:t>
+      </w:r>
+      <w:proofErr w:type="gramStart"/>
+      <w:r>
+        <w:t>...</w:t>
+      </w:r>
+      <w:proofErr w:type="gramEnd"/>
     </w:p>
     <w:p>
       <w:r>
@@ -11339,8 +11875,13 @@
     </w:p>
     <w:p>
       <w:r>
-        <w:t>ユーザーに対して修正版の反映とデバッグ手順の再案内を送信中...</w:t>
-      </w:r>
+        <w:t>ユーザーに対して修正版の反映とデバッグ手順の再案内を送信中</w:t>
+      </w:r>
+      <w:proofErr w:type="gramStart"/>
+      <w:r>
+        <w:t>...</w:t>
+      </w:r>
+      <w:proofErr w:type="gramEnd"/>
     </w:p>
     <w:p>
       <w:r>
@@ -12080,7 +12621,15 @@
         <w:t>映像準備待ちの実装</w:t>
       </w:r>
       <w:r>
-        <w:t>: カメラが起動し、映像の大きさが正しく認識されるまで送信を「映像準備中...」として待機するようにしました。</w:t>
+        <w:t>: カメラが起動し、映像の大きさが正しく認識されるまで送信を「映像準備中</w:t>
+      </w:r>
+      <w:proofErr w:type="gramStart"/>
+      <w:r>
+        <w:t>...</w:t>
+      </w:r>
+      <w:proofErr w:type="gramEnd"/>
+      <w:r>
+        <w:t>」として待機するようにしました。</w:t>
       </w:r>
     </w:p>
     <w:p>
@@ -12157,7 +12706,23 @@
           <w:b/>
           <w:bCs/>
         </w:rPr>
-        <w:t>「映像準備中...」</w:t>
+        <w:t>「映像準備中</w:t>
+      </w:r>
+      <w:proofErr w:type="gramStart"/>
+      <w:r>
+        <w:rPr>
+          <w:b/>
+          <w:bCs/>
+        </w:rPr>
+        <w:t>...</w:t>
+      </w:r>
+      <w:proofErr w:type="gramEnd"/>
+      <w:r>
+        <w:rPr>
+          <w:b/>
+          <w:bCs/>
+        </w:rPr>
+        <w:t>」</w:t>
       </w:r>
       <w:r>
         <w:t> と出続ける場合は、一度中継を停止して、カメラの許可を再確認するか、ブラウザを再読み込みしてください。</w:t>
@@ -12183,7 +12748,15 @@
         <w:t>「</w:t>
       </w:r>
       <w:r>
-        <w:t>実行しましたが、メッセージほ「映像準備中（解像度がまだ確定していません）と表示されます。</w:t>
+        <w:t>実行しましたが、メッセージ</w:t>
+      </w:r>
+      <w:proofErr w:type="gramStart"/>
+      <w:r>
+        <w:t>ほ</w:t>
+      </w:r>
+      <w:proofErr w:type="gramEnd"/>
+      <w:r>
+        <w:t>「映像準備中（解像度がまだ確定していません）と表示されます。</w:t>
       </w:r>
       <w:r>
         <w:rPr>
@@ -12195,7 +12768,15 @@
     <w:p/>
     <w:p>
       <w:r>
-        <w:t>「映像準備中...」というメッセージが消えないのは、一部のスマホブラウザで「カメラ映像は出ているのに、プログラム側で映像サイズが0と報告されてしまう」という特殊な挙動が原因でした。</w:t>
+        <w:t>「映像準備中</w:t>
+      </w:r>
+      <w:proofErr w:type="gramStart"/>
+      <w:r>
+        <w:t>...</w:t>
+      </w:r>
+      <w:proofErr w:type="gramEnd"/>
+      <w:r>
+        <w:t>」というメッセージが消えないのは、一部のスマホブラウザで「カメラ映像は出ているのに、プログラム側で映像サイズが0と報告されてしまう」という特殊な挙動が原因でした。</w:t>
       </w:r>
     </w:p>
     <w:p>
@@ -13245,7 +13826,15 @@
         <w:t>ユーザー様へ確認</w:t>
       </w:r>
       <w:r>
-        <w:t>: スマホ側の「送信成功」の時刻は、現在も秒単位で進んでいますでしょうか？（例：22:50:01 → 22:50:08...）それとも止まっていますでしょうか。これによって対策が変わります。</w:t>
+        <w:t>: スマホ側の「送信成功」の時刻は、現在も秒単位で進んでいますでしょうか？（例：22:50:01 → 22:50:08</w:t>
+      </w:r>
+      <w:proofErr w:type="gramStart"/>
+      <w:r>
+        <w:t>...</w:t>
+      </w:r>
+      <w:proofErr w:type="gramEnd"/>
+      <w:r>
+        <w:t>）それとも止まっていますでしょうか。これによって対策が変わります。</w:t>
       </w:r>
     </w:p>
     <w:p>
@@ -13552,8 +14141,13 @@
     </w:p>
     <w:p>
       <w:r>
-        <w:t>const SPREADSHEET_ID = '1Ae7XoPSovAJM1tjarVsns0sLYNoQcVg6sFBMQwd7ywk';</w:t>
-      </w:r>
+        <w:t>const SPREADSHEET_ID = '1Ae7XoPSovAJM1tjarVsns0sLYNoQcVg6sFBMQwd7ywk</w:t>
+      </w:r>
+      <w:proofErr w:type="gramStart"/>
+      <w:r>
+        <w:t>';</w:t>
+      </w:r>
+      <w:proofErr w:type="gramEnd"/>
     </w:p>
     <w:p>
       <w:r>
@@ -13573,12 +14167,17 @@
         <w:t xml:space="preserve">function </w:t>
       </w:r>
       <w:proofErr w:type="spellStart"/>
+      <w:proofErr w:type="gramStart"/>
       <w:r>
         <w:t>getSS</w:t>
       </w:r>
       <w:proofErr w:type="spellEnd"/>
       <w:r>
-        <w:t>() {</w:t>
+        <w:t>(</w:t>
+      </w:r>
+      <w:proofErr w:type="gramEnd"/>
+      <w:r>
+        <w:t>) {</w:t>
       </w:r>
     </w:p>
     <w:p>
@@ -13596,13 +14195,23 @@
       </w:r>
       <w:proofErr w:type="spellEnd"/>
       <w:r>
-        <w:t>(SPREADSHEET_ID);</w:t>
-      </w:r>
-    </w:p>
-    <w:p>
-      <w:r>
-        <w:t xml:space="preserve">  } catch (e) {</w:t>
-      </w:r>
+        <w:t>(SPREADSHEET_ID</w:t>
+      </w:r>
+      <w:proofErr w:type="gramStart"/>
+      <w:r>
+        <w:t>);</w:t>
+      </w:r>
+      <w:proofErr w:type="gramEnd"/>
+    </w:p>
+    <w:p>
+      <w:r>
+        <w:t xml:space="preserve">  } catch (</w:t>
+      </w:r>
+      <w:proofErr w:type="gramStart"/>
+      <w:r>
+        <w:t>e) {</w:t>
+      </w:r>
+      <w:proofErr w:type="gramEnd"/>
     </w:p>
     <w:p>
       <w:r>
@@ -13629,7 +14238,15 @@
     </w:p>
     <w:p>
       <w:r>
-        <w:t>function setup() {</w:t>
+        <w:t xml:space="preserve">function </w:t>
+      </w:r>
+      <w:proofErr w:type="gramStart"/>
+      <w:r>
+        <w:t>setup(</w:t>
+      </w:r>
+      <w:proofErr w:type="gramEnd"/>
+      <w:r>
+        <w:t>) {</w:t>
       </w:r>
     </w:p>
     <w:p>
@@ -13637,6 +14254,7 @@
         <w:t xml:space="preserve">  const ss = </w:t>
       </w:r>
       <w:proofErr w:type="spellStart"/>
+      <w:proofErr w:type="gramStart"/>
       <w:r>
         <w:t>getSS</w:t>
       </w:r>
@@ -13644,23 +14262,39 @@
       <w:r>
         <w:t>();</w:t>
       </w:r>
+      <w:proofErr w:type="gramEnd"/>
     </w:p>
     <w:p>
       <w:r>
         <w:t xml:space="preserve">  let sheet = </w:t>
       </w:r>
       <w:proofErr w:type="spellStart"/>
+      <w:proofErr w:type="gramStart"/>
       <w:r>
         <w:t>ss.getSheetByName</w:t>
       </w:r>
       <w:proofErr w:type="spellEnd"/>
-      <w:r>
-        <w:t>('reports');</w:t>
-      </w:r>
-    </w:p>
-    <w:p>
-      <w:r>
-        <w:t xml:space="preserve">  if (!sheet) {</w:t>
+      <w:proofErr w:type="gramEnd"/>
+      <w:r>
+        <w:t>('reports'</w:t>
+      </w:r>
+      <w:proofErr w:type="gramStart"/>
+      <w:r>
+        <w:t>);</w:t>
+      </w:r>
+      <w:proofErr w:type="gramEnd"/>
+    </w:p>
+    <w:p>
+      <w:r>
+        <w:t xml:space="preserve">  if </w:t>
+      </w:r>
+      <w:proofErr w:type="gramStart"/>
+      <w:r>
+        <w:t>(!sheet</w:t>
+      </w:r>
+      <w:proofErr w:type="gramEnd"/>
+      <w:r>
+        <w:t>) {</w:t>
       </w:r>
     </w:p>
     <w:p>
@@ -13668,13 +14302,20 @@
         <w:t xml:space="preserve">    sheet = </w:t>
       </w:r>
       <w:proofErr w:type="spellStart"/>
+      <w:proofErr w:type="gramStart"/>
       <w:r>
         <w:t>ss.insertSheet</w:t>
       </w:r>
       <w:proofErr w:type="spellEnd"/>
-      <w:r>
-        <w:t>('reports');</w:t>
-      </w:r>
+      <w:proofErr w:type="gramEnd"/>
+      <w:r>
+        <w:t>('reports'</w:t>
+      </w:r>
+      <w:proofErr w:type="gramStart"/>
+      <w:r>
+        <w:t>);</w:t>
+      </w:r>
+      <w:proofErr w:type="gramEnd"/>
     </w:p>
     <w:p>
       <w:r>
@@ -13707,10 +14348,12 @@
         <w:t xml:space="preserve"> = </w:t>
       </w:r>
       <w:proofErr w:type="spellStart"/>
+      <w:proofErr w:type="gramStart"/>
       <w:r>
         <w:t>ss.getSheetByName</w:t>
       </w:r>
       <w:proofErr w:type="spellEnd"/>
+      <w:proofErr w:type="gramEnd"/>
       <w:r>
         <w:t>('</w:t>
       </w:r>
@@ -13719,19 +14362,26 @@
         <w:t>LiveStreams'</w:t>
       </w:r>
       <w:proofErr w:type="spellEnd"/>
+      <w:proofErr w:type="gramStart"/>
       <w:r>
         <w:t>);</w:t>
       </w:r>
-    </w:p>
-    <w:p>
-      <w:r>
-        <w:t xml:space="preserve">  if (!</w:t>
+      <w:proofErr w:type="gramEnd"/>
+    </w:p>
+    <w:p>
+      <w:r>
+        <w:t xml:space="preserve">  if </w:t>
+      </w:r>
+      <w:proofErr w:type="gramStart"/>
+      <w:r>
+        <w:t>(!</w:t>
       </w:r>
       <w:proofErr w:type="spellStart"/>
       <w:r>
         <w:t>liveSheet</w:t>
       </w:r>
       <w:proofErr w:type="spellEnd"/>
+      <w:proofErr w:type="gramEnd"/>
       <w:r>
         <w:t>) {</w:t>
       </w:r>
@@ -13749,10 +14399,12 @@
         <w:t xml:space="preserve"> = </w:t>
       </w:r>
       <w:proofErr w:type="spellStart"/>
+      <w:proofErr w:type="gramStart"/>
       <w:r>
         <w:t>ss.insertSheet</w:t>
       </w:r>
       <w:proofErr w:type="spellEnd"/>
+      <w:proofErr w:type="gramEnd"/>
       <w:r>
         <w:t>('</w:t>
       </w:r>
@@ -13761,9 +14413,11 @@
         <w:t>LiveStreams'</w:t>
       </w:r>
       <w:proofErr w:type="spellEnd"/>
+      <w:proofErr w:type="gramStart"/>
       <w:r>
         <w:t>);</w:t>
       </w:r>
+      <w:proofErr w:type="gramEnd"/>
     </w:p>
     <w:p>
       <w:r>
@@ -13775,8 +14429,13 @@
       </w:r>
       <w:proofErr w:type="spellEnd"/>
       <w:r>
-        <w:t>(['Corp', 'Timestamp', 'ImageBase64', 'Status', 'Memo']);</w:t>
-      </w:r>
+        <w:t>(['Corp', 'Timestamp', 'ImageBase64', 'Status', 'Memo']</w:t>
+      </w:r>
+      <w:proofErr w:type="gramStart"/>
+      <w:r>
+        <w:t>);</w:t>
+      </w:r>
+      <w:proofErr w:type="gramEnd"/>
     </w:p>
     <w:p>
       <w:r>
@@ -13799,8 +14458,13 @@
       </w:r>
       <w:proofErr w:type="spellEnd"/>
       <w:r>
-        <w:t>(e) {</w:t>
-      </w:r>
+        <w:t>(</w:t>
+      </w:r>
+      <w:proofErr w:type="gramStart"/>
+      <w:r>
+        <w:t>e) {</w:t>
+      </w:r>
+      <w:proofErr w:type="gramEnd"/>
     </w:p>
     <w:p>
       <w:r>
@@ -13820,6 +14484,7 @@
         <w:t>(</w:t>
       </w:r>
       <w:proofErr w:type="spellStart"/>
+      <w:proofErr w:type="gramStart"/>
       <w:r>
         <w:t>e.postData.contents</w:t>
       </w:r>
@@ -13827,12 +14492,14 @@
       <w:r>
         <w:t>);</w:t>
       </w:r>
+      <w:proofErr w:type="gramEnd"/>
     </w:p>
     <w:p>
       <w:r>
         <w:t xml:space="preserve">    const ss = </w:t>
       </w:r>
       <w:proofErr w:type="spellStart"/>
+      <w:proofErr w:type="gramStart"/>
       <w:r>
         <w:t>getSS</w:t>
       </w:r>
@@ -13840,6 +14507,7 @@
       <w:r>
         <w:t>();</w:t>
       </w:r>
+      <w:proofErr w:type="gramEnd"/>
     </w:p>
     <w:p>
       <w:r>
@@ -13851,10 +14519,12 @@
         <w:t xml:space="preserve">    if (</w:t>
       </w:r>
       <w:proofErr w:type="spellStart"/>
+      <w:proofErr w:type="gramStart"/>
       <w:r>
         <w:t>data.action</w:t>
       </w:r>
       <w:proofErr w:type="spellEnd"/>
+      <w:proofErr w:type="gramEnd"/>
       <w:r>
         <w:t xml:space="preserve"> === '</w:t>
       </w:r>
@@ -13875,10 +14545,12 @@
         <w:t xml:space="preserve"> &amp;&amp; </w:t>
       </w:r>
       <w:proofErr w:type="spellStart"/>
+      <w:proofErr w:type="gramStart"/>
       <w:r>
         <w:t>data.image</w:t>
       </w:r>
       <w:proofErr w:type="spellEnd"/>
+      <w:proofErr w:type="gramEnd"/>
       <w:r>
         <w:t>) {</w:t>
       </w:r>
@@ -13896,10 +14568,12 @@
         <w:t xml:space="preserve"> = </w:t>
       </w:r>
       <w:proofErr w:type="spellStart"/>
+      <w:proofErr w:type="gramStart"/>
       <w:r>
         <w:t>ss.getSheetByName</w:t>
       </w:r>
       <w:proofErr w:type="spellEnd"/>
+      <w:proofErr w:type="gramEnd"/>
       <w:r>
         <w:t>('</w:t>
       </w:r>
@@ -13908,19 +14582,26 @@
         <w:t>LiveStreams'</w:t>
       </w:r>
       <w:proofErr w:type="spellEnd"/>
+      <w:proofErr w:type="gramStart"/>
       <w:r>
         <w:t>);</w:t>
       </w:r>
-    </w:p>
-    <w:p>
-      <w:r>
-        <w:t xml:space="preserve">        if (!</w:t>
+      <w:proofErr w:type="gramEnd"/>
+    </w:p>
+    <w:p>
+      <w:r>
+        <w:t xml:space="preserve">        if </w:t>
+      </w:r>
+      <w:proofErr w:type="gramStart"/>
+      <w:r>
+        <w:t>(!</w:t>
       </w:r>
       <w:proofErr w:type="spellStart"/>
       <w:r>
         <w:t>liveSheet</w:t>
       </w:r>
       <w:proofErr w:type="spellEnd"/>
+      <w:proofErr w:type="gramEnd"/>
       <w:r>
         <w:t>) {</w:t>
       </w:r>
@@ -13938,10 +14619,12 @@
         <w:t xml:space="preserve"> = </w:t>
       </w:r>
       <w:proofErr w:type="spellStart"/>
+      <w:proofErr w:type="gramStart"/>
       <w:r>
         <w:t>ss.insertSheet</w:t>
       </w:r>
       <w:proofErr w:type="spellEnd"/>
+      <w:proofErr w:type="gramEnd"/>
       <w:r>
         <w:t>('</w:t>
       </w:r>
@@ -13950,9 +14633,11 @@
         <w:t>LiveStreams'</w:t>
       </w:r>
       <w:proofErr w:type="spellEnd"/>
+      <w:proofErr w:type="gramStart"/>
       <w:r>
         <w:t>);</w:t>
       </w:r>
+      <w:proofErr w:type="gramEnd"/>
     </w:p>
     <w:p>
       <w:r>
@@ -13964,8 +14649,13 @@
       </w:r>
       <w:proofErr w:type="spellEnd"/>
       <w:r>
-        <w:t>(['Corp', 'Timestamp', 'ImageBase64', 'Status', 'Memo']);</w:t>
-      </w:r>
+        <w:t>(['Corp', 'Timestamp', 'ImageBase64', 'Status', 'Memo']</w:t>
+      </w:r>
+      <w:proofErr w:type="gramStart"/>
+      <w:r>
+        <w:t>);</w:t>
+      </w:r>
+      <w:proofErr w:type="gramEnd"/>
     </w:p>
     <w:p>
       <w:r>
@@ -13995,8 +14685,261 @@
       </w:r>
       <w:proofErr w:type="spellEnd"/>
       <w:r>
+        <w:t>(</w:t>
+      </w:r>
+      <w:proofErr w:type="gramStart"/>
+      <w:r>
+        <w:t>);</w:t>
+      </w:r>
+      <w:proofErr w:type="gramEnd"/>
+    </w:p>
+    <w:p>
+      <w:r>
+        <w:t xml:space="preserve">        let </w:t>
+      </w:r>
+      <w:proofErr w:type="spellStart"/>
+      <w:r>
+        <w:t>rowIndex</w:t>
+      </w:r>
+      <w:proofErr w:type="spellEnd"/>
+      <w:r>
+        <w:t xml:space="preserve"> = </w:t>
+      </w:r>
+      <w:proofErr w:type="gramStart"/>
+      <w:r>
+        <w:t>-1;</w:t>
+      </w:r>
+      <w:proofErr w:type="gramEnd"/>
+    </w:p>
+    <w:p>
+      <w:r>
+        <w:t xml:space="preserve">        </w:t>
+      </w:r>
+    </w:p>
+    <w:p>
+      <w:r>
+        <w:t xml:space="preserve">        if (</w:t>
+      </w:r>
+      <w:proofErr w:type="spellStart"/>
+      <w:r>
+        <w:t>lastRow</w:t>
+      </w:r>
+      <w:proofErr w:type="spellEnd"/>
+      <w:r>
+        <w:t xml:space="preserve"> &gt; </w:t>
+      </w:r>
+      <w:proofErr w:type="gramStart"/>
+      <w:r>
+        <w:t>1) {</w:t>
+      </w:r>
+      <w:proofErr w:type="gramEnd"/>
+    </w:p>
+    <w:p>
+      <w:r>
+        <w:t xml:space="preserve">            const </w:t>
+      </w:r>
+      <w:proofErr w:type="spellStart"/>
+      <w:r>
+        <w:t>corpData</w:t>
+      </w:r>
+      <w:proofErr w:type="spellEnd"/>
+      <w:r>
+        <w:t xml:space="preserve"> = </w:t>
+      </w:r>
+      <w:proofErr w:type="spellStart"/>
+      <w:r>
+        <w:t>liveSheet.getRange</w:t>
+      </w:r>
+      <w:proofErr w:type="spellEnd"/>
+      <w:r>
+        <w:t xml:space="preserve">(2, 1, </w:t>
+      </w:r>
+      <w:proofErr w:type="spellStart"/>
+      <w:r>
+        <w:t>lastRow</w:t>
+      </w:r>
+      <w:proofErr w:type="spellEnd"/>
+      <w:r>
+        <w:t xml:space="preserve"> - 1, 1</w:t>
+      </w:r>
+      <w:proofErr w:type="gramStart"/>
+      <w:r>
+        <w:t>).</w:t>
+      </w:r>
+      <w:proofErr w:type="spellStart"/>
+      <w:r>
+        <w:t>getValues</w:t>
+      </w:r>
+      <w:proofErr w:type="spellEnd"/>
+      <w:proofErr w:type="gramEnd"/>
+      <w:r>
+        <w:t>(</w:t>
+      </w:r>
+      <w:proofErr w:type="gramStart"/>
+      <w:r>
+        <w:t>);</w:t>
+      </w:r>
+      <w:proofErr w:type="gramEnd"/>
+    </w:p>
+    <w:p>
+      <w:r>
+        <w:t xml:space="preserve">            for (let </w:t>
+      </w:r>
+      <w:proofErr w:type="spellStart"/>
+      <w:r>
+        <w:t>i</w:t>
+      </w:r>
+      <w:proofErr w:type="spellEnd"/>
+      <w:r>
+        <w:t xml:space="preserve"> = 0; </w:t>
+      </w:r>
+      <w:proofErr w:type="spellStart"/>
+      <w:r>
+        <w:t>i</w:t>
+      </w:r>
+      <w:proofErr w:type="spellEnd"/>
+      <w:r>
+        <w:t xml:space="preserve"> &lt; </w:t>
+      </w:r>
+      <w:proofErr w:type="spellStart"/>
+      <w:r>
+        <w:t>corpData.length</w:t>
+      </w:r>
+      <w:proofErr w:type="spellEnd"/>
+      <w:r>
+        <w:t xml:space="preserve">; </w:t>
+      </w:r>
+      <w:proofErr w:type="spellStart"/>
+      <w:r>
+        <w:t>i</w:t>
+      </w:r>
+      <w:proofErr w:type="spellEnd"/>
+      <w:r>
+        <w:t>+</w:t>
+      </w:r>
+      <w:proofErr w:type="gramStart"/>
+      <w:r>
+        <w:t>+) {</w:t>
+      </w:r>
+      <w:proofErr w:type="gramEnd"/>
+    </w:p>
+    <w:p>
+      <w:r>
+        <w:t xml:space="preserve">                // 名前をトリムして比較</w:t>
+      </w:r>
+    </w:p>
+    <w:p>
+      <w:r>
+        <w:t xml:space="preserve">                if (String(</w:t>
+      </w:r>
+      <w:proofErr w:type="spellStart"/>
+      <w:r>
+        <w:t>corpData</w:t>
+      </w:r>
+      <w:proofErr w:type="spellEnd"/>
+      <w:r>
+        <w:t>[</w:t>
+      </w:r>
+      <w:proofErr w:type="spellStart"/>
+      <w:r>
+        <w:t>i</w:t>
+      </w:r>
+      <w:proofErr w:type="spellEnd"/>
+      <w:r>
+        <w:t>][0]</w:t>
+      </w:r>
+      <w:proofErr w:type="gramStart"/>
+      <w:r>
+        <w:t>).trim</w:t>
+      </w:r>
+      <w:proofErr w:type="gramEnd"/>
+      <w:r>
+        <w:t>() === String(</w:t>
+      </w:r>
+      <w:proofErr w:type="spellStart"/>
+      <w:r>
+        <w:t>data.corp</w:t>
+      </w:r>
+      <w:proofErr w:type="spellEnd"/>
+      <w:proofErr w:type="gramStart"/>
+      <w:r>
+        <w:t>).trim</w:t>
+      </w:r>
+      <w:proofErr w:type="gramEnd"/>
+      <w:r>
+        <w:t>()) {</w:t>
+      </w:r>
+    </w:p>
+    <w:p>
+      <w:r>
+        <w:t xml:space="preserve">                    </w:t>
+      </w:r>
+      <w:proofErr w:type="spellStart"/>
+      <w:r>
+        <w:t>rowIndex</w:t>
+      </w:r>
+      <w:proofErr w:type="spellEnd"/>
+      <w:r>
+        <w:t xml:space="preserve"> = i + </w:t>
+      </w:r>
+      <w:proofErr w:type="gramStart"/>
+      <w:r>
+        <w:t>2;</w:t>
+      </w:r>
+      <w:proofErr w:type="gramEnd"/>
+    </w:p>
+    <w:p>
+      <w:r>
+        <w:t xml:space="preserve">                    </w:t>
+      </w:r>
+      <w:proofErr w:type="gramStart"/>
+      <w:r>
+        <w:t>break;</w:t>
+      </w:r>
+      <w:proofErr w:type="gramEnd"/>
+    </w:p>
+    <w:p>
+      <w:r>
+        <w:t xml:space="preserve">                }</w:t>
+      </w:r>
+    </w:p>
+    <w:p>
+      <w:r>
+        <w:t xml:space="preserve">            }</w:t>
+      </w:r>
+    </w:p>
+    <w:p>
+      <w:r>
+        <w:t xml:space="preserve">        }</w:t>
+      </w:r>
+    </w:p>
+    <w:p>
+      <w:r>
+        <w:t xml:space="preserve">        </w:t>
+      </w:r>
+    </w:p>
+    <w:p>
+      <w:r>
+        <w:t xml:space="preserve">        const </w:t>
+      </w:r>
+      <w:proofErr w:type="spellStart"/>
+      <w:r>
+        <w:t>nowMs</w:t>
+      </w:r>
+      <w:proofErr w:type="spellEnd"/>
+      <w:r>
+        <w:t xml:space="preserve"> = </w:t>
+      </w:r>
+      <w:proofErr w:type="spellStart"/>
+      <w:proofErr w:type="gramStart"/>
+      <w:r>
+        <w:t>Date.now</w:t>
+      </w:r>
+      <w:proofErr w:type="spellEnd"/>
+      <w:r>
         <w:t>();</w:t>
       </w:r>
+      <w:proofErr w:type="gramEnd"/>
     </w:p>
     <w:p>
       <w:r>
@@ -14004,368 +14947,208 @@
       </w:r>
       <w:proofErr w:type="spellStart"/>
       <w:r>
+        <w:t>safeImage</w:t>
+      </w:r>
+      <w:proofErr w:type="spellEnd"/>
+      <w:r>
+        <w:t xml:space="preserve"> = </w:t>
+      </w:r>
+      <w:proofErr w:type="spellStart"/>
+      <w:proofErr w:type="gramStart"/>
+      <w:r>
+        <w:t>data.image</w:t>
+      </w:r>
+      <w:proofErr w:type="spellEnd"/>
+      <w:proofErr w:type="gramEnd"/>
+      <w:r>
+        <w:t xml:space="preserve"> || '</w:t>
+      </w:r>
+      <w:proofErr w:type="gramStart"/>
+      <w:r>
+        <w:t>';</w:t>
+      </w:r>
+      <w:proofErr w:type="gramEnd"/>
+    </w:p>
+    <w:p>
+      <w:r>
+        <w:t xml:space="preserve">        if (</w:t>
+      </w:r>
+      <w:proofErr w:type="spellStart"/>
+      <w:r>
+        <w:t>safeImage.length</w:t>
+      </w:r>
+      <w:proofErr w:type="spellEnd"/>
+      <w:r>
+        <w:t xml:space="preserve"> &gt; 45000) </w:t>
+      </w:r>
+      <w:proofErr w:type="spellStart"/>
+      <w:r>
+        <w:t>safeImage</w:t>
+      </w:r>
+      <w:proofErr w:type="spellEnd"/>
+      <w:r>
+        <w:t xml:space="preserve"> = </w:t>
+      </w:r>
+      <w:proofErr w:type="spellStart"/>
+      <w:r>
+        <w:t>safeImage.substring</w:t>
+      </w:r>
+      <w:proofErr w:type="spellEnd"/>
+      <w:r>
+        <w:t>(0, 45000); // 制限対策</w:t>
+      </w:r>
+    </w:p>
+    <w:p>
+      <w:r>
+        <w:t xml:space="preserve">        </w:t>
+      </w:r>
+    </w:p>
+    <w:p>
+      <w:r>
+        <w:t xml:space="preserve">        const </w:t>
+      </w:r>
+      <w:proofErr w:type="spellStart"/>
+      <w:r>
+        <w:t>rowData</w:t>
+      </w:r>
+      <w:proofErr w:type="spellEnd"/>
+      <w:r>
+        <w:t xml:space="preserve"> = [</w:t>
+      </w:r>
+      <w:proofErr w:type="spellStart"/>
+      <w:r>
+        <w:t>data.</w:t>
+      </w:r>
+      <w:proofErr w:type="gramStart"/>
+      <w:r>
+        <w:t>corp.trim</w:t>
+      </w:r>
+      <w:proofErr w:type="spellEnd"/>
+      <w:proofErr w:type="gramEnd"/>
+      <w:r>
+        <w:t xml:space="preserve">(), </w:t>
+      </w:r>
+      <w:proofErr w:type="spellStart"/>
+      <w:r>
+        <w:t>nowMs</w:t>
+      </w:r>
+      <w:proofErr w:type="spellEnd"/>
+      <w:r>
+        <w:t xml:space="preserve">, </w:t>
+      </w:r>
+      <w:proofErr w:type="spellStart"/>
+      <w:r>
+        <w:t>safeImage</w:t>
+      </w:r>
+      <w:proofErr w:type="spellEnd"/>
+      <w:r>
+        <w:t xml:space="preserve">, </w:t>
+      </w:r>
+      <w:proofErr w:type="spellStart"/>
+      <w:proofErr w:type="gramStart"/>
+      <w:r>
+        <w:t>data.status</w:t>
+      </w:r>
+      <w:proofErr w:type="spellEnd"/>
+      <w:proofErr w:type="gramEnd"/>
+      <w:r>
+        <w:t xml:space="preserve"> || 'LIVE', </w:t>
+      </w:r>
+      <w:proofErr w:type="spellStart"/>
+      <w:proofErr w:type="gramStart"/>
+      <w:r>
+        <w:t>data.memo</w:t>
+      </w:r>
+      <w:proofErr w:type="spellEnd"/>
+      <w:proofErr w:type="gramEnd"/>
+      <w:r>
+        <w:t xml:space="preserve"> || ''</w:t>
+      </w:r>
+      <w:proofErr w:type="gramStart"/>
+      <w:r>
+        <w:t>];</w:t>
+      </w:r>
+      <w:proofErr w:type="gramEnd"/>
+    </w:p>
+    <w:p>
+      <w:r>
+        <w:t xml:space="preserve">        </w:t>
+      </w:r>
+    </w:p>
+    <w:p>
+      <w:r>
+        <w:t xml:space="preserve">        if (</w:t>
+      </w:r>
+      <w:proofErr w:type="spellStart"/>
+      <w:proofErr w:type="gramStart"/>
+      <w:r>
         <w:t>rowIndex</w:t>
       </w:r>
       <w:proofErr w:type="spellEnd"/>
       <w:r>
-        <w:t xml:space="preserve"> = -1;</w:t>
-      </w:r>
-    </w:p>
-    <w:p>
-      <w:r>
-        <w:t xml:space="preserve">        </w:t>
-      </w:r>
-    </w:p>
-    <w:p>
-      <w:r>
-        <w:t xml:space="preserve">        if (</w:t>
+        <w:t xml:space="preserve"> !</w:t>
+      </w:r>
+      <w:proofErr w:type="gramEnd"/>
+      <w:r>
+        <w:t>== -</w:t>
+      </w:r>
+      <w:proofErr w:type="gramStart"/>
+      <w:r>
+        <w:t>1) {</w:t>
+      </w:r>
+      <w:proofErr w:type="gramEnd"/>
+    </w:p>
+    <w:p>
+      <w:r>
+        <w:t xml:space="preserve">            </w:t>
       </w:r>
       <w:proofErr w:type="spellStart"/>
       <w:r>
-        <w:t>lastRow</w:t>
+        <w:t>liveSheet.getRange</w:t>
       </w:r>
       <w:proofErr w:type="spellEnd"/>
       <w:r>
-        <w:t xml:space="preserve"> &gt; 1) {</w:t>
-      </w:r>
-    </w:p>
-    <w:p>
-      <w:r>
-        <w:t xml:space="preserve">            const </w:t>
+        <w:t>(</w:t>
       </w:r>
       <w:proofErr w:type="spellStart"/>
       <w:r>
-        <w:t>corpData</w:t>
+        <w:t>rowIndex</w:t>
       </w:r>
       <w:proofErr w:type="spellEnd"/>
       <w:r>
-        <w:t xml:space="preserve"> = </w:t>
+        <w:t xml:space="preserve">, 1, 1, </w:t>
       </w:r>
       <w:proofErr w:type="spellStart"/>
       <w:r>
-        <w:t>liveSheet.getRange</w:t>
+        <w:t>rowData.length</w:t>
       </w:r>
       <w:proofErr w:type="spellEnd"/>
-      <w:r>
-        <w:t xml:space="preserve">(2, 1, </w:t>
+      <w:proofErr w:type="gramStart"/>
+      <w:r>
+        <w:t>).</w:t>
       </w:r>
       <w:proofErr w:type="spellStart"/>
       <w:r>
-        <w:t>lastRow</w:t>
+        <w:t>setValues</w:t>
       </w:r>
       <w:proofErr w:type="spellEnd"/>
-      <w:r>
-        <w:t xml:space="preserve"> - 1, 1).</w:t>
+      <w:proofErr w:type="gramEnd"/>
+      <w:r>
+        <w:t>([</w:t>
       </w:r>
       <w:proofErr w:type="spellStart"/>
       <w:r>
-        <w:t>getValues</w:t>
+        <w:t>rowData</w:t>
       </w:r>
       <w:proofErr w:type="spellEnd"/>
       <w:r>
-        <w:t>();</w:t>
-      </w:r>
-    </w:p>
-    <w:p>
-      <w:r>
-        <w:t xml:space="preserve">            for (let </w:t>
-      </w:r>
-      <w:proofErr w:type="spellStart"/>
-      <w:r>
-        <w:t>i</w:t>
-      </w:r>
-      <w:proofErr w:type="spellEnd"/>
-      <w:r>
-        <w:t xml:space="preserve"> = 0; </w:t>
-      </w:r>
-      <w:proofErr w:type="spellStart"/>
-      <w:r>
-        <w:t>i</w:t>
-      </w:r>
-      <w:proofErr w:type="spellEnd"/>
-      <w:r>
-        <w:t xml:space="preserve"> &lt; </w:t>
-      </w:r>
-      <w:proofErr w:type="spellStart"/>
-      <w:r>
-        <w:t>corpData.length</w:t>
-      </w:r>
-      <w:proofErr w:type="spellEnd"/>
-      <w:r>
-        <w:t xml:space="preserve">; </w:t>
-      </w:r>
-      <w:proofErr w:type="spellStart"/>
-      <w:r>
-        <w:t>i</w:t>
-      </w:r>
-      <w:proofErr w:type="spellEnd"/>
-      <w:r>
-        <w:t>++) {</w:t>
-      </w:r>
-    </w:p>
-    <w:p>
-      <w:r>
-        <w:t xml:space="preserve">                // 名前をトリムして比較</w:t>
-      </w:r>
-    </w:p>
-    <w:p>
-      <w:r>
-        <w:t xml:space="preserve">                if (String(</w:t>
-      </w:r>
-      <w:proofErr w:type="spellStart"/>
-      <w:r>
-        <w:t>corpData</w:t>
-      </w:r>
-      <w:proofErr w:type="spellEnd"/>
-      <w:r>
-        <w:t>[</w:t>
-      </w:r>
-      <w:proofErr w:type="spellStart"/>
-      <w:r>
-        <w:t>i</w:t>
-      </w:r>
-      <w:proofErr w:type="spellEnd"/>
-      <w:r>
-        <w:t>][0]).trim() === String(</w:t>
-      </w:r>
-      <w:proofErr w:type="spellStart"/>
-      <w:r>
-        <w:t>data.corp</w:t>
-      </w:r>
-      <w:proofErr w:type="spellEnd"/>
-      <w:r>
-        <w:t>).trim()) {</w:t>
-      </w:r>
-    </w:p>
-    <w:p>
-      <w:r>
-        <w:t xml:space="preserve">                    </w:t>
-      </w:r>
-      <w:proofErr w:type="spellStart"/>
-      <w:r>
-        <w:t>rowIndex</w:t>
-      </w:r>
-      <w:proofErr w:type="spellEnd"/>
-      <w:r>
-        <w:t xml:space="preserve"> = i + 2;</w:t>
-      </w:r>
-    </w:p>
-    <w:p>
-      <w:r>
-        <w:t xml:space="preserve">                    break;</w:t>
-      </w:r>
-    </w:p>
-    <w:p>
-      <w:r>
-        <w:t xml:space="preserve">                }</w:t>
-      </w:r>
-    </w:p>
-    <w:p>
-      <w:r>
-        <w:t xml:space="preserve">            }</w:t>
-      </w:r>
-    </w:p>
-    <w:p>
-      <w:r>
-        <w:t xml:space="preserve">        }</w:t>
-      </w:r>
-    </w:p>
-    <w:p>
-      <w:r>
-        <w:t xml:space="preserve">        </w:t>
-      </w:r>
-    </w:p>
-    <w:p>
-      <w:r>
-        <w:t xml:space="preserve">        const </w:t>
-      </w:r>
-      <w:proofErr w:type="spellStart"/>
-      <w:r>
-        <w:t>nowMs</w:t>
-      </w:r>
-      <w:proofErr w:type="spellEnd"/>
-      <w:r>
-        <w:t xml:space="preserve"> = </w:t>
-      </w:r>
-      <w:proofErr w:type="spellStart"/>
-      <w:r>
-        <w:t>Date.now</w:t>
-      </w:r>
-      <w:proofErr w:type="spellEnd"/>
-      <w:r>
-        <w:t>();</w:t>
-      </w:r>
-    </w:p>
-    <w:p>
-      <w:r>
-        <w:t xml:space="preserve">        let </w:t>
-      </w:r>
-      <w:proofErr w:type="spellStart"/>
-      <w:r>
-        <w:t>safeImage</w:t>
-      </w:r>
-      <w:proofErr w:type="spellEnd"/>
-      <w:r>
-        <w:t xml:space="preserve"> = </w:t>
-      </w:r>
-      <w:proofErr w:type="spellStart"/>
-      <w:r>
-        <w:t>data.image</w:t>
-      </w:r>
-      <w:proofErr w:type="spellEnd"/>
-      <w:r>
-        <w:t xml:space="preserve"> || '';</w:t>
-      </w:r>
-    </w:p>
-    <w:p>
-      <w:r>
-        <w:t xml:space="preserve">        if (</w:t>
-      </w:r>
-      <w:proofErr w:type="spellStart"/>
-      <w:r>
-        <w:t>safeImage.length</w:t>
-      </w:r>
-      <w:proofErr w:type="spellEnd"/>
-      <w:r>
-        <w:t xml:space="preserve"> &gt; 45000) </w:t>
-      </w:r>
-      <w:proofErr w:type="spellStart"/>
-      <w:r>
-        <w:t>safeImage</w:t>
-      </w:r>
-      <w:proofErr w:type="spellEnd"/>
-      <w:r>
-        <w:t xml:space="preserve"> = </w:t>
-      </w:r>
-      <w:proofErr w:type="spellStart"/>
-      <w:r>
-        <w:t>safeImage.substring</w:t>
-      </w:r>
-      <w:proofErr w:type="spellEnd"/>
-      <w:r>
-        <w:t>(0, 45000); // 制限対策</w:t>
-      </w:r>
-    </w:p>
-    <w:p>
-      <w:r>
-        <w:t xml:space="preserve">        </w:t>
-      </w:r>
-    </w:p>
-    <w:p>
-      <w:r>
-        <w:t xml:space="preserve">        const </w:t>
-      </w:r>
-      <w:proofErr w:type="spellStart"/>
-      <w:r>
-        <w:t>rowData</w:t>
-      </w:r>
-      <w:proofErr w:type="spellEnd"/>
-      <w:r>
-        <w:t xml:space="preserve"> = [</w:t>
-      </w:r>
-      <w:proofErr w:type="spellStart"/>
-      <w:r>
-        <w:t>data.corp.trim</w:t>
-      </w:r>
-      <w:proofErr w:type="spellEnd"/>
-      <w:r>
-        <w:t xml:space="preserve">(), </w:t>
-      </w:r>
-      <w:proofErr w:type="spellStart"/>
-      <w:r>
-        <w:t>nowMs</w:t>
-      </w:r>
-      <w:proofErr w:type="spellEnd"/>
-      <w:r>
-        <w:t xml:space="preserve">, </w:t>
-      </w:r>
-      <w:proofErr w:type="spellStart"/>
-      <w:r>
-        <w:t>safeImage</w:t>
-      </w:r>
-      <w:proofErr w:type="spellEnd"/>
-      <w:r>
-        <w:t xml:space="preserve">, </w:t>
-      </w:r>
-      <w:proofErr w:type="spellStart"/>
-      <w:r>
-        <w:t>data.status</w:t>
-      </w:r>
-      <w:proofErr w:type="spellEnd"/>
-      <w:r>
-        <w:t xml:space="preserve"> || 'LIVE', </w:t>
-      </w:r>
-      <w:proofErr w:type="spellStart"/>
-      <w:r>
-        <w:t>data.memo</w:t>
-      </w:r>
-      <w:proofErr w:type="spellEnd"/>
-      <w:r>
-        <w:t xml:space="preserve"> || ''];</w:t>
-      </w:r>
-    </w:p>
-    <w:p>
-      <w:r>
-        <w:t xml:space="preserve">        </w:t>
-      </w:r>
-    </w:p>
-    <w:p>
-      <w:r>
-        <w:t xml:space="preserve">        if (</w:t>
-      </w:r>
-      <w:proofErr w:type="spellStart"/>
-      <w:r>
-        <w:t>rowIndex</w:t>
-      </w:r>
-      <w:proofErr w:type="spellEnd"/>
-      <w:r>
-        <w:t xml:space="preserve"> !== -1) {</w:t>
-      </w:r>
-    </w:p>
-    <w:p>
-      <w:r>
-        <w:t xml:space="preserve">            </w:t>
-      </w:r>
-      <w:proofErr w:type="spellStart"/>
-      <w:r>
-        <w:t>liveSheet.getRange</w:t>
-      </w:r>
-      <w:proofErr w:type="spellEnd"/>
-      <w:r>
-        <w:t>(</w:t>
-      </w:r>
-      <w:proofErr w:type="spellStart"/>
-      <w:r>
-        <w:t>rowIndex</w:t>
-      </w:r>
-      <w:proofErr w:type="spellEnd"/>
-      <w:r>
-        <w:t xml:space="preserve">, 1, 1, </w:t>
-      </w:r>
-      <w:proofErr w:type="spellStart"/>
-      <w:r>
-        <w:t>rowData.length</w:t>
-      </w:r>
-      <w:proofErr w:type="spellEnd"/>
-      <w:r>
-        <w:t>).</w:t>
-      </w:r>
-      <w:proofErr w:type="spellStart"/>
-      <w:r>
-        <w:t>setValues</w:t>
-      </w:r>
-      <w:proofErr w:type="spellEnd"/>
-      <w:r>
-        <w:t>([</w:t>
-      </w:r>
-      <w:proofErr w:type="spellStart"/>
-      <w:r>
-        <w:t>rowData</w:t>
-      </w:r>
-      <w:proofErr w:type="spellEnd"/>
-      <w:r>
-        <w:t>]);</w:t>
-      </w:r>
+        <w:t>]</w:t>
+      </w:r>
+      <w:proofErr w:type="gramStart"/>
+      <w:r>
+        <w:t>);</w:t>
+      </w:r>
+      <w:proofErr w:type="gramEnd"/>
     </w:p>
     <w:p>
       <w:r>
@@ -14390,9 +15173,11 @@
         <w:t>rowData</w:t>
       </w:r>
       <w:proofErr w:type="spellEnd"/>
+      <w:proofErr w:type="gramStart"/>
       <w:r>
         <w:t>);</w:t>
       </w:r>
+      <w:proofErr w:type="gramEnd"/>
     </w:p>
     <w:p>
       <w:r>
@@ -14416,8 +15201,13 @@
         <w:t>JSON.stringify</w:t>
       </w:r>
       <w:proofErr w:type="spellEnd"/>
-      <w:r>
-        <w:t xml:space="preserve">({ status: 'success', </w:t>
+      <w:proofErr w:type="gramStart"/>
+      <w:r>
+        <w:t>({ status</w:t>
+      </w:r>
+      <w:proofErr w:type="gramEnd"/>
+      <w:r>
+        <w:t xml:space="preserve">: 'success', </w:t>
       </w:r>
       <w:proofErr w:type="spellStart"/>
       <w:r>
@@ -14425,17 +15215,23 @@
       </w:r>
       <w:proofErr w:type="spellEnd"/>
       <w:r>
-        <w:t>: SERVER_ID })).</w:t>
+        <w:t>: SERVER_</w:t>
+      </w:r>
+      <w:proofErr w:type="gramStart"/>
+      <w:r>
+        <w:t>ID })).</w:t>
       </w:r>
       <w:proofErr w:type="spellStart"/>
       <w:r>
         <w:t>setMimeType</w:t>
       </w:r>
       <w:proofErr w:type="spellEnd"/>
+      <w:proofErr w:type="gramEnd"/>
       <w:r>
         <w:t>(</w:t>
       </w:r>
       <w:proofErr w:type="spellStart"/>
+      <w:proofErr w:type="gramStart"/>
       <w:r>
         <w:t>ContentService.MimeType.JSON</w:t>
       </w:r>
@@ -14443,6 +15239,7 @@
       <w:r>
         <w:t>);</w:t>
       </w:r>
+      <w:proofErr w:type="gramEnd"/>
     </w:p>
     <w:p>
       <w:r>
@@ -14456,8 +15253,13 @@
     </w:p>
     <w:p>
       <w:r>
-        <w:t xml:space="preserve">  } catch (error) {</w:t>
-      </w:r>
+        <w:t xml:space="preserve">  } catch (</w:t>
+      </w:r>
+      <w:proofErr w:type="gramStart"/>
+      <w:r>
+        <w:t>error) {</w:t>
+      </w:r>
+      <w:proofErr w:type="gramEnd"/>
     </w:p>
     <w:p>
       <w:r>
@@ -14476,26 +15278,39 @@
         <w:t>JSON.stringify</w:t>
       </w:r>
       <w:proofErr w:type="spellEnd"/>
-      <w:r>
-        <w:t xml:space="preserve">({ status: 'error', message: </w:t>
+      <w:proofErr w:type="gramStart"/>
+      <w:r>
+        <w:t>({ status</w:t>
+      </w:r>
+      <w:proofErr w:type="gramEnd"/>
+      <w:r>
+        <w:t xml:space="preserve">: 'error', message: </w:t>
       </w:r>
       <w:proofErr w:type="spellStart"/>
+      <w:proofErr w:type="gramStart"/>
       <w:r>
         <w:t>error.toString</w:t>
       </w:r>
       <w:proofErr w:type="spellEnd"/>
-      <w:r>
-        <w:t>() })).</w:t>
+      <w:proofErr w:type="gramEnd"/>
+      <w:r>
+        <w:t>(</w:t>
+      </w:r>
+      <w:proofErr w:type="gramStart"/>
+      <w:r>
+        <w:t>) })).</w:t>
       </w:r>
       <w:proofErr w:type="spellStart"/>
       <w:r>
         <w:t>setMimeType</w:t>
       </w:r>
       <w:proofErr w:type="spellEnd"/>
+      <w:proofErr w:type="gramEnd"/>
       <w:r>
         <w:t>(</w:t>
       </w:r>
       <w:proofErr w:type="spellStart"/>
+      <w:proofErr w:type="gramStart"/>
       <w:r>
         <w:t>ContentService.MimeType.JSON</w:t>
       </w:r>
@@ -14503,6 +15318,7 @@
       <w:r>
         <w:t>);</w:t>
       </w:r>
+      <w:proofErr w:type="gramEnd"/>
     </w:p>
     <w:p>
       <w:r>
@@ -14524,8 +15340,13 @@
       </w:r>
       <w:proofErr w:type="spellEnd"/>
       <w:r>
-        <w:t>(e) {</w:t>
-      </w:r>
+        <w:t>(</w:t>
+      </w:r>
+      <w:proofErr w:type="gramStart"/>
+      <w:r>
+        <w:t>e) {</w:t>
+      </w:r>
+      <w:proofErr w:type="gramEnd"/>
     </w:p>
     <w:p>
       <w:r>
@@ -14537,6 +15358,7 @@
         <w:t xml:space="preserve">    const ss = </w:t>
       </w:r>
       <w:proofErr w:type="spellStart"/>
+      <w:proofErr w:type="gramStart"/>
       <w:r>
         <w:t>getSS</w:t>
       </w:r>
@@ -14544,22 +15366,30 @@
       <w:r>
         <w:t>();</w:t>
       </w:r>
+      <w:proofErr w:type="gramEnd"/>
     </w:p>
     <w:p>
       <w:r>
         <w:t xml:space="preserve">    if (</w:t>
       </w:r>
       <w:proofErr w:type="spellStart"/>
+      <w:proofErr w:type="gramStart"/>
       <w:r>
         <w:t>e.parameter</w:t>
       </w:r>
       <w:proofErr w:type="spellEnd"/>
+      <w:proofErr w:type="gramEnd"/>
       <w:r>
         <w:t xml:space="preserve"> &amp;&amp; </w:t>
       </w:r>
       <w:proofErr w:type="spellStart"/>
-      <w:r>
-        <w:t>e.parameter.action</w:t>
+      <w:proofErr w:type="gramStart"/>
+      <w:r>
+        <w:t>e.parameter</w:t>
+      </w:r>
+      <w:proofErr w:type="gramEnd"/>
+      <w:r>
+        <w:t>.action</w:t>
       </w:r>
       <w:proofErr w:type="spellEnd"/>
       <w:r>
@@ -14570,9 +15400,11 @@
         <w:t>getLive</w:t>
       </w:r>
       <w:proofErr w:type="spellEnd"/>
+      <w:proofErr w:type="gramStart"/>
       <w:r>
         <w:t>') {</w:t>
       </w:r>
+      <w:proofErr w:type="gramEnd"/>
     </w:p>
     <w:p>
       <w:r>
@@ -14587,10 +15419,12 @@
         <w:t xml:space="preserve"> = </w:t>
       </w:r>
       <w:proofErr w:type="spellStart"/>
+      <w:proofErr w:type="gramStart"/>
       <w:r>
         <w:t>ss.getSheetByName</w:t>
       </w:r>
       <w:proofErr w:type="spellEnd"/>
+      <w:proofErr w:type="gramEnd"/>
       <w:r>
         <w:t>('</w:t>
       </w:r>
@@ -14599,9 +15433,11 @@
         <w:t>LiveStreams'</w:t>
       </w:r>
       <w:proofErr w:type="spellEnd"/>
+      <w:proofErr w:type="gramStart"/>
       <w:r>
         <w:t>);</w:t>
       </w:r>
+      <w:proofErr w:type="gramEnd"/>
     </w:p>
     <w:p>
       <w:r>
@@ -14616,12 +15452,17 @@
         <w:t xml:space="preserve"> = </w:t>
       </w:r>
       <w:proofErr w:type="spellStart"/>
+      <w:proofErr w:type="gramStart"/>
       <w:r>
         <w:t>liveSheet</w:t>
       </w:r>
       <w:proofErr w:type="spellEnd"/>
       <w:r>
-        <w:t xml:space="preserve"> ? </w:t>
+        <w:t xml:space="preserve"> ?</w:t>
+      </w:r>
+      <w:proofErr w:type="gramEnd"/>
+      <w:r>
+        <w:t xml:space="preserve"> </w:t>
       </w:r>
       <w:proofErr w:type="spellStart"/>
       <w:r>
@@ -14629,8 +15470,21 @@
       </w:r>
       <w:proofErr w:type="spellEnd"/>
       <w:r>
-        <w:t>() : 0;</w:t>
-      </w:r>
+        <w:t>(</w:t>
+      </w:r>
+      <w:proofErr w:type="gramStart"/>
+      <w:r>
+        <w:t>) :</w:t>
+      </w:r>
+      <w:proofErr w:type="gramEnd"/>
+      <w:r>
+        <w:t xml:space="preserve"> </w:t>
+      </w:r>
+      <w:proofErr w:type="gramStart"/>
+      <w:r>
+        <w:t>0;</w:t>
+      </w:r>
+      <w:proofErr w:type="gramEnd"/>
     </w:p>
     <w:p>
       <w:r>
@@ -14642,8 +15496,21 @@
       </w:r>
       <w:proofErr w:type="spellEnd"/>
       <w:r>
-        <w:t xml:space="preserve"> &lt;= 1) return ContentService.createTextOutput(JSON.stringify([])).setMimeType(ContentService.MimeType.JSON);</w:t>
-      </w:r>
+        <w:t xml:space="preserve"> &lt;= 1) return ContentService.createTextOutput(JSON.stringify([])</w:t>
+      </w:r>
+      <w:proofErr w:type="gramStart"/>
+      <w:r>
+        <w:t>).setMimeType</w:t>
+      </w:r>
+      <w:proofErr w:type="gramEnd"/>
+      <w:r>
+        <w:t>(</w:t>
+      </w:r>
+      <w:proofErr w:type="gramStart"/>
+      <w:r>
+        <w:t>ContentService.MimeType.JSON);</w:t>
+      </w:r>
+      <w:proofErr w:type="gramEnd"/>
     </w:p>
     <w:p>
       <w:r>
@@ -14676,16 +15543,49 @@
       </w:r>
       <w:proofErr w:type="spellEnd"/>
       <w:r>
-        <w:t>()).</w:t>
+        <w:t>()</w:t>
+      </w:r>
+      <w:proofErr w:type="gramStart"/>
+      <w:r>
+        <w:t>).</w:t>
       </w:r>
       <w:proofErr w:type="spellStart"/>
       <w:r>
         <w:t>getValues</w:t>
       </w:r>
       <w:proofErr w:type="spellEnd"/>
+      <w:proofErr w:type="gramEnd"/>
+      <w:r>
+        <w:t>(</w:t>
+      </w:r>
+      <w:proofErr w:type="gramStart"/>
+      <w:r>
+        <w:t>);</w:t>
+      </w:r>
+      <w:proofErr w:type="gramEnd"/>
+    </w:p>
+    <w:p>
+      <w:r>
+        <w:t xml:space="preserve">      const </w:t>
+      </w:r>
+      <w:proofErr w:type="spellStart"/>
+      <w:r>
+        <w:t>nowMs</w:t>
+      </w:r>
+      <w:proofErr w:type="spellEnd"/>
+      <w:r>
+        <w:t xml:space="preserve"> = </w:t>
+      </w:r>
+      <w:proofErr w:type="spellStart"/>
+      <w:proofErr w:type="gramStart"/>
+      <w:r>
+        <w:t>Date.now</w:t>
+      </w:r>
+      <w:proofErr w:type="spellEnd"/>
       <w:r>
         <w:t>();</w:t>
       </w:r>
+      <w:proofErr w:type="gramEnd"/>
     </w:p>
     <w:p>
       <w:r>
@@ -14693,154 +15593,206 @@
       </w:r>
       <w:proofErr w:type="spellStart"/>
       <w:r>
+        <w:t>isDebug</w:t>
+      </w:r>
+      <w:proofErr w:type="spellEnd"/>
+      <w:r>
+        <w:t xml:space="preserve"> = </w:t>
+      </w:r>
+      <w:proofErr w:type="spellStart"/>
+      <w:proofErr w:type="gramStart"/>
+      <w:r>
+        <w:t>e.parameter</w:t>
+      </w:r>
+      <w:proofErr w:type="gramEnd"/>
+      <w:r>
+        <w:t>.debug</w:t>
+      </w:r>
+      <w:proofErr w:type="spellEnd"/>
+      <w:r>
+        <w:t xml:space="preserve"> === 'true</w:t>
+      </w:r>
+      <w:proofErr w:type="gramStart"/>
+      <w:r>
+        <w:t>';</w:t>
+      </w:r>
+      <w:proofErr w:type="gramEnd"/>
+    </w:p>
+    <w:p>
+      <w:r>
+        <w:t xml:space="preserve">      </w:t>
+      </w:r>
+    </w:p>
+    <w:p>
+      <w:r>
+        <w:t xml:space="preserve">      const </w:t>
+      </w:r>
+      <w:proofErr w:type="spellStart"/>
+      <w:r>
+        <w:t>activeStreams</w:t>
+      </w:r>
+      <w:proofErr w:type="spellEnd"/>
+      <w:r>
+        <w:t xml:space="preserve"> = </w:t>
+      </w:r>
+      <w:proofErr w:type="spellStart"/>
+      <w:proofErr w:type="gramStart"/>
+      <w:r>
+        <w:t>rows.map</w:t>
+      </w:r>
+      <w:proofErr w:type="spellEnd"/>
+      <w:r>
+        <w:t>(</w:t>
+      </w:r>
+      <w:proofErr w:type="gramEnd"/>
+      <w:r>
+        <w:t>row =&gt; {</w:t>
+      </w:r>
+    </w:p>
+    <w:p>
+      <w:r>
+        <w:t xml:space="preserve">          const </w:t>
+      </w:r>
+      <w:proofErr w:type="spellStart"/>
+      <w:r>
+        <w:t>ts</w:t>
+      </w:r>
+      <w:proofErr w:type="spellEnd"/>
+      <w:r>
+        <w:t xml:space="preserve"> = Number(</w:t>
+      </w:r>
+      <w:proofErr w:type="gramStart"/>
+      <w:r>
+        <w:t>row[</w:t>
+      </w:r>
+      <w:proofErr w:type="gramEnd"/>
+      <w:r>
+        <w:t>1]</w:t>
+      </w:r>
+      <w:proofErr w:type="gramStart"/>
+      <w:r>
+        <w:t>);</w:t>
+      </w:r>
+      <w:proofErr w:type="gramEnd"/>
+    </w:p>
+    <w:p>
+      <w:r>
+        <w:t xml:space="preserve">          return {</w:t>
+      </w:r>
+    </w:p>
+    <w:p>
+      <w:r>
+        <w:t xml:space="preserve">              </w:t>
+      </w:r>
+      <w:proofErr w:type="spellStart"/>
+      <w:r>
+        <w:t>corp</w:t>
+      </w:r>
+      <w:proofErr w:type="spellEnd"/>
+      <w:r>
+        <w:t xml:space="preserve">: </w:t>
+      </w:r>
+      <w:proofErr w:type="gramStart"/>
+      <w:r>
+        <w:t>row[</w:t>
+      </w:r>
+      <w:proofErr w:type="gramEnd"/>
+      <w:r>
+        <w:t>0],</w:t>
+      </w:r>
+    </w:p>
+    <w:p>
+      <w:r>
+        <w:t xml:space="preserve">              timestamp: </w:t>
+      </w:r>
+      <w:proofErr w:type="spellStart"/>
+      <w:r>
+        <w:t>ts</w:t>
+      </w:r>
+      <w:proofErr w:type="spellEnd"/>
+      <w:r>
+        <w:t>,</w:t>
+      </w:r>
+    </w:p>
+    <w:p>
+      <w:r>
+        <w:t xml:space="preserve">              image: </w:t>
+      </w:r>
+      <w:proofErr w:type="gramStart"/>
+      <w:r>
+        <w:t>row[</w:t>
+      </w:r>
+      <w:proofErr w:type="gramEnd"/>
+      <w:r>
+        <w:t>2],</w:t>
+      </w:r>
+    </w:p>
+    <w:p>
+      <w:r>
+        <w:t xml:space="preserve">              status: </w:t>
+      </w:r>
+      <w:proofErr w:type="gramStart"/>
+      <w:r>
+        <w:t>row[</w:t>
+      </w:r>
+      <w:proofErr w:type="gramEnd"/>
+      <w:r>
+        <w:t>3],</w:t>
+      </w:r>
+    </w:p>
+    <w:p>
+      <w:r>
+        <w:t xml:space="preserve">              memo: </w:t>
+      </w:r>
+      <w:proofErr w:type="gramStart"/>
+      <w:r>
+        <w:t>row[</w:t>
+      </w:r>
+      <w:proofErr w:type="gramEnd"/>
+      <w:r>
+        <w:t>4],</w:t>
+      </w:r>
+    </w:p>
+    <w:p>
+      <w:r>
+        <w:t xml:space="preserve">              age: </w:t>
+      </w:r>
+      <w:proofErr w:type="spellStart"/>
+      <w:proofErr w:type="gramStart"/>
+      <w:r>
+        <w:t>ts</w:t>
+      </w:r>
+      <w:proofErr w:type="spellEnd"/>
+      <w:r>
+        <w:t xml:space="preserve"> ?</w:t>
+      </w:r>
+      <w:proofErr w:type="gramEnd"/>
+      <w:r>
+        <w:t xml:space="preserve"> (</w:t>
+      </w:r>
+      <w:proofErr w:type="spellStart"/>
+      <w:r>
         <w:t>nowMs</w:t>
       </w:r>
       <w:proofErr w:type="spellEnd"/>
       <w:r>
-        <w:t xml:space="preserve"> = </w:t>
+        <w:t xml:space="preserve"> - </w:t>
       </w:r>
       <w:proofErr w:type="spellStart"/>
       <w:r>
-        <w:t>Date.now</w:t>
+        <w:t>ts</w:t>
       </w:r>
       <w:proofErr w:type="spellEnd"/>
       <w:r>
-        <w:t>();</w:t>
-      </w:r>
-    </w:p>
-    <w:p>
-      <w:r>
-        <w:t xml:space="preserve">      const </w:t>
-      </w:r>
-      <w:proofErr w:type="spellStart"/>
-      <w:r>
-        <w:t>isDebug</w:t>
-      </w:r>
-      <w:proofErr w:type="spellEnd"/>
-      <w:r>
-        <w:t xml:space="preserve"> = </w:t>
-      </w:r>
-      <w:proofErr w:type="spellStart"/>
-      <w:r>
-        <w:t>e.parameter.debug</w:t>
-      </w:r>
-      <w:proofErr w:type="spellEnd"/>
-      <w:r>
-        <w:t xml:space="preserve"> === 'true';</w:t>
-      </w:r>
-    </w:p>
-    <w:p>
-      <w:r>
-        <w:t xml:space="preserve">      </w:t>
-      </w:r>
-    </w:p>
-    <w:p>
-      <w:r>
-        <w:t xml:space="preserve">      const </w:t>
-      </w:r>
-      <w:proofErr w:type="spellStart"/>
-      <w:r>
-        <w:t>activeStreams</w:t>
-      </w:r>
-      <w:proofErr w:type="spellEnd"/>
-      <w:r>
-        <w:t xml:space="preserve"> = </w:t>
-      </w:r>
-      <w:proofErr w:type="spellStart"/>
-      <w:r>
-        <w:t>rows.map</w:t>
-      </w:r>
-      <w:proofErr w:type="spellEnd"/>
-      <w:r>
-        <w:t>(row =&gt; {</w:t>
-      </w:r>
-    </w:p>
-    <w:p>
-      <w:r>
-        <w:t xml:space="preserve">          const </w:t>
-      </w:r>
-      <w:proofErr w:type="spellStart"/>
-      <w:r>
-        <w:t>ts</w:t>
-      </w:r>
-      <w:proofErr w:type="spellEnd"/>
-      <w:r>
-        <w:t xml:space="preserve"> = Number(row[1]);</w:t>
-      </w:r>
-    </w:p>
-    <w:p>
-      <w:r>
-        <w:t xml:space="preserve">          return {</w:t>
-      </w:r>
-    </w:p>
-    <w:p>
-      <w:r>
-        <w:t xml:space="preserve">              </w:t>
-      </w:r>
-      <w:proofErr w:type="spellStart"/>
-      <w:r>
-        <w:t>corp</w:t>
-      </w:r>
-      <w:proofErr w:type="spellEnd"/>
-      <w:r>
-        <w:t>: row[0],</w:t>
-      </w:r>
-    </w:p>
-    <w:p>
-      <w:r>
-        <w:t xml:space="preserve">              timestamp: </w:t>
-      </w:r>
-      <w:proofErr w:type="spellStart"/>
-      <w:r>
-        <w:t>ts</w:t>
-      </w:r>
-      <w:proofErr w:type="spellEnd"/>
-      <w:r>
-        <w:t>,</w:t>
-      </w:r>
-    </w:p>
-    <w:p>
-      <w:r>
-        <w:t xml:space="preserve">              image: row[2],</w:t>
-      </w:r>
-    </w:p>
-    <w:p>
-      <w:r>
-        <w:t xml:space="preserve">              status: row[3],</w:t>
-      </w:r>
-    </w:p>
-    <w:p>
-      <w:r>
-        <w:t xml:space="preserve">              memo: row[4],</w:t>
-      </w:r>
-    </w:p>
-    <w:p>
-      <w:r>
-        <w:t xml:space="preserve">              age: </w:t>
-      </w:r>
-      <w:proofErr w:type="spellStart"/>
-      <w:r>
-        <w:t>ts</w:t>
-      </w:r>
-      <w:proofErr w:type="spellEnd"/>
-      <w:r>
-        <w:t xml:space="preserve"> ? (</w:t>
-      </w:r>
-      <w:proofErr w:type="spellStart"/>
-      <w:r>
-        <w:t>nowMs</w:t>
-      </w:r>
-      <w:proofErr w:type="spellEnd"/>
-      <w:r>
-        <w:t xml:space="preserve"> - </w:t>
-      </w:r>
-      <w:proofErr w:type="spellStart"/>
-      <w:r>
-        <w:t>ts</w:t>
-      </w:r>
-      <w:proofErr w:type="spellEnd"/>
-      <w:r>
-        <w:t>) / 1000 : null,</w:t>
+        <w:t xml:space="preserve">) / </w:t>
+      </w:r>
+      <w:proofErr w:type="gramStart"/>
+      <w:r>
+        <w:t>1000 :</w:t>
+      </w:r>
+      <w:proofErr w:type="gramEnd"/>
+      <w:r>
+        <w:t xml:space="preserve"> null,</w:t>
       </w:r>
     </w:p>
     <w:p>
@@ -14859,12 +15811,25 @@
     </w:p>
     <w:p>
       <w:r>
-        <w:t xml:space="preserve">          };</w:t>
-      </w:r>
-    </w:p>
-    <w:p>
-      <w:r>
-        <w:t xml:space="preserve">      }).filter(stream =&gt; {</w:t>
+        <w:t xml:space="preserve">          </w:t>
+      </w:r>
+      <w:proofErr w:type="gramStart"/>
+      <w:r>
+        <w:t>};</w:t>
+      </w:r>
+      <w:proofErr w:type="gramEnd"/>
+    </w:p>
+    <w:p>
+      <w:r>
+        <w:t xml:space="preserve">      }</w:t>
+      </w:r>
+      <w:proofErr w:type="gramStart"/>
+      <w:r>
+        <w:t>).filter</w:t>
+      </w:r>
+      <w:proofErr w:type="gramEnd"/>
+      <w:r>
+        <w:t>(stream =&gt; {</w:t>
       </w:r>
     </w:p>
     <w:p>
@@ -14877,8 +15842,21 @@
       </w:r>
       <w:proofErr w:type="spellEnd"/>
       <w:r>
-        <w:t>) return true;</w:t>
-      </w:r>
+        <w:t xml:space="preserve">) </w:t>
+      </w:r>
+      <w:proofErr w:type="gramStart"/>
+      <w:r>
+        <w:t>return</w:t>
+      </w:r>
+      <w:proofErr w:type="gramEnd"/>
+      <w:r>
+        <w:t xml:space="preserve"> </w:t>
+      </w:r>
+      <w:proofErr w:type="gramStart"/>
+      <w:r>
+        <w:t>true;</w:t>
+      </w:r>
+      <w:proofErr w:type="gramEnd"/>
     </w:p>
     <w:p>
       <w:r>
@@ -14911,8 +15889,13 @@
     </w:p>
     <w:p>
       <w:r>
-        <w:t xml:space="preserve">      });</w:t>
-      </w:r>
+        <w:t xml:space="preserve">      }</w:t>
+      </w:r>
+      <w:proofErr w:type="gramStart"/>
+      <w:r>
+        <w:t>);</w:t>
+      </w:r>
+      <w:proofErr w:type="gramEnd"/>
     </w:p>
     <w:p>
       <w:r>
@@ -14920,21 +15903,32 @@
       </w:r>
       <w:proofErr w:type="spellStart"/>
       <w:r>
-        <w:t>activeStreams.sort</w:t>
+        <w:t>activeStreams.</w:t>
+      </w:r>
+      <w:proofErr w:type="gramStart"/>
+      <w:r>
+        <w:t>sort</w:t>
       </w:r>
       <w:proofErr w:type="spellEnd"/>
       <w:r>
-        <w:t xml:space="preserve">((a, b) =&gt; </w:t>
+        <w:t>((</w:t>
+      </w:r>
+      <w:proofErr w:type="gramEnd"/>
+      <w:r>
+        <w:t xml:space="preserve">a, b) =&gt; </w:t>
       </w:r>
       <w:proofErr w:type="spellStart"/>
+      <w:proofErr w:type="gramStart"/>
       <w:r>
         <w:t>b.timestamp</w:t>
       </w:r>
       <w:proofErr w:type="spellEnd"/>
+      <w:proofErr w:type="gramEnd"/>
       <w:r>
         <w:t xml:space="preserve"> - </w:t>
       </w:r>
       <w:proofErr w:type="spellStart"/>
+      <w:proofErr w:type="gramStart"/>
       <w:r>
         <w:t>a.timestamp</w:t>
       </w:r>
@@ -14942,11 +15936,25 @@
       <w:r>
         <w:t>);</w:t>
       </w:r>
-    </w:p>
-    <w:p>
-      <w:r>
-        <w:t xml:space="preserve">      return ContentService.createTextOutput(JSON.stringify(activeStreams)).setMimeType(ContentService.MimeType.JSON);</w:t>
-      </w:r>
+      <w:proofErr w:type="gramEnd"/>
+    </w:p>
+    <w:p>
+      <w:r>
+        <w:t xml:space="preserve">      return ContentService.createTextOutput(JSON.stringify(activeStreams)</w:t>
+      </w:r>
+      <w:proofErr w:type="gramStart"/>
+      <w:r>
+        <w:t>).setMimeType</w:t>
+      </w:r>
+      <w:proofErr w:type="gramEnd"/>
+      <w:r>
+        <w:t>(</w:t>
+      </w:r>
+      <w:proofErr w:type="gramStart"/>
+      <w:r>
+        <w:t>ContentService.MimeType.JSON);</w:t>
+      </w:r>
+      <w:proofErr w:type="gramEnd"/>
     </w:p>
     <w:p>
       <w:r>
@@ -14960,8 +15968,13 @@
     </w:p>
     <w:p>
       <w:r>
-        <w:t xml:space="preserve">  } catch (error) {</w:t>
-      </w:r>
+        <w:t xml:space="preserve">  } catch (</w:t>
+      </w:r>
+      <w:proofErr w:type="gramStart"/>
+      <w:r>
+        <w:t>error) {</w:t>
+      </w:r>
+      <w:proofErr w:type="gramEnd"/>
     </w:p>
     <w:p>
       <w:r>
@@ -14980,26 +15993,39 @@
         <w:t>JSON.stringify</w:t>
       </w:r>
       <w:proofErr w:type="spellEnd"/>
-      <w:r>
-        <w:t xml:space="preserve">({ status: 'error', message: </w:t>
+      <w:proofErr w:type="gramStart"/>
+      <w:r>
+        <w:t>({ status</w:t>
+      </w:r>
+      <w:proofErr w:type="gramEnd"/>
+      <w:r>
+        <w:t xml:space="preserve">: 'error', message: </w:t>
       </w:r>
       <w:proofErr w:type="spellStart"/>
+      <w:proofErr w:type="gramStart"/>
       <w:r>
         <w:t>error.toString</w:t>
       </w:r>
       <w:proofErr w:type="spellEnd"/>
-      <w:r>
-        <w:t>() })).</w:t>
+      <w:proofErr w:type="gramEnd"/>
+      <w:r>
+        <w:t>(</w:t>
+      </w:r>
+      <w:proofErr w:type="gramStart"/>
+      <w:r>
+        <w:t>) })).</w:t>
       </w:r>
       <w:proofErr w:type="spellStart"/>
       <w:r>
         <w:t>setMimeType</w:t>
       </w:r>
       <w:proofErr w:type="spellEnd"/>
+      <w:proofErr w:type="gramEnd"/>
       <w:r>
         <w:t>(</w:t>
       </w:r>
       <w:proofErr w:type="spellStart"/>
+      <w:proofErr w:type="gramStart"/>
       <w:r>
         <w:t>ContentService.MimeType.JSON</w:t>
       </w:r>
@@ -15007,6 +16033,7 @@
       <w:r>
         <w:t>);</w:t>
       </w:r>
+      <w:proofErr w:type="gramEnd"/>
     </w:p>
     <w:p>
       <w:r>
@@ -15399,7 +16426,15 @@
         </w:numPr>
       </w:pPr>
       <w:r>
-        <w:t>電波が不安定で通信が「応答なし」になった場合でも、15秒で強制的に切り上げ、次の送信（#2, #3...）へ進めるようにしました（</w:t>
+        <w:t>電波が不安定で通信が「応答なし」になった場合でも、15秒で強制的に切り上げ、次の送信（#2, #3</w:t>
+      </w:r>
+      <w:proofErr w:type="gramStart"/>
+      <w:r>
+        <w:t>...</w:t>
+      </w:r>
+      <w:proofErr w:type="gramEnd"/>
+      <w:r>
+        <w:t>）へ進めるようにしました（</w:t>
       </w:r>
       <w:proofErr w:type="spellStart"/>
       <w:r>
@@ -16168,7 +17203,15 @@
         </w:numPr>
       </w:pPr>
       <w:r>
-        <w:t>電波が悪くて送信が止まりそうになっても、15秒で強制的に切り上げて次の送信（#2, #3...）を開始するようにしました。</w:t>
+        <w:t>電波が悪くて送信が止まりそうになっても、15秒で強制的に切り上げて次の送信（#2, #3</w:t>
+      </w:r>
+      <w:proofErr w:type="gramStart"/>
+      <w:r>
+        <w:t>...</w:t>
+      </w:r>
+      <w:proofErr w:type="gramEnd"/>
+      <w:r>
+        <w:t>）を開始するようにしました。</w:t>
       </w:r>
     </w:p>
     <w:p>
@@ -18249,12 +19292,17 @@
         <w:t xml:space="preserve">function </w:t>
       </w:r>
       <w:proofErr w:type="spellStart"/>
+      <w:proofErr w:type="gramStart"/>
       <w:r>
         <w:t>cleanupOldData</w:t>
       </w:r>
       <w:proofErr w:type="spellEnd"/>
       <w:r>
-        <w:t>() {</w:t>
+        <w:t>(</w:t>
+      </w:r>
+      <w:proofErr w:type="gramEnd"/>
+      <w:r>
+        <w:t>) {</w:t>
       </w:r>
     </w:p>
     <w:p>
@@ -18262,6 +19310,7 @@
         <w:t xml:space="preserve">    const ss = </w:t>
       </w:r>
       <w:proofErr w:type="spellStart"/>
+      <w:proofErr w:type="gramStart"/>
       <w:r>
         <w:t>getSS</w:t>
       </w:r>
@@ -18269,6 +19318,7 @@
       <w:r>
         <w:t>();</w:t>
       </w:r>
+      <w:proofErr w:type="gramEnd"/>
     </w:p>
     <w:p>
       <w:r>
@@ -18929,7 +19979,15 @@
         <w:t>「</w:t>
       </w:r>
       <w:r>
-        <w:t>自分が配信するでカメラ画面の下に黒い帯（何も写ってない部分）が表示されます。修正出来ませんか？</w:t>
+        <w:t>自分が配信する</w:t>
+      </w:r>
+      <w:proofErr w:type="gramStart"/>
+      <w:r>
+        <w:t>で</w:t>
+      </w:r>
+      <w:proofErr w:type="gramEnd"/>
+      <w:r>
+        <w:t>カメラ画面の下に黒い帯（何も写ってない部分）が表示されます。修正出来ませんか？</w:t>
       </w:r>
       <w:r>
         <w:br/>
@@ -19125,7 +20183,15 @@
     </w:p>
     <w:p>
       <w:r>
-        <w:t>プロジェクトのルートディレクトリに SETUp_GUIDE.md というファイル名で保存しております。このファイルをそのまま配布したり、PDF化してマニュアルとしてお使いいただけます。</w:t>
+        <w:t>プロジェクトのルートディレクトリに SETUp_GUIDE.md というファイル名で保存しております。このファイルをそのまま配布</w:t>
+      </w:r>
+      <w:proofErr w:type="gramStart"/>
+      <w:r>
+        <w:t>したり</w:t>
+      </w:r>
+      <w:proofErr w:type="gramEnd"/>
+      <w:r>
+        <w:t>、PDF化してマニュアルとしてお使いいただけます。</w:t>
       </w:r>
     </w:p>
     <w:p>
@@ -20315,7 +21381,23 @@
         </w:pBdr>
       </w:pPr>
       <w:r>
-        <w:t>詳細は 完了報告 (walkthrough.md) をご覧ください。これで、現場からの情報が時系列で一目で把握できるようになりました。</w:t>
+        <w:t>詳細は 完了報告 (walkthrough.md) をご覧ください。これで、現場からの情報が時系列</w:t>
+      </w:r>
+      <w:proofErr w:type="gramStart"/>
+      <w:r>
+        <w:t>で</w:t>
+      </w:r>
+      <w:proofErr w:type="gramEnd"/>
+      <w:r>
+        <w:t>一目</w:t>
+      </w:r>
+      <w:proofErr w:type="gramStart"/>
+      <w:r>
+        <w:t>で</w:t>
+      </w:r>
+      <w:proofErr w:type="gramEnd"/>
+      <w:r>
+        <w:t>把握できるようになりました。</w:t>
       </w:r>
     </w:p>
     <w:p/>
@@ -20665,7 +21747,15 @@
       </w:r>
       <w:proofErr w:type="spellEnd"/>
       <w:r>
-        <w:t>）を「完全」から「最低限のデータあり」に引き下げました。これにより、これまで「準備中...」で止まっていた場面でも送信が開始されます。</w:t>
+        <w:t>）を「完全」から「最低限のデータあり」に引き下げました。これにより、これまで「準備中</w:t>
+      </w:r>
+      <w:proofErr w:type="gramStart"/>
+      <w:r>
+        <w:t>...</w:t>
+      </w:r>
+      <w:proofErr w:type="gramEnd"/>
+      <w:r>
+        <w:t>」で止まっていた場面でも送信が開始されます。</w:t>
       </w:r>
     </w:p>
     <w:p>
@@ -22351,7 +23441,15 @@
         <w:t>「</w:t>
       </w:r>
       <w:r>
-        <w:t>+ボタンを押して災害情報入力画面の文字列「大村市消防団災害報告アプリ」をフォント、文字の大きさはそのままで「災害状況を入力して下さい」に変更して下さい。次に写真の文字列「※LINEから開いてる場合、他のブラウザで開いて下さい」は削除して下さい。</w:t>
+        <w:t>+ボタンを押して災害情報入力画面の文字列「大村市消防団災害報告アプリ」をフォント、文字の大きさはそのままで「災害状況を入力して下さい」に変更して下さい。次に写真の文字列「※LINEから</w:t>
+      </w:r>
+      <w:proofErr w:type="gramStart"/>
+      <w:r>
+        <w:t>開いてる</w:t>
+      </w:r>
+      <w:proofErr w:type="gramEnd"/>
+      <w:r>
+        <w:t>場合、他のブラウザで開いて下さい」は削除して下さい。</w:t>
       </w:r>
       <w:r>
         <w:rPr>
@@ -22414,7 +23512,15 @@
         <w:t>注意書きの削除</w:t>
       </w:r>
       <w:r>
-        <w:t>: 写真セクションにあった「※LINEから開いてる場合、他のブラウザで開いて下さい」という一文を削除しました。</w:t>
+        <w:t>: 写真セクションにあった「※LINEから</w:t>
+      </w:r>
+      <w:proofErr w:type="gramStart"/>
+      <w:r>
+        <w:t>開いてる</w:t>
+      </w:r>
+      <w:proofErr w:type="gramEnd"/>
+      <w:r>
+        <w:t>場合、他のブラウザで開いて下さい」という一文を削除しました。</w:t>
       </w:r>
     </w:p>
     <w:p>
@@ -23120,8 +24226,13 @@
       </w:r>
     </w:p>
     <w:p>
-      <w:r>
-        <w:t>[!TIP]</w:t>
+      <w:proofErr w:type="gramStart"/>
+      <w:r>
+        <w:t>[!TIP</w:t>
+      </w:r>
+      <w:proofErr w:type="gramEnd"/>
+      <w:r>
+        <w:t>]</w:t>
       </w:r>
     </w:p>
     <w:p>
@@ -23548,7 +24659,15 @@
         </w:pBdr>
       </w:pPr>
       <w:r>
-        <w:t>もしよろしければ、このアプリが**「ログインして団員が位置情報などを書き込む」ような複雑なもの</w:t>
+        <w:t>もしよろしければ、このアプリが**「ログインして団員が位置情報などを書き込む」</w:t>
+      </w:r>
+      <w:proofErr w:type="gramStart"/>
+      <w:r>
+        <w:t>ような</w:t>
+      </w:r>
+      <w:proofErr w:type="gramEnd"/>
+      <w:r>
+        <w:t>複雑なもの</w:t>
       </w:r>
       <w:r>
         <w:rPr>
@@ -23558,7 +24677,15 @@
         <w:t>か、それとも</w:t>
       </w:r>
       <w:r>
-        <w:t>「登録された情報を見るのがメイン」のシンプルなもの**か教えていただけますか？それに合わせて、最適な引っ越し先や構成をご提案できます！</w:t>
+        <w:t>「登録された情報を見るのがメイン」のシンプルなもの**</w:t>
+      </w:r>
+      <w:proofErr w:type="gramStart"/>
+      <w:r>
+        <w:t>か</w:t>
+      </w:r>
+      <w:proofErr w:type="gramEnd"/>
+      <w:r>
+        <w:t>教えていただけますか？それに合わせて、最適な引っ越し先や構成をご提案できます！</w:t>
       </w:r>
     </w:p>
     <w:p/>
@@ -24166,7 +25293,23 @@
         <w:t>災害時どうなる？：</w:t>
       </w:r>
       <w:r>
-        <w:t xml:space="preserve"> 大きな災害が起き、多くの団員が一斉に「現場の状況」や「位置情報」を送信ボタンを押した場合、この制限に引っかかり、</w:t>
+        <w:t xml:space="preserve"> 大きな災害が起き、多くの団員が一斉に「現場の状況」や「位置情報」</w:t>
+      </w:r>
+      <w:proofErr w:type="gramStart"/>
+      <w:r>
+        <w:t>を</w:t>
+      </w:r>
+      <w:proofErr w:type="gramEnd"/>
+      <w:r>
+        <w:t>送信ボタン</w:t>
+      </w:r>
+      <w:proofErr w:type="gramStart"/>
+      <w:r>
+        <w:t>を</w:t>
+      </w:r>
+      <w:proofErr w:type="gramEnd"/>
+      <w:r>
+        <w:t>押した場合、この制限に引っかかり、</w:t>
       </w:r>
       <w:r>
         <w:rPr>
@@ -24607,8 +25750,13 @@
       </w:tr>
     </w:tbl>
     <w:p>
-      <w:r>
-        <w:t>[!TIP]</w:t>
+      <w:proofErr w:type="gramStart"/>
+      <w:r>
+        <w:t>[!TIP</w:t>
+      </w:r>
+      <w:proofErr w:type="gramEnd"/>
+      <w:r>
+        <w:t>]</w:t>
       </w:r>
     </w:p>
     <w:p>
@@ -25093,7 +26241,15 @@
         <w:t>注意点：</w:t>
       </w:r>
       <w:r>
-        <w:t xml:space="preserve"> もし「大雨のピーク時に、200人が</w:t>
+        <w:t xml:space="preserve"> </w:t>
+      </w:r>
+      <w:proofErr w:type="gramStart"/>
+      <w:r>
+        <w:t>もし</w:t>
+      </w:r>
+      <w:proofErr w:type="gramEnd"/>
+      <w:r>
+        <w:t>「大雨のピーク時に、200人が</w:t>
       </w:r>
       <w:r>
         <w:rPr>
@@ -25894,8 +27050,17 @@
           <w:b/>
           <w:bCs/>
         </w:rPr>
-        <w:t>アプリを開くタイミングをほんの少しズラす</w:t>
-      </w:r>
+        <w:t>アプリを開くタイミングをほんの少しズラ</w:t>
+      </w:r>
+      <w:proofErr w:type="gramStart"/>
+      <w:r>
+        <w:rPr>
+          <w:b/>
+          <w:bCs/>
+        </w:rPr>
+        <w:t>す</w:t>
+      </w:r>
+      <w:proofErr w:type="gramEnd"/>
     </w:p>
     <w:p>
       <w:r>
@@ -28454,7 +29619,15 @@
     </w:p>
     <w:p>
       <w:r>
-        <w:t>GitHubのURLがわかりましたら、以下のよに教えていただければ、こちらで最新のプログラムをそのリポジトリに送信（プッシュ）する準備を整えます。</w:t>
+        <w:t>GitHubのURLがわかりましたら、以下の</w:t>
+      </w:r>
+      <w:proofErr w:type="gramStart"/>
+      <w:r>
+        <w:t>よに</w:t>
+      </w:r>
+      <w:proofErr w:type="gramEnd"/>
+      <w:r>
+        <w:t>教えていただければ、こちらで最新のプログラムをそのリポジトリに送信（プッシュ）する準備を整えます。</w:t>
       </w:r>
     </w:p>
     <w:p>
@@ -28530,7 +29703,15 @@
     </w:p>
     <w:p>
       <w:r>
-        <w:t>Cloudflare Pagesへ引っ越すためには、まず最初に </w:t>
+        <w:t>Cloudflare Pagesへ引っ越すためには、</w:t>
+      </w:r>
+      <w:proofErr w:type="gramStart"/>
+      <w:r>
+        <w:t>まず最初</w:t>
+      </w:r>
+      <w:proofErr w:type="gramEnd"/>
+      <w:r>
+        <w:t>に </w:t>
       </w:r>
       <w:r>
         <w:rPr>
@@ -29406,7 +30587,23 @@
         <w:t>[Begin setup]</w:t>
       </w:r>
       <w:r>
-        <w:t> （または「セットアップを開始」）ボタンを押します。</w:t>
+        <w:t> （または「セットアップ</w:t>
+      </w:r>
+      <w:proofErr w:type="gramStart"/>
+      <w:r>
+        <w:t>を</w:t>
+      </w:r>
+      <w:proofErr w:type="gramEnd"/>
+      <w:r>
+        <w:t>開始」）ボタン</w:t>
+      </w:r>
+      <w:proofErr w:type="gramStart"/>
+      <w:r>
+        <w:t>を</w:t>
+      </w:r>
+      <w:proofErr w:type="gramEnd"/>
+      <w:r>
+        <w:t>押します。</w:t>
       </w:r>
     </w:p>
     <w:p>
@@ -29586,7 +30783,15 @@
         <w:t>完全にお引っ越し完了</w:t>
       </w:r>
       <w:r>
-        <w:t> です！ もし途中で止まってしまったり、エラー（赤い文字）が出たりした場合は、その内容を教えてくださいね。_</w:t>
+        <w:t> です！ もし途中で止まって</w:t>
+      </w:r>
+      <w:proofErr w:type="gramStart"/>
+      <w:r>
+        <w:t>しまったり</w:t>
+      </w:r>
+      <w:proofErr w:type="gramEnd"/>
+      <w:r>
+        <w:t>、エラー（赤い文字）が出たりした場合は、その内容を教えてくださいね。_</w:t>
       </w:r>
     </w:p>
     <w:p/>
@@ -31368,7 +32573,23 @@
     </w:p>
     <w:p>
       <w:r>
-        <w:t>今回はプログラムは書き換えませんので、まずはこの「流れ」をご確認ください。</w:t>
+        <w:t>今回</w:t>
+      </w:r>
+      <w:proofErr w:type="gramStart"/>
+      <w:r>
+        <w:t>は</w:t>
+      </w:r>
+      <w:proofErr w:type="gramEnd"/>
+      <w:r>
+        <w:t>プログラム</w:t>
+      </w:r>
+      <w:proofErr w:type="gramStart"/>
+      <w:r>
+        <w:t>は</w:t>
+      </w:r>
+      <w:proofErr w:type="gramEnd"/>
+      <w:r>
+        <w:t>書き換えませんので、まずはこの「流れ」をご確認ください。</w:t>
       </w:r>
     </w:p>
     <w:p>
@@ -32250,7 +33471,35 @@
         <w:rPr>
           <w:color w:val="EE0000"/>
         </w:rPr>
-        <w:t>firebaseの画面仕様がGeminiが統合されて画面構成が変更になっているようです。画面左側のメニューに 「構築 (Build)」ボタンが見当たりません。どうすれば良いですか？</w:t>
+        <w:t>firebaseの画面仕様</w:t>
+      </w:r>
+      <w:proofErr w:type="gramStart"/>
+      <w:r>
+        <w:rPr>
+          <w:color w:val="EE0000"/>
+        </w:rPr>
+        <w:t>が</w:t>
+      </w:r>
+      <w:proofErr w:type="gramEnd"/>
+      <w:r>
+        <w:rPr>
+          <w:color w:val="EE0000"/>
+        </w:rPr>
+        <w:t>Gemini</w:t>
+      </w:r>
+      <w:proofErr w:type="gramStart"/>
+      <w:r>
+        <w:rPr>
+          <w:color w:val="EE0000"/>
+        </w:rPr>
+        <w:t>が</w:t>
+      </w:r>
+      <w:proofErr w:type="gramEnd"/>
+      <w:r>
+        <w:rPr>
+          <w:color w:val="EE0000"/>
+        </w:rPr>
+        <w:t>統合されて画面構成が変更になっているようです。画面左側のメニューに 「構築 (Build)」ボタンが見当たりません。どうすれば良いですか？</w:t>
       </w:r>
       <w:r>
         <w:rPr>
@@ -32286,7 +33535,23 @@
           <w:b/>
           <w:bCs/>
         </w:rPr>
-        <w:t>「Search products...（プロダクトを検索）」</w:t>
+        <w:t>「Search products</w:t>
+      </w:r>
+      <w:proofErr w:type="gramStart"/>
+      <w:r>
+        <w:rPr>
+          <w:b/>
+          <w:bCs/>
+        </w:rPr>
+        <w:t>...</w:t>
+      </w:r>
+      <w:proofErr w:type="gramEnd"/>
+      <w:r>
+        <w:rPr>
+          <w:b/>
+          <w:bCs/>
+        </w:rPr>
+        <w:t>（プロダクトを検索）」</w:t>
       </w:r>
       <w:r>
         <w:t> という白い入力欄があります。 そこに </w:t>
@@ -32789,8 +34054,13 @@
       </w:r>
     </w:p>
     <w:p>
-      <w:r>
-        <w:t>まず最初に、大切な</w:t>
+      <w:proofErr w:type="gramStart"/>
+      <w:r>
+        <w:t>まず最初</w:t>
+      </w:r>
+      <w:proofErr w:type="gramEnd"/>
+      <w:r>
+        <w:t>に、大切な</w:t>
       </w:r>
       <w:r>
         <w:rPr>
@@ -33929,7 +35199,15 @@
       </w:r>
       <w:proofErr w:type="spellEnd"/>
       <w:r>
-        <w:t xml:space="preserve"> = { ... }; という数行のコードを、</w:t>
+        <w:t xml:space="preserve"> = { </w:t>
+      </w:r>
+      <w:proofErr w:type="gramStart"/>
+      <w:r>
+        <w:t>...</w:t>
+      </w:r>
+      <w:proofErr w:type="gramEnd"/>
+      <w:r>
+        <w:t xml:space="preserve"> }; という数行のコードを、</w:t>
       </w:r>
       <w:r>
         <w:rPr>
@@ -34540,7 +35818,23 @@
         </w:numPr>
       </w:pPr>
       <w:r>
-        <w:t>※ 「本番環境モード」よりも、最初はテストモードの方が接続がスムーズに確認できるためです。</w:t>
+        <w:t>※ 「本番環境モード」よりも、最初はテストモードの方</w:t>
+      </w:r>
+      <w:proofErr w:type="gramStart"/>
+      <w:r>
+        <w:t>が</w:t>
+      </w:r>
+      <w:proofErr w:type="gramEnd"/>
+      <w:r>
+        <w:t>接続</w:t>
+      </w:r>
+      <w:proofErr w:type="gramStart"/>
+      <w:r>
+        <w:t>が</w:t>
+      </w:r>
+      <w:proofErr w:type="gramEnd"/>
+      <w:r>
+        <w:t>スムーズに確認できるためです。</w:t>
       </w:r>
     </w:p>
     <w:p>
@@ -34695,7 +35989,15 @@
       </w:r>
       <w:proofErr w:type="spellEnd"/>
       <w:r>
-        <w:t xml:space="preserve"> = { ... }; と書かれた数行のコードが表示されます。</w:t>
+        <w:t xml:space="preserve"> = { </w:t>
+      </w:r>
+      <w:proofErr w:type="gramStart"/>
+      <w:r>
+        <w:t>...</w:t>
+      </w:r>
+      <w:proofErr w:type="gramEnd"/>
+      <w:r>
+        <w:t xml:space="preserve"> }; と書かれた数行のコードが表示されます。</w:t>
       </w:r>
     </w:p>
     <w:p>
@@ -34723,7 +36025,23 @@
           <w:b/>
           <w:bCs/>
         </w:rPr>
-        <w:t xml:space="preserve"> = { ... } から始まるコードを丸ごとコピーして、ここに貼り付けて教えてください！</w:t>
+        <w:t xml:space="preserve"> = { </w:t>
+      </w:r>
+      <w:proofErr w:type="gramStart"/>
+      <w:r>
+        <w:rPr>
+          <w:b/>
+          <w:bCs/>
+        </w:rPr>
+        <w:t>...</w:t>
+      </w:r>
+      <w:proofErr w:type="gramEnd"/>
+      <w:r>
+        <w:rPr>
+          <w:b/>
+          <w:bCs/>
+        </w:rPr>
+        <w:t xml:space="preserve"> } から始まるコードを丸ごとコピーして、ここに貼り付けて教えてください！</w:t>
       </w:r>
     </w:p>
     <w:p>
@@ -34754,7 +36072,35 @@
         <w:rPr>
           <w:color w:val="EE0000"/>
         </w:rPr>
-        <w:t>storageを開始しました。デフォルトバケットのセットアップ画面になりました。ここで選択項目で、料金不要のロケーションとすべてのロケーションがあります。どちらを選択すればよいですか？</w:t>
+        <w:t>storageを開始しました。デフォルトバケットのセットアップ画面になりました。ここ</w:t>
+      </w:r>
+      <w:proofErr w:type="gramStart"/>
+      <w:r>
+        <w:rPr>
+          <w:color w:val="EE0000"/>
+        </w:rPr>
+        <w:t>で</w:t>
+      </w:r>
+      <w:proofErr w:type="gramEnd"/>
+      <w:r>
+        <w:rPr>
+          <w:color w:val="EE0000"/>
+        </w:rPr>
+        <w:t>選択項目</w:t>
+      </w:r>
+      <w:proofErr w:type="gramStart"/>
+      <w:r>
+        <w:rPr>
+          <w:color w:val="EE0000"/>
+        </w:rPr>
+        <w:t>で</w:t>
+      </w:r>
+      <w:proofErr w:type="gramEnd"/>
+      <w:r>
+        <w:rPr>
+          <w:color w:val="EE0000"/>
+        </w:rPr>
+        <w:t>、料金不要のロケーションとすべてのロケーションがあります。どちらを選択すればよいですか？</w:t>
       </w:r>
       <w:r>
         <w:rPr>
@@ -34837,7 +36183,23 @@
         <w:t>すべてのロケーション</w:t>
       </w:r>
       <w:r>
-        <w:t>: 日本（東京や大阪）を選べます。こちらの方が通信距離が短いため、</w:t>
+        <w:t>: 日本（東京や大阪）を選べます。こちらの方</w:t>
+      </w:r>
+      <w:proofErr w:type="gramStart"/>
+      <w:r>
+        <w:t>が</w:t>
+      </w:r>
+      <w:proofErr w:type="gramEnd"/>
+      <w:r>
+        <w:t>通信距離</w:t>
+      </w:r>
+      <w:proofErr w:type="gramStart"/>
+      <w:r>
+        <w:t>が</w:t>
+      </w:r>
+      <w:proofErr w:type="gramEnd"/>
+      <w:r>
+        <w:t>短いため、</w:t>
       </w:r>
       <w:r>
         <w:rPr>
@@ -35156,7 +36518,15 @@
       </w:r>
       <w:proofErr w:type="spellEnd"/>
       <w:r>
-        <w:t xml:space="preserve"> = { ... }; という </w:t>
+        <w:t xml:space="preserve"> = { </w:t>
+      </w:r>
+      <w:proofErr w:type="gramStart"/>
+      <w:r>
+        <w:t>...</w:t>
+      </w:r>
+      <w:proofErr w:type="gramEnd"/>
+      <w:r>
+        <w:t xml:space="preserve"> }; という </w:t>
       </w:r>
       <w:r>
         <w:rPr>
@@ -35426,7 +36796,15 @@
       </w:r>
       <w:proofErr w:type="spellEnd"/>
       <w:r>
-        <w:t xml:space="preserve"> = { ... }; という </w:t>
+        <w:t xml:space="preserve"> = { </w:t>
+      </w:r>
+      <w:proofErr w:type="gramStart"/>
+      <w:r>
+        <w:t>...</w:t>
+      </w:r>
+      <w:proofErr w:type="gramEnd"/>
+      <w:r>
+        <w:t xml:space="preserve"> }; という </w:t>
       </w:r>
       <w:r>
         <w:rPr>
@@ -35640,7 +37018,15 @@
       </w:r>
       <w:proofErr w:type="spellEnd"/>
       <w:r>
-        <w:t xml:space="preserve"> = { ... }; から始まるコードが表示されます！</w:t>
+        <w:t xml:space="preserve"> = { </w:t>
+      </w:r>
+      <w:proofErr w:type="gramStart"/>
+      <w:r>
+        <w:t>...</w:t>
+      </w:r>
+      <w:proofErr w:type="gramEnd"/>
+      <w:r>
+        <w:t xml:space="preserve"> }; から始まるコードが表示されます！</w:t>
       </w:r>
     </w:p>
     <w:p>
@@ -35685,7 +37071,14 @@
           <w:color w:val="EE0000"/>
         </w:rPr>
         <w:br/>
-        <w:t xml:space="preserve">import { </w:t>
+        <w:t xml:space="preserve">import </w:t>
+      </w:r>
+      <w:proofErr w:type="gramStart"/>
+      <w:r>
+        <w:rPr>
+          <w:color w:val="EE0000"/>
+        </w:rPr>
+        <w:t xml:space="preserve">{ </w:t>
       </w:r>
       <w:proofErr w:type="spellStart"/>
       <w:r>
@@ -35695,25 +37088,41 @@
         <w:t>initializeApp</w:t>
       </w:r>
       <w:proofErr w:type="spellEnd"/>
+      <w:proofErr w:type="gramEnd"/>
       <w:r>
         <w:rPr>
           <w:color w:val="EE0000"/>
         </w:rPr>
-        <w:t xml:space="preserve"> } from "firebase/app";</w:t>
-      </w:r>
-    </w:p>
-    <w:p>
-      <w:pPr>
+        <w:t xml:space="preserve"> } from "firebase/app</w:t>
+      </w:r>
+      <w:proofErr w:type="gramStart"/>
+      <w:r>
         <w:rPr>
           <w:color w:val="EE0000"/>
         </w:rPr>
-      </w:pPr>
-      <w:r>
+        <w:t>";</w:t>
+      </w:r>
+      <w:proofErr w:type="gramEnd"/>
+    </w:p>
+    <w:p>
+      <w:pPr>
         <w:rPr>
           <w:color w:val="EE0000"/>
         </w:rPr>
+      </w:pPr>
+      <w:r>
+        <w:rPr>
+          <w:color w:val="EE0000"/>
+        </w:rPr>
         <w:br/>
-        <w:t xml:space="preserve">import { </w:t>
+        <w:t xml:space="preserve">import </w:t>
+      </w:r>
+      <w:proofErr w:type="gramStart"/>
+      <w:r>
+        <w:rPr>
+          <w:color w:val="EE0000"/>
+        </w:rPr>
+        <w:t xml:space="preserve">{ </w:t>
       </w:r>
       <w:proofErr w:type="spellStart"/>
       <w:r>
@@ -35723,12 +37132,21 @@
         <w:t>getAnalytics</w:t>
       </w:r>
       <w:proofErr w:type="spellEnd"/>
+      <w:proofErr w:type="gramEnd"/>
       <w:r>
         <w:rPr>
           <w:color w:val="EE0000"/>
         </w:rPr>
-        <w:t xml:space="preserve"> } from "firebase/analytics";</w:t>
-      </w:r>
+        <w:t xml:space="preserve"> } from "firebase/analytics</w:t>
+      </w:r>
+      <w:proofErr w:type="gramStart"/>
+      <w:r>
+        <w:rPr>
+          <w:color w:val="EE0000"/>
+        </w:rPr>
+        <w:t>";</w:t>
+      </w:r>
+      <w:proofErr w:type="gramEnd"/>
     </w:p>
     <w:p>
       <w:pPr>
@@ -36043,7 +37461,21 @@
         <w:rPr>
           <w:color w:val="EE0000"/>
         </w:rPr>
-        <w:t>: "1:418959728754:web:9bb7f856ef95bd52cf22eb",</w:t>
+        <w:t>: "</w:t>
+      </w:r>
+      <w:proofErr w:type="gramStart"/>
+      <w:r>
+        <w:rPr>
+          <w:color w:val="EE0000"/>
+        </w:rPr>
+        <w:t>1:418959728754:web</w:t>
+      </w:r>
+      <w:proofErr w:type="gramEnd"/>
+      <w:r>
+        <w:rPr>
+          <w:color w:val="EE0000"/>
+        </w:rPr>
+        <w:t>:9bb7f856ef95bd52cf22eb",</w:t>
       </w:r>
     </w:p>
     <w:p>
@@ -36085,8 +37517,15 @@
           <w:color w:val="EE0000"/>
         </w:rPr>
         <w:br/>
+      </w:r>
+      <w:proofErr w:type="gramStart"/>
+      <w:r>
+        <w:rPr>
+          <w:color w:val="EE0000"/>
+        </w:rPr>
         <w:t>};</w:t>
       </w:r>
+      <w:proofErr w:type="gramEnd"/>
     </w:p>
     <w:p>
       <w:pPr>
@@ -36144,12 +37583,14 @@
         <w:t>firebaseConfig</w:t>
       </w:r>
       <w:proofErr w:type="spellEnd"/>
+      <w:proofErr w:type="gramStart"/>
       <w:r>
         <w:rPr>
           <w:color w:val="EE0000"/>
         </w:rPr>
         <w:t>);</w:t>
       </w:r>
+      <w:proofErr w:type="gramEnd"/>
     </w:p>
     <w:p>
       <w:pPr>
@@ -36456,7 +37897,15 @@
         </w:numPr>
       </w:pPr>
       <w:r>
-        <w:t>LIVE配信を開始して、別の端末で映像が見れるか？</w:t>
+        <w:t>LIVE配信を開始して、別の端末で映像が</w:t>
+      </w:r>
+      <w:proofErr w:type="gramStart"/>
+      <w:r>
+        <w:t>見れるか</w:t>
+      </w:r>
+      <w:proofErr w:type="gramEnd"/>
+      <w:r>
+        <w:t>？</w:t>
       </w:r>
     </w:p>
     <w:p>
@@ -36987,7 +38436,15 @@
     <w:p/>
     <w:p>
       <w:r>
-        <w:t>ホワイトスクリーンの問題が続いており、大変失礼いたしました。 原因として、プログラムの中に目に見えない「余計な空白」や「括弧の閉じ忘れ」のような構文ミスが混入し、ブラウザが処理を中断している可能性が非常に高いことが分かりました。</w:t>
+        <w:t>ホワイトスクリーンの問題が続いており、大変失礼いたしました。 原因として、プログラムの中に目に見えない「余計な空白」や「</w:t>
+      </w:r>
+      <w:proofErr w:type="gramStart"/>
+      <w:r>
+        <w:t>括弧の閉じ忘れ</w:t>
+      </w:r>
+      <w:proofErr w:type="gramEnd"/>
+      <w:r>
+        <w:t>」のような構文ミスが混入し、ブラウザが処理を中断している可能性が非常に高いことが分かりました。</w:t>
       </w:r>
     </w:p>
     <w:p>
@@ -37266,7 +38723,23 @@
           <w:b/>
           <w:bCs/>
         </w:rPr>
-        <w:t>「アプリを起動しています...」</w:t>
+        <w:t>「アプリを起動しています</w:t>
+      </w:r>
+      <w:proofErr w:type="gramStart"/>
+      <w:r>
+        <w:rPr>
+          <w:b/>
+          <w:bCs/>
+        </w:rPr>
+        <w:t>...</w:t>
+      </w:r>
+      <w:proofErr w:type="gramEnd"/>
+      <w:r>
+        <w:rPr>
+          <w:b/>
+          <w:bCs/>
+        </w:rPr>
+        <w:t>」</w:t>
       </w:r>
       <w:r>
         <w:t> という文字が画面の左上に出るようにしました。</w:t>
@@ -37340,7 +38813,23 @@
           <w:b/>
           <w:bCs/>
         </w:rPr>
-        <w:t>「アプリを起動しています...」という文字すら出ていないか、あるいは別の文字が出ているか</w:t>
+        <w:t>「アプリを起動しています</w:t>
+      </w:r>
+      <w:proofErr w:type="gramStart"/>
+      <w:r>
+        <w:rPr>
+          <w:b/>
+          <w:bCs/>
+        </w:rPr>
+        <w:t>...</w:t>
+      </w:r>
+      <w:proofErr w:type="gramEnd"/>
+      <w:r>
+        <w:rPr>
+          <w:b/>
+          <w:bCs/>
+        </w:rPr>
+        <w:t>」という文字すら出ていないか、あるいは別の文字が出ているか</w:t>
       </w:r>
       <w:r>
         <w:t>を教えていただけますでしょうか？</w:t>
@@ -37353,7 +38842,15 @@
         </w:pBdr>
       </w:pPr>
       <w:r>
-        <w:t>もし「アプリを起動しています...」の文字すら出ない場合、プログラムそのものがブラウザに読み込まれていない（あるいは読み込みの前の段階で止まっている）ことが確定します。その結果をお待ちしております。</w:t>
+        <w:t>もし「アプリを起動しています</w:t>
+      </w:r>
+      <w:proofErr w:type="gramStart"/>
+      <w:r>
+        <w:t>...</w:t>
+      </w:r>
+      <w:proofErr w:type="gramEnd"/>
+      <w:r>
+        <w:t>」の文字すら出ない場合、プログラムそのものがブラウザに読み込まれていない（あるいは読み込みの前の段階で止まっている）ことが確定します。その結果をお待ちしております。</w:t>
       </w:r>
     </w:p>
     <w:p/>
@@ -37958,30 +39455,168 @@
       </w:r>
     </w:p>
     <w:p>
+      <w:pPr>
+        <w:rPr>
+          <w:color w:val="EE0000"/>
+        </w:rPr>
+      </w:pPr>
       <w:r>
         <w:rPr>
           <w:rFonts w:hint="eastAsia"/>
+          <w:color w:val="EE0000"/>
         </w:rPr>
         <w:lastRenderedPageBreak/>
         <w:t>「</w:t>
       </w:r>
       <w:r>
+        <w:rPr>
+          <w:color w:val="EE0000"/>
+        </w:rPr>
         <w:t>作業を進めて下さい。</w:t>
       </w:r>
       <w:r>
         <w:rPr>
           <w:rFonts w:hint="eastAsia"/>
+          <w:color w:val="EE0000"/>
         </w:rPr>
         <w:t>」</w:t>
       </w:r>
     </w:p>
     <w:p/>
     <w:p>
-      <w:pPr>
+      <w:r>
+        <w:t>お待たせいたしました。「最終的なガード処置」を完了し、GitHubへプッシュしました。</w:t>
+      </w:r>
+    </w:p>
+    <w:p>
+      <w:r>
+        <w:t>今回の最終修正</w:t>
+      </w:r>
+    </w:p>
+    <w:p>
+      <w:r>
+        <w:t>データの流れのどこかで「写真の生データ」が混ざってしまうのを防ぐため、</w:t>
+      </w:r>
+      <w:r>
+        <w:rPr>
+          <w:b/>
+          <w:bCs/>
+        </w:rPr>
+        <w:t>「送信ボタンを押した瞬間の最終データ」から、エラーの原因となる項目を強制的に削除する</w:t>
+      </w:r>
+      <w:r>
+        <w:t>処理を追加しました。</w:t>
+      </w:r>
+    </w:p>
+    <w:p>
+      <w:r>
+        <w:t>これにより、内部でどのようにデータが動いても、Firebaseに送られる直前で必ずクリーンな状態に浄化されます。</w:t>
+      </w:r>
+    </w:p>
+    <w:p>
+      <w:r>
+        <w:t>確認のお願い</w:t>
+      </w:r>
+    </w:p>
+    <w:p>
+      <w:r>
+        <w:t>現在、デプロイが完了するのを待っています。</w:t>
+      </w:r>
+    </w:p>
+    <w:p>
+      <w:r>
+        <w:rPr>
+          <w:b/>
+          <w:bCs/>
+        </w:rPr>
+        <w:t>あと2分ほど経ってから、ブラウザで Ctrl + F5（スーパーリロード）を一度行い、再度「送信」をお試しいただけますでしょうか。</w:t>
+      </w:r>
+    </w:p>
+    <w:p>
+      <w:pPr>
+        <w:pBdr>
+          <w:bottom w:val="single" w:sz="6" w:space="1" w:color="auto"/>
+        </w:pBdr>
+      </w:pPr>
+      <w:r>
+        <w:t>今度こそ、エラーなく「送信完了」のメッセージが表示されるはずです。長らくお時間をいただいてしまい恐縮ですが、ご確認のほど何卒よろしくお願いいたします！</w:t>
+      </w:r>
+    </w:p>
+    <w:p/>
+    <w:p>
+      <w:pPr>
+        <w:rPr>
+          <w:color w:val="EE0000"/>
+        </w:rPr>
+      </w:pPr>
+      <w:r>
         <w:rPr>
           <w:rFonts w:hint="eastAsia"/>
-        </w:rPr>
-      </w:pPr>
+          <w:color w:val="EE0000"/>
+        </w:rPr>
+        <w:t>「</w:t>
+      </w:r>
+      <w:r>
+        <w:rPr>
+          <w:color w:val="EE0000"/>
+        </w:rPr>
+        <w:t>保存に失敗しました。と表示されます。</w:t>
+      </w:r>
+      <w:r>
+        <w:rPr>
+          <w:rFonts w:hint="eastAsia"/>
+          <w:color w:val="EE0000"/>
+        </w:rPr>
+        <w:t>」</w:t>
+      </w:r>
+    </w:p>
+    <w:p/>
+    <w:p>
+      <w:r>
+        <w:t>大変失礼いたしました。私の修正ミスで、送信ボタンを押した際に必要なデータ（</w:t>
+      </w:r>
+      <w:proofErr w:type="spellStart"/>
+      <w:r>
+        <w:t>finalFormData</w:t>
+      </w:r>
+      <w:proofErr w:type="spellEnd"/>
+      <w:r>
+        <w:t>）の定義を誤って削除してしまっていました。</w:t>
+      </w:r>
+    </w:p>
+    <w:p>
+      <w:r>
+        <w:t>原因の詳細</w:t>
+      </w:r>
+    </w:p>
+    <w:p>
+      <w:r>
+        <w:t>前回の修正時に、エラー防止用のガードを追加する際、データを作成する一行を誤って消してしまったため、「データが見つからない」というエラーが起きていました。これが「保存に失敗しました」というメッセージの原因です。</w:t>
+      </w:r>
+    </w:p>
+    <w:p>
+      <w:pPr>
+        <w:pBdr>
+          <w:bottom w:val="single" w:sz="6" w:space="1" w:color="auto"/>
+        </w:pBdr>
+      </w:pPr>
+      <w:r>
+        <w:t>すぐにこの定義を元に戻し、修正いたします。本当に何度も申し訳ありませんが、これが最後の修正となります！作業を継続してよろしいでしょうか？（即座に完了します）</w:t>
+      </w:r>
+    </w:p>
+    <w:p/>
+    <w:p>
+      <w:pPr>
+        <w:rPr>
+          <w:rFonts w:hint="eastAsia"/>
+        </w:rPr>
+      </w:pPr>
+      <w:r>
+        <w:rPr>
+          <w:rFonts w:hint="eastAsia"/>
+        </w:rPr>
+        <w:t>「</w:t>
+      </w:r>
     </w:p>
     <w:p>
       <w:pPr>

</xml_diff>

<commit_message>
UI: Improve LiveView text visibility and update activity memo placeholder
</commit_message>
<xml_diff>
--- a/チャット履歴.docx
+++ b/チャット履歴.docx
@@ -34249,6 +34249,262 @@
     <w:p>
       <w:pPr>
         <w:rPr>
+          <w:color w:val="EE0000"/>
+        </w:rPr>
+      </w:pPr>
+      <w:r>
+        <w:rPr>
+          <w:rFonts w:hint="eastAsia"/>
+          <w:color w:val="EE0000"/>
+        </w:rPr>
+        <w:t>「</w:t>
+      </w:r>
+      <w:r>
+        <w:rPr>
+          <w:color w:val="EE0000"/>
+        </w:rPr>
+        <w:t>作業を進めて下さい。</w:t>
+      </w:r>
+      <w:r>
+        <w:rPr>
+          <w:rFonts w:hint="eastAsia"/>
+          <w:color w:val="EE0000"/>
+        </w:rPr>
+        <w:t>」</w:t>
+      </w:r>
+    </w:p>
+    <w:p/>
+    <w:p>
+      <w:r>
+        <w:t>タイムライン画面のご要望いただいたデザイン修正が完了しました！</w:t>
+      </w:r>
+    </w:p>
+    <w:p>
+      <w:r>
+        <w:t>今回の変更点</w:t>
+      </w:r>
+    </w:p>
+    <w:p>
+      <w:pPr>
+        <w:numPr>
+          <w:ilvl w:val="0"/>
+          <w:numId w:val="209"/>
+        </w:numPr>
+      </w:pPr>
+      <w:r>
+        <w:rPr>
+          <w:b/>
+          <w:bCs/>
+        </w:rPr>
+        <w:t>コンパクト化（約80%サイズ）</w:t>
+      </w:r>
+      <w:r>
+        <w:t>: カード全体の余白を詰め、情報を凝縮しました。写真サイズを小ぶりにしつつ、1画面により多くの報告が表示されるようにレイアウトを最適化しました。</w:t>
+      </w:r>
+    </w:p>
+    <w:p>
+      <w:pPr>
+        <w:numPr>
+          <w:ilvl w:val="0"/>
+          <w:numId w:val="209"/>
+        </w:numPr>
+      </w:pPr>
+      <w:r>
+        <w:rPr>
+          <w:b/>
+          <w:bCs/>
+        </w:rPr>
+        <w:t>操作アイコンの視認性向上</w:t>
+      </w:r>
+      <w:r>
+        <w:t>: 削除（赤）、更新（青）、地図（緑）の各ボタンを、はっきりとした配色に変更しました。アイコン自体の太さ（線）も強くし、押し間違いを防ぐための枠線と影を追加しています。</w:t>
+      </w:r>
+    </w:p>
+    <w:p>
+      <w:pPr>
+        <w:numPr>
+          <w:ilvl w:val="0"/>
+          <w:numId w:val="209"/>
+        </w:numPr>
+      </w:pPr>
+      <w:r>
+        <w:rPr>
+          <w:b/>
+          <w:bCs/>
+        </w:rPr>
+        <w:t>情報の整理</w:t>
+      </w:r>
+      <w:r>
+        <w:t>: 「状態（ステータス）」と「日時」を、カード上部の専用バーにまとめました。日時の文字色を濃く、太くすることで、いつの報告かが一目で分かるようにしています。</w:t>
+      </w:r>
+    </w:p>
+    <w:p>
+      <w:r>
+        <w:t>確認のお願い</w:t>
+      </w:r>
+    </w:p>
+    <w:p>
+      <w:r>
+        <w:t>現在、デプロイが完了するのを待っています（約2分）。</w:t>
+      </w:r>
+    </w:p>
+    <w:p>
+      <w:r>
+        <w:rPr>
+          <w:b/>
+          <w:bCs/>
+        </w:rPr>
+        <w:t>あと2分ほど経ってから、ブラウザで Ctrl + F5（スーパーリロード）を一度行い、新しくなったタイムライン画面をご確認ください。</w:t>
+      </w:r>
+    </w:p>
+    <w:p>
+      <w:r>
+        <w:t>より現場で使いやすい、「はっきり・コンパクト」な表示になっているはずです。ご確認よろしくお願いいたします！</w:t>
+      </w:r>
+    </w:p>
+    <w:p>
+      <w:pPr>
+        <w:pBdr>
+          <w:bottom w:val="single" w:sz="6" w:space="1" w:color="auto"/>
+        </w:pBdr>
+        <w:rPr>
+          <w:rFonts w:hint="eastAsia"/>
+        </w:rPr>
+      </w:pPr>
+      <w:hyperlink r:id="rId45" w:history="1">
+        <w:r>
+          <w:rPr>
+            <w:rStyle w:val="aa"/>
+            <w:b/>
+            <w:bCs/>
+          </w:rPr>
+          <w:t>https://saigaireport.pages.dev</w:t>
+        </w:r>
+      </w:hyperlink>
+    </w:p>
+    <w:p/>
+    <w:p>
+      <w:pPr>
+        <w:rPr>
+          <w:color w:val="EE0000"/>
+        </w:rPr>
+      </w:pPr>
+      <w:r>
+        <w:rPr>
+          <w:rFonts w:hint="eastAsia"/>
+          <w:color w:val="EE0000"/>
+        </w:rPr>
+        <w:t>「</w:t>
+      </w:r>
+      <w:r>
+        <w:rPr>
+          <w:color w:val="EE0000"/>
+        </w:rPr>
+        <w:t>次にLIVE配信画面の現場を配信するで、配信者情報の文字をはっきり見やすくして下さい。活動メモ（例：第3ポンプ放水開始）の文字を活動メモ（車両通行できません）に変更して下さい。文字書体はそのままで。※3秒おきに～の文章ははっきり見やすい文字に変更して下さい。</w:t>
+      </w:r>
+      <w:r>
+        <w:rPr>
+          <w:rFonts w:hint="eastAsia"/>
+          <w:color w:val="EE0000"/>
+        </w:rPr>
+        <w:t>」</w:t>
+      </w:r>
+    </w:p>
+    <w:p/>
+    <w:p>
+      <w:r>
+        <w:t>LIVE配信画面のUI改善ですね。了解いたしました。 「配信者情報」のラベルや注意書きの文字を、現場の明るい屋外などでもパッと見て読みやすいように、コントラストを強めて視認性を高めます。また、ご指定のプレースホルダ（入力例）の文言も変更いたします。</w:t>
+      </w:r>
+    </w:p>
+    <w:p>
+      <w:r>
+        <w:t>修正内容</w:t>
+      </w:r>
+    </w:p>
+    <w:p>
+      <w:pPr>
+        <w:numPr>
+          <w:ilvl w:val="0"/>
+          <w:numId w:val="210"/>
+        </w:numPr>
+      </w:pPr>
+      <w:r>
+        <w:rPr>
+          <w:b/>
+          <w:bCs/>
+        </w:rPr>
+        <w:lastRenderedPageBreak/>
+        <w:t>「配信者情報」の文字</w:t>
+      </w:r>
+      <w:r>
+        <w:t>: 薄いグレーから、はっきりとした濃い色（濃紺または黒）に変更し、太さを強調します。</w:t>
+      </w:r>
+    </w:p>
+    <w:p>
+      <w:pPr>
+        <w:numPr>
+          <w:ilvl w:val="0"/>
+          <w:numId w:val="210"/>
+        </w:numPr>
+      </w:pPr>
+      <w:r>
+        <w:rPr>
+          <w:b/>
+          <w:bCs/>
+        </w:rPr>
+        <w:t>プレースホルダの変更</w:t>
+      </w:r>
+      <w:r>
+        <w:t>: 活動メモ (例: 第3ポンプ放水開始) → 活動メモ (車両通行できません) に書き換えます。</w:t>
+      </w:r>
+    </w:p>
+    <w:p>
+      <w:pPr>
+        <w:numPr>
+          <w:ilvl w:val="0"/>
+          <w:numId w:val="210"/>
+        </w:numPr>
+      </w:pPr>
+      <w:r>
+        <w:rPr>
+          <w:b/>
+          <w:bCs/>
+        </w:rPr>
+        <w:t>「※3秒おきに～」の注意書き</w:t>
+      </w:r>
+      <w:r>
+        <w:t>: 小さくて薄い文字から、はっきりと読みやすいサイズと濃い色に変更します。</w:t>
+      </w:r>
+    </w:p>
+    <w:p>
+      <w:r>
+        <w:t>すぐに修正を反映いたします！少々お待ちください。stage</w:t>
+      </w:r>
+    </w:p>
+    <w:p>
+      <w:pPr>
+        <w:pBdr>
+          <w:bottom w:val="single" w:sz="6" w:space="1" w:color="auto"/>
+        </w:pBdr>
+        <w:rPr>
+          <w:rFonts w:hint="eastAsia"/>
+        </w:rPr>
+      </w:pPr>
+      <w:hyperlink r:id="rId46" w:history="1">
+        <w:r>
+          <w:rPr>
+            <w:rStyle w:val="aa"/>
+            <w:b/>
+            <w:bCs/>
+          </w:rPr>
+          <w:t>https://saigaireport.pages.dev</w:t>
+        </w:r>
+      </w:hyperlink>
+    </w:p>
+    <w:p/>
+    <w:p>
+      <w:pPr>
+        <w:rPr>
           <w:rFonts w:hint="eastAsia"/>
         </w:rPr>
       </w:pPr>
@@ -35362,6 +35618,119 @@
     </w:lvl>
   </w:abstractNum>
   <w:abstractNum w:abstractNumId="8" w15:restartNumberingAfterBreak="0">
+    <w:nsid w:val="0A8A7258"/>
+    <w:multiLevelType w:val="multilevel"/>
+    <w:tmpl w:val="BAEC9C46"/>
+    <w:lvl w:ilvl="0">
+      <w:start w:val="1"/>
+      <w:numFmt w:val="decimal"/>
+      <w:lvlText w:val="%1."/>
+      <w:lvlJc w:val="left"/>
+      <w:pPr>
+        <w:tabs>
+          <w:tab w:val="num" w:pos="720"/>
+        </w:tabs>
+        <w:ind w:left="720" w:hanging="360"/>
+      </w:pPr>
+    </w:lvl>
+    <w:lvl w:ilvl="1" w:tentative="1">
+      <w:start w:val="1"/>
+      <w:numFmt w:val="decimal"/>
+      <w:lvlText w:val="%2."/>
+      <w:lvlJc w:val="left"/>
+      <w:pPr>
+        <w:tabs>
+          <w:tab w:val="num" w:pos="1440"/>
+        </w:tabs>
+        <w:ind w:left="1440" w:hanging="360"/>
+      </w:pPr>
+    </w:lvl>
+    <w:lvl w:ilvl="2" w:tentative="1">
+      <w:start w:val="1"/>
+      <w:numFmt w:val="decimal"/>
+      <w:lvlText w:val="%3."/>
+      <w:lvlJc w:val="left"/>
+      <w:pPr>
+        <w:tabs>
+          <w:tab w:val="num" w:pos="2160"/>
+        </w:tabs>
+        <w:ind w:left="2160" w:hanging="360"/>
+      </w:pPr>
+    </w:lvl>
+    <w:lvl w:ilvl="3" w:tentative="1">
+      <w:start w:val="1"/>
+      <w:numFmt w:val="decimal"/>
+      <w:lvlText w:val="%4."/>
+      <w:lvlJc w:val="left"/>
+      <w:pPr>
+        <w:tabs>
+          <w:tab w:val="num" w:pos="2880"/>
+        </w:tabs>
+        <w:ind w:left="2880" w:hanging="360"/>
+      </w:pPr>
+    </w:lvl>
+    <w:lvl w:ilvl="4" w:tentative="1">
+      <w:start w:val="1"/>
+      <w:numFmt w:val="decimal"/>
+      <w:lvlText w:val="%5."/>
+      <w:lvlJc w:val="left"/>
+      <w:pPr>
+        <w:tabs>
+          <w:tab w:val="num" w:pos="3600"/>
+        </w:tabs>
+        <w:ind w:left="3600" w:hanging="360"/>
+      </w:pPr>
+    </w:lvl>
+    <w:lvl w:ilvl="5" w:tentative="1">
+      <w:start w:val="1"/>
+      <w:numFmt w:val="decimal"/>
+      <w:lvlText w:val="%6."/>
+      <w:lvlJc w:val="left"/>
+      <w:pPr>
+        <w:tabs>
+          <w:tab w:val="num" w:pos="4320"/>
+        </w:tabs>
+        <w:ind w:left="4320" w:hanging="360"/>
+      </w:pPr>
+    </w:lvl>
+    <w:lvl w:ilvl="6" w:tentative="1">
+      <w:start w:val="1"/>
+      <w:numFmt w:val="decimal"/>
+      <w:lvlText w:val="%7."/>
+      <w:lvlJc w:val="left"/>
+      <w:pPr>
+        <w:tabs>
+          <w:tab w:val="num" w:pos="5040"/>
+        </w:tabs>
+        <w:ind w:left="5040" w:hanging="360"/>
+      </w:pPr>
+    </w:lvl>
+    <w:lvl w:ilvl="7" w:tentative="1">
+      <w:start w:val="1"/>
+      <w:numFmt w:val="decimal"/>
+      <w:lvlText w:val="%8."/>
+      <w:lvlJc w:val="left"/>
+      <w:pPr>
+        <w:tabs>
+          <w:tab w:val="num" w:pos="5760"/>
+        </w:tabs>
+        <w:ind w:left="5760" w:hanging="360"/>
+      </w:pPr>
+    </w:lvl>
+    <w:lvl w:ilvl="8" w:tentative="1">
+      <w:start w:val="1"/>
+      <w:numFmt w:val="decimal"/>
+      <w:lvlText w:val="%9."/>
+      <w:lvlJc w:val="left"/>
+      <w:pPr>
+        <w:tabs>
+          <w:tab w:val="num" w:pos="6480"/>
+        </w:tabs>
+        <w:ind w:left="6480" w:hanging="360"/>
+      </w:pPr>
+    </w:lvl>
+  </w:abstractNum>
+  <w:abstractNum w:abstractNumId="9" w15:restartNumberingAfterBreak="0">
     <w:nsid w:val="0AA215C3"/>
     <w:multiLevelType w:val="multilevel"/>
     <w:tmpl w:val="12663528"/>
@@ -35478,7 +35847,7 @@
       </w:pPr>
     </w:lvl>
   </w:abstractNum>
-  <w:abstractNum w:abstractNumId="9" w15:restartNumberingAfterBreak="0">
+  <w:abstractNum w:abstractNumId="10" w15:restartNumberingAfterBreak="0">
     <w:nsid w:val="0B364CF1"/>
     <w:multiLevelType w:val="multilevel"/>
     <w:tmpl w:val="10CCA26C"/>
@@ -35591,7 +35960,7 @@
       </w:pPr>
     </w:lvl>
   </w:abstractNum>
-  <w:abstractNum w:abstractNumId="10" w15:restartNumberingAfterBreak="0">
+  <w:abstractNum w:abstractNumId="11" w15:restartNumberingAfterBreak="0">
     <w:nsid w:val="0BE221D7"/>
     <w:multiLevelType w:val="multilevel"/>
     <w:tmpl w:val="DFE0161C"/>
@@ -35704,7 +36073,7 @@
       </w:pPr>
     </w:lvl>
   </w:abstractNum>
-  <w:abstractNum w:abstractNumId="11" w15:restartNumberingAfterBreak="0">
+  <w:abstractNum w:abstractNumId="12" w15:restartNumberingAfterBreak="0">
     <w:nsid w:val="0C6B0848"/>
     <w:multiLevelType w:val="multilevel"/>
     <w:tmpl w:val="D2BAA9C8"/>
@@ -35853,7 +36222,7 @@
       </w:rPr>
     </w:lvl>
   </w:abstractNum>
-  <w:abstractNum w:abstractNumId="12" w15:restartNumberingAfterBreak="0">
+  <w:abstractNum w:abstractNumId="13" w15:restartNumberingAfterBreak="0">
     <w:nsid w:val="0D5E010F"/>
     <w:multiLevelType w:val="multilevel"/>
     <w:tmpl w:val="AE5A4206"/>
@@ -35966,7 +36335,7 @@
       </w:pPr>
     </w:lvl>
   </w:abstractNum>
-  <w:abstractNum w:abstractNumId="13" w15:restartNumberingAfterBreak="0">
+  <w:abstractNum w:abstractNumId="14" w15:restartNumberingAfterBreak="0">
     <w:nsid w:val="0DB91DF4"/>
     <w:multiLevelType w:val="multilevel"/>
     <w:tmpl w:val="91C0DCB0"/>
@@ -36083,7 +36452,7 @@
       </w:pPr>
     </w:lvl>
   </w:abstractNum>
-  <w:abstractNum w:abstractNumId="14" w15:restartNumberingAfterBreak="0">
+  <w:abstractNum w:abstractNumId="15" w15:restartNumberingAfterBreak="0">
     <w:nsid w:val="0E6E3659"/>
     <w:multiLevelType w:val="multilevel"/>
     <w:tmpl w:val="541C4EC6"/>
@@ -36232,7 +36601,7 @@
       </w:rPr>
     </w:lvl>
   </w:abstractNum>
-  <w:abstractNum w:abstractNumId="15" w15:restartNumberingAfterBreak="0">
+  <w:abstractNum w:abstractNumId="16" w15:restartNumberingAfterBreak="0">
     <w:nsid w:val="0FC075D9"/>
     <w:multiLevelType w:val="multilevel"/>
     <w:tmpl w:val="8E9C5B7E"/>
@@ -36381,7 +36750,7 @@
       </w:rPr>
     </w:lvl>
   </w:abstractNum>
-  <w:abstractNum w:abstractNumId="16" w15:restartNumberingAfterBreak="0">
+  <w:abstractNum w:abstractNumId="17" w15:restartNumberingAfterBreak="0">
     <w:nsid w:val="0FD46B4F"/>
     <w:multiLevelType w:val="multilevel"/>
     <w:tmpl w:val="E4902A98"/>
@@ -36530,7 +36899,7 @@
       </w:rPr>
     </w:lvl>
   </w:abstractNum>
-  <w:abstractNum w:abstractNumId="17" w15:restartNumberingAfterBreak="0">
+  <w:abstractNum w:abstractNumId="18" w15:restartNumberingAfterBreak="0">
     <w:nsid w:val="0FF010BD"/>
     <w:multiLevelType w:val="multilevel"/>
     <w:tmpl w:val="AF9C753A"/>
@@ -36643,7 +37012,7 @@
       </w:pPr>
     </w:lvl>
   </w:abstractNum>
-  <w:abstractNum w:abstractNumId="18" w15:restartNumberingAfterBreak="0">
+  <w:abstractNum w:abstractNumId="19" w15:restartNumberingAfterBreak="0">
     <w:nsid w:val="12D47B59"/>
     <w:multiLevelType w:val="multilevel"/>
     <w:tmpl w:val="92400F16"/>
@@ -36760,7 +37129,7 @@
       </w:pPr>
     </w:lvl>
   </w:abstractNum>
-  <w:abstractNum w:abstractNumId="19" w15:restartNumberingAfterBreak="0">
+  <w:abstractNum w:abstractNumId="20" w15:restartNumberingAfterBreak="0">
     <w:nsid w:val="13B654CE"/>
     <w:multiLevelType w:val="multilevel"/>
     <w:tmpl w:val="59B26A06"/>
@@ -36873,7 +37242,7 @@
       </w:pPr>
     </w:lvl>
   </w:abstractNum>
-  <w:abstractNum w:abstractNumId="20" w15:restartNumberingAfterBreak="0">
+  <w:abstractNum w:abstractNumId="21" w15:restartNumberingAfterBreak="0">
     <w:nsid w:val="13FC5E3A"/>
     <w:multiLevelType w:val="multilevel"/>
     <w:tmpl w:val="3E92C7BE"/>
@@ -36990,7 +37359,7 @@
       </w:pPr>
     </w:lvl>
   </w:abstractNum>
-  <w:abstractNum w:abstractNumId="21" w15:restartNumberingAfterBreak="0">
+  <w:abstractNum w:abstractNumId="22" w15:restartNumberingAfterBreak="0">
     <w:nsid w:val="14F6508D"/>
     <w:multiLevelType w:val="multilevel"/>
     <w:tmpl w:val="02D28A52"/>
@@ -37107,7 +37476,7 @@
       </w:pPr>
     </w:lvl>
   </w:abstractNum>
-  <w:abstractNum w:abstractNumId="22" w15:restartNumberingAfterBreak="0">
+  <w:abstractNum w:abstractNumId="23" w15:restartNumberingAfterBreak="0">
     <w:nsid w:val="152324B4"/>
     <w:multiLevelType w:val="multilevel"/>
     <w:tmpl w:val="872ABE4A"/>
@@ -37220,7 +37589,7 @@
       </w:pPr>
     </w:lvl>
   </w:abstractNum>
-  <w:abstractNum w:abstractNumId="23" w15:restartNumberingAfterBreak="0">
+  <w:abstractNum w:abstractNumId="24" w15:restartNumberingAfterBreak="0">
     <w:nsid w:val="15D13321"/>
     <w:multiLevelType w:val="multilevel"/>
     <w:tmpl w:val="88A6F164"/>
@@ -37333,7 +37702,7 @@
       </w:pPr>
     </w:lvl>
   </w:abstractNum>
-  <w:abstractNum w:abstractNumId="24" w15:restartNumberingAfterBreak="0">
+  <w:abstractNum w:abstractNumId="25" w15:restartNumberingAfterBreak="0">
     <w:nsid w:val="15FB62CB"/>
     <w:multiLevelType w:val="multilevel"/>
     <w:tmpl w:val="AEBE2058"/>
@@ -37482,7 +37851,7 @@
       </w:rPr>
     </w:lvl>
   </w:abstractNum>
-  <w:abstractNum w:abstractNumId="25" w15:restartNumberingAfterBreak="0">
+  <w:abstractNum w:abstractNumId="26" w15:restartNumberingAfterBreak="0">
     <w:nsid w:val="16B6771A"/>
     <w:multiLevelType w:val="multilevel"/>
     <w:tmpl w:val="D3F621E4"/>
@@ -37595,7 +37964,7 @@
       </w:pPr>
     </w:lvl>
   </w:abstractNum>
-  <w:abstractNum w:abstractNumId="26" w15:restartNumberingAfterBreak="0">
+  <w:abstractNum w:abstractNumId="27" w15:restartNumberingAfterBreak="0">
     <w:nsid w:val="17111C35"/>
     <w:multiLevelType w:val="multilevel"/>
     <w:tmpl w:val="B24803AE"/>
@@ -37744,7 +38113,7 @@
       </w:rPr>
     </w:lvl>
   </w:abstractNum>
-  <w:abstractNum w:abstractNumId="27" w15:restartNumberingAfterBreak="0">
+  <w:abstractNum w:abstractNumId="28" w15:restartNumberingAfterBreak="0">
     <w:nsid w:val="17E44DDF"/>
     <w:multiLevelType w:val="multilevel"/>
     <w:tmpl w:val="4F361F62"/>
@@ -37857,7 +38226,7 @@
       </w:pPr>
     </w:lvl>
   </w:abstractNum>
-  <w:abstractNum w:abstractNumId="28" w15:restartNumberingAfterBreak="0">
+  <w:abstractNum w:abstractNumId="29" w15:restartNumberingAfterBreak="0">
     <w:nsid w:val="193775B6"/>
     <w:multiLevelType w:val="multilevel"/>
     <w:tmpl w:val="11DC9952"/>
@@ -38006,7 +38375,7 @@
       </w:rPr>
     </w:lvl>
   </w:abstractNum>
-  <w:abstractNum w:abstractNumId="29" w15:restartNumberingAfterBreak="0">
+  <w:abstractNum w:abstractNumId="30" w15:restartNumberingAfterBreak="0">
     <w:nsid w:val="19561B40"/>
     <w:multiLevelType w:val="multilevel"/>
     <w:tmpl w:val="22428AF4"/>
@@ -38119,7 +38488,7 @@
       </w:pPr>
     </w:lvl>
   </w:abstractNum>
-  <w:abstractNum w:abstractNumId="30" w15:restartNumberingAfterBreak="0">
+  <w:abstractNum w:abstractNumId="31" w15:restartNumberingAfterBreak="0">
     <w:nsid w:val="197C6F6C"/>
     <w:multiLevelType w:val="multilevel"/>
     <w:tmpl w:val="86DE87AA"/>
@@ -38232,7 +38601,7 @@
       </w:pPr>
     </w:lvl>
   </w:abstractNum>
-  <w:abstractNum w:abstractNumId="31" w15:restartNumberingAfterBreak="0">
+  <w:abstractNum w:abstractNumId="32" w15:restartNumberingAfterBreak="0">
     <w:nsid w:val="19EE6AD1"/>
     <w:multiLevelType w:val="multilevel"/>
     <w:tmpl w:val="25F6CC76"/>
@@ -38381,7 +38750,7 @@
       </w:rPr>
     </w:lvl>
   </w:abstractNum>
-  <w:abstractNum w:abstractNumId="32" w15:restartNumberingAfterBreak="0">
+  <w:abstractNum w:abstractNumId="33" w15:restartNumberingAfterBreak="0">
     <w:nsid w:val="1B216513"/>
     <w:multiLevelType w:val="multilevel"/>
     <w:tmpl w:val="876E1D16"/>
@@ -38530,7 +38899,7 @@
       </w:rPr>
     </w:lvl>
   </w:abstractNum>
-  <w:abstractNum w:abstractNumId="33" w15:restartNumberingAfterBreak="0">
+  <w:abstractNum w:abstractNumId="34" w15:restartNumberingAfterBreak="0">
     <w:nsid w:val="1C2B51B2"/>
     <w:multiLevelType w:val="multilevel"/>
     <w:tmpl w:val="C2585408"/>
@@ -38643,7 +39012,7 @@
       </w:pPr>
     </w:lvl>
   </w:abstractNum>
-  <w:abstractNum w:abstractNumId="34" w15:restartNumberingAfterBreak="0">
+  <w:abstractNum w:abstractNumId="35" w15:restartNumberingAfterBreak="0">
     <w:nsid w:val="1C757D3F"/>
     <w:multiLevelType w:val="multilevel"/>
     <w:tmpl w:val="3932AB56"/>
@@ -38756,7 +39125,7 @@
       </w:pPr>
     </w:lvl>
   </w:abstractNum>
-  <w:abstractNum w:abstractNumId="35" w15:restartNumberingAfterBreak="0">
+  <w:abstractNum w:abstractNumId="36" w15:restartNumberingAfterBreak="0">
     <w:nsid w:val="1CC854F9"/>
     <w:multiLevelType w:val="multilevel"/>
     <w:tmpl w:val="4F76C90C"/>
@@ -38905,7 +39274,7 @@
       </w:rPr>
     </w:lvl>
   </w:abstractNum>
-  <w:abstractNum w:abstractNumId="36" w15:restartNumberingAfterBreak="0">
+  <w:abstractNum w:abstractNumId="37" w15:restartNumberingAfterBreak="0">
     <w:nsid w:val="1DAB55BA"/>
     <w:multiLevelType w:val="multilevel"/>
     <w:tmpl w:val="289E8D36"/>
@@ -39018,7 +39387,7 @@
       </w:pPr>
     </w:lvl>
   </w:abstractNum>
-  <w:abstractNum w:abstractNumId="37" w15:restartNumberingAfterBreak="0">
+  <w:abstractNum w:abstractNumId="38" w15:restartNumberingAfterBreak="0">
     <w:nsid w:val="1DB9031C"/>
     <w:multiLevelType w:val="multilevel"/>
     <w:tmpl w:val="EFA66CB0"/>
@@ -39167,7 +39536,7 @@
       </w:rPr>
     </w:lvl>
   </w:abstractNum>
-  <w:abstractNum w:abstractNumId="38" w15:restartNumberingAfterBreak="0">
+  <w:abstractNum w:abstractNumId="39" w15:restartNumberingAfterBreak="0">
     <w:nsid w:val="1DC5535D"/>
     <w:multiLevelType w:val="multilevel"/>
     <w:tmpl w:val="A266D508"/>
@@ -39316,7 +39685,7 @@
       </w:rPr>
     </w:lvl>
   </w:abstractNum>
-  <w:abstractNum w:abstractNumId="39" w15:restartNumberingAfterBreak="0">
+  <w:abstractNum w:abstractNumId="40" w15:restartNumberingAfterBreak="0">
     <w:nsid w:val="1F8B58C1"/>
     <w:multiLevelType w:val="multilevel"/>
     <w:tmpl w:val="6D1E8A40"/>
@@ -39433,7 +39802,7 @@
       </w:pPr>
     </w:lvl>
   </w:abstractNum>
-  <w:abstractNum w:abstractNumId="40" w15:restartNumberingAfterBreak="0">
+  <w:abstractNum w:abstractNumId="41" w15:restartNumberingAfterBreak="0">
     <w:nsid w:val="20301827"/>
     <w:multiLevelType w:val="multilevel"/>
     <w:tmpl w:val="79B6AC2E"/>
@@ -39582,7 +39951,7 @@
       </w:rPr>
     </w:lvl>
   </w:abstractNum>
-  <w:abstractNum w:abstractNumId="41" w15:restartNumberingAfterBreak="0">
+  <w:abstractNum w:abstractNumId="42" w15:restartNumberingAfterBreak="0">
     <w:nsid w:val="20982B0E"/>
     <w:multiLevelType w:val="multilevel"/>
     <w:tmpl w:val="CAC45B04"/>
@@ -39699,7 +40068,7 @@
       </w:pPr>
     </w:lvl>
   </w:abstractNum>
-  <w:abstractNum w:abstractNumId="42" w15:restartNumberingAfterBreak="0">
+  <w:abstractNum w:abstractNumId="43" w15:restartNumberingAfterBreak="0">
     <w:nsid w:val="20A91DCA"/>
     <w:multiLevelType w:val="multilevel"/>
     <w:tmpl w:val="22C0A11E"/>
@@ -39848,7 +40217,7 @@
       </w:rPr>
     </w:lvl>
   </w:abstractNum>
-  <w:abstractNum w:abstractNumId="43" w15:restartNumberingAfterBreak="0">
+  <w:abstractNum w:abstractNumId="44" w15:restartNumberingAfterBreak="0">
     <w:nsid w:val="20E4730A"/>
     <w:multiLevelType w:val="multilevel"/>
     <w:tmpl w:val="3F982870"/>
@@ -39965,7 +40334,7 @@
       </w:pPr>
     </w:lvl>
   </w:abstractNum>
-  <w:abstractNum w:abstractNumId="44" w15:restartNumberingAfterBreak="0">
+  <w:abstractNum w:abstractNumId="45" w15:restartNumberingAfterBreak="0">
     <w:nsid w:val="226128AC"/>
     <w:multiLevelType w:val="multilevel"/>
     <w:tmpl w:val="04663C56"/>
@@ -40114,7 +40483,7 @@
       </w:rPr>
     </w:lvl>
   </w:abstractNum>
-  <w:abstractNum w:abstractNumId="45" w15:restartNumberingAfterBreak="0">
+  <w:abstractNum w:abstractNumId="46" w15:restartNumberingAfterBreak="0">
     <w:nsid w:val="23371ED0"/>
     <w:multiLevelType w:val="multilevel"/>
     <w:tmpl w:val="8752E3D8"/>
@@ -40263,7 +40632,7 @@
       </w:rPr>
     </w:lvl>
   </w:abstractNum>
-  <w:abstractNum w:abstractNumId="46" w15:restartNumberingAfterBreak="0">
+  <w:abstractNum w:abstractNumId="47" w15:restartNumberingAfterBreak="0">
     <w:nsid w:val="24C022AE"/>
     <w:multiLevelType w:val="multilevel"/>
     <w:tmpl w:val="6A00EABA"/>
@@ -40412,7 +40781,7 @@
       </w:rPr>
     </w:lvl>
   </w:abstractNum>
-  <w:abstractNum w:abstractNumId="47" w15:restartNumberingAfterBreak="0">
+  <w:abstractNum w:abstractNumId="48" w15:restartNumberingAfterBreak="0">
     <w:nsid w:val="24F336E3"/>
     <w:multiLevelType w:val="multilevel"/>
     <w:tmpl w:val="E29C27C6"/>
@@ -40529,7 +40898,7 @@
       </w:pPr>
     </w:lvl>
   </w:abstractNum>
-  <w:abstractNum w:abstractNumId="48" w15:restartNumberingAfterBreak="0">
+  <w:abstractNum w:abstractNumId="49" w15:restartNumberingAfterBreak="0">
     <w:nsid w:val="25DE6D5A"/>
     <w:multiLevelType w:val="multilevel"/>
     <w:tmpl w:val="C45CB6F0"/>
@@ -40678,7 +41047,7 @@
       </w:rPr>
     </w:lvl>
   </w:abstractNum>
-  <w:abstractNum w:abstractNumId="49" w15:restartNumberingAfterBreak="0">
+  <w:abstractNum w:abstractNumId="50" w15:restartNumberingAfterBreak="0">
     <w:nsid w:val="25FA1773"/>
     <w:multiLevelType w:val="multilevel"/>
     <w:tmpl w:val="71E870C8"/>
@@ -40827,7 +41196,7 @@
       </w:rPr>
     </w:lvl>
   </w:abstractNum>
-  <w:abstractNum w:abstractNumId="50" w15:restartNumberingAfterBreak="0">
+  <w:abstractNum w:abstractNumId="51" w15:restartNumberingAfterBreak="0">
     <w:nsid w:val="262A61A8"/>
     <w:multiLevelType w:val="multilevel"/>
     <w:tmpl w:val="8762313E"/>
@@ -40944,7 +41313,7 @@
       </w:pPr>
     </w:lvl>
   </w:abstractNum>
-  <w:abstractNum w:abstractNumId="51" w15:restartNumberingAfterBreak="0">
+  <w:abstractNum w:abstractNumId="52" w15:restartNumberingAfterBreak="0">
     <w:nsid w:val="267503A7"/>
     <w:multiLevelType w:val="multilevel"/>
     <w:tmpl w:val="A92C8EF8"/>
@@ -41093,7 +41462,7 @@
       </w:rPr>
     </w:lvl>
   </w:abstractNum>
-  <w:abstractNum w:abstractNumId="52" w15:restartNumberingAfterBreak="0">
+  <w:abstractNum w:abstractNumId="53" w15:restartNumberingAfterBreak="0">
     <w:nsid w:val="26CA5E03"/>
     <w:multiLevelType w:val="multilevel"/>
     <w:tmpl w:val="E4A645DC"/>
@@ -41206,7 +41575,7 @@
       </w:pPr>
     </w:lvl>
   </w:abstractNum>
-  <w:abstractNum w:abstractNumId="53" w15:restartNumberingAfterBreak="0">
+  <w:abstractNum w:abstractNumId="54" w15:restartNumberingAfterBreak="0">
     <w:nsid w:val="273C7502"/>
     <w:multiLevelType w:val="multilevel"/>
     <w:tmpl w:val="256E7586"/>
@@ -41355,7 +41724,7 @@
       </w:rPr>
     </w:lvl>
   </w:abstractNum>
-  <w:abstractNum w:abstractNumId="54" w15:restartNumberingAfterBreak="0">
+  <w:abstractNum w:abstractNumId="55" w15:restartNumberingAfterBreak="0">
     <w:nsid w:val="280F1262"/>
     <w:multiLevelType w:val="multilevel"/>
     <w:tmpl w:val="E6086032"/>
@@ -41504,7 +41873,7 @@
       </w:rPr>
     </w:lvl>
   </w:abstractNum>
-  <w:abstractNum w:abstractNumId="55" w15:restartNumberingAfterBreak="0">
+  <w:abstractNum w:abstractNumId="56" w15:restartNumberingAfterBreak="0">
     <w:nsid w:val="282A0C1D"/>
     <w:multiLevelType w:val="multilevel"/>
     <w:tmpl w:val="CD66732E"/>
@@ -41621,7 +41990,7 @@
       </w:pPr>
     </w:lvl>
   </w:abstractNum>
-  <w:abstractNum w:abstractNumId="56" w15:restartNumberingAfterBreak="0">
+  <w:abstractNum w:abstractNumId="57" w15:restartNumberingAfterBreak="0">
     <w:nsid w:val="28742AB8"/>
     <w:multiLevelType w:val="multilevel"/>
     <w:tmpl w:val="2DFC6CDE"/>
@@ -41738,7 +42107,7 @@
       </w:pPr>
     </w:lvl>
   </w:abstractNum>
-  <w:abstractNum w:abstractNumId="57" w15:restartNumberingAfterBreak="0">
+  <w:abstractNum w:abstractNumId="58" w15:restartNumberingAfterBreak="0">
     <w:nsid w:val="29E737B1"/>
     <w:multiLevelType w:val="multilevel"/>
     <w:tmpl w:val="895E70B0"/>
@@ -41851,7 +42220,7 @@
       </w:pPr>
     </w:lvl>
   </w:abstractNum>
-  <w:abstractNum w:abstractNumId="58" w15:restartNumberingAfterBreak="0">
+  <w:abstractNum w:abstractNumId="59" w15:restartNumberingAfterBreak="0">
     <w:nsid w:val="2ABA6A84"/>
     <w:multiLevelType w:val="multilevel"/>
     <w:tmpl w:val="486A912E"/>
@@ -41964,7 +42333,7 @@
       </w:pPr>
     </w:lvl>
   </w:abstractNum>
-  <w:abstractNum w:abstractNumId="59" w15:restartNumberingAfterBreak="0">
+  <w:abstractNum w:abstractNumId="60" w15:restartNumberingAfterBreak="0">
     <w:nsid w:val="2AD02549"/>
     <w:multiLevelType w:val="multilevel"/>
     <w:tmpl w:val="164E2AC4"/>
@@ -42081,7 +42450,7 @@
       </w:pPr>
     </w:lvl>
   </w:abstractNum>
-  <w:abstractNum w:abstractNumId="60" w15:restartNumberingAfterBreak="0">
+  <w:abstractNum w:abstractNumId="61" w15:restartNumberingAfterBreak="0">
     <w:nsid w:val="2B150BED"/>
     <w:multiLevelType w:val="multilevel"/>
     <w:tmpl w:val="6D6A00EE"/>
@@ -42194,7 +42563,7 @@
       </w:pPr>
     </w:lvl>
   </w:abstractNum>
-  <w:abstractNum w:abstractNumId="61" w15:restartNumberingAfterBreak="0">
+  <w:abstractNum w:abstractNumId="62" w15:restartNumberingAfterBreak="0">
     <w:nsid w:val="2B5F0ADB"/>
     <w:multiLevelType w:val="multilevel"/>
     <w:tmpl w:val="56E066EA"/>
@@ -42307,7 +42676,7 @@
       </w:pPr>
     </w:lvl>
   </w:abstractNum>
-  <w:abstractNum w:abstractNumId="62" w15:restartNumberingAfterBreak="0">
+  <w:abstractNum w:abstractNumId="63" w15:restartNumberingAfterBreak="0">
     <w:nsid w:val="2B8537C4"/>
     <w:multiLevelType w:val="multilevel"/>
     <w:tmpl w:val="2DFCA6C0"/>
@@ -42424,7 +42793,7 @@
       </w:pPr>
     </w:lvl>
   </w:abstractNum>
-  <w:abstractNum w:abstractNumId="63" w15:restartNumberingAfterBreak="0">
+  <w:abstractNum w:abstractNumId="64" w15:restartNumberingAfterBreak="0">
     <w:nsid w:val="2C7D74A6"/>
     <w:multiLevelType w:val="multilevel"/>
     <w:tmpl w:val="B5147606"/>
@@ -42537,7 +42906,7 @@
       </w:pPr>
     </w:lvl>
   </w:abstractNum>
-  <w:abstractNum w:abstractNumId="64" w15:restartNumberingAfterBreak="0">
+  <w:abstractNum w:abstractNumId="65" w15:restartNumberingAfterBreak="0">
     <w:nsid w:val="2CB5577D"/>
     <w:multiLevelType w:val="multilevel"/>
     <w:tmpl w:val="3B86DD98"/>
@@ -42650,7 +43019,7 @@
       </w:pPr>
     </w:lvl>
   </w:abstractNum>
-  <w:abstractNum w:abstractNumId="65" w15:restartNumberingAfterBreak="0">
+  <w:abstractNum w:abstractNumId="66" w15:restartNumberingAfterBreak="0">
     <w:nsid w:val="2CEB5E83"/>
     <w:multiLevelType w:val="multilevel"/>
     <w:tmpl w:val="3F9245DE"/>
@@ -42763,7 +43132,7 @@
       </w:pPr>
     </w:lvl>
   </w:abstractNum>
-  <w:abstractNum w:abstractNumId="66" w15:restartNumberingAfterBreak="0">
+  <w:abstractNum w:abstractNumId="67" w15:restartNumberingAfterBreak="0">
     <w:nsid w:val="2D2938E3"/>
     <w:multiLevelType w:val="multilevel"/>
     <w:tmpl w:val="5AF2635E"/>
@@ -42880,7 +43249,7 @@
       </w:pPr>
     </w:lvl>
   </w:abstractNum>
-  <w:abstractNum w:abstractNumId="67" w15:restartNumberingAfterBreak="0">
+  <w:abstractNum w:abstractNumId="68" w15:restartNumberingAfterBreak="0">
     <w:nsid w:val="30DB035F"/>
     <w:multiLevelType w:val="multilevel"/>
     <w:tmpl w:val="E17AC872"/>
@@ -42993,7 +43362,7 @@
       </w:pPr>
     </w:lvl>
   </w:abstractNum>
-  <w:abstractNum w:abstractNumId="68" w15:restartNumberingAfterBreak="0">
+  <w:abstractNum w:abstractNumId="69" w15:restartNumberingAfterBreak="0">
     <w:nsid w:val="316F3DF7"/>
     <w:multiLevelType w:val="multilevel"/>
     <w:tmpl w:val="D7149616"/>
@@ -43106,7 +43475,7 @@
       </w:pPr>
     </w:lvl>
   </w:abstractNum>
-  <w:abstractNum w:abstractNumId="69" w15:restartNumberingAfterBreak="0">
+  <w:abstractNum w:abstractNumId="70" w15:restartNumberingAfterBreak="0">
     <w:nsid w:val="31B1219F"/>
     <w:multiLevelType w:val="multilevel"/>
     <w:tmpl w:val="294CBEEC"/>
@@ -43219,7 +43588,7 @@
       </w:pPr>
     </w:lvl>
   </w:abstractNum>
-  <w:abstractNum w:abstractNumId="70" w15:restartNumberingAfterBreak="0">
+  <w:abstractNum w:abstractNumId="71" w15:restartNumberingAfterBreak="0">
     <w:nsid w:val="31DC0752"/>
     <w:multiLevelType w:val="multilevel"/>
     <w:tmpl w:val="13504090"/>
@@ -43332,7 +43701,7 @@
       </w:pPr>
     </w:lvl>
   </w:abstractNum>
-  <w:abstractNum w:abstractNumId="71" w15:restartNumberingAfterBreak="0">
+  <w:abstractNum w:abstractNumId="72" w15:restartNumberingAfterBreak="0">
     <w:nsid w:val="32243C7B"/>
     <w:multiLevelType w:val="multilevel"/>
     <w:tmpl w:val="EA926358"/>
@@ -43481,7 +43850,7 @@
       </w:rPr>
     </w:lvl>
   </w:abstractNum>
-  <w:abstractNum w:abstractNumId="72" w15:restartNumberingAfterBreak="0">
+  <w:abstractNum w:abstractNumId="73" w15:restartNumberingAfterBreak="0">
     <w:nsid w:val="32B215EC"/>
     <w:multiLevelType w:val="multilevel"/>
     <w:tmpl w:val="74EAAF8E"/>
@@ -43594,7 +43963,7 @@
       </w:pPr>
     </w:lvl>
   </w:abstractNum>
-  <w:abstractNum w:abstractNumId="73" w15:restartNumberingAfterBreak="0">
+  <w:abstractNum w:abstractNumId="74" w15:restartNumberingAfterBreak="0">
     <w:nsid w:val="32C55FAF"/>
     <w:multiLevelType w:val="multilevel"/>
     <w:tmpl w:val="FB244F80"/>
@@ -43743,7 +44112,7 @@
       </w:rPr>
     </w:lvl>
   </w:abstractNum>
-  <w:abstractNum w:abstractNumId="74" w15:restartNumberingAfterBreak="0">
+  <w:abstractNum w:abstractNumId="75" w15:restartNumberingAfterBreak="0">
     <w:nsid w:val="356F1387"/>
     <w:multiLevelType w:val="multilevel"/>
     <w:tmpl w:val="A4028C62"/>
@@ -43892,7 +44261,7 @@
       </w:rPr>
     </w:lvl>
   </w:abstractNum>
-  <w:abstractNum w:abstractNumId="75" w15:restartNumberingAfterBreak="0">
+  <w:abstractNum w:abstractNumId="76" w15:restartNumberingAfterBreak="0">
     <w:nsid w:val="35EA7E57"/>
     <w:multiLevelType w:val="multilevel"/>
     <w:tmpl w:val="38DA783A"/>
@@ -44005,7 +44374,7 @@
       </w:pPr>
     </w:lvl>
   </w:abstractNum>
-  <w:abstractNum w:abstractNumId="76" w15:restartNumberingAfterBreak="0">
+  <w:abstractNum w:abstractNumId="77" w15:restartNumberingAfterBreak="0">
     <w:nsid w:val="37550099"/>
     <w:multiLevelType w:val="multilevel"/>
     <w:tmpl w:val="4E80F410"/>
@@ -44122,7 +44491,7 @@
       </w:pPr>
     </w:lvl>
   </w:abstractNum>
-  <w:abstractNum w:abstractNumId="77" w15:restartNumberingAfterBreak="0">
+  <w:abstractNum w:abstractNumId="78" w15:restartNumberingAfterBreak="0">
     <w:nsid w:val="37D820E4"/>
     <w:multiLevelType w:val="multilevel"/>
     <w:tmpl w:val="22FC75C6"/>
@@ -44271,7 +44640,7 @@
       </w:rPr>
     </w:lvl>
   </w:abstractNum>
-  <w:abstractNum w:abstractNumId="78" w15:restartNumberingAfterBreak="0">
+  <w:abstractNum w:abstractNumId="79" w15:restartNumberingAfterBreak="0">
     <w:nsid w:val="37F0247B"/>
     <w:multiLevelType w:val="multilevel"/>
     <w:tmpl w:val="9D9621D0"/>
@@ -44388,7 +44757,7 @@
       </w:pPr>
     </w:lvl>
   </w:abstractNum>
-  <w:abstractNum w:abstractNumId="79" w15:restartNumberingAfterBreak="0">
+  <w:abstractNum w:abstractNumId="80" w15:restartNumberingAfterBreak="0">
     <w:nsid w:val="38781B8F"/>
     <w:multiLevelType w:val="multilevel"/>
     <w:tmpl w:val="F43C34A0"/>
@@ -44505,7 +44874,7 @@
       </w:pPr>
     </w:lvl>
   </w:abstractNum>
-  <w:abstractNum w:abstractNumId="80" w15:restartNumberingAfterBreak="0">
+  <w:abstractNum w:abstractNumId="81" w15:restartNumberingAfterBreak="0">
     <w:nsid w:val="38C102AA"/>
     <w:multiLevelType w:val="multilevel"/>
     <w:tmpl w:val="A4746E7E"/>
@@ -44654,7 +45023,7 @@
       </w:rPr>
     </w:lvl>
   </w:abstractNum>
-  <w:abstractNum w:abstractNumId="81" w15:restartNumberingAfterBreak="0">
+  <w:abstractNum w:abstractNumId="82" w15:restartNumberingAfterBreak="0">
     <w:nsid w:val="39E53615"/>
     <w:multiLevelType w:val="multilevel"/>
     <w:tmpl w:val="F6001C8C"/>
@@ -44803,7 +45172,7 @@
       </w:rPr>
     </w:lvl>
   </w:abstractNum>
-  <w:abstractNum w:abstractNumId="82" w15:restartNumberingAfterBreak="0">
+  <w:abstractNum w:abstractNumId="83" w15:restartNumberingAfterBreak="0">
     <w:nsid w:val="3A627DC2"/>
     <w:multiLevelType w:val="multilevel"/>
     <w:tmpl w:val="9806B5CC"/>
@@ -44952,7 +45321,7 @@
       </w:rPr>
     </w:lvl>
   </w:abstractNum>
-  <w:abstractNum w:abstractNumId="83" w15:restartNumberingAfterBreak="0">
+  <w:abstractNum w:abstractNumId="84" w15:restartNumberingAfterBreak="0">
     <w:nsid w:val="3AB86A9E"/>
     <w:multiLevelType w:val="multilevel"/>
     <w:tmpl w:val="0E94C00A"/>
@@ -45065,7 +45434,7 @@
       </w:pPr>
     </w:lvl>
   </w:abstractNum>
-  <w:abstractNum w:abstractNumId="84" w15:restartNumberingAfterBreak="0">
+  <w:abstractNum w:abstractNumId="85" w15:restartNumberingAfterBreak="0">
     <w:nsid w:val="3B3B0B1C"/>
     <w:multiLevelType w:val="multilevel"/>
     <w:tmpl w:val="CD664BD0"/>
@@ -45214,7 +45583,7 @@
       </w:rPr>
     </w:lvl>
   </w:abstractNum>
-  <w:abstractNum w:abstractNumId="85" w15:restartNumberingAfterBreak="0">
+  <w:abstractNum w:abstractNumId="86" w15:restartNumberingAfterBreak="0">
     <w:nsid w:val="3B53161F"/>
     <w:multiLevelType w:val="multilevel"/>
     <w:tmpl w:val="9B6E392A"/>
@@ -45363,7 +45732,7 @@
       </w:rPr>
     </w:lvl>
   </w:abstractNum>
-  <w:abstractNum w:abstractNumId="86" w15:restartNumberingAfterBreak="0">
+  <w:abstractNum w:abstractNumId="87" w15:restartNumberingAfterBreak="0">
     <w:nsid w:val="3B961BD4"/>
     <w:multiLevelType w:val="multilevel"/>
     <w:tmpl w:val="9CDE90DE"/>
@@ -45480,7 +45849,7 @@
       </w:pPr>
     </w:lvl>
   </w:abstractNum>
-  <w:abstractNum w:abstractNumId="87" w15:restartNumberingAfterBreak="0">
+  <w:abstractNum w:abstractNumId="88" w15:restartNumberingAfterBreak="0">
     <w:nsid w:val="3BFB5921"/>
     <w:multiLevelType w:val="multilevel"/>
     <w:tmpl w:val="0FA6CE6A"/>
@@ -45629,7 +45998,7 @@
       </w:rPr>
     </w:lvl>
   </w:abstractNum>
-  <w:abstractNum w:abstractNumId="88" w15:restartNumberingAfterBreak="0">
+  <w:abstractNum w:abstractNumId="89" w15:restartNumberingAfterBreak="0">
     <w:nsid w:val="3D243E74"/>
     <w:multiLevelType w:val="multilevel"/>
     <w:tmpl w:val="636CADC2"/>
@@ -45742,7 +46111,7 @@
       </w:pPr>
     </w:lvl>
   </w:abstractNum>
-  <w:abstractNum w:abstractNumId="89" w15:restartNumberingAfterBreak="0">
+  <w:abstractNum w:abstractNumId="90" w15:restartNumberingAfterBreak="0">
     <w:nsid w:val="3DF475C4"/>
     <w:multiLevelType w:val="multilevel"/>
     <w:tmpl w:val="647C6328"/>
@@ -45891,7 +46260,7 @@
       </w:rPr>
     </w:lvl>
   </w:abstractNum>
-  <w:abstractNum w:abstractNumId="90" w15:restartNumberingAfterBreak="0">
+  <w:abstractNum w:abstractNumId="91" w15:restartNumberingAfterBreak="0">
     <w:nsid w:val="3F2F28BC"/>
     <w:multiLevelType w:val="multilevel"/>
     <w:tmpl w:val="CED4163C"/>
@@ -46004,7 +46373,7 @@
       </w:pPr>
     </w:lvl>
   </w:abstractNum>
-  <w:abstractNum w:abstractNumId="91" w15:restartNumberingAfterBreak="0">
+  <w:abstractNum w:abstractNumId="92" w15:restartNumberingAfterBreak="0">
     <w:nsid w:val="3F781B31"/>
     <w:multiLevelType w:val="multilevel"/>
     <w:tmpl w:val="D30E4AF4"/>
@@ -46121,7 +46490,7 @@
       </w:pPr>
     </w:lvl>
   </w:abstractNum>
-  <w:abstractNum w:abstractNumId="92" w15:restartNumberingAfterBreak="0">
+  <w:abstractNum w:abstractNumId="93" w15:restartNumberingAfterBreak="0">
     <w:nsid w:val="406B17C2"/>
     <w:multiLevelType w:val="multilevel"/>
     <w:tmpl w:val="2AF2DE58"/>
@@ -46234,7 +46603,7 @@
       </w:pPr>
     </w:lvl>
   </w:abstractNum>
-  <w:abstractNum w:abstractNumId="93" w15:restartNumberingAfterBreak="0">
+  <w:abstractNum w:abstractNumId="94" w15:restartNumberingAfterBreak="0">
     <w:nsid w:val="408A3E59"/>
     <w:multiLevelType w:val="multilevel"/>
     <w:tmpl w:val="29DE851C"/>
@@ -46347,7 +46716,7 @@
       </w:pPr>
     </w:lvl>
   </w:abstractNum>
-  <w:abstractNum w:abstractNumId="94" w15:restartNumberingAfterBreak="0">
+  <w:abstractNum w:abstractNumId="95" w15:restartNumberingAfterBreak="0">
     <w:nsid w:val="41035F14"/>
     <w:multiLevelType w:val="multilevel"/>
     <w:tmpl w:val="B99AFF60"/>
@@ -46464,7 +46833,120 @@
       </w:pPr>
     </w:lvl>
   </w:abstractNum>
-  <w:abstractNum w:abstractNumId="95" w15:restartNumberingAfterBreak="0">
+  <w:abstractNum w:abstractNumId="96" w15:restartNumberingAfterBreak="0">
+    <w:nsid w:val="42AA4333"/>
+    <w:multiLevelType w:val="multilevel"/>
+    <w:tmpl w:val="6E287F20"/>
+    <w:lvl w:ilvl="0">
+      <w:start w:val="1"/>
+      <w:numFmt w:val="decimal"/>
+      <w:lvlText w:val="%1."/>
+      <w:lvlJc w:val="left"/>
+      <w:pPr>
+        <w:tabs>
+          <w:tab w:val="num" w:pos="720"/>
+        </w:tabs>
+        <w:ind w:left="720" w:hanging="360"/>
+      </w:pPr>
+    </w:lvl>
+    <w:lvl w:ilvl="1" w:tentative="1">
+      <w:start w:val="1"/>
+      <w:numFmt w:val="decimal"/>
+      <w:lvlText w:val="%2."/>
+      <w:lvlJc w:val="left"/>
+      <w:pPr>
+        <w:tabs>
+          <w:tab w:val="num" w:pos="1440"/>
+        </w:tabs>
+        <w:ind w:left="1440" w:hanging="360"/>
+      </w:pPr>
+    </w:lvl>
+    <w:lvl w:ilvl="2" w:tentative="1">
+      <w:start w:val="1"/>
+      <w:numFmt w:val="decimal"/>
+      <w:lvlText w:val="%3."/>
+      <w:lvlJc w:val="left"/>
+      <w:pPr>
+        <w:tabs>
+          <w:tab w:val="num" w:pos="2160"/>
+        </w:tabs>
+        <w:ind w:left="2160" w:hanging="360"/>
+      </w:pPr>
+    </w:lvl>
+    <w:lvl w:ilvl="3" w:tentative="1">
+      <w:start w:val="1"/>
+      <w:numFmt w:val="decimal"/>
+      <w:lvlText w:val="%4."/>
+      <w:lvlJc w:val="left"/>
+      <w:pPr>
+        <w:tabs>
+          <w:tab w:val="num" w:pos="2880"/>
+        </w:tabs>
+        <w:ind w:left="2880" w:hanging="360"/>
+      </w:pPr>
+    </w:lvl>
+    <w:lvl w:ilvl="4" w:tentative="1">
+      <w:start w:val="1"/>
+      <w:numFmt w:val="decimal"/>
+      <w:lvlText w:val="%5."/>
+      <w:lvlJc w:val="left"/>
+      <w:pPr>
+        <w:tabs>
+          <w:tab w:val="num" w:pos="3600"/>
+        </w:tabs>
+        <w:ind w:left="3600" w:hanging="360"/>
+      </w:pPr>
+    </w:lvl>
+    <w:lvl w:ilvl="5" w:tentative="1">
+      <w:start w:val="1"/>
+      <w:numFmt w:val="decimal"/>
+      <w:lvlText w:val="%6."/>
+      <w:lvlJc w:val="left"/>
+      <w:pPr>
+        <w:tabs>
+          <w:tab w:val="num" w:pos="4320"/>
+        </w:tabs>
+        <w:ind w:left="4320" w:hanging="360"/>
+      </w:pPr>
+    </w:lvl>
+    <w:lvl w:ilvl="6" w:tentative="1">
+      <w:start w:val="1"/>
+      <w:numFmt w:val="decimal"/>
+      <w:lvlText w:val="%7."/>
+      <w:lvlJc w:val="left"/>
+      <w:pPr>
+        <w:tabs>
+          <w:tab w:val="num" w:pos="5040"/>
+        </w:tabs>
+        <w:ind w:left="5040" w:hanging="360"/>
+      </w:pPr>
+    </w:lvl>
+    <w:lvl w:ilvl="7" w:tentative="1">
+      <w:start w:val="1"/>
+      <w:numFmt w:val="decimal"/>
+      <w:lvlText w:val="%8."/>
+      <w:lvlJc w:val="left"/>
+      <w:pPr>
+        <w:tabs>
+          <w:tab w:val="num" w:pos="5760"/>
+        </w:tabs>
+        <w:ind w:left="5760" w:hanging="360"/>
+      </w:pPr>
+    </w:lvl>
+    <w:lvl w:ilvl="8" w:tentative="1">
+      <w:start w:val="1"/>
+      <w:numFmt w:val="decimal"/>
+      <w:lvlText w:val="%9."/>
+      <w:lvlJc w:val="left"/>
+      <w:pPr>
+        <w:tabs>
+          <w:tab w:val="num" w:pos="6480"/>
+        </w:tabs>
+        <w:ind w:left="6480" w:hanging="360"/>
+      </w:pPr>
+    </w:lvl>
+  </w:abstractNum>
+  <w:abstractNum w:abstractNumId="97" w15:restartNumberingAfterBreak="0">
     <w:nsid w:val="42ED30EB"/>
     <w:multiLevelType w:val="multilevel"/>
     <w:tmpl w:val="E56E69F8"/>
@@ -46577,7 +47059,7 @@
       </w:pPr>
     </w:lvl>
   </w:abstractNum>
-  <w:abstractNum w:abstractNumId="96" w15:restartNumberingAfterBreak="0">
+  <w:abstractNum w:abstractNumId="98" w15:restartNumberingAfterBreak="0">
     <w:nsid w:val="43083F1B"/>
     <w:multiLevelType w:val="multilevel"/>
     <w:tmpl w:val="5D3C41AA"/>
@@ -46690,7 +47172,7 @@
       </w:pPr>
     </w:lvl>
   </w:abstractNum>
-  <w:abstractNum w:abstractNumId="97" w15:restartNumberingAfterBreak="0">
+  <w:abstractNum w:abstractNumId="99" w15:restartNumberingAfterBreak="0">
     <w:nsid w:val="43C8008C"/>
     <w:multiLevelType w:val="multilevel"/>
     <w:tmpl w:val="6DE66ED8"/>
@@ -46803,7 +47285,7 @@
       </w:pPr>
     </w:lvl>
   </w:abstractNum>
-  <w:abstractNum w:abstractNumId="98" w15:restartNumberingAfterBreak="0">
+  <w:abstractNum w:abstractNumId="100" w15:restartNumberingAfterBreak="0">
     <w:nsid w:val="43D17831"/>
     <w:multiLevelType w:val="multilevel"/>
     <w:tmpl w:val="7FC87F90"/>
@@ -46916,7 +47398,7 @@
       </w:pPr>
     </w:lvl>
   </w:abstractNum>
-  <w:abstractNum w:abstractNumId="99" w15:restartNumberingAfterBreak="0">
+  <w:abstractNum w:abstractNumId="101" w15:restartNumberingAfterBreak="0">
     <w:nsid w:val="44066B20"/>
     <w:multiLevelType w:val="multilevel"/>
     <w:tmpl w:val="EA765396"/>
@@ -47029,7 +47511,7 @@
       </w:pPr>
     </w:lvl>
   </w:abstractNum>
-  <w:abstractNum w:abstractNumId="100" w15:restartNumberingAfterBreak="0">
+  <w:abstractNum w:abstractNumId="102" w15:restartNumberingAfterBreak="0">
     <w:nsid w:val="44983E34"/>
     <w:multiLevelType w:val="multilevel"/>
     <w:tmpl w:val="335A6FE2"/>
@@ -47142,7 +47624,7 @@
       </w:pPr>
     </w:lvl>
   </w:abstractNum>
-  <w:abstractNum w:abstractNumId="101" w15:restartNumberingAfterBreak="0">
+  <w:abstractNum w:abstractNumId="103" w15:restartNumberingAfterBreak="0">
     <w:nsid w:val="44B471DD"/>
     <w:multiLevelType w:val="multilevel"/>
     <w:tmpl w:val="07521FF2"/>
@@ -47255,7 +47737,7 @@
       </w:pPr>
     </w:lvl>
   </w:abstractNum>
-  <w:abstractNum w:abstractNumId="102" w15:restartNumberingAfterBreak="0">
+  <w:abstractNum w:abstractNumId="104" w15:restartNumberingAfterBreak="0">
     <w:nsid w:val="464A4875"/>
     <w:multiLevelType w:val="multilevel"/>
     <w:tmpl w:val="01464750"/>
@@ -47372,7 +47854,7 @@
       </w:pPr>
     </w:lvl>
   </w:abstractNum>
-  <w:abstractNum w:abstractNumId="103" w15:restartNumberingAfterBreak="0">
+  <w:abstractNum w:abstractNumId="105" w15:restartNumberingAfterBreak="0">
     <w:nsid w:val="46E45680"/>
     <w:multiLevelType w:val="multilevel"/>
     <w:tmpl w:val="4B9C2C7A"/>
@@ -47485,7 +47967,7 @@
       </w:pPr>
     </w:lvl>
   </w:abstractNum>
-  <w:abstractNum w:abstractNumId="104" w15:restartNumberingAfterBreak="0">
+  <w:abstractNum w:abstractNumId="106" w15:restartNumberingAfterBreak="0">
     <w:nsid w:val="47E72DF4"/>
     <w:multiLevelType w:val="multilevel"/>
     <w:tmpl w:val="513E270E"/>
@@ -47598,7 +48080,7 @@
       </w:pPr>
     </w:lvl>
   </w:abstractNum>
-  <w:abstractNum w:abstractNumId="105" w15:restartNumberingAfterBreak="0">
+  <w:abstractNum w:abstractNumId="107" w15:restartNumberingAfterBreak="0">
     <w:nsid w:val="48104DC2"/>
     <w:multiLevelType w:val="multilevel"/>
     <w:tmpl w:val="851CF8A4"/>
@@ -47715,7 +48197,7 @@
       </w:pPr>
     </w:lvl>
   </w:abstractNum>
-  <w:abstractNum w:abstractNumId="106" w15:restartNumberingAfterBreak="0">
+  <w:abstractNum w:abstractNumId="108" w15:restartNumberingAfterBreak="0">
     <w:nsid w:val="48A1167E"/>
     <w:multiLevelType w:val="multilevel"/>
     <w:tmpl w:val="3C501384"/>
@@ -47828,7 +48310,7 @@
       </w:pPr>
     </w:lvl>
   </w:abstractNum>
-  <w:abstractNum w:abstractNumId="107" w15:restartNumberingAfterBreak="0">
+  <w:abstractNum w:abstractNumId="109" w15:restartNumberingAfterBreak="0">
     <w:nsid w:val="491275A2"/>
     <w:multiLevelType w:val="multilevel"/>
     <w:tmpl w:val="2EDACE96"/>
@@ -47945,7 +48427,7 @@
       </w:pPr>
     </w:lvl>
   </w:abstractNum>
-  <w:abstractNum w:abstractNumId="108" w15:restartNumberingAfterBreak="0">
+  <w:abstractNum w:abstractNumId="110" w15:restartNumberingAfterBreak="0">
     <w:nsid w:val="49DA708D"/>
     <w:multiLevelType w:val="multilevel"/>
     <w:tmpl w:val="462A0D68"/>
@@ -48058,7 +48540,7 @@
       </w:pPr>
     </w:lvl>
   </w:abstractNum>
-  <w:abstractNum w:abstractNumId="109" w15:restartNumberingAfterBreak="0">
+  <w:abstractNum w:abstractNumId="111" w15:restartNumberingAfterBreak="0">
     <w:nsid w:val="4A48617C"/>
     <w:multiLevelType w:val="multilevel"/>
     <w:tmpl w:val="1ACE9B2E"/>
@@ -48171,7 +48653,7 @@
       </w:pPr>
     </w:lvl>
   </w:abstractNum>
-  <w:abstractNum w:abstractNumId="110" w15:restartNumberingAfterBreak="0">
+  <w:abstractNum w:abstractNumId="112" w15:restartNumberingAfterBreak="0">
     <w:nsid w:val="4AA27CA7"/>
     <w:multiLevelType w:val="multilevel"/>
     <w:tmpl w:val="C242D0AA"/>
@@ -48284,7 +48766,7 @@
       </w:pPr>
     </w:lvl>
   </w:abstractNum>
-  <w:abstractNum w:abstractNumId="111" w15:restartNumberingAfterBreak="0">
+  <w:abstractNum w:abstractNumId="113" w15:restartNumberingAfterBreak="0">
     <w:nsid w:val="4AEE4188"/>
     <w:multiLevelType w:val="multilevel"/>
     <w:tmpl w:val="8D78BEC4"/>
@@ -48433,7 +48915,7 @@
       </w:rPr>
     </w:lvl>
   </w:abstractNum>
-  <w:abstractNum w:abstractNumId="112" w15:restartNumberingAfterBreak="0">
+  <w:abstractNum w:abstractNumId="114" w15:restartNumberingAfterBreak="0">
     <w:nsid w:val="4B3D33B4"/>
     <w:multiLevelType w:val="multilevel"/>
     <w:tmpl w:val="67B615FC"/>
@@ -48550,7 +49032,7 @@
       </w:pPr>
     </w:lvl>
   </w:abstractNum>
-  <w:abstractNum w:abstractNumId="113" w15:restartNumberingAfterBreak="0">
+  <w:abstractNum w:abstractNumId="115" w15:restartNumberingAfterBreak="0">
     <w:nsid w:val="4B985712"/>
     <w:multiLevelType w:val="multilevel"/>
     <w:tmpl w:val="0780201E"/>
@@ -48699,7 +49181,7 @@
       </w:rPr>
     </w:lvl>
   </w:abstractNum>
-  <w:abstractNum w:abstractNumId="114" w15:restartNumberingAfterBreak="0">
+  <w:abstractNum w:abstractNumId="116" w15:restartNumberingAfterBreak="0">
     <w:nsid w:val="4BCC16FF"/>
     <w:multiLevelType w:val="multilevel"/>
     <w:tmpl w:val="AF34FA2A"/>
@@ -48848,7 +49330,7 @@
       </w:rPr>
     </w:lvl>
   </w:abstractNum>
-  <w:abstractNum w:abstractNumId="115" w15:restartNumberingAfterBreak="0">
+  <w:abstractNum w:abstractNumId="117" w15:restartNumberingAfterBreak="0">
     <w:nsid w:val="4C3B3EF0"/>
     <w:multiLevelType w:val="multilevel"/>
     <w:tmpl w:val="746CDCD4"/>
@@ -48961,7 +49443,7 @@
       </w:pPr>
     </w:lvl>
   </w:abstractNum>
-  <w:abstractNum w:abstractNumId="116" w15:restartNumberingAfterBreak="0">
+  <w:abstractNum w:abstractNumId="118" w15:restartNumberingAfterBreak="0">
     <w:nsid w:val="4C952815"/>
     <w:multiLevelType w:val="multilevel"/>
     <w:tmpl w:val="DE20F42C"/>
@@ -49078,7 +49560,7 @@
       </w:pPr>
     </w:lvl>
   </w:abstractNum>
-  <w:abstractNum w:abstractNumId="117" w15:restartNumberingAfterBreak="0">
+  <w:abstractNum w:abstractNumId="119" w15:restartNumberingAfterBreak="0">
     <w:nsid w:val="4CC26436"/>
     <w:multiLevelType w:val="multilevel"/>
     <w:tmpl w:val="6EB8FA40"/>
@@ -49191,7 +49673,7 @@
       </w:pPr>
     </w:lvl>
   </w:abstractNum>
-  <w:abstractNum w:abstractNumId="118" w15:restartNumberingAfterBreak="0">
+  <w:abstractNum w:abstractNumId="120" w15:restartNumberingAfterBreak="0">
     <w:nsid w:val="4D032D4A"/>
     <w:multiLevelType w:val="multilevel"/>
     <w:tmpl w:val="63BC9612"/>
@@ -49304,7 +49786,7 @@
       </w:pPr>
     </w:lvl>
   </w:abstractNum>
-  <w:abstractNum w:abstractNumId="119" w15:restartNumberingAfterBreak="0">
+  <w:abstractNum w:abstractNumId="121" w15:restartNumberingAfterBreak="0">
     <w:nsid w:val="4DB44AF0"/>
     <w:multiLevelType w:val="multilevel"/>
     <w:tmpl w:val="58DA2EE2"/>
@@ -49417,7 +49899,7 @@
       </w:pPr>
     </w:lvl>
   </w:abstractNum>
-  <w:abstractNum w:abstractNumId="120" w15:restartNumberingAfterBreak="0">
+  <w:abstractNum w:abstractNumId="122" w15:restartNumberingAfterBreak="0">
     <w:nsid w:val="4DF86B1F"/>
     <w:multiLevelType w:val="multilevel"/>
     <w:tmpl w:val="A482ABCE"/>
@@ -49566,7 +50048,7 @@
       </w:rPr>
     </w:lvl>
   </w:abstractNum>
-  <w:abstractNum w:abstractNumId="121" w15:restartNumberingAfterBreak="0">
+  <w:abstractNum w:abstractNumId="123" w15:restartNumberingAfterBreak="0">
     <w:nsid w:val="4E2B7FEA"/>
     <w:multiLevelType w:val="multilevel"/>
     <w:tmpl w:val="04FA4720"/>
@@ -49679,7 +50161,7 @@
       </w:pPr>
     </w:lvl>
   </w:abstractNum>
-  <w:abstractNum w:abstractNumId="122" w15:restartNumberingAfterBreak="0">
+  <w:abstractNum w:abstractNumId="124" w15:restartNumberingAfterBreak="0">
     <w:nsid w:val="4E4454FC"/>
     <w:multiLevelType w:val="multilevel"/>
     <w:tmpl w:val="35F21314"/>
@@ -49792,7 +50274,7 @@
       </w:pPr>
     </w:lvl>
   </w:abstractNum>
-  <w:abstractNum w:abstractNumId="123" w15:restartNumberingAfterBreak="0">
+  <w:abstractNum w:abstractNumId="125" w15:restartNumberingAfterBreak="0">
     <w:nsid w:val="4E7771A5"/>
     <w:multiLevelType w:val="multilevel"/>
     <w:tmpl w:val="0E4CC61E"/>
@@ -49941,7 +50423,7 @@
       </w:rPr>
     </w:lvl>
   </w:abstractNum>
-  <w:abstractNum w:abstractNumId="124" w15:restartNumberingAfterBreak="0">
+  <w:abstractNum w:abstractNumId="126" w15:restartNumberingAfterBreak="0">
     <w:nsid w:val="4E956A86"/>
     <w:multiLevelType w:val="multilevel"/>
     <w:tmpl w:val="EE82B4D6"/>
@@ -50054,7 +50536,7 @@
       </w:pPr>
     </w:lvl>
   </w:abstractNum>
-  <w:abstractNum w:abstractNumId="125" w15:restartNumberingAfterBreak="0">
+  <w:abstractNum w:abstractNumId="127" w15:restartNumberingAfterBreak="0">
     <w:nsid w:val="4F332B07"/>
     <w:multiLevelType w:val="multilevel"/>
     <w:tmpl w:val="D8469A06"/>
@@ -50171,7 +50653,7 @@
       </w:pPr>
     </w:lvl>
   </w:abstractNum>
-  <w:abstractNum w:abstractNumId="126" w15:restartNumberingAfterBreak="0">
+  <w:abstractNum w:abstractNumId="128" w15:restartNumberingAfterBreak="0">
     <w:nsid w:val="507157BC"/>
     <w:multiLevelType w:val="multilevel"/>
     <w:tmpl w:val="0BC624E8"/>
@@ -50284,7 +50766,7 @@
       </w:pPr>
     </w:lvl>
   </w:abstractNum>
-  <w:abstractNum w:abstractNumId="127" w15:restartNumberingAfterBreak="0">
+  <w:abstractNum w:abstractNumId="129" w15:restartNumberingAfterBreak="0">
     <w:nsid w:val="533E35AF"/>
     <w:multiLevelType w:val="multilevel"/>
     <w:tmpl w:val="837EDF0E"/>
@@ -50401,7 +50883,7 @@
       </w:pPr>
     </w:lvl>
   </w:abstractNum>
-  <w:abstractNum w:abstractNumId="128" w15:restartNumberingAfterBreak="0">
+  <w:abstractNum w:abstractNumId="130" w15:restartNumberingAfterBreak="0">
     <w:nsid w:val="534F4431"/>
     <w:multiLevelType w:val="multilevel"/>
     <w:tmpl w:val="BF7CAB86"/>
@@ -50550,7 +51032,7 @@
       </w:rPr>
     </w:lvl>
   </w:abstractNum>
-  <w:abstractNum w:abstractNumId="129" w15:restartNumberingAfterBreak="0">
+  <w:abstractNum w:abstractNumId="131" w15:restartNumberingAfterBreak="0">
     <w:nsid w:val="536759AD"/>
     <w:multiLevelType w:val="multilevel"/>
     <w:tmpl w:val="F1F00B3C"/>
@@ -50667,7 +51149,7 @@
       </w:pPr>
     </w:lvl>
   </w:abstractNum>
-  <w:abstractNum w:abstractNumId="130" w15:restartNumberingAfterBreak="0">
+  <w:abstractNum w:abstractNumId="132" w15:restartNumberingAfterBreak="0">
     <w:nsid w:val="53AC4292"/>
     <w:multiLevelType w:val="hybridMultilevel"/>
     <w:tmpl w:val="4F0CEF54"/>
@@ -50756,7 +51238,7 @@
       </w:pPr>
     </w:lvl>
   </w:abstractNum>
-  <w:abstractNum w:abstractNumId="131" w15:restartNumberingAfterBreak="0">
+  <w:abstractNum w:abstractNumId="133" w15:restartNumberingAfterBreak="0">
     <w:nsid w:val="54354DDE"/>
     <w:multiLevelType w:val="multilevel"/>
     <w:tmpl w:val="12246854"/>
@@ -50905,7 +51387,7 @@
       </w:rPr>
     </w:lvl>
   </w:abstractNum>
-  <w:abstractNum w:abstractNumId="132" w15:restartNumberingAfterBreak="0">
+  <w:abstractNum w:abstractNumId="134" w15:restartNumberingAfterBreak="0">
     <w:nsid w:val="548B3142"/>
     <w:multiLevelType w:val="multilevel"/>
     <w:tmpl w:val="CDF85F84"/>
@@ -51054,7 +51536,7 @@
       </w:rPr>
     </w:lvl>
   </w:abstractNum>
-  <w:abstractNum w:abstractNumId="133" w15:restartNumberingAfterBreak="0">
+  <w:abstractNum w:abstractNumId="135" w15:restartNumberingAfterBreak="0">
     <w:nsid w:val="54DB296D"/>
     <w:multiLevelType w:val="multilevel"/>
     <w:tmpl w:val="E66EA43A"/>
@@ -51171,7 +51653,7 @@
       </w:pPr>
     </w:lvl>
   </w:abstractNum>
-  <w:abstractNum w:abstractNumId="134" w15:restartNumberingAfterBreak="0">
+  <w:abstractNum w:abstractNumId="136" w15:restartNumberingAfterBreak="0">
     <w:nsid w:val="550C03CE"/>
     <w:multiLevelType w:val="multilevel"/>
     <w:tmpl w:val="37A076FA"/>
@@ -51284,7 +51766,7 @@
       </w:pPr>
     </w:lvl>
   </w:abstractNum>
-  <w:abstractNum w:abstractNumId="135" w15:restartNumberingAfterBreak="0">
+  <w:abstractNum w:abstractNumId="137" w15:restartNumberingAfterBreak="0">
     <w:nsid w:val="554E68E3"/>
     <w:multiLevelType w:val="multilevel"/>
     <w:tmpl w:val="389630B4"/>
@@ -51397,7 +51879,7 @@
       </w:pPr>
     </w:lvl>
   </w:abstractNum>
-  <w:abstractNum w:abstractNumId="136" w15:restartNumberingAfterBreak="0">
+  <w:abstractNum w:abstractNumId="138" w15:restartNumberingAfterBreak="0">
     <w:nsid w:val="556D0E6B"/>
     <w:multiLevelType w:val="multilevel"/>
     <w:tmpl w:val="A7A015D4"/>
@@ -51514,7 +51996,7 @@
       </w:pPr>
     </w:lvl>
   </w:abstractNum>
-  <w:abstractNum w:abstractNumId="137" w15:restartNumberingAfterBreak="0">
+  <w:abstractNum w:abstractNumId="139" w15:restartNumberingAfterBreak="0">
     <w:nsid w:val="55766A99"/>
     <w:multiLevelType w:val="multilevel"/>
     <w:tmpl w:val="61D0CBF0"/>
@@ -51627,7 +52109,7 @@
       </w:pPr>
     </w:lvl>
   </w:abstractNum>
-  <w:abstractNum w:abstractNumId="138" w15:restartNumberingAfterBreak="0">
+  <w:abstractNum w:abstractNumId="140" w15:restartNumberingAfterBreak="0">
     <w:nsid w:val="558E78DE"/>
     <w:multiLevelType w:val="multilevel"/>
     <w:tmpl w:val="530C880C"/>
@@ -51740,7 +52222,7 @@
       </w:pPr>
     </w:lvl>
   </w:abstractNum>
-  <w:abstractNum w:abstractNumId="139" w15:restartNumberingAfterBreak="0">
+  <w:abstractNum w:abstractNumId="141" w15:restartNumberingAfterBreak="0">
     <w:nsid w:val="5680284F"/>
     <w:multiLevelType w:val="multilevel"/>
     <w:tmpl w:val="37E6FF24"/>
@@ -51853,7 +52335,7 @@
       </w:pPr>
     </w:lvl>
   </w:abstractNum>
-  <w:abstractNum w:abstractNumId="140" w15:restartNumberingAfterBreak="0">
+  <w:abstractNum w:abstractNumId="142" w15:restartNumberingAfterBreak="0">
     <w:nsid w:val="570B1384"/>
     <w:multiLevelType w:val="multilevel"/>
     <w:tmpl w:val="A03C9384"/>
@@ -52002,7 +52484,7 @@
       </w:rPr>
     </w:lvl>
   </w:abstractNum>
-  <w:abstractNum w:abstractNumId="141" w15:restartNumberingAfterBreak="0">
+  <w:abstractNum w:abstractNumId="143" w15:restartNumberingAfterBreak="0">
     <w:nsid w:val="575232BF"/>
     <w:multiLevelType w:val="multilevel"/>
     <w:tmpl w:val="F376B0FA"/>
@@ -52115,7 +52597,7 @@
       </w:pPr>
     </w:lvl>
   </w:abstractNum>
-  <w:abstractNum w:abstractNumId="142" w15:restartNumberingAfterBreak="0">
+  <w:abstractNum w:abstractNumId="144" w15:restartNumberingAfterBreak="0">
     <w:nsid w:val="57BC0BBA"/>
     <w:multiLevelType w:val="multilevel"/>
     <w:tmpl w:val="1AB2A202"/>
@@ -52228,7 +52710,7 @@
       </w:pPr>
     </w:lvl>
   </w:abstractNum>
-  <w:abstractNum w:abstractNumId="143" w15:restartNumberingAfterBreak="0">
+  <w:abstractNum w:abstractNumId="145" w15:restartNumberingAfterBreak="0">
     <w:nsid w:val="581A1A4E"/>
     <w:multiLevelType w:val="multilevel"/>
     <w:tmpl w:val="AB20A01E"/>
@@ -52377,7 +52859,7 @@
       </w:rPr>
     </w:lvl>
   </w:abstractNum>
-  <w:abstractNum w:abstractNumId="144" w15:restartNumberingAfterBreak="0">
+  <w:abstractNum w:abstractNumId="146" w15:restartNumberingAfterBreak="0">
     <w:nsid w:val="59B36D59"/>
     <w:multiLevelType w:val="multilevel"/>
     <w:tmpl w:val="61465210"/>
@@ -52494,7 +52976,7 @@
       </w:pPr>
     </w:lvl>
   </w:abstractNum>
-  <w:abstractNum w:abstractNumId="145" w15:restartNumberingAfterBreak="0">
+  <w:abstractNum w:abstractNumId="147" w15:restartNumberingAfterBreak="0">
     <w:nsid w:val="5B1C198D"/>
     <w:multiLevelType w:val="multilevel"/>
     <w:tmpl w:val="EC10DAE8"/>
@@ -52607,7 +53089,7 @@
       </w:pPr>
     </w:lvl>
   </w:abstractNum>
-  <w:abstractNum w:abstractNumId="146" w15:restartNumberingAfterBreak="0">
+  <w:abstractNum w:abstractNumId="148" w15:restartNumberingAfterBreak="0">
     <w:nsid w:val="5BE11CD3"/>
     <w:multiLevelType w:val="multilevel"/>
     <w:tmpl w:val="E8CECECC"/>
@@ -52720,7 +53202,7 @@
       </w:pPr>
     </w:lvl>
   </w:abstractNum>
-  <w:abstractNum w:abstractNumId="147" w15:restartNumberingAfterBreak="0">
+  <w:abstractNum w:abstractNumId="149" w15:restartNumberingAfterBreak="0">
     <w:nsid w:val="5C4C1E34"/>
     <w:multiLevelType w:val="multilevel"/>
     <w:tmpl w:val="DD6C2480"/>
@@ -52869,7 +53351,7 @@
       </w:rPr>
     </w:lvl>
   </w:abstractNum>
-  <w:abstractNum w:abstractNumId="148" w15:restartNumberingAfterBreak="0">
+  <w:abstractNum w:abstractNumId="150" w15:restartNumberingAfterBreak="0">
     <w:nsid w:val="5D4978B1"/>
     <w:multiLevelType w:val="multilevel"/>
     <w:tmpl w:val="E8B04226"/>
@@ -53018,7 +53500,7 @@
       </w:rPr>
     </w:lvl>
   </w:abstractNum>
-  <w:abstractNum w:abstractNumId="149" w15:restartNumberingAfterBreak="0">
+  <w:abstractNum w:abstractNumId="151" w15:restartNumberingAfterBreak="0">
     <w:nsid w:val="5DD57DEB"/>
     <w:multiLevelType w:val="multilevel"/>
     <w:tmpl w:val="06FE81CA"/>
@@ -53131,7 +53613,7 @@
       </w:pPr>
     </w:lvl>
   </w:abstractNum>
-  <w:abstractNum w:abstractNumId="150" w15:restartNumberingAfterBreak="0">
+  <w:abstractNum w:abstractNumId="152" w15:restartNumberingAfterBreak="0">
     <w:nsid w:val="5E65244F"/>
     <w:multiLevelType w:val="multilevel"/>
     <w:tmpl w:val="561019E4"/>
@@ -53248,7 +53730,7 @@
       </w:pPr>
     </w:lvl>
   </w:abstractNum>
-  <w:abstractNum w:abstractNumId="151" w15:restartNumberingAfterBreak="0">
+  <w:abstractNum w:abstractNumId="153" w15:restartNumberingAfterBreak="0">
     <w:nsid w:val="5EA230AE"/>
     <w:multiLevelType w:val="multilevel"/>
     <w:tmpl w:val="A49ECC58"/>
@@ -53365,7 +53847,7 @@
       </w:pPr>
     </w:lvl>
   </w:abstractNum>
-  <w:abstractNum w:abstractNumId="152" w15:restartNumberingAfterBreak="0">
+  <w:abstractNum w:abstractNumId="154" w15:restartNumberingAfterBreak="0">
     <w:nsid w:val="5F115971"/>
     <w:multiLevelType w:val="multilevel"/>
     <w:tmpl w:val="16760B04"/>
@@ -53514,7 +53996,7 @@
       </w:rPr>
     </w:lvl>
   </w:abstractNum>
-  <w:abstractNum w:abstractNumId="153" w15:restartNumberingAfterBreak="0">
+  <w:abstractNum w:abstractNumId="155" w15:restartNumberingAfterBreak="0">
     <w:nsid w:val="5F7B36A5"/>
     <w:multiLevelType w:val="multilevel"/>
     <w:tmpl w:val="097AD57E"/>
@@ -53663,7 +54145,7 @@
       </w:rPr>
     </w:lvl>
   </w:abstractNum>
-  <w:abstractNum w:abstractNumId="154" w15:restartNumberingAfterBreak="0">
+  <w:abstractNum w:abstractNumId="156" w15:restartNumberingAfterBreak="0">
     <w:nsid w:val="60892418"/>
     <w:multiLevelType w:val="multilevel"/>
     <w:tmpl w:val="B26C8FD4"/>
@@ -53776,7 +54258,7 @@
       </w:pPr>
     </w:lvl>
   </w:abstractNum>
-  <w:abstractNum w:abstractNumId="155" w15:restartNumberingAfterBreak="0">
+  <w:abstractNum w:abstractNumId="157" w15:restartNumberingAfterBreak="0">
     <w:nsid w:val="608B6E2E"/>
     <w:multiLevelType w:val="multilevel"/>
     <w:tmpl w:val="4EDCD094"/>
@@ -53925,7 +54407,7 @@
       </w:rPr>
     </w:lvl>
   </w:abstractNum>
-  <w:abstractNum w:abstractNumId="156" w15:restartNumberingAfterBreak="0">
+  <w:abstractNum w:abstractNumId="158" w15:restartNumberingAfterBreak="0">
     <w:nsid w:val="62B332AE"/>
     <w:multiLevelType w:val="multilevel"/>
     <w:tmpl w:val="FDFEB8B4"/>
@@ -54074,7 +54556,7 @@
       </w:rPr>
     </w:lvl>
   </w:abstractNum>
-  <w:abstractNum w:abstractNumId="157" w15:restartNumberingAfterBreak="0">
+  <w:abstractNum w:abstractNumId="159" w15:restartNumberingAfterBreak="0">
     <w:nsid w:val="62D2677D"/>
     <w:multiLevelType w:val="multilevel"/>
     <w:tmpl w:val="FAA07F2C"/>
@@ -54191,7 +54673,7 @@
       </w:pPr>
     </w:lvl>
   </w:abstractNum>
-  <w:abstractNum w:abstractNumId="158" w15:restartNumberingAfterBreak="0">
+  <w:abstractNum w:abstractNumId="160" w15:restartNumberingAfterBreak="0">
     <w:nsid w:val="63186CEA"/>
     <w:multiLevelType w:val="multilevel"/>
     <w:tmpl w:val="4180175A"/>
@@ -54308,7 +54790,7 @@
       </w:pPr>
     </w:lvl>
   </w:abstractNum>
-  <w:abstractNum w:abstractNumId="159" w15:restartNumberingAfterBreak="0">
+  <w:abstractNum w:abstractNumId="161" w15:restartNumberingAfterBreak="0">
     <w:nsid w:val="63CD6B31"/>
     <w:multiLevelType w:val="multilevel"/>
     <w:tmpl w:val="1C400508"/>
@@ -54421,7 +54903,7 @@
       </w:pPr>
     </w:lvl>
   </w:abstractNum>
-  <w:abstractNum w:abstractNumId="160" w15:restartNumberingAfterBreak="0">
+  <w:abstractNum w:abstractNumId="162" w15:restartNumberingAfterBreak="0">
     <w:nsid w:val="648E7032"/>
     <w:multiLevelType w:val="multilevel"/>
     <w:tmpl w:val="FC62E00A"/>
@@ -54570,7 +55052,7 @@
       </w:rPr>
     </w:lvl>
   </w:abstractNum>
-  <w:abstractNum w:abstractNumId="161" w15:restartNumberingAfterBreak="0">
+  <w:abstractNum w:abstractNumId="163" w15:restartNumberingAfterBreak="0">
     <w:nsid w:val="64BC39EB"/>
     <w:multiLevelType w:val="multilevel"/>
     <w:tmpl w:val="425C4B32"/>
@@ -54719,7 +55201,7 @@
       </w:rPr>
     </w:lvl>
   </w:abstractNum>
-  <w:abstractNum w:abstractNumId="162" w15:restartNumberingAfterBreak="0">
+  <w:abstractNum w:abstractNumId="164" w15:restartNumberingAfterBreak="0">
     <w:nsid w:val="64CE0601"/>
     <w:multiLevelType w:val="multilevel"/>
     <w:tmpl w:val="EB66259A"/>
@@ -54836,7 +55318,7 @@
       </w:pPr>
     </w:lvl>
   </w:abstractNum>
-  <w:abstractNum w:abstractNumId="163" w15:restartNumberingAfterBreak="0">
+  <w:abstractNum w:abstractNumId="165" w15:restartNumberingAfterBreak="0">
     <w:nsid w:val="658F6959"/>
     <w:multiLevelType w:val="multilevel"/>
     <w:tmpl w:val="88F6DB54"/>
@@ -54985,7 +55467,7 @@
       </w:rPr>
     </w:lvl>
   </w:abstractNum>
-  <w:abstractNum w:abstractNumId="164" w15:restartNumberingAfterBreak="0">
+  <w:abstractNum w:abstractNumId="166" w15:restartNumberingAfterBreak="0">
     <w:nsid w:val="660F1065"/>
     <w:multiLevelType w:val="multilevel"/>
     <w:tmpl w:val="47642678"/>
@@ -55098,7 +55580,7 @@
       </w:pPr>
     </w:lvl>
   </w:abstractNum>
-  <w:abstractNum w:abstractNumId="165" w15:restartNumberingAfterBreak="0">
+  <w:abstractNum w:abstractNumId="167" w15:restartNumberingAfterBreak="0">
     <w:nsid w:val="663D7BCC"/>
     <w:multiLevelType w:val="multilevel"/>
     <w:tmpl w:val="34CAB34E"/>
@@ -55211,7 +55693,7 @@
       </w:pPr>
     </w:lvl>
   </w:abstractNum>
-  <w:abstractNum w:abstractNumId="166" w15:restartNumberingAfterBreak="0">
+  <w:abstractNum w:abstractNumId="168" w15:restartNumberingAfterBreak="0">
     <w:nsid w:val="671B48A4"/>
     <w:multiLevelType w:val="multilevel"/>
     <w:tmpl w:val="F250794E"/>
@@ -55328,7 +55810,7 @@
       </w:pPr>
     </w:lvl>
   </w:abstractNum>
-  <w:abstractNum w:abstractNumId="167" w15:restartNumberingAfterBreak="0">
+  <w:abstractNum w:abstractNumId="169" w15:restartNumberingAfterBreak="0">
     <w:nsid w:val="681D785E"/>
     <w:multiLevelType w:val="multilevel"/>
     <w:tmpl w:val="E3FAAD48"/>
@@ -55441,7 +55923,7 @@
       </w:pPr>
     </w:lvl>
   </w:abstractNum>
-  <w:abstractNum w:abstractNumId="168" w15:restartNumberingAfterBreak="0">
+  <w:abstractNum w:abstractNumId="170" w15:restartNumberingAfterBreak="0">
     <w:nsid w:val="68F0090B"/>
     <w:multiLevelType w:val="multilevel"/>
     <w:tmpl w:val="3F028008"/>
@@ -55590,7 +56072,7 @@
       </w:rPr>
     </w:lvl>
   </w:abstractNum>
-  <w:abstractNum w:abstractNumId="169" w15:restartNumberingAfterBreak="0">
+  <w:abstractNum w:abstractNumId="171" w15:restartNumberingAfterBreak="0">
     <w:nsid w:val="695D6A99"/>
     <w:multiLevelType w:val="multilevel"/>
     <w:tmpl w:val="659A40B6"/>
@@ -55707,7 +56189,7 @@
       </w:pPr>
     </w:lvl>
   </w:abstractNum>
-  <w:abstractNum w:abstractNumId="170" w15:restartNumberingAfterBreak="0">
+  <w:abstractNum w:abstractNumId="172" w15:restartNumberingAfterBreak="0">
     <w:nsid w:val="69786AC2"/>
     <w:multiLevelType w:val="multilevel"/>
     <w:tmpl w:val="AF70F76E"/>
@@ -55820,7 +56302,7 @@
       </w:pPr>
     </w:lvl>
   </w:abstractNum>
-  <w:abstractNum w:abstractNumId="171" w15:restartNumberingAfterBreak="0">
+  <w:abstractNum w:abstractNumId="173" w15:restartNumberingAfterBreak="0">
     <w:nsid w:val="69A35405"/>
     <w:multiLevelType w:val="multilevel"/>
     <w:tmpl w:val="1924F998"/>
@@ -55937,7 +56419,7 @@
       </w:pPr>
     </w:lvl>
   </w:abstractNum>
-  <w:abstractNum w:abstractNumId="172" w15:restartNumberingAfterBreak="0">
+  <w:abstractNum w:abstractNumId="174" w15:restartNumberingAfterBreak="0">
     <w:nsid w:val="69DD1AF8"/>
     <w:multiLevelType w:val="multilevel"/>
     <w:tmpl w:val="BD5AC04A"/>
@@ -56054,7 +56536,7 @@
       </w:pPr>
     </w:lvl>
   </w:abstractNum>
-  <w:abstractNum w:abstractNumId="173" w15:restartNumberingAfterBreak="0">
+  <w:abstractNum w:abstractNumId="175" w15:restartNumberingAfterBreak="0">
     <w:nsid w:val="6A701DE7"/>
     <w:multiLevelType w:val="multilevel"/>
     <w:tmpl w:val="97D2F714"/>
@@ -56167,7 +56649,7 @@
       </w:pPr>
     </w:lvl>
   </w:abstractNum>
-  <w:abstractNum w:abstractNumId="174" w15:restartNumberingAfterBreak="0">
+  <w:abstractNum w:abstractNumId="176" w15:restartNumberingAfterBreak="0">
     <w:nsid w:val="6C885F83"/>
     <w:multiLevelType w:val="multilevel"/>
     <w:tmpl w:val="E04C4104"/>
@@ -56280,7 +56762,7 @@
       </w:pPr>
     </w:lvl>
   </w:abstractNum>
-  <w:abstractNum w:abstractNumId="175" w15:restartNumberingAfterBreak="0">
+  <w:abstractNum w:abstractNumId="177" w15:restartNumberingAfterBreak="0">
     <w:nsid w:val="6D216706"/>
     <w:multiLevelType w:val="multilevel"/>
     <w:tmpl w:val="19BA3346"/>
@@ -56429,7 +56911,7 @@
       </w:rPr>
     </w:lvl>
   </w:abstractNum>
-  <w:abstractNum w:abstractNumId="176" w15:restartNumberingAfterBreak="0">
+  <w:abstractNum w:abstractNumId="178" w15:restartNumberingAfterBreak="0">
     <w:nsid w:val="6D52424E"/>
     <w:multiLevelType w:val="multilevel"/>
     <w:tmpl w:val="EC089A6C"/>
@@ -56578,7 +57060,7 @@
       </w:rPr>
     </w:lvl>
   </w:abstractNum>
-  <w:abstractNum w:abstractNumId="177" w15:restartNumberingAfterBreak="0">
+  <w:abstractNum w:abstractNumId="179" w15:restartNumberingAfterBreak="0">
     <w:nsid w:val="700C582D"/>
     <w:multiLevelType w:val="multilevel"/>
     <w:tmpl w:val="F1E6B3F6"/>
@@ -56695,7 +57177,7 @@
       </w:pPr>
     </w:lvl>
   </w:abstractNum>
-  <w:abstractNum w:abstractNumId="178" w15:restartNumberingAfterBreak="0">
+  <w:abstractNum w:abstractNumId="180" w15:restartNumberingAfterBreak="0">
     <w:nsid w:val="71396F90"/>
     <w:multiLevelType w:val="multilevel"/>
     <w:tmpl w:val="49D603BA"/>
@@ -56808,7 +57290,7 @@
       </w:pPr>
     </w:lvl>
   </w:abstractNum>
-  <w:abstractNum w:abstractNumId="179" w15:restartNumberingAfterBreak="0">
+  <w:abstractNum w:abstractNumId="181" w15:restartNumberingAfterBreak="0">
     <w:nsid w:val="714C3769"/>
     <w:multiLevelType w:val="multilevel"/>
     <w:tmpl w:val="0400F236"/>
@@ -56925,7 +57407,7 @@
       </w:pPr>
     </w:lvl>
   </w:abstractNum>
-  <w:abstractNum w:abstractNumId="180" w15:restartNumberingAfterBreak="0">
+  <w:abstractNum w:abstractNumId="182" w15:restartNumberingAfterBreak="0">
     <w:nsid w:val="718A101C"/>
     <w:multiLevelType w:val="multilevel"/>
     <w:tmpl w:val="5CD8517C"/>
@@ -57038,7 +57520,7 @@
       </w:pPr>
     </w:lvl>
   </w:abstractNum>
-  <w:abstractNum w:abstractNumId="181" w15:restartNumberingAfterBreak="0">
+  <w:abstractNum w:abstractNumId="183" w15:restartNumberingAfterBreak="0">
     <w:nsid w:val="71BE59BD"/>
     <w:multiLevelType w:val="multilevel"/>
     <w:tmpl w:val="EEA6D5E4"/>
@@ -57187,7 +57669,7 @@
       </w:rPr>
     </w:lvl>
   </w:abstractNum>
-  <w:abstractNum w:abstractNumId="182" w15:restartNumberingAfterBreak="0">
+  <w:abstractNum w:abstractNumId="184" w15:restartNumberingAfterBreak="0">
     <w:nsid w:val="723B172E"/>
     <w:multiLevelType w:val="multilevel"/>
     <w:tmpl w:val="EABCB996"/>
@@ -57300,7 +57782,7 @@
       </w:pPr>
     </w:lvl>
   </w:abstractNum>
-  <w:abstractNum w:abstractNumId="183" w15:restartNumberingAfterBreak="0">
+  <w:abstractNum w:abstractNumId="185" w15:restartNumberingAfterBreak="0">
     <w:nsid w:val="72644679"/>
     <w:multiLevelType w:val="multilevel"/>
     <w:tmpl w:val="8940D022"/>
@@ -57417,7 +57899,7 @@
       </w:pPr>
     </w:lvl>
   </w:abstractNum>
-  <w:abstractNum w:abstractNumId="184" w15:restartNumberingAfterBreak="0">
+  <w:abstractNum w:abstractNumId="186" w15:restartNumberingAfterBreak="0">
     <w:nsid w:val="73420300"/>
     <w:multiLevelType w:val="multilevel"/>
     <w:tmpl w:val="9A482894"/>
@@ -57534,7 +58016,7 @@
       </w:pPr>
     </w:lvl>
   </w:abstractNum>
-  <w:abstractNum w:abstractNumId="185" w15:restartNumberingAfterBreak="0">
+  <w:abstractNum w:abstractNumId="187" w15:restartNumberingAfterBreak="0">
     <w:nsid w:val="737B0DAD"/>
     <w:multiLevelType w:val="multilevel"/>
     <w:tmpl w:val="A67435B0"/>
@@ -57647,7 +58129,7 @@
       </w:pPr>
     </w:lvl>
   </w:abstractNum>
-  <w:abstractNum w:abstractNumId="186" w15:restartNumberingAfterBreak="0">
+  <w:abstractNum w:abstractNumId="188" w15:restartNumberingAfterBreak="0">
     <w:nsid w:val="73AE2955"/>
     <w:multiLevelType w:val="multilevel"/>
     <w:tmpl w:val="DCC05106"/>
@@ -57796,7 +58278,7 @@
       </w:rPr>
     </w:lvl>
   </w:abstractNum>
-  <w:abstractNum w:abstractNumId="187" w15:restartNumberingAfterBreak="0">
+  <w:abstractNum w:abstractNumId="189" w15:restartNumberingAfterBreak="0">
     <w:nsid w:val="74122332"/>
     <w:multiLevelType w:val="multilevel"/>
     <w:tmpl w:val="D7BAA042"/>
@@ -57945,7 +58427,7 @@
       </w:rPr>
     </w:lvl>
   </w:abstractNum>
-  <w:abstractNum w:abstractNumId="188" w15:restartNumberingAfterBreak="0">
+  <w:abstractNum w:abstractNumId="190" w15:restartNumberingAfterBreak="0">
     <w:nsid w:val="74540941"/>
     <w:multiLevelType w:val="multilevel"/>
     <w:tmpl w:val="8CD6733A"/>
@@ -58062,7 +58544,7 @@
       </w:pPr>
     </w:lvl>
   </w:abstractNum>
-  <w:abstractNum w:abstractNumId="189" w15:restartNumberingAfterBreak="0">
+  <w:abstractNum w:abstractNumId="191" w15:restartNumberingAfterBreak="0">
     <w:nsid w:val="7497277D"/>
     <w:multiLevelType w:val="multilevel"/>
     <w:tmpl w:val="30D48552"/>
@@ -58175,7 +58657,7 @@
       </w:pPr>
     </w:lvl>
   </w:abstractNum>
-  <w:abstractNum w:abstractNumId="190" w15:restartNumberingAfterBreak="0">
+  <w:abstractNum w:abstractNumId="192" w15:restartNumberingAfterBreak="0">
     <w:nsid w:val="749E2893"/>
     <w:multiLevelType w:val="multilevel"/>
     <w:tmpl w:val="7794CA12"/>
@@ -58292,7 +58774,7 @@
       </w:pPr>
     </w:lvl>
   </w:abstractNum>
-  <w:abstractNum w:abstractNumId="191" w15:restartNumberingAfterBreak="0">
+  <w:abstractNum w:abstractNumId="193" w15:restartNumberingAfterBreak="0">
     <w:nsid w:val="74FB20C9"/>
     <w:multiLevelType w:val="multilevel"/>
     <w:tmpl w:val="E6FAA2AC"/>
@@ -58405,7 +58887,7 @@
       </w:pPr>
     </w:lvl>
   </w:abstractNum>
-  <w:abstractNum w:abstractNumId="192" w15:restartNumberingAfterBreak="0">
+  <w:abstractNum w:abstractNumId="194" w15:restartNumberingAfterBreak="0">
     <w:nsid w:val="7584213B"/>
     <w:multiLevelType w:val="multilevel"/>
     <w:tmpl w:val="09F8B056"/>
@@ -58554,7 +59036,7 @@
       </w:rPr>
     </w:lvl>
   </w:abstractNum>
-  <w:abstractNum w:abstractNumId="193" w15:restartNumberingAfterBreak="0">
+  <w:abstractNum w:abstractNumId="195" w15:restartNumberingAfterBreak="0">
     <w:nsid w:val="7608668A"/>
     <w:multiLevelType w:val="multilevel"/>
     <w:tmpl w:val="296EE14C"/>
@@ -58703,7 +59185,7 @@
       </w:rPr>
     </w:lvl>
   </w:abstractNum>
-  <w:abstractNum w:abstractNumId="194" w15:restartNumberingAfterBreak="0">
+  <w:abstractNum w:abstractNumId="196" w15:restartNumberingAfterBreak="0">
     <w:nsid w:val="76637E8B"/>
     <w:multiLevelType w:val="multilevel"/>
     <w:tmpl w:val="CCD23BE8"/>
@@ -58852,7 +59334,7 @@
       </w:rPr>
     </w:lvl>
   </w:abstractNum>
-  <w:abstractNum w:abstractNumId="195" w15:restartNumberingAfterBreak="0">
+  <w:abstractNum w:abstractNumId="197" w15:restartNumberingAfterBreak="0">
     <w:nsid w:val="76777F05"/>
     <w:multiLevelType w:val="multilevel"/>
     <w:tmpl w:val="67BABF30"/>
@@ -58965,7 +59447,7 @@
       </w:pPr>
     </w:lvl>
   </w:abstractNum>
-  <w:abstractNum w:abstractNumId="196" w15:restartNumberingAfterBreak="0">
+  <w:abstractNum w:abstractNumId="198" w15:restartNumberingAfterBreak="0">
     <w:nsid w:val="76AE47D3"/>
     <w:multiLevelType w:val="multilevel"/>
     <w:tmpl w:val="5B72B3F0"/>
@@ -59078,7 +59560,7 @@
       </w:pPr>
     </w:lvl>
   </w:abstractNum>
-  <w:abstractNum w:abstractNumId="197" w15:restartNumberingAfterBreak="0">
+  <w:abstractNum w:abstractNumId="199" w15:restartNumberingAfterBreak="0">
     <w:nsid w:val="76E453BA"/>
     <w:multiLevelType w:val="multilevel"/>
     <w:tmpl w:val="79A6522E"/>
@@ -59227,7 +59709,7 @@
       </w:rPr>
     </w:lvl>
   </w:abstractNum>
-  <w:abstractNum w:abstractNumId="198" w15:restartNumberingAfterBreak="0">
+  <w:abstractNum w:abstractNumId="200" w15:restartNumberingAfterBreak="0">
     <w:nsid w:val="77E3193E"/>
     <w:multiLevelType w:val="multilevel"/>
     <w:tmpl w:val="048270E0"/>
@@ -59340,7 +59822,7 @@
       </w:pPr>
     </w:lvl>
   </w:abstractNum>
-  <w:abstractNum w:abstractNumId="199" w15:restartNumberingAfterBreak="0">
+  <w:abstractNum w:abstractNumId="201" w15:restartNumberingAfterBreak="0">
     <w:nsid w:val="7AC767E7"/>
     <w:multiLevelType w:val="multilevel"/>
     <w:tmpl w:val="8EC46F34"/>
@@ -59489,7 +59971,7 @@
       </w:rPr>
     </w:lvl>
   </w:abstractNum>
-  <w:abstractNum w:abstractNumId="200" w15:restartNumberingAfterBreak="0">
+  <w:abstractNum w:abstractNumId="202" w15:restartNumberingAfterBreak="0">
     <w:nsid w:val="7B0A7861"/>
     <w:multiLevelType w:val="multilevel"/>
     <w:tmpl w:val="F5A8C422"/>
@@ -59602,7 +60084,7 @@
       </w:pPr>
     </w:lvl>
   </w:abstractNum>
-  <w:abstractNum w:abstractNumId="201" w15:restartNumberingAfterBreak="0">
+  <w:abstractNum w:abstractNumId="203" w15:restartNumberingAfterBreak="0">
     <w:nsid w:val="7BAE23B0"/>
     <w:multiLevelType w:val="multilevel"/>
     <w:tmpl w:val="C010C154"/>
@@ -59751,7 +60233,7 @@
       </w:rPr>
     </w:lvl>
   </w:abstractNum>
-  <w:abstractNum w:abstractNumId="202" w15:restartNumberingAfterBreak="0">
+  <w:abstractNum w:abstractNumId="204" w15:restartNumberingAfterBreak="0">
     <w:nsid w:val="7C50587B"/>
     <w:multiLevelType w:val="multilevel"/>
     <w:tmpl w:val="5964D326"/>
@@ -59864,7 +60346,7 @@
       </w:pPr>
     </w:lvl>
   </w:abstractNum>
-  <w:abstractNum w:abstractNumId="203" w15:restartNumberingAfterBreak="0">
+  <w:abstractNum w:abstractNumId="205" w15:restartNumberingAfterBreak="0">
     <w:nsid w:val="7CAE74D9"/>
     <w:multiLevelType w:val="multilevel"/>
     <w:tmpl w:val="D15C67A8"/>
@@ -59981,7 +60463,7 @@
       </w:pPr>
     </w:lvl>
   </w:abstractNum>
-  <w:abstractNum w:abstractNumId="204" w15:restartNumberingAfterBreak="0">
+  <w:abstractNum w:abstractNumId="206" w15:restartNumberingAfterBreak="0">
     <w:nsid w:val="7D015591"/>
     <w:multiLevelType w:val="multilevel"/>
     <w:tmpl w:val="A7482748"/>
@@ -60098,7 +60580,7 @@
       </w:pPr>
     </w:lvl>
   </w:abstractNum>
-  <w:abstractNum w:abstractNumId="205" w15:restartNumberingAfterBreak="0">
+  <w:abstractNum w:abstractNumId="207" w15:restartNumberingAfterBreak="0">
     <w:nsid w:val="7E1E1EAD"/>
     <w:multiLevelType w:val="multilevel"/>
     <w:tmpl w:val="F7AE9A24"/>
@@ -60215,7 +60697,7 @@
       </w:pPr>
     </w:lvl>
   </w:abstractNum>
-  <w:abstractNum w:abstractNumId="206" w15:restartNumberingAfterBreak="0">
+  <w:abstractNum w:abstractNumId="208" w15:restartNumberingAfterBreak="0">
     <w:nsid w:val="7F424B9F"/>
     <w:multiLevelType w:val="multilevel"/>
     <w:tmpl w:val="B5FC2886"/>
@@ -60328,7 +60810,7 @@
       </w:pPr>
     </w:lvl>
   </w:abstractNum>
-  <w:abstractNum w:abstractNumId="207" w15:restartNumberingAfterBreak="0">
+  <w:abstractNum w:abstractNumId="209" w15:restartNumberingAfterBreak="0">
     <w:nsid w:val="7FE662A4"/>
     <w:multiLevelType w:val="multilevel"/>
     <w:tmpl w:val="04E4FC32"/>
@@ -60442,628 +60924,634 @@
     </w:lvl>
   </w:abstractNum>
   <w:num w:numId="1" w16cid:durableId="720787938">
+    <w:abstractNumId w:val="21"/>
+  </w:num>
+  <w:num w:numId="2" w16cid:durableId="2122188350">
+    <w:abstractNumId w:val="191"/>
+  </w:num>
+  <w:num w:numId="3" w16cid:durableId="290138649">
+    <w:abstractNumId w:val="40"/>
+  </w:num>
+  <w:num w:numId="4" w16cid:durableId="595292039">
+    <w:abstractNumId w:val="13"/>
+  </w:num>
+  <w:num w:numId="5" w16cid:durableId="1847280962">
+    <w:abstractNumId w:val="22"/>
+  </w:num>
+  <w:num w:numId="6" w16cid:durableId="1617760563">
+    <w:abstractNumId w:val="176"/>
+  </w:num>
+  <w:num w:numId="7" w16cid:durableId="120729188">
+    <w:abstractNumId w:val="193"/>
+  </w:num>
+  <w:num w:numId="8" w16cid:durableId="43719143">
+    <w:abstractNumId w:val="126"/>
+  </w:num>
+  <w:num w:numId="9" w16cid:durableId="2097052817">
+    <w:abstractNumId w:val="187"/>
+  </w:num>
+  <w:num w:numId="10" w16cid:durableId="1925332722">
+    <w:abstractNumId w:val="137"/>
+  </w:num>
+  <w:num w:numId="11" w16cid:durableId="204148796">
+    <w:abstractNumId w:val="205"/>
+  </w:num>
+  <w:num w:numId="12" w16cid:durableId="677930456">
+    <w:abstractNumId w:val="167"/>
+  </w:num>
+  <w:num w:numId="13" w16cid:durableId="461389204">
+    <w:abstractNumId w:val="166"/>
+  </w:num>
+  <w:num w:numId="14" w16cid:durableId="1933659178">
     <w:abstractNumId w:val="20"/>
   </w:num>
-  <w:num w:numId="2" w16cid:durableId="2122188350">
-    <w:abstractNumId w:val="189"/>
+  <w:num w:numId="15" w16cid:durableId="1880163776">
+    <w:abstractNumId w:val="99"/>
   </w:num>
-  <w:num w:numId="3" w16cid:durableId="290138649">
+  <w:num w:numId="16" w16cid:durableId="1840995707">
+    <w:abstractNumId w:val="136"/>
+  </w:num>
+  <w:num w:numId="17" w16cid:durableId="550731318">
+    <w:abstractNumId w:val="194"/>
+  </w:num>
+  <w:num w:numId="18" w16cid:durableId="1973629605">
+    <w:abstractNumId w:val="84"/>
+  </w:num>
+  <w:num w:numId="19" w16cid:durableId="872235080">
+    <w:abstractNumId w:val="36"/>
+  </w:num>
+  <w:num w:numId="20" w16cid:durableId="984550753">
+    <w:abstractNumId w:val="122"/>
+  </w:num>
+  <w:num w:numId="21" w16cid:durableId="688216659">
+    <w:abstractNumId w:val="206"/>
+  </w:num>
+  <w:num w:numId="22" w16cid:durableId="1910460291">
+    <w:abstractNumId w:val="31"/>
+  </w:num>
+  <w:num w:numId="23" w16cid:durableId="1260138581">
+    <w:abstractNumId w:val="47"/>
+  </w:num>
+  <w:num w:numId="24" w16cid:durableId="1644503332">
+    <w:abstractNumId w:val="111"/>
+  </w:num>
+  <w:num w:numId="25" w16cid:durableId="229116854">
     <w:abstractNumId w:val="39"/>
   </w:num>
-  <w:num w:numId="4" w16cid:durableId="595292039">
-    <w:abstractNumId w:val="12"/>
-  </w:num>
-  <w:num w:numId="5" w16cid:durableId="1847280962">
-    <w:abstractNumId w:val="21"/>
-  </w:num>
-  <w:num w:numId="6" w16cid:durableId="1617760563">
-    <w:abstractNumId w:val="174"/>
-  </w:num>
-  <w:num w:numId="7" w16cid:durableId="120729188">
-    <w:abstractNumId w:val="191"/>
-  </w:num>
-  <w:num w:numId="8" w16cid:durableId="43719143">
-    <w:abstractNumId w:val="124"/>
-  </w:num>
-  <w:num w:numId="9" w16cid:durableId="2097052817">
-    <w:abstractNumId w:val="185"/>
-  </w:num>
-  <w:num w:numId="10" w16cid:durableId="1925332722">
-    <w:abstractNumId w:val="135"/>
-  </w:num>
-  <w:num w:numId="11" w16cid:durableId="204148796">
-    <w:abstractNumId w:val="203"/>
-  </w:num>
-  <w:num w:numId="12" w16cid:durableId="677930456">
-    <w:abstractNumId w:val="165"/>
-  </w:num>
-  <w:num w:numId="13" w16cid:durableId="461389204">
-    <w:abstractNumId w:val="164"/>
-  </w:num>
-  <w:num w:numId="14" w16cid:durableId="1933659178">
-    <w:abstractNumId w:val="19"/>
-  </w:num>
-  <w:num w:numId="15" w16cid:durableId="1880163776">
-    <w:abstractNumId w:val="97"/>
-  </w:num>
-  <w:num w:numId="16" w16cid:durableId="1840995707">
-    <w:abstractNumId w:val="134"/>
-  </w:num>
-  <w:num w:numId="17" w16cid:durableId="550731318">
-    <w:abstractNumId w:val="192"/>
-  </w:num>
-  <w:num w:numId="18" w16cid:durableId="1973629605">
-    <w:abstractNumId w:val="83"/>
-  </w:num>
-  <w:num w:numId="19" w16cid:durableId="872235080">
-    <w:abstractNumId w:val="35"/>
-  </w:num>
-  <w:num w:numId="20" w16cid:durableId="984550753">
+  <w:num w:numId="26" w16cid:durableId="1425801237">
     <w:abstractNumId w:val="120"/>
   </w:num>
-  <w:num w:numId="21" w16cid:durableId="688216659">
-    <w:abstractNumId w:val="204"/>
-  </w:num>
-  <w:num w:numId="22" w16cid:durableId="1910460291">
-    <w:abstractNumId w:val="30"/>
-  </w:num>
-  <w:num w:numId="23" w16cid:durableId="1260138581">
-    <w:abstractNumId w:val="46"/>
-  </w:num>
-  <w:num w:numId="24" w16cid:durableId="1644503332">
-    <w:abstractNumId w:val="109"/>
-  </w:num>
-  <w:num w:numId="25" w16cid:durableId="229116854">
-    <w:abstractNumId w:val="38"/>
-  </w:num>
-  <w:num w:numId="26" w16cid:durableId="1425801237">
-    <w:abstractNumId w:val="118"/>
-  </w:num>
   <w:num w:numId="27" w16cid:durableId="1291547366">
-    <w:abstractNumId w:val="94"/>
+    <w:abstractNumId w:val="95"/>
   </w:num>
   <w:num w:numId="28" w16cid:durableId="1019892213">
-    <w:abstractNumId w:val="85"/>
+    <w:abstractNumId w:val="86"/>
   </w:num>
   <w:num w:numId="29" w16cid:durableId="2011176441">
-    <w:abstractNumId w:val="116"/>
+    <w:abstractNumId w:val="118"/>
   </w:num>
   <w:num w:numId="30" w16cid:durableId="904994195">
     <w:abstractNumId w:val="5"/>
   </w:num>
   <w:num w:numId="31" w16cid:durableId="469321429">
-    <w:abstractNumId w:val="24"/>
+    <w:abstractNumId w:val="25"/>
   </w:num>
   <w:num w:numId="32" w16cid:durableId="429549527">
-    <w:abstractNumId w:val="51"/>
+    <w:abstractNumId w:val="52"/>
   </w:num>
   <w:num w:numId="33" w16cid:durableId="901989019">
-    <w:abstractNumId w:val="156"/>
+    <w:abstractNumId w:val="158"/>
   </w:num>
   <w:num w:numId="34" w16cid:durableId="1613777564">
     <w:abstractNumId w:val="2"/>
   </w:num>
   <w:num w:numId="35" w16cid:durableId="1600016767">
-    <w:abstractNumId w:val="179"/>
+    <w:abstractNumId w:val="181"/>
   </w:num>
   <w:num w:numId="36" w16cid:durableId="1816994449">
-    <w:abstractNumId w:val="75"/>
+    <w:abstractNumId w:val="76"/>
   </w:num>
   <w:num w:numId="37" w16cid:durableId="1140609622">
-    <w:abstractNumId w:val="125"/>
+    <w:abstractNumId w:val="127"/>
   </w:num>
   <w:num w:numId="38" w16cid:durableId="547574006">
-    <w:abstractNumId w:val="184"/>
+    <w:abstractNumId w:val="186"/>
   </w:num>
   <w:num w:numId="39" w16cid:durableId="1926454116">
-    <w:abstractNumId w:val="69"/>
+    <w:abstractNumId w:val="70"/>
   </w:num>
   <w:num w:numId="40" w16cid:durableId="613295287">
-    <w:abstractNumId w:val="129"/>
+    <w:abstractNumId w:val="131"/>
   </w:num>
   <w:num w:numId="41" w16cid:durableId="616762043">
-    <w:abstractNumId w:val="183"/>
+    <w:abstractNumId w:val="185"/>
   </w:num>
   <w:num w:numId="42" w16cid:durableId="1999190555">
-    <w:abstractNumId w:val="119"/>
+    <w:abstractNumId w:val="121"/>
   </w:num>
   <w:num w:numId="43" w16cid:durableId="1404599519">
-    <w:abstractNumId w:val="136"/>
+    <w:abstractNumId w:val="138"/>
   </w:num>
   <w:num w:numId="44" w16cid:durableId="1060250660">
-    <w:abstractNumId w:val="130"/>
+    <w:abstractNumId w:val="132"/>
   </w:num>
   <w:num w:numId="45" w16cid:durableId="74593740">
-    <w:abstractNumId w:val="166"/>
+    <w:abstractNumId w:val="168"/>
   </w:num>
   <w:num w:numId="46" w16cid:durableId="1259214755">
-    <w:abstractNumId w:val="8"/>
+    <w:abstractNumId w:val="9"/>
   </w:num>
   <w:num w:numId="47" w16cid:durableId="1380595732">
     <w:abstractNumId w:val="7"/>
   </w:num>
   <w:num w:numId="48" w16cid:durableId="602999984">
-    <w:abstractNumId w:val="29"/>
+    <w:abstractNumId w:val="30"/>
   </w:num>
   <w:num w:numId="49" w16cid:durableId="1457484756">
-    <w:abstractNumId w:val="187"/>
+    <w:abstractNumId w:val="189"/>
   </w:num>
   <w:num w:numId="50" w16cid:durableId="1184441454">
+    <w:abstractNumId w:val="162"/>
+  </w:num>
+  <w:num w:numId="51" w16cid:durableId="600069704">
+    <w:abstractNumId w:val="81"/>
+  </w:num>
+  <w:num w:numId="52" w16cid:durableId="1329747235">
+    <w:abstractNumId w:val="142"/>
+  </w:num>
+  <w:num w:numId="53" w16cid:durableId="16781818">
+    <w:abstractNumId w:val="153"/>
+  </w:num>
+  <w:num w:numId="54" w16cid:durableId="152913906">
+    <w:abstractNumId w:val="56"/>
+  </w:num>
+  <w:num w:numId="55" w16cid:durableId="1464350358">
+    <w:abstractNumId w:val="130"/>
+  </w:num>
+  <w:num w:numId="56" w16cid:durableId="590813891">
+    <w:abstractNumId w:val="128"/>
+  </w:num>
+  <w:num w:numId="57" w16cid:durableId="681473003">
     <w:abstractNumId w:val="160"/>
   </w:num>
-  <w:num w:numId="51" w16cid:durableId="600069704">
+  <w:num w:numId="58" w16cid:durableId="448858249">
     <w:abstractNumId w:val="80"/>
   </w:num>
-  <w:num w:numId="52" w16cid:durableId="1329747235">
-    <w:abstractNumId w:val="140"/>
-  </w:num>
-  <w:num w:numId="53" w16cid:durableId="16781818">
-    <w:abstractNumId w:val="151"/>
-  </w:num>
-  <w:num w:numId="54" w16cid:durableId="152913906">
-    <w:abstractNumId w:val="55"/>
-  </w:num>
-  <w:num w:numId="55" w16cid:durableId="1464350358">
-    <w:abstractNumId w:val="128"/>
-  </w:num>
-  <w:num w:numId="56" w16cid:durableId="590813891">
-    <w:abstractNumId w:val="126"/>
-  </w:num>
-  <w:num w:numId="57" w16cid:durableId="681473003">
-    <w:abstractNumId w:val="158"/>
-  </w:num>
-  <w:num w:numId="58" w16cid:durableId="448858249">
-    <w:abstractNumId w:val="79"/>
-  </w:num>
   <w:num w:numId="59" w16cid:durableId="553349782">
-    <w:abstractNumId w:val="47"/>
+    <w:abstractNumId w:val="48"/>
   </w:num>
   <w:num w:numId="60" w16cid:durableId="740492220">
+    <w:abstractNumId w:val="100"/>
+  </w:num>
+  <w:num w:numId="61" w16cid:durableId="141428899">
+    <w:abstractNumId w:val="183"/>
+  </w:num>
+  <w:num w:numId="62" w16cid:durableId="1886334593">
+    <w:abstractNumId w:val="173"/>
+  </w:num>
+  <w:num w:numId="63" w16cid:durableId="1709601069">
+    <w:abstractNumId w:val="135"/>
+  </w:num>
+  <w:num w:numId="64" w16cid:durableId="583994672">
+    <w:abstractNumId w:val="159"/>
+  </w:num>
+  <w:num w:numId="65" w16cid:durableId="1455640937">
+    <w:abstractNumId w:val="63"/>
+  </w:num>
+  <w:num w:numId="66" w16cid:durableId="1175614540">
     <w:abstractNumId w:val="98"/>
   </w:num>
-  <w:num w:numId="61" w16cid:durableId="141428899">
-    <w:abstractNumId w:val="181"/>
-  </w:num>
-  <w:num w:numId="62" w16cid:durableId="1886334593">
-    <w:abstractNumId w:val="171"/>
-  </w:num>
-  <w:num w:numId="63" w16cid:durableId="1709601069">
-    <w:abstractNumId w:val="133"/>
-  </w:num>
-  <w:num w:numId="64" w16cid:durableId="583994672">
-    <w:abstractNumId w:val="157"/>
-  </w:num>
-  <w:num w:numId="65" w16cid:durableId="1455640937">
-    <w:abstractNumId w:val="62"/>
-  </w:num>
-  <w:num w:numId="66" w16cid:durableId="1175614540">
-    <w:abstractNumId w:val="96"/>
-  </w:num>
   <w:num w:numId="67" w16cid:durableId="2116124383">
-    <w:abstractNumId w:val="188"/>
+    <w:abstractNumId w:val="190"/>
   </w:num>
   <w:num w:numId="68" w16cid:durableId="339822818">
     <w:abstractNumId w:val="4"/>
   </w:num>
   <w:num w:numId="69" w16cid:durableId="1694376526">
-    <w:abstractNumId w:val="110"/>
+    <w:abstractNumId w:val="112"/>
   </w:num>
   <w:num w:numId="70" w16cid:durableId="826287560">
-    <w:abstractNumId w:val="113"/>
+    <w:abstractNumId w:val="115"/>
   </w:num>
   <w:num w:numId="71" w16cid:durableId="613905652">
-    <w:abstractNumId w:val="33"/>
+    <w:abstractNumId w:val="34"/>
   </w:num>
   <w:num w:numId="72" w16cid:durableId="474612903">
-    <w:abstractNumId w:val="148"/>
+    <w:abstractNumId w:val="150"/>
   </w:num>
   <w:num w:numId="73" w16cid:durableId="1396392309">
+    <w:abstractNumId w:val="51"/>
+  </w:num>
+  <w:num w:numId="74" w16cid:durableId="1164706610">
+    <w:abstractNumId w:val="62"/>
+  </w:num>
+  <w:num w:numId="75" w16cid:durableId="507865771">
+    <w:abstractNumId w:val="87"/>
+  </w:num>
+  <w:num w:numId="76" w16cid:durableId="839125081">
+    <w:abstractNumId w:val="117"/>
+  </w:num>
+  <w:num w:numId="77" w16cid:durableId="1907640573">
+    <w:abstractNumId w:val="171"/>
+  </w:num>
+  <w:num w:numId="78" w16cid:durableId="1111514901">
+    <w:abstractNumId w:val="58"/>
+  </w:num>
+  <w:num w:numId="79" w16cid:durableId="610628819">
+    <w:abstractNumId w:val="174"/>
+  </w:num>
+  <w:num w:numId="80" w16cid:durableId="1456830388">
+    <w:abstractNumId w:val="141"/>
+  </w:num>
+  <w:num w:numId="81" w16cid:durableId="296496655">
+    <w:abstractNumId w:val="19"/>
+  </w:num>
+  <w:num w:numId="82" w16cid:durableId="1493988613">
+    <w:abstractNumId w:val="44"/>
+  </w:num>
+  <w:num w:numId="83" w16cid:durableId="220791385">
     <w:abstractNumId w:val="50"/>
   </w:num>
-  <w:num w:numId="74" w16cid:durableId="1164706610">
-    <w:abstractNumId w:val="61"/>
-  </w:num>
-  <w:num w:numId="75" w16cid:durableId="507865771">
-    <w:abstractNumId w:val="86"/>
-  </w:num>
-  <w:num w:numId="76" w16cid:durableId="839125081">
-    <w:abstractNumId w:val="115"/>
-  </w:num>
-  <w:num w:numId="77" w16cid:durableId="1907640573">
-    <w:abstractNumId w:val="169"/>
-  </w:num>
-  <w:num w:numId="78" w16cid:durableId="1111514901">
-    <w:abstractNumId w:val="57"/>
-  </w:num>
-  <w:num w:numId="79" w16cid:durableId="610628819">
-    <w:abstractNumId w:val="172"/>
-  </w:num>
-  <w:num w:numId="80" w16cid:durableId="1456830388">
-    <w:abstractNumId w:val="139"/>
-  </w:num>
-  <w:num w:numId="81" w16cid:durableId="296496655">
-    <w:abstractNumId w:val="18"/>
-  </w:num>
-  <w:num w:numId="82" w16cid:durableId="1493988613">
-    <w:abstractNumId w:val="43"/>
-  </w:num>
-  <w:num w:numId="83" w16cid:durableId="220791385">
-    <w:abstractNumId w:val="49"/>
-  </w:num>
   <w:num w:numId="84" w16cid:durableId="277494691">
-    <w:abstractNumId w:val="102"/>
+    <w:abstractNumId w:val="104"/>
   </w:num>
   <w:num w:numId="85" w16cid:durableId="1853449985">
-    <w:abstractNumId w:val="82"/>
+    <w:abstractNumId w:val="83"/>
   </w:num>
   <w:num w:numId="86" w16cid:durableId="1657372575">
-    <w:abstractNumId w:val="144"/>
+    <w:abstractNumId w:val="146"/>
   </w:num>
   <w:num w:numId="87" w16cid:durableId="841238149">
-    <w:abstractNumId w:val="28"/>
+    <w:abstractNumId w:val="29"/>
   </w:num>
   <w:num w:numId="88" w16cid:durableId="1834905874">
-    <w:abstractNumId w:val="65"/>
+    <w:abstractNumId w:val="66"/>
   </w:num>
   <w:num w:numId="89" w16cid:durableId="1612280281">
-    <w:abstractNumId w:val="205"/>
+    <w:abstractNumId w:val="207"/>
   </w:num>
   <w:num w:numId="90" w16cid:durableId="1885369056">
-    <w:abstractNumId w:val="132"/>
+    <w:abstractNumId w:val="134"/>
   </w:num>
   <w:num w:numId="91" w16cid:durableId="579606855">
-    <w:abstractNumId w:val="105"/>
+    <w:abstractNumId w:val="107"/>
   </w:num>
   <w:num w:numId="92" w16cid:durableId="98723762">
-    <w:abstractNumId w:val="74"/>
+    <w:abstractNumId w:val="75"/>
   </w:num>
   <w:num w:numId="93" w16cid:durableId="1276251666">
-    <w:abstractNumId w:val="127"/>
+    <w:abstractNumId w:val="129"/>
   </w:num>
   <w:num w:numId="94" w16cid:durableId="1003168853">
     <w:abstractNumId w:val="3"/>
   </w:num>
   <w:num w:numId="95" w16cid:durableId="1881699644">
-    <w:abstractNumId w:val="13"/>
+    <w:abstractNumId w:val="14"/>
   </w:num>
   <w:num w:numId="96" w16cid:durableId="1213543914">
-    <w:abstractNumId w:val="9"/>
+    <w:abstractNumId w:val="10"/>
   </w:num>
   <w:num w:numId="97" w16cid:durableId="666250584">
-    <w:abstractNumId w:val="137"/>
+    <w:abstractNumId w:val="139"/>
   </w:num>
   <w:num w:numId="98" w16cid:durableId="2072849294">
-    <w:abstractNumId w:val="91"/>
+    <w:abstractNumId w:val="92"/>
   </w:num>
   <w:num w:numId="99" w16cid:durableId="164977349">
-    <w:abstractNumId w:val="121"/>
+    <w:abstractNumId w:val="123"/>
   </w:num>
   <w:num w:numId="100" w16cid:durableId="987516317">
-    <w:abstractNumId w:val="68"/>
+    <w:abstractNumId w:val="69"/>
   </w:num>
   <w:num w:numId="101" w16cid:durableId="1860242736">
-    <w:abstractNumId w:val="107"/>
+    <w:abstractNumId w:val="109"/>
   </w:num>
   <w:num w:numId="102" w16cid:durableId="1477988547">
-    <w:abstractNumId w:val="10"/>
+    <w:abstractNumId w:val="11"/>
   </w:num>
   <w:num w:numId="103" w16cid:durableId="1016226098">
     <w:abstractNumId w:val="1"/>
   </w:num>
   <w:num w:numId="104" w16cid:durableId="937061478">
-    <w:abstractNumId w:val="34"/>
+    <w:abstractNumId w:val="35"/>
   </w:num>
   <w:num w:numId="105" w16cid:durableId="1562525008">
-    <w:abstractNumId w:val="138"/>
+    <w:abstractNumId w:val="140"/>
   </w:num>
   <w:num w:numId="106" w16cid:durableId="782572167">
+    <w:abstractNumId w:val="17"/>
+  </w:num>
+  <w:num w:numId="107" w16cid:durableId="1048140908">
+    <w:abstractNumId w:val="147"/>
+  </w:num>
+  <w:num w:numId="108" w16cid:durableId="1143162587">
+    <w:abstractNumId w:val="179"/>
+  </w:num>
+  <w:num w:numId="109" w16cid:durableId="2134132814">
+    <w:abstractNumId w:val="125"/>
+  </w:num>
+  <w:num w:numId="110" w16cid:durableId="1320571727">
+    <w:abstractNumId w:val="77"/>
+  </w:num>
+  <w:num w:numId="111" w16cid:durableId="206528832">
+    <w:abstractNumId w:val="94"/>
+  </w:num>
+  <w:num w:numId="112" w16cid:durableId="1475489534">
+    <w:abstractNumId w:val="49"/>
+  </w:num>
+  <w:num w:numId="113" w16cid:durableId="839348143">
     <w:abstractNumId w:val="16"/>
   </w:num>
-  <w:num w:numId="107" w16cid:durableId="1048140908">
-    <w:abstractNumId w:val="145"/>
-  </w:num>
-  <w:num w:numId="108" w16cid:durableId="1143162587">
-    <w:abstractNumId w:val="177"/>
-  </w:num>
-  <w:num w:numId="109" w16cid:durableId="2134132814">
-    <w:abstractNumId w:val="123"/>
-  </w:num>
-  <w:num w:numId="110" w16cid:durableId="1320571727">
-    <w:abstractNumId w:val="76"/>
-  </w:num>
-  <w:num w:numId="111" w16cid:durableId="206528832">
-    <w:abstractNumId w:val="93"/>
-  </w:num>
-  <w:num w:numId="112" w16cid:durableId="1475489534">
-    <w:abstractNumId w:val="48"/>
-  </w:num>
-  <w:num w:numId="113" w16cid:durableId="839348143">
-    <w:abstractNumId w:val="15"/>
-  </w:num>
   <w:num w:numId="114" w16cid:durableId="1483306220">
-    <w:abstractNumId w:val="163"/>
+    <w:abstractNumId w:val="165"/>
   </w:num>
   <w:num w:numId="115" w16cid:durableId="899829047">
-    <w:abstractNumId w:val="67"/>
+    <w:abstractNumId w:val="68"/>
   </w:num>
   <w:num w:numId="116" w16cid:durableId="1312249696">
-    <w:abstractNumId w:val="81"/>
+    <w:abstractNumId w:val="82"/>
   </w:num>
   <w:num w:numId="117" w16cid:durableId="1355230779">
-    <w:abstractNumId w:val="112"/>
+    <w:abstractNumId w:val="114"/>
   </w:num>
   <w:num w:numId="118" w16cid:durableId="1949197237">
-    <w:abstractNumId w:val="84"/>
+    <w:abstractNumId w:val="85"/>
   </w:num>
   <w:num w:numId="119" w16cid:durableId="152720340">
-    <w:abstractNumId w:val="117"/>
+    <w:abstractNumId w:val="119"/>
   </w:num>
   <w:num w:numId="120" w16cid:durableId="376469452">
-    <w:abstractNumId w:val="197"/>
+    <w:abstractNumId w:val="199"/>
   </w:num>
   <w:num w:numId="121" w16cid:durableId="1135951281">
+    <w:abstractNumId w:val="46"/>
+  </w:num>
+  <w:num w:numId="122" w16cid:durableId="632490731">
+    <w:abstractNumId w:val="203"/>
+  </w:num>
+  <w:num w:numId="123" w16cid:durableId="268390822">
+    <w:abstractNumId w:val="54"/>
+  </w:num>
+  <w:num w:numId="124" w16cid:durableId="2081363220">
+    <w:abstractNumId w:val="113"/>
+  </w:num>
+  <w:num w:numId="125" w16cid:durableId="2146239562">
+    <w:abstractNumId w:val="155"/>
+  </w:num>
+  <w:num w:numId="126" w16cid:durableId="274218658">
+    <w:abstractNumId w:val="108"/>
+  </w:num>
+  <w:num w:numId="127" w16cid:durableId="1330477011">
+    <w:abstractNumId w:val="149"/>
+  </w:num>
+  <w:num w:numId="128" w16cid:durableId="521088880">
     <w:abstractNumId w:val="45"/>
   </w:num>
-  <w:num w:numId="122" w16cid:durableId="632490731">
-    <w:abstractNumId w:val="201"/>
-  </w:num>
-  <w:num w:numId="123" w16cid:durableId="268390822">
-    <w:abstractNumId w:val="53"/>
-  </w:num>
-  <w:num w:numId="124" w16cid:durableId="2081363220">
-    <w:abstractNumId w:val="111"/>
-  </w:num>
-  <w:num w:numId="125" w16cid:durableId="2146239562">
-    <w:abstractNumId w:val="153"/>
-  </w:num>
-  <w:num w:numId="126" w16cid:durableId="274218658">
-    <w:abstractNumId w:val="106"/>
-  </w:num>
-  <w:num w:numId="127" w16cid:durableId="1330477011">
-    <w:abstractNumId w:val="147"/>
-  </w:num>
-  <w:num w:numId="128" w16cid:durableId="521088880">
-    <w:abstractNumId w:val="44"/>
-  </w:num>
   <w:num w:numId="129" w16cid:durableId="1620213678">
-    <w:abstractNumId w:val="54"/>
+    <w:abstractNumId w:val="55"/>
   </w:num>
   <w:num w:numId="130" w16cid:durableId="889421125">
-    <w:abstractNumId w:val="31"/>
+    <w:abstractNumId w:val="32"/>
   </w:num>
   <w:num w:numId="131" w16cid:durableId="2135512691">
-    <w:abstractNumId w:val="146"/>
+    <w:abstractNumId w:val="148"/>
   </w:num>
   <w:num w:numId="132" w16cid:durableId="818545028">
     <w:abstractNumId w:val="6"/>
   </w:num>
   <w:num w:numId="133" w16cid:durableId="1952710860">
-    <w:abstractNumId w:val="114"/>
+    <w:abstractNumId w:val="116"/>
   </w:num>
   <w:num w:numId="134" w16cid:durableId="1104106408">
+    <w:abstractNumId w:val="89"/>
+  </w:num>
+  <w:num w:numId="135" w16cid:durableId="1667707256">
+    <w:abstractNumId w:val="37"/>
+  </w:num>
+  <w:num w:numId="136" w16cid:durableId="1099057485">
+    <w:abstractNumId w:val="196"/>
+  </w:num>
+  <w:num w:numId="137" w16cid:durableId="883905248">
+    <w:abstractNumId w:val="161"/>
+  </w:num>
+  <w:num w:numId="138" w16cid:durableId="548878409">
+    <w:abstractNumId w:val="74"/>
+  </w:num>
+  <w:num w:numId="139" w16cid:durableId="592129558">
+    <w:abstractNumId w:val="156"/>
+  </w:num>
+  <w:num w:numId="140" w16cid:durableId="985278700">
     <w:abstractNumId w:val="88"/>
   </w:num>
-  <w:num w:numId="135" w16cid:durableId="1667707256">
-    <w:abstractNumId w:val="36"/>
+  <w:num w:numId="141" w16cid:durableId="506595522">
+    <w:abstractNumId w:val="170"/>
   </w:num>
-  <w:num w:numId="136" w16cid:durableId="1099057485">
-    <w:abstractNumId w:val="194"/>
-  </w:num>
-  <w:num w:numId="137" w16cid:durableId="883905248">
-    <w:abstractNumId w:val="159"/>
-  </w:num>
-  <w:num w:numId="138" w16cid:durableId="548878409">
+  <w:num w:numId="142" w16cid:durableId="1088043777">
     <w:abstractNumId w:val="73"/>
   </w:num>
-  <w:num w:numId="139" w16cid:durableId="592129558">
+  <w:num w:numId="143" w16cid:durableId="2054378093">
+    <w:abstractNumId w:val="164"/>
+  </w:num>
+  <w:num w:numId="144" w16cid:durableId="665090898">
+    <w:abstractNumId w:val="175"/>
+  </w:num>
+  <w:num w:numId="145" w16cid:durableId="1542353486">
+    <w:abstractNumId w:val="192"/>
+  </w:num>
+  <w:num w:numId="146" w16cid:durableId="12999930">
+    <w:abstractNumId w:val="172"/>
+  </w:num>
+  <w:num w:numId="147" w16cid:durableId="554658314">
+    <w:abstractNumId w:val="64"/>
+  </w:num>
+  <w:num w:numId="148" w16cid:durableId="1662661964">
+    <w:abstractNumId w:val="106"/>
+  </w:num>
+  <w:num w:numId="149" w16cid:durableId="2021158411">
+    <w:abstractNumId w:val="143"/>
+  </w:num>
+  <w:num w:numId="150" w16cid:durableId="1588882082">
+    <w:abstractNumId w:val="202"/>
+  </w:num>
+  <w:num w:numId="151" w16cid:durableId="1460341342">
+    <w:abstractNumId w:val="43"/>
+  </w:num>
+  <w:num w:numId="152" w16cid:durableId="1515073945">
+    <w:abstractNumId w:val="110"/>
+  </w:num>
+  <w:num w:numId="153" w16cid:durableId="1536574827">
+    <w:abstractNumId w:val="188"/>
+  </w:num>
+  <w:num w:numId="154" w16cid:durableId="452018586">
+    <w:abstractNumId w:val="157"/>
+  </w:num>
+  <w:num w:numId="155" w16cid:durableId="1342387813">
+    <w:abstractNumId w:val="65"/>
+  </w:num>
+  <w:num w:numId="156" w16cid:durableId="1784152374">
+    <w:abstractNumId w:val="12"/>
+  </w:num>
+  <w:num w:numId="157" w16cid:durableId="1797599501">
+    <w:abstractNumId w:val="23"/>
+  </w:num>
+  <w:num w:numId="158" w16cid:durableId="706755317">
+    <w:abstractNumId w:val="28"/>
+  </w:num>
+  <w:num w:numId="159" w16cid:durableId="1484395961">
+    <w:abstractNumId w:val="201"/>
+  </w:num>
+  <w:num w:numId="160" w16cid:durableId="190802594">
+    <w:abstractNumId w:val="41"/>
+  </w:num>
+  <w:num w:numId="161" w16cid:durableId="1238440755">
+    <w:abstractNumId w:val="105"/>
+  </w:num>
+  <w:num w:numId="162" w16cid:durableId="1216313167">
+    <w:abstractNumId w:val="27"/>
+  </w:num>
+  <w:num w:numId="163" w16cid:durableId="1405377389">
+    <w:abstractNumId w:val="144"/>
+  </w:num>
+  <w:num w:numId="164" w16cid:durableId="997079127">
+    <w:abstractNumId w:val="93"/>
+  </w:num>
+  <w:num w:numId="165" w16cid:durableId="950625477">
+    <w:abstractNumId w:val="79"/>
+  </w:num>
+  <w:num w:numId="166" w16cid:durableId="10304174">
+    <w:abstractNumId w:val="38"/>
+  </w:num>
+  <w:num w:numId="167" w16cid:durableId="79375219">
     <w:abstractNumId w:val="154"/>
   </w:num>
-  <w:num w:numId="140" w16cid:durableId="985278700">
-    <w:abstractNumId w:val="87"/>
+  <w:num w:numId="168" w16cid:durableId="166865891">
+    <w:abstractNumId w:val="33"/>
   </w:num>
-  <w:num w:numId="141" w16cid:durableId="506595522">
-    <w:abstractNumId w:val="168"/>
+  <w:num w:numId="169" w16cid:durableId="361790208">
+    <w:abstractNumId w:val="124"/>
   </w:num>
-  <w:num w:numId="142" w16cid:durableId="1088043777">
+  <w:num w:numId="170" w16cid:durableId="57097848">
+    <w:abstractNumId w:val="59"/>
+  </w:num>
+  <w:num w:numId="171" w16cid:durableId="766198819">
+    <w:abstractNumId w:val="90"/>
+  </w:num>
+  <w:num w:numId="172" w16cid:durableId="1211499061">
+    <w:abstractNumId w:val="53"/>
+  </w:num>
+  <w:num w:numId="173" w16cid:durableId="283080003">
+    <w:abstractNumId w:val="208"/>
+  </w:num>
+  <w:num w:numId="174" w16cid:durableId="1553426079">
+    <w:abstractNumId w:val="200"/>
+  </w:num>
+  <w:num w:numId="175" w16cid:durableId="1091394449">
+    <w:abstractNumId w:val="67"/>
+  </w:num>
+  <w:num w:numId="176" w16cid:durableId="1367634584">
+    <w:abstractNumId w:val="151"/>
+  </w:num>
+  <w:num w:numId="177" w16cid:durableId="1165852170">
+    <w:abstractNumId w:val="152"/>
+  </w:num>
+  <w:num w:numId="178" w16cid:durableId="2038700258">
+    <w:abstractNumId w:val="57"/>
+  </w:num>
+  <w:num w:numId="179" w16cid:durableId="2116898398">
+    <w:abstractNumId w:val="133"/>
+  </w:num>
+  <w:num w:numId="180" w16cid:durableId="360203943">
+    <w:abstractNumId w:val="42"/>
+  </w:num>
+  <w:num w:numId="181" w16cid:durableId="2061125978">
+    <w:abstractNumId w:val="103"/>
+  </w:num>
+  <w:num w:numId="182" w16cid:durableId="1221601732">
+    <w:abstractNumId w:val="78"/>
+  </w:num>
+  <w:num w:numId="183" w16cid:durableId="1689021137">
+    <w:abstractNumId w:val="18"/>
+  </w:num>
+  <w:num w:numId="184" w16cid:durableId="1153184084">
+    <w:abstractNumId w:val="26"/>
+  </w:num>
+  <w:num w:numId="185" w16cid:durableId="261765655">
+    <w:abstractNumId w:val="71"/>
+  </w:num>
+  <w:num w:numId="186" w16cid:durableId="1412504817">
+    <w:abstractNumId w:val="195"/>
+  </w:num>
+  <w:num w:numId="187" w16cid:durableId="483665091">
+    <w:abstractNumId w:val="145"/>
+  </w:num>
+  <w:num w:numId="188" w16cid:durableId="1355233360">
+    <w:abstractNumId w:val="198"/>
+  </w:num>
+  <w:num w:numId="189" w16cid:durableId="352222945">
+    <w:abstractNumId w:val="60"/>
+  </w:num>
+  <w:num w:numId="190" w16cid:durableId="1552962342">
+    <w:abstractNumId w:val="102"/>
+  </w:num>
+  <w:num w:numId="191" w16cid:durableId="1733844750">
+    <w:abstractNumId w:val="178"/>
+  </w:num>
+  <w:num w:numId="192" w16cid:durableId="193275403">
+    <w:abstractNumId w:val="169"/>
+  </w:num>
+  <w:num w:numId="193" w16cid:durableId="944120758">
+    <w:abstractNumId w:val="182"/>
+  </w:num>
+  <w:num w:numId="194" w16cid:durableId="1358195019">
+    <w:abstractNumId w:val="209"/>
+  </w:num>
+  <w:num w:numId="195" w16cid:durableId="1582526379">
+    <w:abstractNumId w:val="97"/>
+  </w:num>
+  <w:num w:numId="196" w16cid:durableId="1555775009">
     <w:abstractNumId w:val="72"/>
   </w:num>
-  <w:num w:numId="143" w16cid:durableId="2054378093">
-    <w:abstractNumId w:val="162"/>
+  <w:num w:numId="197" w16cid:durableId="49348746">
+    <w:abstractNumId w:val="197"/>
   </w:num>
-  <w:num w:numId="144" w16cid:durableId="665090898">
-    <w:abstractNumId w:val="173"/>
+  <w:num w:numId="198" w16cid:durableId="518855812">
+    <w:abstractNumId w:val="180"/>
   </w:num>
-  <w:num w:numId="145" w16cid:durableId="1542353486">
-    <w:abstractNumId w:val="190"/>
-  </w:num>
-  <w:num w:numId="146" w16cid:durableId="12999930">
-    <w:abstractNumId w:val="170"/>
-  </w:num>
-  <w:num w:numId="147" w16cid:durableId="554658314">
-    <w:abstractNumId w:val="63"/>
-  </w:num>
-  <w:num w:numId="148" w16cid:durableId="1662661964">
-    <w:abstractNumId w:val="104"/>
-  </w:num>
-  <w:num w:numId="149" w16cid:durableId="2021158411">
-    <w:abstractNumId w:val="141"/>
-  </w:num>
-  <w:num w:numId="150" w16cid:durableId="1588882082">
-    <w:abstractNumId w:val="200"/>
-  </w:num>
-  <w:num w:numId="151" w16cid:durableId="1460341342">
-    <w:abstractNumId w:val="42"/>
-  </w:num>
-  <w:num w:numId="152" w16cid:durableId="1515073945">
-    <w:abstractNumId w:val="108"/>
-  </w:num>
-  <w:num w:numId="153" w16cid:durableId="1536574827">
-    <w:abstractNumId w:val="186"/>
-  </w:num>
-  <w:num w:numId="154" w16cid:durableId="452018586">
-    <w:abstractNumId w:val="155"/>
-  </w:num>
-  <w:num w:numId="155" w16cid:durableId="1342387813">
-    <w:abstractNumId w:val="64"/>
-  </w:num>
-  <w:num w:numId="156" w16cid:durableId="1784152374">
-    <w:abstractNumId w:val="11"/>
-  </w:num>
-  <w:num w:numId="157" w16cid:durableId="1797599501">
-    <w:abstractNumId w:val="22"/>
-  </w:num>
-  <w:num w:numId="158" w16cid:durableId="706755317">
-    <w:abstractNumId w:val="27"/>
-  </w:num>
-  <w:num w:numId="159" w16cid:durableId="1484395961">
-    <w:abstractNumId w:val="199"/>
-  </w:num>
-  <w:num w:numId="160" w16cid:durableId="190802594">
-    <w:abstractNumId w:val="40"/>
-  </w:num>
-  <w:num w:numId="161" w16cid:durableId="1238440755">
-    <w:abstractNumId w:val="103"/>
-  </w:num>
-  <w:num w:numId="162" w16cid:durableId="1216313167">
-    <w:abstractNumId w:val="26"/>
-  </w:num>
-  <w:num w:numId="163" w16cid:durableId="1405377389">
-    <w:abstractNumId w:val="142"/>
-  </w:num>
-  <w:num w:numId="164" w16cid:durableId="997079127">
-    <w:abstractNumId w:val="92"/>
-  </w:num>
-  <w:num w:numId="165" w16cid:durableId="950625477">
-    <w:abstractNumId w:val="78"/>
-  </w:num>
-  <w:num w:numId="166" w16cid:durableId="10304174">
-    <w:abstractNumId w:val="37"/>
-  </w:num>
-  <w:num w:numId="167" w16cid:durableId="79375219">
-    <w:abstractNumId w:val="152"/>
-  </w:num>
-  <w:num w:numId="168" w16cid:durableId="166865891">
-    <w:abstractNumId w:val="32"/>
-  </w:num>
-  <w:num w:numId="169" w16cid:durableId="361790208">
-    <w:abstractNumId w:val="122"/>
-  </w:num>
-  <w:num w:numId="170" w16cid:durableId="57097848">
-    <w:abstractNumId w:val="58"/>
-  </w:num>
-  <w:num w:numId="171" w16cid:durableId="766198819">
-    <w:abstractNumId w:val="89"/>
-  </w:num>
-  <w:num w:numId="172" w16cid:durableId="1211499061">
-    <w:abstractNumId w:val="52"/>
-  </w:num>
-  <w:num w:numId="173" w16cid:durableId="283080003">
-    <w:abstractNumId w:val="206"/>
-  </w:num>
-  <w:num w:numId="174" w16cid:durableId="1553426079">
-    <w:abstractNumId w:val="198"/>
-  </w:num>
-  <w:num w:numId="175" w16cid:durableId="1091394449">
-    <w:abstractNumId w:val="66"/>
-  </w:num>
-  <w:num w:numId="176" w16cid:durableId="1367634584">
-    <w:abstractNumId w:val="149"/>
-  </w:num>
-  <w:num w:numId="177" w16cid:durableId="1165852170">
-    <w:abstractNumId w:val="150"/>
-  </w:num>
-  <w:num w:numId="178" w16cid:durableId="2038700258">
-    <w:abstractNumId w:val="56"/>
-  </w:num>
-  <w:num w:numId="179" w16cid:durableId="2116898398">
-    <w:abstractNumId w:val="131"/>
-  </w:num>
-  <w:num w:numId="180" w16cid:durableId="360203943">
-    <w:abstractNumId w:val="41"/>
-  </w:num>
-  <w:num w:numId="181" w16cid:durableId="2061125978">
+  <w:num w:numId="199" w16cid:durableId="322659837">
     <w:abstractNumId w:val="101"/>
   </w:num>
-  <w:num w:numId="182" w16cid:durableId="1221601732">
-    <w:abstractNumId w:val="77"/>
-  </w:num>
-  <w:num w:numId="183" w16cid:durableId="1689021137">
-    <w:abstractNumId w:val="17"/>
-  </w:num>
-  <w:num w:numId="184" w16cid:durableId="1153184084">
-    <w:abstractNumId w:val="25"/>
-  </w:num>
-  <w:num w:numId="185" w16cid:durableId="261765655">
-    <w:abstractNumId w:val="70"/>
-  </w:num>
-  <w:num w:numId="186" w16cid:durableId="1412504817">
-    <w:abstractNumId w:val="193"/>
-  </w:num>
-  <w:num w:numId="187" w16cid:durableId="483665091">
-    <w:abstractNumId w:val="143"/>
-  </w:num>
-  <w:num w:numId="188" w16cid:durableId="1355233360">
-    <w:abstractNumId w:val="196"/>
-  </w:num>
-  <w:num w:numId="189" w16cid:durableId="352222945">
-    <w:abstractNumId w:val="59"/>
-  </w:num>
-  <w:num w:numId="190" w16cid:durableId="1552962342">
-    <w:abstractNumId w:val="100"/>
-  </w:num>
-  <w:num w:numId="191" w16cid:durableId="1733844750">
-    <w:abstractNumId w:val="176"/>
-  </w:num>
-  <w:num w:numId="192" w16cid:durableId="193275403">
-    <w:abstractNumId w:val="167"/>
-  </w:num>
-  <w:num w:numId="193" w16cid:durableId="944120758">
-    <w:abstractNumId w:val="180"/>
-  </w:num>
-  <w:num w:numId="194" w16cid:durableId="1358195019">
-    <w:abstractNumId w:val="207"/>
-  </w:num>
-  <w:num w:numId="195" w16cid:durableId="1582526379">
-    <w:abstractNumId w:val="95"/>
-  </w:num>
-  <w:num w:numId="196" w16cid:durableId="1555775009">
-    <w:abstractNumId w:val="71"/>
-  </w:num>
-  <w:num w:numId="197" w16cid:durableId="49348746">
-    <w:abstractNumId w:val="195"/>
-  </w:num>
-  <w:num w:numId="198" w16cid:durableId="518855812">
-    <w:abstractNumId w:val="178"/>
-  </w:num>
-  <w:num w:numId="199" w16cid:durableId="322659837">
-    <w:abstractNumId w:val="99"/>
-  </w:num>
   <w:num w:numId="200" w16cid:durableId="708724577">
-    <w:abstractNumId w:val="90"/>
+    <w:abstractNumId w:val="91"/>
   </w:num>
   <w:num w:numId="201" w16cid:durableId="174730028">
-    <w:abstractNumId w:val="161"/>
+    <w:abstractNumId w:val="163"/>
   </w:num>
   <w:num w:numId="202" w16cid:durableId="384985789">
-    <w:abstractNumId w:val="182"/>
+    <w:abstractNumId w:val="184"/>
   </w:num>
   <w:num w:numId="203" w16cid:durableId="1065883077">
-    <w:abstractNumId w:val="14"/>
+    <w:abstractNumId w:val="15"/>
   </w:num>
   <w:num w:numId="204" w16cid:durableId="502858348">
-    <w:abstractNumId w:val="23"/>
+    <w:abstractNumId w:val="24"/>
   </w:num>
   <w:num w:numId="205" w16cid:durableId="1234506169">
     <w:abstractNumId w:val="0"/>
   </w:num>
   <w:num w:numId="206" w16cid:durableId="55472094">
-    <w:abstractNumId w:val="60"/>
+    <w:abstractNumId w:val="61"/>
   </w:num>
   <w:num w:numId="207" w16cid:durableId="1105225460">
-    <w:abstractNumId w:val="175"/>
+    <w:abstractNumId w:val="177"/>
   </w:num>
   <w:num w:numId="208" w16cid:durableId="1786273355">
-    <w:abstractNumId w:val="202"/>
+    <w:abstractNumId w:val="204"/>
+  </w:num>
+  <w:num w:numId="209" w16cid:durableId="1344895192">
+    <w:abstractNumId w:val="8"/>
+  </w:num>
+  <w:num w:numId="210" w16cid:durableId="987708063">
+    <w:abstractNumId w:val="96"/>
   </w:num>
 </w:numbering>
 </file>
@@ -61464,7 +61952,7 @@
   <w:style w:type="paragraph" w:default="1" w:styleId="a">
     <w:name w:val="Normal"/>
     <w:qFormat/>
-    <w:rsid w:val="003D0FB4"/>
+    <w:rsid w:val="00F95145"/>
     <w:pPr>
       <w:widowControl w:val="0"/>
     </w:pPr>

</xml_diff>